<commit_message>
update uarch and hdd
</commit_message>
<xml_diff>
--- a/axi_mem_controller/Project_GR001_IP_AXI_SRAMC_HDD.docx
+++ b/axi_mem_controller/Project_GR001_IP_AXI_SRAMC_HDD.docx
@@ -7235,6 +7235,7 @@
         <w:pStyle w:val="ac"/>
       </w:pPr>
       <w:bookmarkStart w:id="8" w:name="_Toc141358507"/>
+      <w:bookmarkStart w:id="9" w:name="_Ref142408256"/>
       <w:r>
         <w:t xml:space="preserve">Figure </w:t>
       </w:r>
@@ -7257,6 +7258,7 @@
           <w:t>1</w:t>
         </w:r>
       </w:fldSimple>
+      <w:bookmarkEnd w:id="9"/>
       <w:r>
         <w:t xml:space="preserve"> </w:t>
       </w:r>
@@ -7278,7 +7280,7 @@
       <w:pPr>
         <w:pStyle w:val="20"/>
       </w:pPr>
-      <w:bookmarkStart w:id="9" w:name="_Toc141358438"/>
+      <w:bookmarkStart w:id="10" w:name="_Toc141358438"/>
       <w:r>
         <w:rPr>
           <w:rFonts w:hint="eastAsia"/>
@@ -7294,7 +7296,7 @@
         </w:rPr>
         <w:t>Description</w:t>
       </w:r>
-      <w:bookmarkEnd w:id="9"/>
+      <w:bookmarkEnd w:id="10"/>
     </w:p>
     <w:p>
       <w:pPr>
@@ -7535,7 +7537,7 @@
       <w:pPr>
         <w:pStyle w:val="20"/>
       </w:pPr>
-      <w:bookmarkStart w:id="10" w:name="_Toc141358439"/>
+      <w:bookmarkStart w:id="11" w:name="_Toc141358439"/>
       <w:r>
         <w:rPr>
           <w:rFonts w:hint="eastAsia"/>
@@ -7546,7 +7548,7 @@
       <w:r>
         <w:t>igh Level Timing Diagram</w:t>
       </w:r>
-      <w:bookmarkEnd w:id="10"/>
+      <w:bookmarkEnd w:id="11"/>
     </w:p>
     <w:p>
       <w:pPr>
@@ -7608,7 +7610,7 @@
       <w:pPr>
         <w:pStyle w:val="ac"/>
       </w:pPr>
-      <w:bookmarkStart w:id="11" w:name="_Toc141358508"/>
+      <w:bookmarkStart w:id="12" w:name="_Toc141358508"/>
       <w:r>
         <w:t xml:space="preserve">Figure </w:t>
       </w:r>
@@ -7667,13 +7669,13 @@
         </w:rPr>
         <w:t>Diagram</w:t>
       </w:r>
-      <w:bookmarkEnd w:id="11"/>
+      <w:bookmarkEnd w:id="12"/>
     </w:p>
     <w:p>
       <w:pPr>
         <w:pStyle w:val="20"/>
       </w:pPr>
-      <w:bookmarkStart w:id="12" w:name="_Toc141358440"/>
+      <w:bookmarkStart w:id="13" w:name="_Toc141358440"/>
       <w:r>
         <w:rPr>
           <w:rFonts w:hint="eastAsia"/>
@@ -7683,7 +7685,7 @@
       <w:r>
         <w:t>lock and Reset</w:t>
       </w:r>
-      <w:bookmarkEnd w:id="12"/>
+      <w:bookmarkEnd w:id="13"/>
     </w:p>
     <w:p>
       <w:pPr>
@@ -7706,7 +7708,7 @@
       <w:pPr>
         <w:pStyle w:val="30"/>
       </w:pPr>
-      <w:bookmarkStart w:id="13" w:name="_Toc141358441"/>
+      <w:bookmarkStart w:id="14" w:name="_Toc141358441"/>
       <w:r>
         <w:rPr>
           <w:rFonts w:hint="eastAsia"/>
@@ -7716,7 +7718,7 @@
       <w:r>
         <w:t>lock</w:t>
       </w:r>
-      <w:bookmarkEnd w:id="13"/>
+      <w:bookmarkEnd w:id="14"/>
     </w:p>
     <w:tbl>
       <w:tblPr>
@@ -8201,7 +8203,7 @@
       <w:pPr>
         <w:pStyle w:val="ac"/>
       </w:pPr>
-      <w:bookmarkStart w:id="14" w:name="_Toc141358484"/>
+      <w:bookmarkStart w:id="15" w:name="_Toc141358484"/>
       <w:r>
         <w:t xml:space="preserve">Table </w:t>
       </w:r>
@@ -8227,13 +8229,13 @@
       <w:r>
         <w:t xml:space="preserve"> Clock Requirements</w:t>
       </w:r>
-      <w:bookmarkEnd w:id="14"/>
+      <w:bookmarkEnd w:id="15"/>
     </w:p>
     <w:p>
       <w:pPr>
         <w:pStyle w:val="30"/>
       </w:pPr>
-      <w:bookmarkStart w:id="15" w:name="_Toc141358442"/>
+      <w:bookmarkStart w:id="16" w:name="_Toc141358442"/>
       <w:r>
         <w:rPr>
           <w:rFonts w:hint="eastAsia"/>
@@ -8243,7 +8245,7 @@
       <w:r>
         <w:t>eset</w:t>
       </w:r>
-      <w:bookmarkEnd w:id="15"/>
+      <w:bookmarkEnd w:id="16"/>
     </w:p>
     <w:tbl>
       <w:tblPr>
@@ -8474,7 +8476,7 @@
       <w:pPr>
         <w:pStyle w:val="ac"/>
       </w:pPr>
-      <w:bookmarkStart w:id="16" w:name="_Toc141358485"/>
+      <w:bookmarkStart w:id="17" w:name="_Toc141358485"/>
       <w:r>
         <w:t xml:space="preserve">Table </w:t>
       </w:r>
@@ -8500,13 +8502,13 @@
       <w:r>
         <w:t xml:space="preserve"> Reset Requirements</w:t>
       </w:r>
-      <w:bookmarkEnd w:id="16"/>
+      <w:bookmarkEnd w:id="17"/>
     </w:p>
     <w:p>
       <w:pPr>
         <w:pStyle w:val="20"/>
       </w:pPr>
-      <w:bookmarkStart w:id="17" w:name="_Toc141358443"/>
+      <w:bookmarkStart w:id="18" w:name="_Toc141358443"/>
       <w:r>
         <w:rPr>
           <w:rFonts w:hint="eastAsia"/>
@@ -8516,7 +8518,7 @@
       <w:r>
         <w:t>/O Interfaces</w:t>
       </w:r>
-      <w:bookmarkEnd w:id="17"/>
+      <w:bookmarkEnd w:id="18"/>
     </w:p>
     <w:p>
       <w:pPr>
@@ -9410,7 +9412,7 @@
       <w:pPr>
         <w:pStyle w:val="ac"/>
       </w:pPr>
-      <w:bookmarkStart w:id="18" w:name="_Toc141358486"/>
+      <w:bookmarkStart w:id="19" w:name="_Toc141358486"/>
       <w:r>
         <w:t xml:space="preserve">Table </w:t>
       </w:r>
@@ -9436,13 +9438,13 @@
       <w:r>
         <w:t xml:space="preserve"> I/O Interfaces</w:t>
       </w:r>
-      <w:bookmarkEnd w:id="18"/>
+      <w:bookmarkEnd w:id="19"/>
     </w:p>
     <w:p>
       <w:pPr>
         <w:pStyle w:val="20"/>
       </w:pPr>
-      <w:bookmarkStart w:id="19" w:name="_Toc141358444"/>
+      <w:bookmarkStart w:id="20" w:name="_Toc141358444"/>
       <w:r>
         <w:rPr>
           <w:rFonts w:hint="eastAsia"/>
@@ -9452,7 +9454,7 @@
       <w:r>
         <w:t>rupt</w:t>
       </w:r>
-      <w:bookmarkEnd w:id="19"/>
+      <w:bookmarkEnd w:id="20"/>
     </w:p>
     <w:p>
       <w:pPr>
@@ -9687,7 +9689,7 @@
       <w:pPr>
         <w:pStyle w:val="ac"/>
       </w:pPr>
-      <w:bookmarkStart w:id="20" w:name="_Toc141358487"/>
+      <w:bookmarkStart w:id="21" w:name="_Toc141358487"/>
       <w:r>
         <w:t xml:space="preserve">Table </w:t>
       </w:r>
@@ -9713,13 +9715,13 @@
       <w:r>
         <w:t xml:space="preserve"> Interrupt Table</w:t>
       </w:r>
-      <w:bookmarkEnd w:id="20"/>
+      <w:bookmarkEnd w:id="21"/>
     </w:p>
     <w:p>
       <w:pPr>
         <w:pStyle w:val="20"/>
       </w:pPr>
-      <w:bookmarkStart w:id="21" w:name="_Toc141358445"/>
+      <w:bookmarkStart w:id="22" w:name="_Toc141358445"/>
       <w:r>
         <w:rPr>
           <w:rFonts w:hint="eastAsia"/>
@@ -9729,7 +9731,7 @@
       <w:r>
         <w:t>ddress Mapping</w:t>
       </w:r>
-      <w:bookmarkEnd w:id="21"/>
+      <w:bookmarkEnd w:id="22"/>
     </w:p>
     <w:tbl>
       <w:tblPr>
@@ -9846,7 +9848,7 @@
       <w:pPr>
         <w:pStyle w:val="ac"/>
       </w:pPr>
-      <w:bookmarkStart w:id="22" w:name="_Toc141358488"/>
+      <w:bookmarkStart w:id="23" w:name="_Toc141358488"/>
       <w:r>
         <w:t xml:space="preserve">Table </w:t>
       </w:r>
@@ -9872,13 +9874,13 @@
       <w:r>
         <w:t xml:space="preserve"> Address Mapping</w:t>
       </w:r>
-      <w:bookmarkEnd w:id="22"/>
+      <w:bookmarkEnd w:id="23"/>
     </w:p>
     <w:p>
       <w:pPr>
         <w:pStyle w:val="11"/>
       </w:pPr>
-      <w:bookmarkStart w:id="23" w:name="_Toc141358446"/>
+      <w:bookmarkStart w:id="24" w:name="_Toc141358446"/>
       <w:r>
         <w:rPr>
           <w:rFonts w:hint="eastAsia"/>
@@ -9889,7 +9891,7 @@
       <w:r>
         <w:t>lock Description</w:t>
       </w:r>
-      <w:bookmarkEnd w:id="23"/>
+      <w:bookmarkEnd w:id="24"/>
     </w:p>
     <w:p>
       <w:pPr>
@@ -9937,10 +9939,10 @@
           <w:noProof/>
         </w:rPr>
         <w:drawing>
-          <wp:inline distT="0" distB="0" distL="0" distR="0" wp14:anchorId="0CE7E84E" wp14:editId="60EB026B">
-            <wp:extent cx="3490623" cy="1977096"/>
-            <wp:effectExtent l="0" t="0" r="0" b="4445"/>
-            <wp:docPr id="1057858830" name="图片 1"/>
+          <wp:inline distT="0" distB="0" distL="0" distR="0" wp14:anchorId="5EA6A9F4" wp14:editId="711ECFC2">
+            <wp:extent cx="3997842" cy="2039085"/>
+            <wp:effectExtent l="0" t="0" r="3175" b="0"/>
+            <wp:docPr id="73291201" name="图片 1"/>
             <wp:cNvGraphicFramePr>
               <a:graphicFrameLocks xmlns:a="http://schemas.openxmlformats.org/drawingml/2006/main" noChangeAspect="1"/>
             </wp:cNvGraphicFramePr>
@@ -9948,7 +9950,7 @@
               <a:graphicData uri="http://schemas.openxmlformats.org/drawingml/2006/picture">
                 <pic:pic xmlns:pic="http://schemas.openxmlformats.org/drawingml/2006/picture">
                   <pic:nvPicPr>
-                    <pic:cNvPr id="1057858830" name=""/>
+                    <pic:cNvPr id="73291201" name=""/>
                     <pic:cNvPicPr/>
                   </pic:nvPicPr>
                   <pic:blipFill>
@@ -9960,7 +9962,7 @@
                   <pic:spPr>
                     <a:xfrm>
                       <a:off x="0" y="0"/>
-                      <a:ext cx="3506141" cy="1985886"/>
+                      <a:ext cx="4016096" cy="2048396"/>
                     </a:xfrm>
                     <a:prstGeom prst="rect">
                       <a:avLst/>
@@ -9977,8 +9979,8 @@
       <w:pPr>
         <w:pStyle w:val="ac"/>
       </w:pPr>
-      <w:bookmarkStart w:id="24" w:name="_Ref142385100"/>
-      <w:bookmarkStart w:id="25" w:name="_Ref142385091"/>
+      <w:bookmarkStart w:id="25" w:name="_Ref142385100"/>
+      <w:bookmarkStart w:id="26" w:name="_Ref142385091"/>
       <w:r>
         <w:t xml:space="preserve">Figure </w:t>
       </w:r>
@@ -10001,11 +10003,11 @@
           <w:t>1</w:t>
         </w:r>
       </w:fldSimple>
-      <w:bookmarkEnd w:id="24"/>
+      <w:bookmarkEnd w:id="25"/>
       <w:r>
         <w:t xml:space="preserve"> Read Handler Diagram</w:t>
       </w:r>
-      <w:bookmarkEnd w:id="25"/>
+      <w:bookmarkEnd w:id="26"/>
     </w:p>
     <w:p>
       <w:pPr>
@@ -10130,7 +10132,7 @@
         <w:rPr>
           <w:rFonts w:eastAsiaTheme="minorEastAsia"/>
         </w:rPr>
-        <w:t xml:space="preserve"> packet format of the downstream arb</w:t>
+        <w:t xml:space="preserve"> format of the downstream arb</w:t>
       </w:r>
       <w:r>
         <w:rPr>
@@ -10213,7 +10215,7 @@
     <w:tbl>
       <w:tblPr>
         <w:tblStyle w:val="ab"/>
-        <w:tblW w:w="0" w:type="auto"/>
+        <w:tblW w:w="9020" w:type="dxa"/>
         <w:jc w:val="center"/>
         <w:tblLook w:val="04A0" w:firstRow="1" w:lastRow="0" w:firstColumn="1" w:lastColumn="0" w:noHBand="0" w:noVBand="1"/>
       </w:tblPr>
@@ -10221,8 +10223,8 @@
         <w:gridCol w:w="1136"/>
         <w:gridCol w:w="1223"/>
         <w:gridCol w:w="917"/>
-        <w:gridCol w:w="1686"/>
-        <w:gridCol w:w="1932"/>
+        <w:gridCol w:w="1922"/>
+        <w:gridCol w:w="3822"/>
       </w:tblGrid>
       <w:tr>
         <w:trPr>
@@ -10247,7 +10249,7 @@
         </w:tc>
         <w:tc>
           <w:tcPr>
-            <w:tcW w:w="1686" w:type="dxa"/>
+            <w:tcW w:w="1922" w:type="dxa"/>
             <w:shd w:val="clear" w:color="auto" w:fill="00B050"/>
           </w:tcPr>
           <w:p>
@@ -10272,7 +10274,7 @@
         </w:tc>
         <w:tc>
           <w:tcPr>
-            <w:tcW w:w="1932" w:type="dxa"/>
+            <w:tcW w:w="3822" w:type="dxa"/>
             <w:shd w:val="clear" w:color="auto" w:fill="00B050"/>
           </w:tcPr>
           <w:p>
@@ -10313,7 +10315,19 @@
               <w:rPr>
                 <w:rFonts w:eastAsiaTheme="minorEastAsia"/>
               </w:rPr>
-              <w:t>rb req</w:t>
+              <w:t>rb</w:t>
+            </w:r>
+            <w:r>
+              <w:rPr>
+                <w:rFonts w:eastAsiaTheme="minorEastAsia"/>
+              </w:rPr>
+              <w:t>iter</w:t>
+            </w:r>
+            <w:r>
+              <w:rPr>
+                <w:rFonts w:eastAsiaTheme="minorEastAsia"/>
+              </w:rPr>
+              <w:t xml:space="preserve"> req</w:t>
             </w:r>
           </w:p>
         </w:tc>
@@ -10339,7 +10353,7 @@
         </w:tc>
         <w:tc>
           <w:tcPr>
-            <w:tcW w:w="1686" w:type="dxa"/>
+            <w:tcW w:w="1922" w:type="dxa"/>
           </w:tcPr>
           <w:p>
             <w:pPr>
@@ -10357,9 +10371,21 @@
         </w:tc>
         <w:tc>
           <w:tcPr>
-            <w:tcW w:w="1932" w:type="dxa"/>
-          </w:tcPr>
-          <w:p/>
+            <w:tcW w:w="3822" w:type="dxa"/>
+          </w:tcPr>
+          <w:p>
+            <w:pPr>
+              <w:rPr>
+                <w:rFonts w:eastAsiaTheme="minorEastAsia" w:hint="eastAsia"/>
+              </w:rPr>
+            </w:pPr>
+            <w:r>
+              <w:rPr>
+                <w:rFonts w:eastAsiaTheme="minorEastAsia"/>
+              </w:rPr>
+              <w:t>Valid signal</w:t>
+            </w:r>
+          </w:p>
         </w:tc>
       </w:tr>
       <w:tr>
@@ -10395,7 +10421,7 @@
         </w:tc>
         <w:tc>
           <w:tcPr>
-            <w:tcW w:w="1686" w:type="dxa"/>
+            <w:tcW w:w="1922" w:type="dxa"/>
           </w:tcPr>
           <w:p>
             <w:pPr>
@@ -10413,9 +10439,21 @@
         </w:tc>
         <w:tc>
           <w:tcPr>
-            <w:tcW w:w="1932" w:type="dxa"/>
-          </w:tcPr>
-          <w:p/>
+            <w:tcW w:w="3822" w:type="dxa"/>
+          </w:tcPr>
+          <w:p>
+            <w:pPr>
+              <w:rPr>
+                <w:rFonts w:eastAsiaTheme="minorEastAsia" w:hint="eastAsia"/>
+              </w:rPr>
+            </w:pPr>
+            <w:r>
+              <w:rPr>
+                <w:rFonts w:eastAsiaTheme="minorEastAsia"/>
+              </w:rPr>
+              <w:t>Ready signal</w:t>
+            </w:r>
+          </w:p>
         </w:tc>
       </w:tr>
       <w:tr>
@@ -10450,7 +10488,7 @@
               <w:rPr>
                 <w:rFonts w:eastAsiaTheme="minorEastAsia"/>
               </w:rPr>
-              <w:t>layload</w:t>
+              <w:t>ayload</w:t>
             </w:r>
           </w:p>
         </w:tc>
@@ -10475,15 +10513,45 @@
         </w:tc>
         <w:tc>
           <w:tcPr>
-            <w:tcW w:w="1686" w:type="dxa"/>
-          </w:tcPr>
-          <w:p/>
-        </w:tc>
-        <w:tc>
-          <w:tcPr>
-            <w:tcW w:w="1932" w:type="dxa"/>
-          </w:tcPr>
-          <w:p/>
+            <w:tcW w:w="1922" w:type="dxa"/>
+          </w:tcPr>
+          <w:p>
+            <w:pPr>
+              <w:rPr>
+                <w:rFonts w:eastAsiaTheme="minorEastAsia" w:hint="eastAsia"/>
+              </w:rPr>
+            </w:pPr>
+            <w:r>
+              <w:rPr>
+                <w:rFonts w:eastAsiaTheme="minorEastAsia"/>
+              </w:rPr>
+              <w:t>Configurable</w:t>
+            </w:r>
+          </w:p>
+        </w:tc>
+        <w:tc>
+          <w:tcPr>
+            <w:tcW w:w="3822" w:type="dxa"/>
+          </w:tcPr>
+          <w:p>
+            <w:pPr>
+              <w:rPr>
+                <w:rFonts w:eastAsiaTheme="minorEastAsia" w:hint="eastAsia"/>
+              </w:rPr>
+            </w:pPr>
+            <w:r>
+              <w:rPr>
+                <w:rFonts w:eastAsiaTheme="minorEastAsia" w:hint="eastAsia"/>
+              </w:rPr>
+              <w:t>A</w:t>
+            </w:r>
+            <w:r>
+              <w:rPr>
+                <w:rFonts w:eastAsiaTheme="minorEastAsia"/>
+              </w:rPr>
+              <w:t>XI id</w:t>
+            </w:r>
+          </w:p>
         </w:tc>
       </w:tr>
       <w:tr>
@@ -10531,7 +10599,7 @@
         </w:tc>
         <w:tc>
           <w:tcPr>
-            <w:tcW w:w="1686" w:type="dxa"/>
+            <w:tcW w:w="1922" w:type="dxa"/>
           </w:tcPr>
           <w:p>
             <w:pPr>
@@ -10555,9 +10623,27 @@
         </w:tc>
         <w:tc>
           <w:tcPr>
-            <w:tcW w:w="1932" w:type="dxa"/>
-          </w:tcPr>
-          <w:p/>
+            <w:tcW w:w="3822" w:type="dxa"/>
+          </w:tcPr>
+          <w:p>
+            <w:pPr>
+              <w:rPr>
+                <w:rFonts w:eastAsiaTheme="minorEastAsia" w:hint="eastAsia"/>
+              </w:rPr>
+            </w:pPr>
+            <w:r>
+              <w:rPr>
+                <w:rFonts w:eastAsiaTheme="minorEastAsia" w:hint="eastAsia"/>
+              </w:rPr>
+              <w:t>A</w:t>
+            </w:r>
+            <w:r>
+              <w:rPr>
+                <w:rFonts w:eastAsiaTheme="minorEastAsia"/>
+              </w:rPr>
+              <w:t>XI address</w:t>
+            </w:r>
+          </w:p>
         </w:tc>
       </w:tr>
       <w:tr>
@@ -10605,7 +10691,7 @@
         </w:tc>
         <w:tc>
           <w:tcPr>
-            <w:tcW w:w="1686" w:type="dxa"/>
+            <w:tcW w:w="1922" w:type="dxa"/>
           </w:tcPr>
           <w:p>
             <w:pPr>
@@ -10623,7 +10709,7 @@
         </w:tc>
         <w:tc>
           <w:tcPr>
-            <w:tcW w:w="1932" w:type="dxa"/>
+            <w:tcW w:w="3822" w:type="dxa"/>
           </w:tcPr>
           <w:p>
             <w:pPr>
@@ -10642,6 +10728,12 @@
                 <w:rFonts w:eastAsiaTheme="minorEastAsia" w:hint="eastAsia"/>
               </w:rPr>
               <w:t>transfer</w:t>
+            </w:r>
+            <w:r>
+              <w:rPr>
+                <w:rFonts w:eastAsiaTheme="minorEastAsia"/>
+              </w:rPr>
+              <w:t xml:space="preserve"> flag</w:t>
             </w:r>
           </w:p>
         </w:tc>
@@ -10691,7 +10783,7 @@
         </w:tc>
         <w:tc>
           <w:tcPr>
-            <w:tcW w:w="1686" w:type="dxa"/>
+            <w:tcW w:w="1922" w:type="dxa"/>
           </w:tcPr>
           <w:p>
             <w:pPr>
@@ -10709,7 +10801,7 @@
         </w:tc>
         <w:tc>
           <w:tcPr>
-            <w:tcW w:w="1932" w:type="dxa"/>
+            <w:tcW w:w="3822" w:type="dxa"/>
           </w:tcPr>
           <w:p>
             <w:pPr>
@@ -10721,7 +10813,19 @@
               <w:rPr>
                 <w:rFonts w:eastAsiaTheme="minorEastAsia"/>
               </w:rPr>
-              <w:t>Read or write transaction</w:t>
+              <w:t>0: r</w:t>
+            </w:r>
+            <w:r>
+              <w:rPr>
+                <w:rFonts w:eastAsiaTheme="minorEastAsia"/>
+              </w:rPr>
+              <w:t>ead</w:t>
+            </w:r>
+            <w:r>
+              <w:rPr>
+                <w:rFonts w:eastAsiaTheme="minorEastAsia"/>
+              </w:rPr>
+              <w:t>; 1: write</w:t>
             </w:r>
           </w:p>
         </w:tc>
@@ -10771,7 +10875,7 @@
         </w:tc>
         <w:tc>
           <w:tcPr>
-            <w:tcW w:w="1686" w:type="dxa"/>
+            <w:tcW w:w="1922" w:type="dxa"/>
           </w:tcPr>
           <w:p>
             <w:pPr>
@@ -10789,9 +10893,33 @@
         </w:tc>
         <w:tc>
           <w:tcPr>
-            <w:tcW w:w="1932" w:type="dxa"/>
-          </w:tcPr>
-          <w:p/>
+            <w:tcW w:w="3822" w:type="dxa"/>
+          </w:tcPr>
+          <w:p>
+            <w:pPr>
+              <w:rPr>
+                <w:rFonts w:eastAsiaTheme="minorEastAsia" w:hint="eastAsia"/>
+              </w:rPr>
+            </w:pPr>
+            <w:r>
+              <w:rPr>
+                <w:rFonts w:eastAsiaTheme="minorEastAsia"/>
+              </w:rPr>
+              <w:t>Read request of Write Handler</w:t>
+            </w:r>
+            <w:r>
+              <w:rPr>
+                <w:rFonts w:eastAsiaTheme="minorEastAsia"/>
+              </w:rPr>
+              <w:t xml:space="preserve">. </w:t>
+            </w:r>
+            <w:r>
+              <w:rPr>
+                <w:rFonts w:eastAsiaTheme="minorEastAsia"/>
+              </w:rPr>
+              <w:t>Reserved for AXI read transaction</w:t>
+            </w:r>
+          </w:p>
         </w:tc>
       </w:tr>
       <w:tr>
@@ -10839,7 +10967,7 @@
         </w:tc>
         <w:tc>
           <w:tcPr>
-            <w:tcW w:w="1686" w:type="dxa"/>
+            <w:tcW w:w="1922" w:type="dxa"/>
           </w:tcPr>
           <w:p>
             <w:pPr>
@@ -10847,13 +10975,31 @@
                 <w:rFonts w:eastAsiaTheme="minorEastAsia"/>
               </w:rPr>
             </w:pPr>
+            <w:r>
+              <w:rPr>
+                <w:rFonts w:eastAsiaTheme="minorEastAsia"/>
+              </w:rPr>
+              <w:t>Consistent with bus width</w:t>
+            </w:r>
           </w:p>
         </w:tc>
         <w:tc>
           <w:tcPr>
-            <w:tcW w:w="1932" w:type="dxa"/>
-          </w:tcPr>
-          <w:p/>
+            <w:tcW w:w="3822" w:type="dxa"/>
+          </w:tcPr>
+          <w:p>
+            <w:pPr>
+              <w:rPr>
+                <w:rFonts w:eastAsiaTheme="minorEastAsia" w:hint="eastAsia"/>
+              </w:rPr>
+            </w:pPr>
+            <w:r>
+              <w:rPr>
+                <w:rFonts w:eastAsiaTheme="minorEastAsia"/>
+              </w:rPr>
+              <w:t>Write data. Reserved for AXI read transaction</w:t>
+            </w:r>
+          </w:p>
         </w:tc>
       </w:tr>
       <w:tr>
@@ -10863,24 +11009,38 @@
         <w:tc>
           <w:tcPr>
             <w:tcW w:w="1136" w:type="dxa"/>
-          </w:tcPr>
-          <w:p/>
-        </w:tc>
-        <w:tc>
-          <w:tcPr>
-            <w:tcW w:w="1223" w:type="dxa"/>
-          </w:tcPr>
-          <w:p/>
-        </w:tc>
-        <w:tc>
-          <w:tcPr>
-            <w:tcW w:w="917" w:type="dxa"/>
+            <w:vMerge w:val="restart"/>
           </w:tcPr>
           <w:p>
             <w:pPr>
               <w:rPr>
+                <w:rFonts w:eastAsiaTheme="minorEastAsia" w:hint="eastAsia"/>
+              </w:rPr>
+            </w:pPr>
+            <w:r>
+              <w:rPr>
+                <w:rFonts w:eastAsiaTheme="minorEastAsia" w:hint="eastAsia"/>
+              </w:rPr>
+              <w:t>D</w:t>
+            </w:r>
+            <w:r>
+              <w:rPr>
                 <w:rFonts w:eastAsiaTheme="minorEastAsia"/>
               </w:rPr>
+              <w:t>ecoder rsp</w:t>
+            </w:r>
+          </w:p>
+        </w:tc>
+        <w:tc>
+          <w:tcPr>
+            <w:tcW w:w="2140" w:type="dxa"/>
+            <w:gridSpan w:val="2"/>
+          </w:tcPr>
+          <w:p>
+            <w:pPr>
+              <w:rPr>
+                <w:rFonts w:eastAsiaTheme="minorEastAsia"/>
+              </w:rPr>
             </w:pPr>
             <w:r>
               <w:rPr>
@@ -10898,15 +11058,34 @@
         </w:tc>
         <w:tc>
           <w:tcPr>
-            <w:tcW w:w="1686" w:type="dxa"/>
-          </w:tcPr>
-          <w:p/>
-        </w:tc>
-        <w:tc>
-          <w:tcPr>
-            <w:tcW w:w="1932" w:type="dxa"/>
-          </w:tcPr>
-          <w:p/>
+            <w:tcW w:w="1922" w:type="dxa"/>
+          </w:tcPr>
+          <w:p>
+            <w:pPr>
+              <w:rPr>
+                <w:rFonts w:eastAsiaTheme="minorEastAsia" w:hint="eastAsia"/>
+              </w:rPr>
+            </w:pPr>
+            <w:r>
+              <w:rPr>
+                <w:rFonts w:eastAsiaTheme="minorEastAsia" w:hint="eastAsia"/>
+              </w:rPr>
+              <w:t>1</w:t>
+            </w:r>
+          </w:p>
+        </w:tc>
+        <w:tc>
+          <w:tcPr>
+            <w:tcW w:w="3822" w:type="dxa"/>
+          </w:tcPr>
+          <w:p>
+            <w:r>
+              <w:rPr>
+                <w:rFonts w:eastAsiaTheme="minorEastAsia"/>
+              </w:rPr>
+              <w:t>Valid signal</w:t>
+            </w:r>
+          </w:p>
         </w:tc>
       </w:tr>
       <w:tr>
@@ -10916,32 +11095,54 @@
         <w:tc>
           <w:tcPr>
             <w:tcW w:w="1136" w:type="dxa"/>
+            <w:vMerge/>
           </w:tcPr>
           <w:p/>
         </w:tc>
         <w:tc>
           <w:tcPr>
-            <w:tcW w:w="1223" w:type="dxa"/>
-          </w:tcPr>
-          <w:p/>
-        </w:tc>
-        <w:tc>
-          <w:tcPr>
-            <w:tcW w:w="917" w:type="dxa"/>
-          </w:tcPr>
-          <w:p/>
-        </w:tc>
-        <w:tc>
-          <w:tcPr>
-            <w:tcW w:w="1686" w:type="dxa"/>
-          </w:tcPr>
-          <w:p/>
-        </w:tc>
-        <w:tc>
-          <w:tcPr>
-            <w:tcW w:w="1932" w:type="dxa"/>
-          </w:tcPr>
-          <w:p/>
+            <w:tcW w:w="2140" w:type="dxa"/>
+            <w:gridSpan w:val="2"/>
+          </w:tcPr>
+          <w:p>
+            <w:r>
+              <w:rPr>
+                <w:rFonts w:eastAsiaTheme="minorEastAsia" w:hint="eastAsia"/>
+              </w:rPr>
+              <w:t>Rdy</w:t>
+            </w:r>
+          </w:p>
+        </w:tc>
+        <w:tc>
+          <w:tcPr>
+            <w:tcW w:w="1922" w:type="dxa"/>
+          </w:tcPr>
+          <w:p>
+            <w:pPr>
+              <w:rPr>
+                <w:rFonts w:eastAsiaTheme="minorEastAsia" w:hint="eastAsia"/>
+              </w:rPr>
+            </w:pPr>
+            <w:r>
+              <w:rPr>
+                <w:rFonts w:eastAsiaTheme="minorEastAsia" w:hint="eastAsia"/>
+              </w:rPr>
+              <w:t>1</w:t>
+            </w:r>
+          </w:p>
+        </w:tc>
+        <w:tc>
+          <w:tcPr>
+            <w:tcW w:w="3822" w:type="dxa"/>
+          </w:tcPr>
+          <w:p>
+            <w:r>
+              <w:rPr>
+                <w:rFonts w:eastAsiaTheme="minorEastAsia"/>
+              </w:rPr>
+              <w:t>Ready signal</w:t>
+            </w:r>
+          </w:p>
         </w:tc>
       </w:tr>
       <w:tr>
@@ -10951,32 +11152,90 @@
         <w:tc>
           <w:tcPr>
             <w:tcW w:w="1136" w:type="dxa"/>
+            <w:vMerge/>
           </w:tcPr>
           <w:p/>
         </w:tc>
         <w:tc>
           <w:tcPr>
             <w:tcW w:w="1223" w:type="dxa"/>
-          </w:tcPr>
-          <w:p/>
+            <w:vMerge w:val="restart"/>
+          </w:tcPr>
+          <w:p>
+            <w:pPr>
+              <w:rPr>
+                <w:rFonts w:eastAsiaTheme="minorEastAsia" w:hint="eastAsia"/>
+              </w:rPr>
+            </w:pPr>
+            <w:r>
+              <w:rPr>
+                <w:rFonts w:eastAsiaTheme="minorEastAsia" w:hint="eastAsia"/>
+              </w:rPr>
+              <w:t>p</w:t>
+            </w:r>
+            <w:r>
+              <w:rPr>
+                <w:rFonts w:eastAsiaTheme="minorEastAsia"/>
+              </w:rPr>
+              <w:t>ayload</w:t>
+            </w:r>
+          </w:p>
         </w:tc>
         <w:tc>
           <w:tcPr>
             <w:tcW w:w="917" w:type="dxa"/>
           </w:tcPr>
-          <w:p/>
-        </w:tc>
-        <w:tc>
-          <w:tcPr>
-            <w:tcW w:w="1686" w:type="dxa"/>
-          </w:tcPr>
-          <w:p/>
-        </w:tc>
-        <w:tc>
-          <w:tcPr>
-            <w:tcW w:w="1932" w:type="dxa"/>
-          </w:tcPr>
-          <w:p/>
+          <w:p>
+            <w:pPr>
+              <w:rPr>
+                <w:rFonts w:eastAsiaTheme="minorEastAsia" w:hint="eastAsia"/>
+              </w:rPr>
+            </w:pPr>
+            <w:r>
+              <w:rPr>
+                <w:rFonts w:eastAsiaTheme="minorEastAsia" w:hint="eastAsia"/>
+              </w:rPr>
+              <w:t>A</w:t>
+            </w:r>
+            <w:r>
+              <w:rPr>
+                <w:rFonts w:eastAsiaTheme="minorEastAsia"/>
+              </w:rPr>
+              <w:t>xid</w:t>
+            </w:r>
+          </w:p>
+        </w:tc>
+        <w:tc>
+          <w:tcPr>
+            <w:tcW w:w="1922" w:type="dxa"/>
+          </w:tcPr>
+          <w:p>
+            <w:r>
+              <w:rPr>
+                <w:rFonts w:eastAsiaTheme="minorEastAsia"/>
+              </w:rPr>
+              <w:t>Configurable</w:t>
+            </w:r>
+          </w:p>
+        </w:tc>
+        <w:tc>
+          <w:tcPr>
+            <w:tcW w:w="3822" w:type="dxa"/>
+          </w:tcPr>
+          <w:p>
+            <w:r>
+              <w:rPr>
+                <w:rFonts w:eastAsiaTheme="minorEastAsia" w:hint="eastAsia"/>
+              </w:rPr>
+              <w:t>A</w:t>
+            </w:r>
+            <w:r>
+              <w:rPr>
+                <w:rFonts w:eastAsiaTheme="minorEastAsia"/>
+              </w:rPr>
+              <w:t>XI id</w:t>
+            </w:r>
+          </w:p>
         </w:tc>
       </w:tr>
       <w:tr>
@@ -10986,12 +11245,14 @@
         <w:tc>
           <w:tcPr>
             <w:tcW w:w="1136" w:type="dxa"/>
+            <w:vMerge/>
           </w:tcPr>
           <w:p/>
         </w:tc>
         <w:tc>
           <w:tcPr>
             <w:tcW w:w="1223" w:type="dxa"/>
+            <w:vMerge/>
           </w:tcPr>
           <w:p/>
         </w:tc>
@@ -10999,19 +11260,86 @@
           <w:tcPr>
             <w:tcW w:w="917" w:type="dxa"/>
           </w:tcPr>
-          <w:p/>
-        </w:tc>
-        <w:tc>
-          <w:tcPr>
-            <w:tcW w:w="1686" w:type="dxa"/>
-          </w:tcPr>
-          <w:p/>
-        </w:tc>
-        <w:tc>
-          <w:tcPr>
-            <w:tcW w:w="1932" w:type="dxa"/>
-          </w:tcPr>
-          <w:p/>
+          <w:p>
+            <w:pPr>
+              <w:rPr>
+                <w:rFonts w:eastAsiaTheme="minorEastAsia" w:hint="eastAsia"/>
+              </w:rPr>
+            </w:pPr>
+            <w:r>
+              <w:rPr>
+                <w:rFonts w:eastAsiaTheme="minorEastAsia" w:hint="eastAsia"/>
+              </w:rPr>
+              <w:t>L</w:t>
+            </w:r>
+            <w:r>
+              <w:rPr>
+                <w:rFonts w:eastAsiaTheme="minorEastAsia"/>
+              </w:rPr>
+              <w:t>ast</w:t>
+            </w:r>
+          </w:p>
+        </w:tc>
+        <w:tc>
+          <w:tcPr>
+            <w:tcW w:w="1922" w:type="dxa"/>
+          </w:tcPr>
+          <w:p>
+            <w:pPr>
+              <w:rPr>
+                <w:rFonts w:eastAsiaTheme="minorEastAsia" w:hint="eastAsia"/>
+              </w:rPr>
+            </w:pPr>
+            <w:r>
+              <w:rPr>
+                <w:rFonts w:eastAsiaTheme="minorEastAsia" w:hint="eastAsia"/>
+              </w:rPr>
+              <w:t>1</w:t>
+            </w:r>
+          </w:p>
+        </w:tc>
+        <w:tc>
+          <w:tcPr>
+            <w:tcW w:w="3822" w:type="dxa"/>
+          </w:tcPr>
+          <w:p>
+            <w:r>
+              <w:rPr>
+                <w:rFonts w:eastAsiaTheme="minorEastAsia"/>
+              </w:rPr>
+              <w:t xml:space="preserve">Last burst </w:t>
+            </w:r>
+            <w:r>
+              <w:rPr>
+                <w:rFonts w:eastAsiaTheme="minorEastAsia" w:hint="eastAsia"/>
+              </w:rPr>
+              <w:t>transfer</w:t>
+            </w:r>
+            <w:r>
+              <w:rPr>
+                <w:rFonts w:eastAsiaTheme="minorEastAsia"/>
+              </w:rPr>
+              <w:t xml:space="preserve"> </w:t>
+            </w:r>
+            <w:r>
+              <w:rPr>
+                <w:rFonts w:eastAsiaTheme="minorEastAsia" w:hint="eastAsia"/>
+              </w:rPr>
+              <w:t>response</w:t>
+            </w:r>
+            <w:r>
+              <w:rPr>
+                <w:rFonts w:eastAsiaTheme="minorEastAsia"/>
+              </w:rPr>
+              <w:t xml:space="preserve"> </w:t>
+            </w:r>
+            <w:r>
+              <w:rPr>
+                <w:rFonts w:eastAsiaTheme="minorEastAsia"/>
+              </w:rPr>
+              <w:t>flag</w:t>
+            </w:r>
+          </w:p>
         </w:tc>
       </w:tr>
       <w:tr>
@@ -11021,12 +11349,14 @@
         <w:tc>
           <w:tcPr>
             <w:tcW w:w="1136" w:type="dxa"/>
+            <w:vMerge/>
           </w:tcPr>
           <w:p/>
         </w:tc>
         <w:tc>
           <w:tcPr>
             <w:tcW w:w="1223" w:type="dxa"/>
+            <w:vMerge/>
           </w:tcPr>
           <w:p/>
         </w:tc>
@@ -11034,19 +11364,56 @@
           <w:tcPr>
             <w:tcW w:w="917" w:type="dxa"/>
           </w:tcPr>
-          <w:p/>
-        </w:tc>
-        <w:tc>
-          <w:tcPr>
-            <w:tcW w:w="1686" w:type="dxa"/>
-          </w:tcPr>
-          <w:p/>
-        </w:tc>
-        <w:tc>
-          <w:tcPr>
-            <w:tcW w:w="1932" w:type="dxa"/>
-          </w:tcPr>
-          <w:p/>
+          <w:p>
+            <w:pPr>
+              <w:rPr>
+                <w:rFonts w:eastAsiaTheme="minorEastAsia" w:hint="eastAsia"/>
+              </w:rPr>
+            </w:pPr>
+            <w:r>
+              <w:rPr>
+                <w:rFonts w:eastAsiaTheme="minorEastAsia" w:hint="eastAsia"/>
+              </w:rPr>
+              <w:t>R</w:t>
+            </w:r>
+            <w:r>
+              <w:rPr>
+                <w:rFonts w:eastAsiaTheme="minorEastAsia"/>
+              </w:rPr>
+              <w:t>W</w:t>
+            </w:r>
+          </w:p>
+        </w:tc>
+        <w:tc>
+          <w:tcPr>
+            <w:tcW w:w="1922" w:type="dxa"/>
+          </w:tcPr>
+          <w:p>
+            <w:pPr>
+              <w:rPr>
+                <w:rFonts w:eastAsiaTheme="minorEastAsia" w:hint="eastAsia"/>
+              </w:rPr>
+            </w:pPr>
+            <w:r>
+              <w:rPr>
+                <w:rFonts w:eastAsiaTheme="minorEastAsia" w:hint="eastAsia"/>
+              </w:rPr>
+              <w:t>1</w:t>
+            </w:r>
+          </w:p>
+        </w:tc>
+        <w:tc>
+          <w:tcPr>
+            <w:tcW w:w="3822" w:type="dxa"/>
+          </w:tcPr>
+          <w:p>
+            <w:r>
+              <w:rPr>
+                <w:rFonts w:eastAsiaTheme="minorEastAsia"/>
+              </w:rPr>
+              <w:t>0: read; 1: write</w:t>
+            </w:r>
+          </w:p>
         </w:tc>
       </w:tr>
       <w:tr>
@@ -11056,12 +11423,14 @@
         <w:tc>
           <w:tcPr>
             <w:tcW w:w="1136" w:type="dxa"/>
+            <w:vMerge/>
           </w:tcPr>
           <w:p/>
         </w:tc>
         <w:tc>
           <w:tcPr>
             <w:tcW w:w="1223" w:type="dxa"/>
+            <w:vMerge/>
           </w:tcPr>
           <w:p/>
         </w:tc>
@@ -11069,19 +11438,158 @@
           <w:tcPr>
             <w:tcW w:w="917" w:type="dxa"/>
           </w:tcPr>
+          <w:p>
+            <w:pPr>
+              <w:rPr>
+                <w:rFonts w:eastAsiaTheme="minorEastAsia" w:hint="eastAsia"/>
+              </w:rPr>
+            </w:pPr>
+            <w:r>
+              <w:rPr>
+                <w:rFonts w:eastAsiaTheme="minorEastAsia" w:hint="eastAsia"/>
+              </w:rPr>
+              <w:t>R</w:t>
+            </w:r>
+            <w:r>
+              <w:rPr>
+                <w:rFonts w:eastAsiaTheme="minorEastAsia"/>
+              </w:rPr>
+              <w:t>mw</w:t>
+            </w:r>
+          </w:p>
+        </w:tc>
+        <w:tc>
+          <w:tcPr>
+            <w:tcW w:w="1922" w:type="dxa"/>
+          </w:tcPr>
+          <w:p>
+            <w:pPr>
+              <w:rPr>
+                <w:rFonts w:eastAsiaTheme="minorEastAsia" w:hint="eastAsia"/>
+              </w:rPr>
+            </w:pPr>
+            <w:r>
+              <w:rPr>
+                <w:rFonts w:eastAsiaTheme="minorEastAsia" w:hint="eastAsia"/>
+              </w:rPr>
+              <w:t>1</w:t>
+            </w:r>
+          </w:p>
+        </w:tc>
+        <w:tc>
+          <w:tcPr>
+            <w:tcW w:w="3822" w:type="dxa"/>
+          </w:tcPr>
+          <w:p>
+            <w:r>
+              <w:rPr>
+                <w:rFonts w:eastAsiaTheme="minorEastAsia"/>
+              </w:rPr>
+              <w:t>Read request of Write Handler. Reserved for AXI read transaction</w:t>
+            </w:r>
+          </w:p>
+        </w:tc>
+      </w:tr>
+      <w:tr>
+        <w:trPr>
+          <w:jc w:val="center"/>
+        </w:trPr>
+        <w:tc>
+          <w:tcPr>
+            <w:tcW w:w="1136" w:type="dxa"/>
+            <w:vMerge/>
+          </w:tcPr>
           <w:p/>
         </w:tc>
         <w:tc>
           <w:tcPr>
-            <w:tcW w:w="1686" w:type="dxa"/>
+            <w:tcW w:w="1223" w:type="dxa"/>
+            <w:vMerge/>
           </w:tcPr>
           <w:p/>
         </w:tc>
         <w:tc>
           <w:tcPr>
-            <w:tcW w:w="1932" w:type="dxa"/>
-          </w:tcPr>
-          <w:p/>
+            <w:tcW w:w="917" w:type="dxa"/>
+          </w:tcPr>
+          <w:p>
+            <w:pPr>
+              <w:rPr>
+                <w:rFonts w:eastAsiaTheme="minorEastAsia" w:hint="eastAsia"/>
+              </w:rPr>
+            </w:pPr>
+            <w:r>
+              <w:rPr>
+                <w:rFonts w:eastAsiaTheme="minorEastAsia" w:hint="eastAsia"/>
+              </w:rPr>
+              <w:t>D</w:t>
+            </w:r>
+            <w:r>
+              <w:rPr>
+                <w:rFonts w:eastAsiaTheme="minorEastAsia"/>
+              </w:rPr>
+              <w:t>ata</w:t>
+            </w:r>
+          </w:p>
+        </w:tc>
+        <w:tc>
+          <w:tcPr>
+            <w:tcW w:w="1922" w:type="dxa"/>
+          </w:tcPr>
+          <w:p>
+            <w:r>
+              <w:rPr>
+                <w:rFonts w:eastAsiaTheme="minorEastAsia"/>
+              </w:rPr>
+              <w:t xml:space="preserve">Consistent with </w:t>
+            </w:r>
+            <w:r>
+              <w:rPr>
+                <w:rFonts w:eastAsiaTheme="minorEastAsia"/>
+              </w:rPr>
+              <w:lastRenderedPageBreak/>
+              <w:t>bus width</w:t>
+            </w:r>
+          </w:p>
+        </w:tc>
+        <w:tc>
+          <w:tcPr>
+            <w:tcW w:w="3822" w:type="dxa"/>
+          </w:tcPr>
+          <w:p>
+            <w:r>
+              <w:rPr>
+                <w:rFonts w:eastAsiaTheme="minorEastAsia" w:hint="eastAsia"/>
+              </w:rPr>
+              <w:lastRenderedPageBreak/>
+              <w:t>Read</w:t>
+            </w:r>
+            <w:r>
+              <w:rPr>
+                <w:rFonts w:eastAsiaTheme="minorEastAsia"/>
+              </w:rPr>
+              <w:t xml:space="preserve"> data. Reserved for AXI </w:t>
+            </w:r>
+            <w:r>
+              <w:rPr>
+                <w:rFonts w:eastAsiaTheme="minorEastAsia"/>
+              </w:rPr>
+              <w:t>write</w:t>
+            </w:r>
+            <w:r>
+              <w:rPr>
+                <w:rFonts w:eastAsiaTheme="minorEastAsia"/>
+              </w:rPr>
+              <w:t xml:space="preserve"> </w:t>
+            </w:r>
+            <w:r>
+              <w:rPr>
+                <w:rFonts w:eastAsiaTheme="minorEastAsia"/>
+              </w:rPr>
+              <w:lastRenderedPageBreak/>
+              <w:t>transaction</w:t>
+            </w:r>
+          </w:p>
         </w:tc>
       </w:tr>
     </w:tbl>
@@ -11089,9 +11597,10 @@
       <w:pPr>
         <w:pStyle w:val="ac"/>
       </w:pPr>
-      <w:bookmarkStart w:id="26" w:name="_Ref142387546"/>
-      <w:bookmarkStart w:id="27" w:name="_Ref142387540"/>
-      <w:r>
+      <w:bookmarkStart w:id="27" w:name="_Ref142387546"/>
+      <w:bookmarkStart w:id="28" w:name="_Ref142387540"/>
+      <w:r>
+        <w:lastRenderedPageBreak/>
         <w:t xml:space="preserve">Table </w:t>
       </w:r>
       <w:fldSimple w:instr=" STYLEREF 1 \s ">
@@ -11113,17 +11622,217 @@
           <w:t>1</w:t>
         </w:r>
       </w:fldSimple>
-      <w:bookmarkEnd w:id="26"/>
+      <w:bookmarkEnd w:id="27"/>
       <w:r>
         <w:t xml:space="preserve"> Request/Response Format of </w:t>
       </w:r>
       <w:r>
         <w:t>Arbiter/Decoder</w:t>
       </w:r>
-      <w:bookmarkEnd w:id="27"/>
-    </w:p>
-    <w:p>
-      <w:pPr>
+      <w:bookmarkEnd w:id="28"/>
+    </w:p>
+    <w:p>
+      <w:pPr>
+        <w:rPr>
+          <w:rFonts w:eastAsiaTheme="minorEastAsia" w:hint="eastAsia"/>
+        </w:rPr>
+      </w:pPr>
+      <w:r>
+        <w:rPr>
+          <w:rFonts w:eastAsiaTheme="minorEastAsia"/>
+        </w:rPr>
+        <w:t xml:space="preserve">Transfer split </w:t>
+      </w:r>
+      <w:r>
+        <w:rPr>
+          <w:rFonts w:eastAsiaTheme="minorEastAsia"/>
+        </w:rPr>
+        <w:t xml:space="preserve">supports the burst type split specified in the </w:t>
+      </w:r>
+      <w:r>
+        <w:rPr>
+          <w:rFonts w:eastAsiaTheme="minorEastAsia"/>
+        </w:rPr>
+        <w:t>AXI</w:t>
+      </w:r>
+      <w:r>
+        <w:rPr>
+          <w:rFonts w:eastAsiaTheme="minorEastAsia"/>
+        </w:rPr>
+        <w:t>4 protocol, and the burst length supports a maximum of 16.</w:t>
+      </w:r>
+      <w:r>
+        <w:rPr>
+          <w:rFonts w:eastAsiaTheme="minorEastAsia"/>
+        </w:rPr>
+        <w:t xml:space="preserve"> </w:t>
+      </w:r>
+      <w:r>
+        <w:rPr>
+          <w:rFonts w:eastAsiaTheme="minorEastAsia"/>
+        </w:rPr>
+        <w:t xml:space="preserve">To simplify the design, it does not support out-of-order reading, that is to say, the Rrsp </w:t>
+      </w:r>
+      <w:r>
+        <w:rPr>
+          <w:rFonts w:eastAsiaTheme="minorEastAsia"/>
+        </w:rPr>
+        <w:t>g</w:t>
+      </w:r>
+      <w:r>
+        <w:rPr>
+          <w:rFonts w:eastAsiaTheme="minorEastAsia"/>
+        </w:rPr>
+        <w:t>en will reply the read data in order, and use the field</w:t>
+      </w:r>
+      <w:r>
+        <w:rPr>
+          <w:rFonts w:eastAsiaTheme="minorEastAsia"/>
+        </w:rPr>
+        <w:t xml:space="preserve"> </w:t>
+      </w:r>
+      <w:r>
+        <w:rPr>
+          <w:rFonts w:eastAsiaTheme="minorEastAsia"/>
+        </w:rPr>
+        <w:t>‘</w:t>
+      </w:r>
+      <w:r>
+        <w:rPr>
+          <w:rFonts w:eastAsiaTheme="minorEastAsia"/>
+        </w:rPr>
+        <w:t>Last</w:t>
+      </w:r>
+      <w:r>
+        <w:rPr>
+          <w:rFonts w:eastAsiaTheme="minorEastAsia"/>
+        </w:rPr>
+        <w:t>’</w:t>
+      </w:r>
+      <w:r>
+        <w:rPr>
+          <w:rFonts w:eastAsiaTheme="minorEastAsia"/>
+        </w:rPr>
+        <w:t xml:space="preserve"> in </w:t>
+      </w:r>
+      <w:r>
+        <w:rPr>
+          <w:rFonts w:eastAsiaTheme="minorEastAsia"/>
+        </w:rPr>
+        <w:t>decoder response</w:t>
+      </w:r>
+      <w:r>
+        <w:rPr>
+          <w:rFonts w:eastAsiaTheme="minorEastAsia"/>
+        </w:rPr>
+        <w:t xml:space="preserve"> as the flag bit of the last data</w:t>
+      </w:r>
+      <w:r>
+        <w:rPr>
+          <w:rFonts w:eastAsiaTheme="minorEastAsia"/>
+        </w:rPr>
+        <w:t>.</w:t>
+      </w:r>
+      <w:r>
+        <w:rPr>
+          <w:rFonts w:eastAsiaTheme="minorEastAsia"/>
+        </w:rPr>
+        <w:t xml:space="preserve"> </w:t>
+      </w:r>
+      <w:r>
+        <w:rPr>
+          <w:rFonts w:eastAsiaTheme="minorEastAsia"/>
+        </w:rPr>
+        <w:t>A counter is used to record the read trans</w:t>
+      </w:r>
+      <w:r>
+        <w:rPr>
+          <w:rFonts w:eastAsiaTheme="minorEastAsia"/>
+        </w:rPr>
+        <w:t xml:space="preserve">action. The counter plus one for </w:t>
+      </w:r>
+      <w:r>
+        <w:rPr>
+          <w:rFonts w:eastAsiaTheme="minorEastAsia"/>
+        </w:rPr>
+        <w:t xml:space="preserve">the AR </w:t>
+      </w:r>
+      <w:r>
+        <w:rPr>
+          <w:rFonts w:eastAsiaTheme="minorEastAsia"/>
+        </w:rPr>
+        <w:t>FiFO receiving a transaction</w:t>
+      </w:r>
+      <w:r>
+        <w:rPr>
+          <w:rFonts w:eastAsiaTheme="minorEastAsia"/>
+        </w:rPr>
+        <w:t xml:space="preserve">, and </w:t>
+      </w:r>
+      <w:r>
+        <w:rPr>
+          <w:rFonts w:eastAsiaTheme="minorEastAsia"/>
+        </w:rPr>
+        <w:t xml:space="preserve">counter </w:t>
+      </w:r>
+      <w:r>
+        <w:rPr>
+          <w:rFonts w:eastAsiaTheme="minorEastAsia"/>
+        </w:rPr>
+        <w:t>minus</w:t>
+      </w:r>
+      <w:r>
+        <w:rPr>
+          <w:rFonts w:eastAsiaTheme="minorEastAsia"/>
+        </w:rPr>
+        <w:t xml:space="preserve"> one</w:t>
+      </w:r>
+      <w:r>
+        <w:rPr>
+          <w:rFonts w:eastAsiaTheme="minorEastAsia"/>
+        </w:rPr>
+        <w:t xml:space="preserve"> for the </w:t>
+      </w:r>
+      <w:r>
+        <w:rPr>
+          <w:rFonts w:eastAsiaTheme="minorEastAsia"/>
+        </w:rPr>
+        <w:t xml:space="preserve">Rrsp </w:t>
+      </w:r>
+      <w:r>
+        <w:rPr>
+          <w:rFonts w:eastAsiaTheme="minorEastAsia"/>
+        </w:rPr>
+        <w:t>g</w:t>
+      </w:r>
+      <w:r>
+        <w:rPr>
+          <w:rFonts w:eastAsiaTheme="minorEastAsia"/>
+        </w:rPr>
+        <w:t>en</w:t>
+      </w:r>
+      <w:r>
+        <w:rPr>
+          <w:rFonts w:eastAsiaTheme="minorEastAsia"/>
+        </w:rPr>
+        <w:t xml:space="preserve"> completing a</w:t>
+      </w:r>
+      <w:r>
+        <w:rPr>
+          <w:rFonts w:eastAsiaTheme="minorEastAsia"/>
+        </w:rPr>
+        <w:t>n</w:t>
+      </w:r>
+      <w:r>
+        <w:rPr>
+          <w:rFonts w:eastAsiaTheme="minorEastAsia"/>
+        </w:rPr>
+        <w:t xml:space="preserve"> AR request.</w:t>
+      </w:r>
+    </w:p>
+    <w:p>
+      <w:pPr>
+        <w:jc w:val="center"/>
         <w:rPr>
           <w:rFonts w:eastAsiaTheme="minorEastAsia"/>
         </w:rPr>
@@ -11132,12 +11841,11 @@
         <w:rPr>
           <w:noProof/>
         </w:rPr>
-        <w:lastRenderedPageBreak/>
         <w:drawing>
-          <wp:inline distT="0" distB="0" distL="0" distR="0" wp14:anchorId="7E976927" wp14:editId="2EE1DC7D">
-            <wp:extent cx="5479626" cy="1812898"/>
-            <wp:effectExtent l="0" t="0" r="6985" b="0"/>
-            <wp:docPr id="1479257711" name="图片 1"/>
+          <wp:inline distT="0" distB="0" distL="0" distR="0" wp14:anchorId="06D67584" wp14:editId="06D0FE83">
+            <wp:extent cx="5270500" cy="1747520"/>
+            <wp:effectExtent l="0" t="0" r="6350" b="5080"/>
+            <wp:docPr id="550201238" name="图片 1"/>
             <wp:cNvGraphicFramePr>
               <a:graphicFrameLocks xmlns:a="http://schemas.openxmlformats.org/drawingml/2006/main" noChangeAspect="1"/>
             </wp:cNvGraphicFramePr>
@@ -11145,7 +11853,7 @@
               <a:graphicData uri="http://schemas.openxmlformats.org/drawingml/2006/picture">
                 <pic:pic xmlns:pic="http://schemas.openxmlformats.org/drawingml/2006/picture">
                   <pic:nvPicPr>
-                    <pic:cNvPr id="1479257711" name=""/>
+                    <pic:cNvPr id="550201238" name=""/>
                     <pic:cNvPicPr/>
                   </pic:nvPicPr>
                   <pic:blipFill>
@@ -11157,7 +11865,7 @@
                   <pic:spPr>
                     <a:xfrm>
                       <a:off x="0" y="0"/>
-                      <a:ext cx="5483303" cy="1814114"/>
+                      <a:ext cx="5270500" cy="1747520"/>
                     </a:xfrm>
                     <a:prstGeom prst="rect">
                       <a:avLst/>
@@ -11174,6 +11882,8 @@
       <w:pPr>
         <w:jc w:val="center"/>
       </w:pPr>
+      <w:bookmarkStart w:id="29" w:name="_Ref142399907"/>
+      <w:bookmarkStart w:id="30" w:name="_Ref142399910"/>
       <w:r>
         <w:t xml:space="preserve">Figure </w:t>
       </w:r>
@@ -11196,16 +11906,521 @@
           <w:t>3</w:t>
         </w:r>
       </w:fldSimple>
+      <w:bookmarkEnd w:id="30"/>
       <w:r>
         <w:t xml:space="preserve"> Write Handler Diagram</w:t>
       </w:r>
-    </w:p>
-    <w:p>
-      <w:pPr>
-        <w:rPr>
-          <w:rFonts w:eastAsiaTheme="minorEastAsia"/>
-        </w:rPr>
-      </w:pPr>
+      <w:bookmarkEnd w:id="29"/>
+    </w:p>
+    <w:p>
+      <w:pPr>
+        <w:rPr>
+          <w:rFonts w:eastAsiaTheme="minorEastAsia" w:hint="eastAsia"/>
+        </w:rPr>
+      </w:pPr>
+      <w:r>
+        <w:rPr>
+          <w:rFonts w:eastAsiaTheme="minorEastAsia" w:hint="eastAsia"/>
+        </w:rPr>
+        <w:t>A</w:t>
+      </w:r>
+      <w:r>
+        <w:rPr>
+          <w:rFonts w:eastAsiaTheme="minorEastAsia"/>
+        </w:rPr>
+        <w:t>s shown in</w:t>
+      </w:r>
+      <w:r>
+        <w:rPr>
+          <w:rFonts w:eastAsiaTheme="minorEastAsia"/>
+        </w:rPr>
+        <w:t xml:space="preserve"> </w:t>
+      </w:r>
+      <w:r>
+        <w:rPr>
+          <w:rFonts w:eastAsiaTheme="minorEastAsia"/>
+        </w:rPr>
+        <w:fldChar w:fldCharType="begin"/>
+      </w:r>
+      <w:r>
+        <w:rPr>
+          <w:rFonts w:eastAsiaTheme="minorEastAsia"/>
+        </w:rPr>
+        <w:instrText xml:space="preserve"> REF _Ref142399910 \h </w:instrText>
+      </w:r>
+      <w:r>
+        <w:rPr>
+          <w:rFonts w:eastAsiaTheme="minorEastAsia"/>
+        </w:rPr>
+      </w:r>
+      <w:r>
+        <w:rPr>
+          <w:rFonts w:eastAsiaTheme="minorEastAsia"/>
+        </w:rPr>
+        <w:fldChar w:fldCharType="separate"/>
+      </w:r>
+      <w:r>
+        <w:t xml:space="preserve">Figure </w:t>
+      </w:r>
+      <w:r>
+        <w:rPr>
+          <w:noProof/>
+        </w:rPr>
+        <w:t>4</w:t>
+      </w:r>
+      <w:r>
+        <w:noBreakHyphen/>
+      </w:r>
+      <w:r>
+        <w:rPr>
+          <w:noProof/>
+        </w:rPr>
+        <w:t>3</w:t>
+      </w:r>
+      <w:r>
+        <w:rPr>
+          <w:rFonts w:eastAsiaTheme="minorEastAsia"/>
+        </w:rPr>
+        <w:fldChar w:fldCharType="end"/>
+      </w:r>
+      <w:r>
+        <w:rPr>
+          <w:rFonts w:eastAsiaTheme="minorEastAsia"/>
+        </w:rPr>
+        <w:t xml:space="preserve">, AXI </w:t>
+      </w:r>
+      <w:r>
+        <w:rPr>
+          <w:rFonts w:eastAsiaTheme="minorEastAsia"/>
+        </w:rPr>
+        <w:t>write</w:t>
+      </w:r>
+      <w:r>
+        <w:rPr>
+          <w:rFonts w:eastAsiaTheme="minorEastAsia"/>
+        </w:rPr>
+        <w:t xml:space="preserve"> address channel transaction </w:t>
+      </w:r>
+      <w:r>
+        <w:rPr>
+          <w:rFonts w:eastAsiaTheme="minorEastAsia"/>
+        </w:rPr>
+        <w:t xml:space="preserve">is </w:t>
+      </w:r>
+      <w:r>
+        <w:rPr>
+          <w:rFonts w:eastAsiaTheme="minorEastAsia"/>
+        </w:rPr>
+        <w:t xml:space="preserve">also </w:t>
+      </w:r>
+      <w:r>
+        <w:rPr>
+          <w:rFonts w:eastAsiaTheme="minorEastAsia"/>
+        </w:rPr>
+        <w:t xml:space="preserve">buffered in a </w:t>
+      </w:r>
+      <w:r>
+        <w:rPr>
+          <w:rFonts w:eastAsiaTheme="minorEastAsia"/>
+        </w:rPr>
+        <w:t xml:space="preserve">FIFO and </w:t>
+      </w:r>
+      <w:r>
+        <w:rPr>
+          <w:rFonts w:eastAsiaTheme="minorEastAsia"/>
+        </w:rPr>
+        <w:t>the depth of the FIFO is 8</w:t>
+      </w:r>
+      <w:r>
+        <w:rPr>
+          <w:rFonts w:eastAsiaTheme="minorEastAsia"/>
+        </w:rPr>
+        <w:t>.</w:t>
+      </w:r>
+      <w:r>
+        <w:rPr>
+          <w:rFonts w:eastAsiaTheme="minorEastAsia"/>
+        </w:rPr>
+        <w:t xml:space="preserve"> Write transaction will also be </w:t>
+      </w:r>
+      <w:r>
+        <w:rPr>
+          <w:rFonts w:eastAsiaTheme="minorEastAsia"/>
+        </w:rPr>
+        <w:t>disassembl</w:t>
+      </w:r>
+      <w:r>
+        <w:rPr>
+          <w:rFonts w:eastAsiaTheme="minorEastAsia"/>
+        </w:rPr>
+        <w:t xml:space="preserve">ed and </w:t>
+      </w:r>
+      <w:r>
+        <w:rPr>
+          <w:rFonts w:eastAsiaTheme="minorEastAsia"/>
+        </w:rPr>
+        <w:t>convert</w:t>
+      </w:r>
+      <w:r>
+        <w:rPr>
+          <w:rFonts w:eastAsiaTheme="minorEastAsia"/>
+        </w:rPr>
+        <w:t xml:space="preserve">ed in the Transfer split. Module AWW merge </w:t>
+      </w:r>
+      <w:r>
+        <w:rPr>
+          <w:rFonts w:eastAsiaTheme="minorEastAsia"/>
+        </w:rPr>
+        <w:t>is responsible for</w:t>
+      </w:r>
+      <w:r>
+        <w:rPr>
+          <w:rFonts w:eastAsiaTheme="minorEastAsia"/>
+        </w:rPr>
+        <w:t xml:space="preserve"> merging AW &amp; W channel and generating </w:t>
+      </w:r>
+      <w:r>
+        <w:rPr>
+          <w:rFonts w:eastAsiaTheme="minorEastAsia"/>
+        </w:rPr>
+        <w:t xml:space="preserve">the </w:t>
+      </w:r>
+      <w:r>
+        <w:rPr>
+          <w:rFonts w:eastAsiaTheme="minorEastAsia"/>
+        </w:rPr>
+        <w:t>request</w:t>
+      </w:r>
+      <w:r>
+        <w:rPr>
+          <w:rFonts w:eastAsiaTheme="minorEastAsia"/>
+        </w:rPr>
+        <w:t xml:space="preserve"> packet</w:t>
+      </w:r>
+      <w:r>
+        <w:rPr>
+          <w:rFonts w:eastAsiaTheme="minorEastAsia"/>
+        </w:rPr>
+        <w:t>.</w:t>
+      </w:r>
+      <w:r>
+        <w:rPr>
+          <w:rFonts w:eastAsiaTheme="minorEastAsia"/>
+        </w:rPr>
+        <w:t xml:space="preserve"> </w:t>
+      </w:r>
+      <w:r>
+        <w:rPr>
+          <w:rFonts w:eastAsiaTheme="minorEastAsia"/>
+        </w:rPr>
+        <w:t>Considering the partial write</w:t>
+      </w:r>
+      <w:r>
+        <w:rPr>
+          <w:rFonts w:eastAsiaTheme="minorEastAsia"/>
+        </w:rPr>
+        <w:t xml:space="preserve">, </w:t>
+      </w:r>
+      <w:r>
+        <w:rPr>
+          <w:rFonts w:eastAsiaTheme="minorEastAsia"/>
+        </w:rPr>
+        <w:t>the write request with ‘wstrb != `1’ will</w:t>
+      </w:r>
+      <w:r>
+        <w:rPr>
+          <w:rFonts w:eastAsiaTheme="minorEastAsia"/>
+        </w:rPr>
+        <w:t xml:space="preserve"> </w:t>
+      </w:r>
+      <w:r>
+        <w:rPr>
+          <w:rFonts w:eastAsiaTheme="minorEastAsia"/>
+        </w:rPr>
+        <w:t>be specially handled</w:t>
+      </w:r>
+      <w:r>
+        <w:rPr>
+          <w:rFonts w:eastAsiaTheme="minorEastAsia"/>
+        </w:rPr>
+        <w:t xml:space="preserve"> </w:t>
+      </w:r>
+      <w:r>
+        <w:rPr>
+          <w:rFonts w:eastAsiaTheme="minorEastAsia"/>
+        </w:rPr>
+        <w:t xml:space="preserve">in </w:t>
+      </w:r>
+      <w:r>
+        <w:rPr>
+          <w:rFonts w:eastAsiaTheme="minorEastAsia"/>
+        </w:rPr>
+        <w:t xml:space="preserve">module RMW </w:t>
+      </w:r>
+      <w:r>
+        <w:rPr>
+          <w:rFonts w:eastAsiaTheme="minorEastAsia" w:hint="eastAsia"/>
+        </w:rPr>
+        <w:t>(</w:t>
+      </w:r>
+      <w:r>
+        <w:rPr>
+          <w:rFonts w:eastAsiaTheme="minorEastAsia"/>
+        </w:rPr>
+        <w:t xml:space="preserve">Read Modify Write). </w:t>
+      </w:r>
+      <w:r>
+        <w:rPr>
+          <w:rFonts w:eastAsiaTheme="minorEastAsia"/>
+        </w:rPr>
+        <w:t xml:space="preserve">RMW </w:t>
+      </w:r>
+      <w:r>
+        <w:rPr>
+          <w:rFonts w:eastAsiaTheme="minorEastAsia"/>
+        </w:rPr>
+        <w:t>will first initiate a read operation to read back the data of the complete bus bit width corresponding to the write address, then merge it with the actual data to be written, and finally write the combined data into memory</w:t>
+      </w:r>
+      <w:r>
+        <w:rPr>
+          <w:rFonts w:eastAsiaTheme="minorEastAsia"/>
+        </w:rPr>
+        <w:t xml:space="preserve">. </w:t>
+      </w:r>
+      <w:r>
+        <w:rPr>
+          <w:rFonts w:eastAsiaTheme="minorEastAsia"/>
+        </w:rPr>
+        <w:t>For the response returned by memory</w:t>
+      </w:r>
+      <w:r>
+        <w:rPr>
+          <w:rFonts w:eastAsiaTheme="minorEastAsia"/>
+        </w:rPr>
+        <w:t xml:space="preserve"> </w:t>
+      </w:r>
+      <w:r>
+        <w:rPr>
+          <w:rFonts w:eastAsiaTheme="minorEastAsia" w:hint="eastAsia"/>
+        </w:rPr>
+        <w:t>wrapper</w:t>
+      </w:r>
+      <w:r>
+        <w:rPr>
+          <w:rFonts w:eastAsiaTheme="minorEastAsia"/>
+        </w:rPr>
+        <w:t xml:space="preserve">, </w:t>
+      </w:r>
+      <w:r>
+        <w:rPr>
+          <w:rFonts w:eastAsiaTheme="minorEastAsia"/>
+        </w:rPr>
+        <w:t xml:space="preserve">whether </w:t>
+      </w:r>
+      <w:r>
+        <w:rPr>
+          <w:rFonts w:eastAsiaTheme="minorEastAsia"/>
+        </w:rPr>
+        <w:t xml:space="preserve">it is routed to the RMW or the Brsp </w:t>
+      </w:r>
+      <w:r>
+        <w:rPr>
+          <w:rFonts w:eastAsiaTheme="minorEastAsia"/>
+        </w:rPr>
+        <w:t>gen</w:t>
+      </w:r>
+      <w:r>
+        <w:rPr>
+          <w:rFonts w:eastAsiaTheme="minorEastAsia"/>
+        </w:rPr>
+        <w:t xml:space="preserve"> </w:t>
+      </w:r>
+      <w:r>
+        <w:rPr>
+          <w:rFonts w:eastAsiaTheme="minorEastAsia"/>
+        </w:rPr>
+        <w:t>is determined by field ‘rmw’ in d</w:t>
+      </w:r>
+      <w:r>
+        <w:rPr>
+          <w:rFonts w:eastAsiaTheme="minorEastAsia"/>
+        </w:rPr>
+        <w:t>ecoder rsp</w:t>
+      </w:r>
+      <w:r>
+        <w:rPr>
+          <w:rFonts w:eastAsiaTheme="minorEastAsia"/>
+        </w:rPr>
+        <w:t>.</w:t>
+      </w:r>
+      <w:r>
+        <w:rPr>
+          <w:rFonts w:eastAsiaTheme="minorEastAsia"/>
+        </w:rPr>
+        <w:t xml:space="preserve"> </w:t>
+      </w:r>
+      <w:r>
+        <w:rPr>
+          <w:rFonts w:eastAsiaTheme="minorEastAsia"/>
+        </w:rPr>
+        <w:t xml:space="preserve">When ‘rmw’ signal is set, </w:t>
+      </w:r>
+      <w:r>
+        <w:rPr>
+          <w:rFonts w:eastAsiaTheme="minorEastAsia"/>
+        </w:rPr>
+        <w:t xml:space="preserve">it indicates that </w:t>
+      </w:r>
+      <w:r>
+        <w:rPr>
+          <w:rFonts w:eastAsiaTheme="minorEastAsia"/>
+        </w:rPr>
+        <w:t>the</w:t>
+      </w:r>
+      <w:r>
+        <w:rPr>
+          <w:rFonts w:eastAsiaTheme="minorEastAsia"/>
+        </w:rPr>
+        <w:t xml:space="preserve"> r</w:t>
+      </w:r>
+      <w:r>
+        <w:rPr>
+          <w:rFonts w:eastAsiaTheme="minorEastAsia"/>
+        </w:rPr>
+        <w:t>esponse</w:t>
+      </w:r>
+      <w:r>
+        <w:rPr>
+          <w:rFonts w:eastAsiaTheme="minorEastAsia"/>
+        </w:rPr>
+        <w:t xml:space="preserve"> is a reply to a read request sent by RMW</w:t>
+      </w:r>
+      <w:r>
+        <w:rPr>
+          <w:rFonts w:eastAsiaTheme="minorEastAsia"/>
+        </w:rPr>
+        <w:t xml:space="preserve"> </w:t>
+      </w:r>
+      <w:r>
+        <w:rPr>
+          <w:rFonts w:eastAsiaTheme="minorEastAsia"/>
+        </w:rPr>
+        <w:t>and this response will be routed to RMW</w:t>
+      </w:r>
+      <w:r>
+        <w:rPr>
+          <w:rFonts w:eastAsiaTheme="minorEastAsia" w:hint="eastAsia"/>
+        </w:rPr>
+        <w:t>.</w:t>
+      </w:r>
+      <w:r>
+        <w:rPr>
+          <w:rFonts w:eastAsiaTheme="minorEastAsia"/>
+        </w:rPr>
+        <w:t xml:space="preserve"> </w:t>
+      </w:r>
+      <w:r>
+        <w:rPr>
+          <w:rFonts w:eastAsiaTheme="minorEastAsia"/>
+        </w:rPr>
+        <w:t xml:space="preserve">Since out-of-order writing is not supported, </w:t>
+      </w:r>
+      <w:r>
+        <w:rPr>
+          <w:rFonts w:eastAsiaTheme="minorEastAsia"/>
+        </w:rPr>
+        <w:t>the Brsp gen</w:t>
+      </w:r>
+      <w:r>
+        <w:rPr>
+          <w:rFonts w:eastAsiaTheme="minorEastAsia"/>
+        </w:rPr>
+        <w:t xml:space="preserve"> will directly generate </w:t>
+      </w:r>
+      <w:r>
+        <w:rPr>
+          <w:rFonts w:eastAsiaTheme="minorEastAsia"/>
+        </w:rPr>
+        <w:t>write response</w:t>
+      </w:r>
+      <w:r>
+        <w:rPr>
+          <w:rFonts w:eastAsiaTheme="minorEastAsia"/>
+        </w:rPr>
+        <w:t xml:space="preserve"> through </w:t>
+      </w:r>
+      <w:r>
+        <w:rPr>
+          <w:rFonts w:eastAsiaTheme="minorEastAsia"/>
+        </w:rPr>
+        <w:t>field ‘</w:t>
+      </w:r>
+      <w:r>
+        <w:rPr>
+          <w:rFonts w:eastAsiaTheme="minorEastAsia"/>
+        </w:rPr>
+        <w:t>Last</w:t>
+      </w:r>
+      <w:r>
+        <w:rPr>
+          <w:rFonts w:eastAsiaTheme="minorEastAsia"/>
+        </w:rPr>
+        <w:t>’ and ‘Axid’.</w:t>
+      </w:r>
+      <w:r>
+        <w:rPr>
+          <w:rFonts w:eastAsiaTheme="minorEastAsia"/>
+        </w:rPr>
+        <w:t xml:space="preserve"> </w:t>
+      </w:r>
+      <w:r>
+        <w:rPr>
+          <w:rFonts w:eastAsiaTheme="minorEastAsia"/>
+        </w:rPr>
+        <w:t>Similarly, a counter is used to record write trans</w:t>
+      </w:r>
+      <w:r>
+        <w:rPr>
+          <w:rFonts w:eastAsiaTheme="minorEastAsia"/>
+        </w:rPr>
+        <w:t>action</w:t>
+      </w:r>
+      <w:r>
+        <w:rPr>
+          <w:rFonts w:eastAsiaTheme="minorEastAsia"/>
+        </w:rPr>
+        <w:t xml:space="preserve"> and generate a</w:t>
+      </w:r>
+      <w:r>
+        <w:rPr>
+          <w:rFonts w:eastAsiaTheme="minorEastAsia"/>
+        </w:rPr>
+        <w:t xml:space="preserve"> block</w:t>
+      </w:r>
+      <w:r>
+        <w:rPr>
+          <w:rFonts w:eastAsiaTheme="minorEastAsia"/>
+        </w:rPr>
+        <w:t xml:space="preserve"> </w:t>
+      </w:r>
+      <w:r>
+        <w:rPr>
+          <w:rFonts w:eastAsiaTheme="minorEastAsia"/>
+        </w:rPr>
+        <w:t>Write Handler</w:t>
+      </w:r>
+      <w:r>
+        <w:rPr>
+          <w:rFonts w:eastAsiaTheme="minorEastAsia"/>
+        </w:rPr>
+        <w:t xml:space="preserve"> idle signal</w:t>
+      </w:r>
+      <w:r>
+        <w:rPr>
+          <w:rFonts w:eastAsiaTheme="minorEastAsia"/>
+        </w:rPr>
+        <w:t>.</w:t>
+      </w:r>
     </w:p>
     <w:p>
       <w:pPr>
@@ -11217,161 +12432,147 @@
     </w:p>
     <w:p>
       <w:pPr>
-        <w:pStyle w:val="30"/>
-      </w:pPr>
-      <w:bookmarkStart w:id="28" w:name="_Toc141358455"/>
-      <w:r>
-        <w:t>Block 2 FSM</w:t>
-      </w:r>
-      <w:bookmarkEnd w:id="28"/>
-    </w:p>
-    <w:p>
-      <w:pPr>
-        <w:rPr>
-          <w:i/>
-          <w:iCs/>
-          <w:color w:val="0070C0"/>
-        </w:rPr>
-      </w:pPr>
-      <w:r>
-        <w:rPr>
-          <w:i/>
-          <w:iCs/>
-          <w:color w:val="0070C0"/>
-        </w:rPr>
-        <w:t xml:space="preserve">Please draw block </w:t>
-      </w:r>
-      <w:r>
-        <w:rPr>
-          <w:i/>
-          <w:iCs/>
-          <w:color w:val="0070C0"/>
-        </w:rPr>
-        <w:t>2</w:t>
-      </w:r>
-      <w:r>
-        <w:rPr>
-          <w:i/>
-          <w:iCs/>
-          <w:color w:val="0070C0"/>
-        </w:rPr>
-        <w:t xml:space="preserve"> FSM diagram if necessary.</w:t>
-      </w:r>
-    </w:p>
-    <w:p>
-      <w:pPr>
-        <w:pStyle w:val="30"/>
-      </w:pPr>
-      <w:bookmarkStart w:id="29" w:name="_Toc141358456"/>
-      <w:r>
-        <w:rPr>
-          <w:rFonts w:hint="eastAsia"/>
-        </w:rPr>
-        <w:t>B</w:t>
-      </w:r>
-      <w:r>
-        <w:t>lock 2 Timing Diagram</w:t>
-      </w:r>
-      <w:bookmarkEnd w:id="29"/>
-    </w:p>
-    <w:p>
-      <w:pPr>
-        <w:rPr>
-          <w:i/>
-          <w:iCs/>
-          <w:color w:val="0070C0"/>
-        </w:rPr>
-      </w:pPr>
-      <w:r>
-        <w:rPr>
-          <w:i/>
-          <w:iCs/>
-          <w:color w:val="0070C0"/>
-        </w:rPr>
-        <w:t xml:space="preserve">Please draw necessary block </w:t>
-      </w:r>
-      <w:r>
-        <w:rPr>
-          <w:i/>
-          <w:iCs/>
-          <w:color w:val="0070C0"/>
-        </w:rPr>
-        <w:t>2</w:t>
-      </w:r>
-      <w:r>
-        <w:rPr>
-          <w:i/>
-          <w:iCs/>
-          <w:color w:val="0070C0"/>
-        </w:rPr>
-        <w:t xml:space="preserve"> timing diagrams here and give the description.</w:t>
-      </w:r>
-    </w:p>
-    <w:p/>
-    <w:p>
-      <w:pPr>
-        <w:pStyle w:val="ac"/>
-      </w:pPr>
-      <w:bookmarkStart w:id="30" w:name="_Toc141358512"/>
+        <w:rPr>
+          <w:rFonts w:eastAsiaTheme="minorEastAsia" w:hint="eastAsia"/>
+        </w:rPr>
+      </w:pPr>
+      <w:r>
+        <w:rPr>
+          <w:rFonts w:eastAsiaTheme="minorEastAsia"/>
+        </w:rPr>
+        <w:t xml:space="preserve">As shown in </w:t>
+      </w:r>
+      <w:r>
+        <w:rPr>
+          <w:rFonts w:eastAsiaTheme="minorEastAsia"/>
+        </w:rPr>
+        <w:fldChar w:fldCharType="begin"/>
+      </w:r>
+      <w:r>
+        <w:rPr>
+          <w:rFonts w:eastAsiaTheme="minorEastAsia"/>
+        </w:rPr>
+        <w:instrText xml:space="preserve"> REF _Ref142408256 \h </w:instrText>
+      </w:r>
+      <w:r>
+        <w:rPr>
+          <w:rFonts w:eastAsiaTheme="minorEastAsia"/>
+        </w:rPr>
+      </w:r>
+      <w:r>
+        <w:rPr>
+          <w:rFonts w:eastAsiaTheme="minorEastAsia"/>
+        </w:rPr>
+        <w:fldChar w:fldCharType="separate"/>
+      </w:r>
       <w:r>
         <w:t xml:space="preserve">Figure </w:t>
       </w:r>
-      <w:fldSimple w:instr=" STYLEREF 1 \s ">
-        <w:r>
-          <w:rPr>
-            <w:noProof/>
-          </w:rPr>
-          <w:t>4</w:t>
-        </w:r>
-      </w:fldSimple>
+      <w:r>
+        <w:rPr>
+          <w:noProof/>
+        </w:rPr>
+        <w:t>3</w:t>
+      </w:r>
       <w:r>
         <w:noBreakHyphen/>
       </w:r>
-      <w:fldSimple w:instr=" SEQ Figure \* ARABIC \s 1 ">
-        <w:r>
-          <w:rPr>
-            <w:noProof/>
-          </w:rPr>
-          <w:t>4</w:t>
-        </w:r>
-      </w:fldSimple>
-      <w:r>
-        <w:t xml:space="preserve"> Block 2 Case 1 Timing Diagram</w:t>
-      </w:r>
-      <w:bookmarkEnd w:id="30"/>
-    </w:p>
-    <w:p/>
-    <w:p>
-      <w:pPr>
-        <w:pStyle w:val="ac"/>
-      </w:pPr>
-      <w:bookmarkStart w:id="31" w:name="_Toc141358513"/>
-      <w:r>
-        <w:t xml:space="preserve">Figure </w:t>
-      </w:r>
-      <w:fldSimple w:instr=" STYLEREF 1 \s ">
-        <w:r>
-          <w:rPr>
-            <w:noProof/>
-          </w:rPr>
-          <w:t>4</w:t>
-        </w:r>
-      </w:fldSimple>
-      <w:r>
-        <w:noBreakHyphen/>
-      </w:r>
-      <w:fldSimple w:instr=" SEQ Figure \* ARABIC \s 1 ">
-        <w:r>
-          <w:rPr>
-            <w:noProof/>
-          </w:rPr>
-          <w:t>5</w:t>
-        </w:r>
-      </w:fldSimple>
-      <w:r>
-        <w:t xml:space="preserve"> Block 2 Case 2 Timing Diagram</w:t>
-      </w:r>
-      <w:bookmarkEnd w:id="31"/>
+      <w:r>
+        <w:rPr>
+          <w:noProof/>
+        </w:rPr>
+        <w:t>1</w:t>
+      </w:r>
+      <w:r>
+        <w:rPr>
+          <w:rFonts w:eastAsiaTheme="minorEastAsia"/>
+        </w:rPr>
+        <w:fldChar w:fldCharType="end"/>
+      </w:r>
+      <w:r>
+        <w:rPr>
+          <w:rFonts w:eastAsiaTheme="minorEastAsia"/>
+        </w:rPr>
+        <w:t>, a round robin arbiter</w:t>
+      </w:r>
+      <w:r>
+        <w:rPr>
+          <w:rFonts w:eastAsiaTheme="minorEastAsia"/>
+        </w:rPr>
+        <w:t xml:space="preserve"> is employed to arbitrate memory access requests from </w:t>
+      </w:r>
+      <w:r>
+        <w:rPr>
+          <w:rFonts w:eastAsiaTheme="minorEastAsia"/>
+        </w:rPr>
+        <w:t>Write Handler</w:t>
+      </w:r>
+      <w:r>
+        <w:rPr>
+          <w:rFonts w:eastAsiaTheme="minorEastAsia"/>
+        </w:rPr>
+        <w:t xml:space="preserve"> and </w:t>
+      </w:r>
+      <w:r>
+        <w:rPr>
+          <w:rFonts w:eastAsiaTheme="minorEastAsia"/>
+        </w:rPr>
+        <w:t>Read Handler</w:t>
+      </w:r>
+      <w:r>
+        <w:rPr>
+          <w:rFonts w:eastAsiaTheme="minorEastAsia"/>
+        </w:rPr>
+        <w:t>.</w:t>
+      </w:r>
+      <w:r>
+        <w:rPr>
+          <w:rFonts w:eastAsiaTheme="minorEastAsia"/>
+        </w:rPr>
+        <w:t xml:space="preserve"> </w:t>
+      </w:r>
+      <w:r>
+        <w:rPr>
+          <w:rFonts w:eastAsiaTheme="minorEastAsia"/>
+        </w:rPr>
+        <w:t>For the returned response, a decoder is used to complete the shunt.</w:t>
+      </w:r>
+      <w:r>
+        <w:rPr>
+          <w:rFonts w:eastAsiaTheme="minorEastAsia"/>
+        </w:rPr>
+        <w:t xml:space="preserve"> When field ‘RW’==1, </w:t>
+      </w:r>
+      <w:r>
+        <w:rPr>
+          <w:rFonts w:eastAsiaTheme="minorEastAsia"/>
+        </w:rPr>
+        <w:t xml:space="preserve">this </w:t>
+      </w:r>
+      <w:r>
+        <w:rPr>
+          <w:rFonts w:eastAsiaTheme="minorEastAsia"/>
+        </w:rPr>
+        <w:t>response</w:t>
+      </w:r>
+      <w:r>
+        <w:rPr>
+          <w:rFonts w:eastAsiaTheme="minorEastAsia"/>
+        </w:rPr>
+        <w:t xml:space="preserve"> will be routed to </w:t>
+      </w:r>
+      <w:r>
+        <w:rPr>
+          <w:rFonts w:eastAsiaTheme="minorEastAsia"/>
+        </w:rPr>
+        <w:t>Write Handler</w:t>
+      </w:r>
+      <w:r>
+        <w:rPr>
+          <w:rFonts w:eastAsiaTheme="minorEastAsia"/>
+        </w:rPr>
+        <w:t>, otherwise routed to Read Handler.</w:t>
+      </w:r>
     </w:p>
     <w:p>
       <w:pPr>
@@ -11396,7 +12597,7 @@
       <w:pPr>
         <w:pStyle w:val="11"/>
       </w:pPr>
-      <w:bookmarkStart w:id="32" w:name="_Toc141358457"/>
+      <w:bookmarkStart w:id="31" w:name="_Toc141358457"/>
       <w:r>
         <w:rPr>
           <w:rFonts w:hint="eastAsia"/>
@@ -11413,7 +12614,7 @@
         </w:rPr>
         <w:t>cases</w:t>
       </w:r>
-      <w:bookmarkEnd w:id="32"/>
+      <w:bookmarkEnd w:id="31"/>
     </w:p>
     <w:p>
       <w:pPr>
@@ -11444,7 +12645,7 @@
       <w:pPr>
         <w:pStyle w:val="20"/>
       </w:pPr>
-      <w:bookmarkStart w:id="33" w:name="_Toc141358458"/>
+      <w:bookmarkStart w:id="32" w:name="_Toc141358458"/>
       <w:r>
         <w:rPr>
           <w:rFonts w:hint="eastAsia"/>
@@ -11454,13 +12655,45 @@
       <w:r>
         <w:t>cenario 1</w:t>
       </w:r>
+      <w:bookmarkEnd w:id="32"/>
+    </w:p>
+    <w:p>
+      <w:pPr>
+        <w:pStyle w:val="ac"/>
+      </w:pPr>
+      <w:bookmarkStart w:id="33" w:name="_Toc141358514"/>
+      <w:r>
+        <w:t xml:space="preserve">Figure </w:t>
+      </w:r>
+      <w:fldSimple w:instr=" STYLEREF 1 \s ">
+        <w:r>
+          <w:rPr>
+            <w:noProof/>
+          </w:rPr>
+          <w:t>5</w:t>
+        </w:r>
+      </w:fldSimple>
+      <w:r>
+        <w:noBreakHyphen/>
+      </w:r>
+      <w:fldSimple w:instr=" SEQ Figure \* ARABIC \s 1 ">
+        <w:r>
+          <w:rPr>
+            <w:noProof/>
+          </w:rPr>
+          <w:t>1</w:t>
+        </w:r>
+      </w:fldSimple>
+      <w:r>
+        <w:t xml:space="preserve"> Data Path 1</w:t>
+      </w:r>
       <w:bookmarkEnd w:id="33"/>
     </w:p>
     <w:p>
       <w:pPr>
         <w:pStyle w:val="ac"/>
       </w:pPr>
-      <w:bookmarkStart w:id="34" w:name="_Toc141358514"/>
+      <w:bookmarkStart w:id="34" w:name="_Toc141358515"/>
       <w:r>
         <w:t xml:space="preserve">Figure </w:t>
       </w:r>
@@ -11480,19 +12713,67 @@
           <w:rPr>
             <w:noProof/>
           </w:rPr>
-          <w:t>1</w:t>
+          <w:t>2</w:t>
         </w:r>
       </w:fldSimple>
       <w:r>
+        <w:t xml:space="preserve"> Data Path 2</w:t>
+      </w:r>
+      <w:bookmarkEnd w:id="34"/>
+    </w:p>
+    <w:p>
+      <w:pPr>
+        <w:pStyle w:val="20"/>
+      </w:pPr>
+      <w:bookmarkStart w:id="35" w:name="_Toc141358459"/>
+      <w:r>
+        <w:rPr>
+          <w:rFonts w:hint="eastAsia"/>
+        </w:rPr>
+        <w:t>S</w:t>
+      </w:r>
+      <w:r>
+        <w:t>cenario 2</w:t>
+      </w:r>
+      <w:bookmarkEnd w:id="35"/>
+    </w:p>
+    <w:p>
+      <w:pPr>
+        <w:pStyle w:val="ac"/>
+      </w:pPr>
+      <w:bookmarkStart w:id="36" w:name="_Toc141358516"/>
+      <w:r>
+        <w:t xml:space="preserve">Figure </w:t>
+      </w:r>
+      <w:fldSimple w:instr=" STYLEREF 1 \s ">
+        <w:r>
+          <w:rPr>
+            <w:noProof/>
+          </w:rPr>
+          <w:t>5</w:t>
+        </w:r>
+      </w:fldSimple>
+      <w:r>
+        <w:noBreakHyphen/>
+      </w:r>
+      <w:fldSimple w:instr=" SEQ Figure \* ARABIC \s 1 ">
+        <w:r>
+          <w:rPr>
+            <w:noProof/>
+          </w:rPr>
+          <w:t>3</w:t>
+        </w:r>
+      </w:fldSimple>
+      <w:r>
         <w:t xml:space="preserve"> Data Path 1</w:t>
       </w:r>
-      <w:bookmarkEnd w:id="34"/>
+      <w:bookmarkEnd w:id="36"/>
     </w:p>
     <w:p>
       <w:pPr>
         <w:pStyle w:val="ac"/>
       </w:pPr>
-      <w:bookmarkStart w:id="35" w:name="_Toc141358515"/>
+      <w:bookmarkStart w:id="37" w:name="_Toc141358517"/>
       <w:r>
         <w:t xml:space="preserve">Figure </w:t>
       </w:r>
@@ -11512,99 +12793,19 @@
           <w:rPr>
             <w:noProof/>
           </w:rPr>
-          <w:t>2</w:t>
+          <w:t>4</w:t>
         </w:r>
       </w:fldSimple>
       <w:r>
         <w:t xml:space="preserve"> Data Path 2</w:t>
       </w:r>
-      <w:bookmarkEnd w:id="35"/>
-    </w:p>
-    <w:p>
-      <w:pPr>
-        <w:pStyle w:val="20"/>
-      </w:pPr>
-      <w:bookmarkStart w:id="36" w:name="_Toc141358459"/>
-      <w:r>
-        <w:rPr>
-          <w:rFonts w:hint="eastAsia"/>
-        </w:rPr>
-        <w:t>S</w:t>
-      </w:r>
-      <w:r>
-        <w:t>cenario 2</w:t>
-      </w:r>
-      <w:bookmarkEnd w:id="36"/>
-    </w:p>
-    <w:p>
-      <w:pPr>
-        <w:pStyle w:val="ac"/>
-      </w:pPr>
-      <w:bookmarkStart w:id="37" w:name="_Toc141358516"/>
-      <w:r>
-        <w:t xml:space="preserve">Figure </w:t>
-      </w:r>
-      <w:fldSimple w:instr=" STYLEREF 1 \s ">
-        <w:r>
-          <w:rPr>
-            <w:noProof/>
-          </w:rPr>
-          <w:t>5</w:t>
-        </w:r>
-      </w:fldSimple>
-      <w:r>
-        <w:noBreakHyphen/>
-      </w:r>
-      <w:fldSimple w:instr=" SEQ Figure \* ARABIC \s 1 ">
-        <w:r>
-          <w:rPr>
-            <w:noProof/>
-          </w:rPr>
-          <w:t>3</w:t>
-        </w:r>
-      </w:fldSimple>
-      <w:r>
-        <w:t xml:space="preserve"> Data Path 1</w:t>
-      </w:r>
       <w:bookmarkEnd w:id="37"/>
     </w:p>
     <w:p>
       <w:pPr>
-        <w:pStyle w:val="ac"/>
-      </w:pPr>
-      <w:bookmarkStart w:id="38" w:name="_Toc141358517"/>
-      <w:r>
-        <w:t xml:space="preserve">Figure </w:t>
-      </w:r>
-      <w:fldSimple w:instr=" STYLEREF 1 \s ">
-        <w:r>
-          <w:rPr>
-            <w:noProof/>
-          </w:rPr>
-          <w:t>5</w:t>
-        </w:r>
-      </w:fldSimple>
-      <w:r>
-        <w:noBreakHyphen/>
-      </w:r>
-      <w:fldSimple w:instr=" SEQ Figure \* ARABIC \s 1 ">
-        <w:r>
-          <w:rPr>
-            <w:noProof/>
-          </w:rPr>
-          <w:t>4</w:t>
-        </w:r>
-      </w:fldSimple>
-      <w:r>
-        <w:t xml:space="preserve"> Data Path 2</w:t>
-      </w:r>
-      <w:bookmarkEnd w:id="38"/>
-    </w:p>
-    <w:p>
-      <w:pPr>
         <w:pStyle w:val="11"/>
       </w:pPr>
-      <w:bookmarkStart w:id="39" w:name="_Toc141358460"/>
+      <w:bookmarkStart w:id="38" w:name="_Toc141358460"/>
       <w:r>
         <w:rPr>
           <w:rFonts w:hint="eastAsia"/>
@@ -11615,23 +12816,23 @@
       <w:r>
         <w:t>onfiguration</w:t>
       </w:r>
+      <w:bookmarkEnd w:id="38"/>
+    </w:p>
+    <w:p>
+      <w:pPr>
+        <w:pStyle w:val="20"/>
+      </w:pPr>
+      <w:bookmarkStart w:id="39" w:name="_Toc141358461"/>
+      <w:r>
+        <w:rPr>
+          <w:rFonts w:hint="eastAsia"/>
+        </w:rPr>
+        <w:t>P</w:t>
+      </w:r>
+      <w:r>
+        <w:t>arameter</w:t>
+      </w:r>
       <w:bookmarkEnd w:id="39"/>
-    </w:p>
-    <w:p>
-      <w:pPr>
-        <w:pStyle w:val="20"/>
-      </w:pPr>
-      <w:bookmarkStart w:id="40" w:name="_Toc141358461"/>
-      <w:r>
-        <w:rPr>
-          <w:rFonts w:hint="eastAsia"/>
-        </w:rPr>
-        <w:t>P</w:t>
-      </w:r>
-      <w:r>
-        <w:t>arameter</w:t>
-      </w:r>
-      <w:bookmarkEnd w:id="40"/>
     </w:p>
     <w:tbl>
       <w:tblPr>
@@ -11802,7 +13003,7 @@
       <w:pPr>
         <w:pStyle w:val="ac"/>
       </w:pPr>
-      <w:bookmarkStart w:id="41" w:name="_Toc141358489"/>
+      <w:bookmarkStart w:id="40" w:name="_Toc141358489"/>
       <w:r>
         <w:t xml:space="preserve">Table </w:t>
       </w:r>
@@ -11828,23 +13029,23 @@
       <w:r>
         <w:t xml:space="preserve"> Parameter List</w:t>
       </w:r>
+      <w:bookmarkEnd w:id="40"/>
+    </w:p>
+    <w:p>
+      <w:pPr>
+        <w:pStyle w:val="20"/>
+      </w:pPr>
+      <w:bookmarkStart w:id="41" w:name="_Toc141358462"/>
+      <w:r>
+        <w:rPr>
+          <w:rFonts w:hint="eastAsia"/>
+        </w:rPr>
+        <w:t>M</w:t>
+      </w:r>
+      <w:r>
+        <w:t>acro</w:t>
+      </w:r>
       <w:bookmarkEnd w:id="41"/>
-    </w:p>
-    <w:p>
-      <w:pPr>
-        <w:pStyle w:val="20"/>
-      </w:pPr>
-      <w:bookmarkStart w:id="42" w:name="_Toc141358462"/>
-      <w:r>
-        <w:rPr>
-          <w:rFonts w:hint="eastAsia"/>
-        </w:rPr>
-        <w:t>M</w:t>
-      </w:r>
-      <w:r>
-        <w:t>acro</w:t>
-      </w:r>
-      <w:bookmarkEnd w:id="42"/>
     </w:p>
     <w:tbl>
       <w:tblPr>
@@ -12021,7 +13222,7 @@
       <w:pPr>
         <w:pStyle w:val="ac"/>
       </w:pPr>
-      <w:bookmarkStart w:id="43" w:name="_Toc141358490"/>
+      <w:bookmarkStart w:id="42" w:name="_Toc141358490"/>
       <w:r>
         <w:t xml:space="preserve">Table </w:t>
       </w:r>
@@ -12047,23 +13248,23 @@
       <w:r>
         <w:t xml:space="preserve"> Macro List</w:t>
       </w:r>
+      <w:bookmarkEnd w:id="42"/>
+    </w:p>
+    <w:p>
+      <w:pPr>
+        <w:pStyle w:val="20"/>
+      </w:pPr>
+      <w:bookmarkStart w:id="43" w:name="_Toc141358463"/>
+      <w:r>
+        <w:rPr>
+          <w:rFonts w:hint="eastAsia"/>
+        </w:rPr>
+        <w:t>M</w:t>
+      </w:r>
+      <w:r>
+        <w:t>emory</w:t>
+      </w:r>
       <w:bookmarkEnd w:id="43"/>
-    </w:p>
-    <w:p>
-      <w:pPr>
-        <w:pStyle w:val="20"/>
-      </w:pPr>
-      <w:bookmarkStart w:id="44" w:name="_Toc141358463"/>
-      <w:r>
-        <w:rPr>
-          <w:rFonts w:hint="eastAsia"/>
-        </w:rPr>
-        <w:t>M</w:t>
-      </w:r>
-      <w:r>
-        <w:t>emory</w:t>
-      </w:r>
-      <w:bookmarkEnd w:id="44"/>
     </w:p>
     <w:tbl>
       <w:tblPr>
@@ -12546,7 +13747,7 @@
       <w:pPr>
         <w:pStyle w:val="ac"/>
       </w:pPr>
-      <w:bookmarkStart w:id="45" w:name="_Toc141358491"/>
+      <w:bookmarkStart w:id="44" w:name="_Toc141358491"/>
       <w:r>
         <w:t xml:space="preserve">Table </w:t>
       </w:r>
@@ -12572,13 +13773,13 @@
       <w:r>
         <w:t xml:space="preserve"> Memory Requirements Table</w:t>
       </w:r>
-      <w:bookmarkEnd w:id="45"/>
+      <w:bookmarkEnd w:id="44"/>
     </w:p>
     <w:p>
       <w:pPr>
         <w:pStyle w:val="11"/>
       </w:pPr>
-      <w:bookmarkStart w:id="46" w:name="_Toc141358464"/>
+      <w:bookmarkStart w:id="45" w:name="_Toc141358464"/>
       <w:r>
         <w:rPr>
           <w:rFonts w:hint="eastAsia"/>
@@ -12595,23 +13796,23 @@
         </w:rPr>
         <w:t>Information</w:t>
       </w:r>
+      <w:bookmarkEnd w:id="45"/>
+    </w:p>
+    <w:p>
+      <w:pPr>
+        <w:pStyle w:val="20"/>
+      </w:pPr>
+      <w:bookmarkStart w:id="46" w:name="_Toc141358465"/>
+      <w:r>
+        <w:rPr>
+          <w:rFonts w:hint="eastAsia"/>
+        </w:rPr>
+        <w:t>P</w:t>
+      </w:r>
+      <w:r>
+        <w:t>ower</w:t>
+      </w:r>
       <w:bookmarkEnd w:id="46"/>
-    </w:p>
-    <w:p>
-      <w:pPr>
-        <w:pStyle w:val="20"/>
-      </w:pPr>
-      <w:bookmarkStart w:id="47" w:name="_Toc141358465"/>
-      <w:r>
-        <w:rPr>
-          <w:rFonts w:hint="eastAsia"/>
-        </w:rPr>
-        <w:t>P</w:t>
-      </w:r>
-      <w:r>
-        <w:t>ower</w:t>
-      </w:r>
-      <w:bookmarkEnd w:id="47"/>
     </w:p>
     <w:p>
       <w:pPr>
@@ -12812,7 +14013,7 @@
       <w:pPr>
         <w:pStyle w:val="ac"/>
       </w:pPr>
-      <w:bookmarkStart w:id="48" w:name="_Toc141358492"/>
+      <w:bookmarkStart w:id="47" w:name="_Toc141358492"/>
       <w:r>
         <w:t xml:space="preserve">Table </w:t>
       </w:r>
@@ -12838,7 +14039,7 @@
       <w:r>
         <w:t xml:space="preserve"> Power State Table</w:t>
       </w:r>
-      <w:bookmarkEnd w:id="48"/>
+      <w:bookmarkEnd w:id="47"/>
     </w:p>
     <w:p/>
     <w:tbl>
@@ -13010,7 +14211,7 @@
       <w:pPr>
         <w:pStyle w:val="ac"/>
       </w:pPr>
-      <w:bookmarkStart w:id="49" w:name="_Toc141358493"/>
+      <w:bookmarkStart w:id="48" w:name="_Toc141358493"/>
       <w:r>
         <w:t xml:space="preserve">Table </w:t>
       </w:r>
@@ -13036,21 +14237,21 @@
       <w:r>
         <w:t xml:space="preserve"> Power Consumption Table</w:t>
       </w:r>
+      <w:bookmarkEnd w:id="48"/>
+    </w:p>
+    <w:p/>
+    <w:p>
+      <w:pPr>
+        <w:pStyle w:val="20"/>
+      </w:pPr>
+      <w:bookmarkStart w:id="49" w:name="_Toc141358466"/>
+      <w:r>
+        <w:rPr>
+          <w:rFonts w:hint="eastAsia"/>
+        </w:rPr>
+        <w:t>Performance</w:t>
+      </w:r>
       <w:bookmarkEnd w:id="49"/>
-    </w:p>
-    <w:p/>
-    <w:p>
-      <w:pPr>
-        <w:pStyle w:val="20"/>
-      </w:pPr>
-      <w:bookmarkStart w:id="50" w:name="_Toc141358466"/>
-      <w:r>
-        <w:rPr>
-          <w:rFonts w:hint="eastAsia"/>
-        </w:rPr>
-        <w:t>Performance</w:t>
-      </w:r>
-      <w:bookmarkEnd w:id="50"/>
     </w:p>
     <w:p>
       <w:pPr>
@@ -13302,14 +14503,14 @@
       <w:pPr>
         <w:pStyle w:val="20"/>
       </w:pPr>
-      <w:bookmarkStart w:id="51" w:name="_Toc141358467"/>
+      <w:bookmarkStart w:id="50" w:name="_Toc141358467"/>
       <w:r>
         <w:rPr>
           <w:rFonts w:hint="eastAsia"/>
         </w:rPr>
         <w:t>Area</w:t>
       </w:r>
-      <w:bookmarkEnd w:id="51"/>
+      <w:bookmarkEnd w:id="50"/>
     </w:p>
     <w:p>
       <w:r>
@@ -13486,7 +14687,7 @@
       <w:pPr>
         <w:pStyle w:val="ac"/>
       </w:pPr>
-      <w:bookmarkStart w:id="52" w:name="_Toc141358494"/>
+      <w:bookmarkStart w:id="51" w:name="_Toc141358494"/>
       <w:r>
         <w:t xml:space="preserve">Table </w:t>
       </w:r>
@@ -13512,7 +14713,7 @@
       <w:r>
         <w:t xml:space="preserve"> Area Information</w:t>
       </w:r>
-      <w:bookmarkEnd w:id="52"/>
+      <w:bookmarkEnd w:id="51"/>
     </w:p>
     <w:p/>
     <w:p/>
@@ -13629,7 +14830,7 @@
       <w:pPr>
         <w:pStyle w:val="ac"/>
       </w:pPr>
-      <w:bookmarkStart w:id="53" w:name="_Toc141358495"/>
+      <w:bookmarkStart w:id="52" w:name="_Toc141358495"/>
       <w:r>
         <w:t xml:space="preserve">Table </w:t>
       </w:r>
@@ -13655,13 +14856,13 @@
       <w:r>
         <w:t xml:space="preserve"> VT Cell Number</w:t>
       </w:r>
-      <w:bookmarkEnd w:id="53"/>
+      <w:bookmarkEnd w:id="52"/>
     </w:p>
     <w:p>
       <w:pPr>
         <w:pStyle w:val="11"/>
       </w:pPr>
-      <w:bookmarkStart w:id="54" w:name="_Toc141358468"/>
+      <w:bookmarkStart w:id="53" w:name="_Toc141358468"/>
       <w:r>
         <w:rPr>
           <w:rFonts w:hint="eastAsia"/>
@@ -13681,7 +14882,7 @@
       <w:r>
         <w:t>onstraints</w:t>
       </w:r>
-      <w:bookmarkEnd w:id="54"/>
+      <w:bookmarkEnd w:id="53"/>
     </w:p>
     <w:p>
       <w:pPr>
@@ -13813,7 +15014,7 @@
       <w:pPr>
         <w:pStyle w:val="11"/>
       </w:pPr>
-      <w:bookmarkStart w:id="55" w:name="_Toc141358469"/>
+      <w:bookmarkStart w:id="54" w:name="_Toc141358469"/>
       <w:r>
         <w:rPr>
           <w:rFonts w:hint="eastAsia"/>
@@ -13824,7 +15025,7 @@
       <w:r>
         <w:t xml:space="preserve"> &amp; R Guidelines</w:t>
       </w:r>
-      <w:bookmarkEnd w:id="55"/>
+      <w:bookmarkEnd w:id="54"/>
     </w:p>
     <w:p>
       <w:pPr>
@@ -13847,7 +15048,7 @@
       <w:pPr>
         <w:pStyle w:val="11"/>
       </w:pPr>
-      <w:bookmarkStart w:id="56" w:name="_Toc141358470"/>
+      <w:bookmarkStart w:id="55" w:name="_Toc141358470"/>
       <w:r>
         <w:rPr>
           <w:rFonts w:hint="eastAsia"/>
@@ -13858,7 +15059,7 @@
       <w:r>
         <w:t>erification</w:t>
       </w:r>
-      <w:bookmarkEnd w:id="56"/>
+      <w:bookmarkEnd w:id="55"/>
     </w:p>
     <w:p>
       <w:pPr>
@@ -13881,7 +15082,7 @@
       <w:pPr>
         <w:pStyle w:val="11"/>
       </w:pPr>
-      <w:bookmarkStart w:id="57" w:name="_Toc141358471"/>
+      <w:bookmarkStart w:id="56" w:name="_Toc141358471"/>
       <w:r>
         <w:rPr>
           <w:rFonts w:hint="eastAsia"/>
@@ -13892,7 +15093,7 @@
       <w:r>
         <w:t>ppendix</w:t>
       </w:r>
-      <w:bookmarkEnd w:id="57"/>
+      <w:bookmarkEnd w:id="56"/>
     </w:p>
     <w:p/>
     <w:sectPr>

</xml_diff>

<commit_message>
1.updated memory wrapper; 2.modified axi sramc hdd
</commit_message>
<xml_diff>
--- a/axi_mem_controller/Project_GR001_IP_AXI_SRAMC_HDD.docx
+++ b/axi_mem_controller/Project_GR001_IP_AXI_SRAMC_HDD.docx
@@ -6546,7 +6546,114 @@
         <w:t>And then, it</w:t>
       </w:r>
       <w:r>
-        <w:t xml:space="preserve"> is sent to the downstream memory wrapper. </w:t>
+        <w:t xml:space="preserve"> is sent to the downstream </w:t>
+      </w:r>
+      <w:r>
+        <w:t>M</w:t>
+      </w:r>
+      <w:r>
+        <w:t xml:space="preserve">emory </w:t>
+      </w:r>
+      <w:r>
+        <w:t>W</w:t>
+      </w:r>
+      <w:r>
+        <w:t>rapper</w:t>
+      </w:r>
+      <w:r>
+        <w:rPr>
+          <w:rFonts w:eastAsiaTheme="minorEastAsia"/>
+        </w:rPr>
+        <w:t xml:space="preserve"> </w:t>
+      </w:r>
+      <w:r>
+        <w:t>(</w:t>
+      </w:r>
+      <w:r>
+        <w:rPr>
+          <w:rFonts w:eastAsiaTheme="minorEastAsia"/>
+        </w:rPr>
+        <w:t>See</w:t>
+      </w:r>
+      <w:r>
+        <w:rPr>
+          <w:rFonts w:eastAsiaTheme="minorEastAsia"/>
+        </w:rPr>
+        <w:t xml:space="preserve"> </w:t>
+      </w:r>
+      <w:r>
+        <w:rPr>
+          <w:rFonts w:eastAsiaTheme="minorEastAsia"/>
+        </w:rPr>
+        <w:t xml:space="preserve">Appendix Section </w:t>
+      </w:r>
+      <w:r>
+        <w:rPr>
+          <w:rFonts w:eastAsiaTheme="minorEastAsia"/>
+        </w:rPr>
+        <w:fldChar w:fldCharType="begin"/>
+      </w:r>
+      <w:r>
+        <w:rPr>
+          <w:rFonts w:eastAsiaTheme="minorEastAsia"/>
+        </w:rPr>
+        <w:instrText xml:space="preserve"> REF _Ref142643323 \r \h </w:instrText>
+      </w:r>
+      <w:r>
+        <w:rPr>
+          <w:rFonts w:eastAsiaTheme="minorEastAsia"/>
+        </w:rPr>
+      </w:r>
+      <w:r>
+        <w:rPr>
+          <w:rFonts w:eastAsiaTheme="minorEastAsia"/>
+        </w:rPr>
+        <w:fldChar w:fldCharType="separate"/>
+      </w:r>
+      <w:r>
+        <w:rPr>
+          <w:rFonts w:eastAsiaTheme="minorEastAsia"/>
+        </w:rPr>
+        <w:t>11.1</w:t>
+      </w:r>
+      <w:r>
+        <w:rPr>
+          <w:rFonts w:eastAsiaTheme="minorEastAsia"/>
+        </w:rPr>
+        <w:fldChar w:fldCharType="end"/>
+      </w:r>
+      <w:r>
+        <w:rPr>
+          <w:rFonts w:eastAsiaTheme="minorEastAsia"/>
+        </w:rPr>
+        <w:t xml:space="preserve"> </w:t>
+      </w:r>
+      <w:r>
+        <w:rPr>
+          <w:rFonts w:eastAsiaTheme="minorEastAsia"/>
+        </w:rPr>
+        <w:t xml:space="preserve">for relevant information on </w:t>
+      </w:r>
+      <w:r>
+        <w:t>M</w:t>
+      </w:r>
+      <w:r>
+        <w:t xml:space="preserve">emory </w:t>
+      </w:r>
+      <w:r>
+        <w:t>W</w:t>
+      </w:r>
+      <w:r>
+        <w:t>rapper</w:t>
+      </w:r>
+      <w:r>
+        <w:rPr>
+          <w:rFonts w:eastAsiaTheme="minorEastAsia"/>
+        </w:rPr>
+        <w:t>)</w:t>
+      </w:r>
+      <w:r>
+        <w:t xml:space="preserve">. </w:t>
       </w:r>
       <w:r>
         <w:t xml:space="preserve">In order to complete data error correction and improve robustness, an ECC module is used to encode written </w:t>
@@ -6657,7 +6764,14 @@
         <w:rPr>
           <w:rFonts w:eastAsiaTheme="minorEastAsia"/>
         </w:rPr>
-        <w:t xml:space="preserve"> needs to initiate a read operation to obtain complete write data before continuing the write operation</w:t>
+        <w:t xml:space="preserve"> needs to initiate a read operation to obtain complete write data before continuing the </w:t>
+      </w:r>
+      <w:r>
+        <w:rPr>
+          <w:rFonts w:eastAsiaTheme="minorEastAsia"/>
+        </w:rPr>
+        <w:lastRenderedPageBreak/>
+        <w:t>write operation</w:t>
       </w:r>
       <w:r>
         <w:rPr>
@@ -6675,7 +6789,6 @@
         <w:rPr>
           <w:rFonts w:hint="eastAsia"/>
         </w:rPr>
-        <w:lastRenderedPageBreak/>
         <w:t>H</w:t>
       </w:r>
       <w:r>
@@ -6821,10 +6934,7 @@
         <w:fldChar w:fldCharType="begin"/>
       </w:r>
       <w:r>
-        <w:instrText xml:space="preserve"> SEQ Figure \* ARABI</w:instrText>
-      </w:r>
-      <w:r>
-        <w:instrText xml:space="preserve">C \s 1 </w:instrText>
+        <w:instrText xml:space="preserve"> SEQ Figure \* ARABIC \s 1 </w:instrText>
       </w:r>
       <w:r>
         <w:fldChar w:fldCharType="separate"/>
@@ -6993,11 +7103,19 @@
         </w:rPr>
         <w:t>“</w:t>
       </w:r>
-      <w:r>
-        <w:rPr>
-          <w:rFonts w:eastAsiaTheme="minorEastAsia"/>
-        </w:rPr>
-        <w:t>wstrb==</w:t>
+      <w:proofErr w:type="spellStart"/>
+      <w:r>
+        <w:rPr>
+          <w:rFonts w:eastAsiaTheme="minorEastAsia"/>
+        </w:rPr>
+        <w:t>wstrb</w:t>
+      </w:r>
+      <w:proofErr w:type="spellEnd"/>
+      <w:r>
+        <w:rPr>
+          <w:rFonts w:eastAsiaTheme="minorEastAsia"/>
+        </w:rPr>
+        <w:t>==</w:t>
       </w:r>
       <w:r>
         <w:rPr>
@@ -7035,12 +7153,14 @@
         </w:rPr>
         <w:t>“</w:t>
       </w:r>
+      <w:proofErr w:type="spellStart"/>
       <w:r>
         <w:rPr>
           <w:rFonts w:eastAsiaTheme="minorEastAsia"/>
         </w:rPr>
         <w:t>wstrb</w:t>
       </w:r>
+      <w:proofErr w:type="spellEnd"/>
       <w:r>
         <w:rPr>
           <w:rFonts w:eastAsiaTheme="minorEastAsia"/>
@@ -7267,6 +7387,7 @@
                 <w:rFonts w:eastAsiaTheme="minorEastAsia"/>
               </w:rPr>
             </w:pPr>
+            <w:proofErr w:type="spellStart"/>
             <w:r>
               <w:rPr>
                 <w:rFonts w:eastAsiaTheme="minorEastAsia"/>
@@ -7279,6 +7400,7 @@
               </w:rPr>
               <w:t>lk</w:t>
             </w:r>
+            <w:proofErr w:type="spellEnd"/>
           </w:p>
         </w:tc>
         <w:tc>
@@ -7555,6 +7677,7 @@
             <w:tcW w:w="2763" w:type="dxa"/>
           </w:tcPr>
           <w:p>
+            <w:proofErr w:type="spellStart"/>
             <w:r>
               <w:rPr>
                 <w:rFonts w:hint="eastAsia"/>
@@ -7564,6 +7687,7 @@
             <w:r>
               <w:t>st_n</w:t>
             </w:r>
+            <w:proofErr w:type="spellEnd"/>
           </w:p>
         </w:tc>
         <w:tc>
@@ -7576,6 +7700,7 @@
                 <w:rFonts w:eastAsiaTheme="minorEastAsia"/>
               </w:rPr>
             </w:pPr>
+            <w:proofErr w:type="spellStart"/>
             <w:r>
               <w:rPr>
                 <w:rFonts w:eastAsiaTheme="minorEastAsia" w:hint="eastAsia"/>
@@ -7588,6 +7713,7 @@
               </w:rPr>
               <w:t>lk</w:t>
             </w:r>
+            <w:proofErr w:type="spellEnd"/>
           </w:p>
         </w:tc>
         <w:tc>
@@ -7721,6 +7847,7 @@
         <w:rPr>
           <w:rFonts w:hint="eastAsia"/>
         </w:rPr>
+        <w:lastRenderedPageBreak/>
         <w:t>I</w:t>
       </w:r>
       <w:r>
@@ -7742,16 +7869,7 @@
           <w:iCs/>
           <w:color w:val="0070C0"/>
         </w:rPr>
-        <w:t xml:space="preserve">Please give the fully I/O interfaces in the interface table, the interfaces can be divided </w:t>
-      </w:r>
-      <w:r>
-        <w:rPr>
-          <w:i/>
-          <w:iCs/>
-          <w:color w:val="0070C0"/>
-        </w:rPr>
-        <w:lastRenderedPageBreak/>
-        <w:t>into different groups such as:</w:t>
+        <w:t>Please give the fully I/O interfaces in the interface table, the interfaces can be divided into different groups such as:</w:t>
       </w:r>
     </w:p>
     <w:p>
@@ -7892,13 +8010,23 @@
           <w:color w:val="0070C0"/>
         </w:rPr>
       </w:pPr>
+      <w:proofErr w:type="spellStart"/>
       <w:r>
         <w:rPr>
           <w:i/>
           <w:iCs/>
           <w:color w:val="0070C0"/>
         </w:rPr>
-        <w:t>Etcs.</w:t>
+        <w:t>Etcs</w:t>
+      </w:r>
+      <w:proofErr w:type="spellEnd"/>
+      <w:r>
+        <w:rPr>
+          <w:i/>
+          <w:iCs/>
+          <w:color w:val="0070C0"/>
+        </w:rPr>
+        <w:t>.</w:t>
       </w:r>
     </w:p>
     <w:p/>
@@ -8039,6 +8167,7 @@
             <w:pPr>
               <w:jc w:val="center"/>
             </w:pPr>
+            <w:proofErr w:type="spellStart"/>
             <w:r>
               <w:rPr>
                 <w:rFonts w:hint="eastAsia"/>
@@ -8048,6 +8177,7 @@
             <w:r>
               <w:t>lk</w:t>
             </w:r>
+            <w:proofErr w:type="spellEnd"/>
           </w:p>
         </w:tc>
         <w:tc>
@@ -8128,6 +8258,7 @@
             <w:pPr>
               <w:jc w:val="center"/>
             </w:pPr>
+            <w:proofErr w:type="spellStart"/>
             <w:r>
               <w:rPr>
                 <w:rFonts w:hint="eastAsia"/>
@@ -8137,6 +8268,7 @@
             <w:r>
               <w:t>st_n</w:t>
             </w:r>
+            <w:proofErr w:type="spellEnd"/>
           </w:p>
         </w:tc>
         <w:tc>
@@ -8231,6 +8363,7 @@
                 <w:rFonts w:eastAsiaTheme="minorEastAsia"/>
               </w:rPr>
             </w:pPr>
+            <w:proofErr w:type="spellStart"/>
             <w:r>
               <w:rPr>
                 <w:rFonts w:eastAsiaTheme="minorEastAsia"/>
@@ -8249,6 +8382,7 @@
               </w:rPr>
               <w:t>aild</w:t>
             </w:r>
+            <w:proofErr w:type="spellEnd"/>
           </w:p>
         </w:tc>
         <w:tc>
@@ -8330,6 +8464,7 @@
                 <w:rFonts w:eastAsiaTheme="minorEastAsia"/>
               </w:rPr>
             </w:pPr>
+            <w:proofErr w:type="spellStart"/>
             <w:r>
               <w:rPr>
                 <w:rFonts w:eastAsiaTheme="minorEastAsia" w:hint="eastAsia"/>
@@ -8342,6 +8477,7 @@
               </w:rPr>
               <w:t>wready</w:t>
             </w:r>
+            <w:proofErr w:type="spellEnd"/>
           </w:p>
         </w:tc>
         <w:tc>
@@ -8426,6 +8562,7 @@
                 <w:szCs w:val="20"/>
               </w:rPr>
             </w:pPr>
+            <w:proofErr w:type="spellStart"/>
             <w:r>
               <w:rPr>
                 <w:rFonts w:eastAsiaTheme="minorEastAsia" w:hint="eastAsia"/>
@@ -8438,6 +8575,7 @@
               </w:rPr>
               <w:t>wid</w:t>
             </w:r>
+            <w:proofErr w:type="spellEnd"/>
           </w:p>
         </w:tc>
         <w:tc>
@@ -8514,6 +8652,7 @@
                 <w:szCs w:val="20"/>
               </w:rPr>
             </w:pPr>
+            <w:proofErr w:type="spellStart"/>
             <w:r>
               <w:rPr>
                 <w:rFonts w:eastAsiaTheme="minorEastAsia" w:hint="eastAsia"/>
@@ -8526,6 +8665,7 @@
               </w:rPr>
               <w:t>waddr</w:t>
             </w:r>
+            <w:proofErr w:type="spellEnd"/>
           </w:p>
         </w:tc>
         <w:tc>
@@ -8605,6 +8745,7 @@
                 <w:rFonts w:eastAsiaTheme="minorEastAsia"/>
               </w:rPr>
             </w:pPr>
+            <w:proofErr w:type="spellStart"/>
             <w:r>
               <w:rPr>
                 <w:rFonts w:eastAsiaTheme="minorEastAsia" w:hint="eastAsia"/>
@@ -8617,6 +8758,7 @@
               </w:rPr>
               <w:t>wlen</w:t>
             </w:r>
+            <w:proofErr w:type="spellEnd"/>
           </w:p>
         </w:tc>
         <w:tc>
@@ -8693,6 +8835,7 @@
                 <w:rFonts w:eastAsiaTheme="minorEastAsia"/>
               </w:rPr>
             </w:pPr>
+            <w:proofErr w:type="spellStart"/>
             <w:r>
               <w:rPr>
                 <w:rFonts w:eastAsiaTheme="minorEastAsia" w:hint="eastAsia"/>
@@ -8705,6 +8848,7 @@
               </w:rPr>
               <w:t>wsize</w:t>
             </w:r>
+            <w:proofErr w:type="spellEnd"/>
           </w:p>
         </w:tc>
         <w:tc>
@@ -8778,6 +8922,7 @@
                 <w:rFonts w:eastAsiaTheme="minorEastAsia"/>
               </w:rPr>
             </w:pPr>
+            <w:proofErr w:type="spellStart"/>
             <w:r>
               <w:rPr>
                 <w:rFonts w:eastAsiaTheme="minorEastAsia" w:hint="eastAsia"/>
@@ -8790,6 +8935,7 @@
               </w:rPr>
               <w:t>wburst</w:t>
             </w:r>
+            <w:proofErr w:type="spellEnd"/>
           </w:p>
         </w:tc>
         <w:tc>
@@ -8880,6 +9026,7 @@
                 <w:rFonts w:eastAsiaTheme="minorEastAsia"/>
               </w:rPr>
             </w:pPr>
+            <w:proofErr w:type="spellStart"/>
             <w:r>
               <w:rPr>
                 <w:rFonts w:eastAsiaTheme="minorEastAsia" w:hint="eastAsia"/>
@@ -8892,6 +9039,7 @@
               </w:rPr>
               <w:t>wcache</w:t>
             </w:r>
+            <w:proofErr w:type="spellEnd"/>
           </w:p>
         </w:tc>
         <w:tc>
@@ -8962,6 +9110,7 @@
                 <w:rFonts w:eastAsiaTheme="minorEastAsia"/>
               </w:rPr>
             </w:pPr>
+            <w:proofErr w:type="spellStart"/>
             <w:r>
               <w:rPr>
                 <w:rFonts w:eastAsiaTheme="minorEastAsia" w:hint="eastAsia"/>
@@ -8974,6 +9123,7 @@
               </w:rPr>
               <w:t>wprot</w:t>
             </w:r>
+            <w:proofErr w:type="spellEnd"/>
           </w:p>
         </w:tc>
         <w:tc>
@@ -9044,6 +9194,7 @@
                 <w:rFonts w:eastAsiaTheme="minorEastAsia"/>
               </w:rPr>
             </w:pPr>
+            <w:proofErr w:type="spellStart"/>
             <w:r>
               <w:rPr>
                 <w:rFonts w:eastAsiaTheme="minorEastAsia" w:hint="eastAsia"/>
@@ -9056,6 +9207,7 @@
               </w:rPr>
               <w:t>wqos</w:t>
             </w:r>
+            <w:proofErr w:type="spellEnd"/>
           </w:p>
         </w:tc>
         <w:tc>
@@ -9129,6 +9281,7 @@
                 <w:szCs w:val="20"/>
               </w:rPr>
             </w:pPr>
+            <w:proofErr w:type="spellStart"/>
             <w:r>
               <w:rPr>
                 <w:rFonts w:eastAsiaTheme="minorEastAsia"/>
@@ -9147,6 +9300,7 @@
               </w:rPr>
               <w:t>user</w:t>
             </w:r>
+            <w:proofErr w:type="spellEnd"/>
           </w:p>
         </w:tc>
         <w:tc>
@@ -9220,6 +9374,7 @@
                 <w:rFonts w:eastAsiaTheme="minorEastAsia"/>
               </w:rPr>
             </w:pPr>
+            <w:proofErr w:type="spellStart"/>
             <w:r>
               <w:rPr>
                 <w:rFonts w:eastAsiaTheme="minorEastAsia" w:hint="eastAsia"/>
@@ -9232,6 +9387,7 @@
               </w:rPr>
               <w:t>valid</w:t>
             </w:r>
+            <w:proofErr w:type="spellEnd"/>
           </w:p>
         </w:tc>
         <w:tc>
@@ -9305,6 +9461,7 @@
                 <w:rFonts w:eastAsiaTheme="minorEastAsia"/>
               </w:rPr>
             </w:pPr>
+            <w:proofErr w:type="spellStart"/>
             <w:r>
               <w:rPr>
                 <w:rFonts w:eastAsiaTheme="minorEastAsia" w:hint="eastAsia"/>
@@ -9317,6 +9474,7 @@
               </w:rPr>
               <w:t>ready</w:t>
             </w:r>
+            <w:proofErr w:type="spellEnd"/>
           </w:p>
         </w:tc>
         <w:tc>
@@ -9393,6 +9551,7 @@
                 <w:szCs w:val="20"/>
               </w:rPr>
             </w:pPr>
+            <w:proofErr w:type="spellStart"/>
             <w:r>
               <w:rPr>
                 <w:rFonts w:eastAsiaTheme="minorEastAsia" w:hint="eastAsia"/>
@@ -9405,6 +9564,7 @@
               </w:rPr>
               <w:t>data</w:t>
             </w:r>
+            <w:proofErr w:type="spellEnd"/>
           </w:p>
         </w:tc>
         <w:tc>
@@ -9481,6 +9641,7 @@
                 <w:szCs w:val="20"/>
               </w:rPr>
             </w:pPr>
+            <w:proofErr w:type="spellStart"/>
             <w:r>
               <w:rPr>
                 <w:rFonts w:eastAsiaTheme="minorEastAsia" w:hint="eastAsia"/>
@@ -9493,6 +9654,7 @@
               </w:rPr>
               <w:t>strb</w:t>
             </w:r>
+            <w:proofErr w:type="spellEnd"/>
           </w:p>
         </w:tc>
         <w:tc>
@@ -9568,6 +9730,7 @@
                 <w:rFonts w:eastAsiaTheme="minorEastAsia"/>
               </w:rPr>
             </w:pPr>
+            <w:proofErr w:type="spellStart"/>
             <w:r>
               <w:rPr>
                 <w:rFonts w:eastAsiaTheme="minorEastAsia" w:hint="eastAsia"/>
@@ -9580,6 +9743,7 @@
               </w:rPr>
               <w:t>last</w:t>
             </w:r>
+            <w:proofErr w:type="spellEnd"/>
           </w:p>
         </w:tc>
         <w:tc>
@@ -9653,6 +9817,7 @@
                 <w:rFonts w:eastAsiaTheme="minorEastAsia"/>
               </w:rPr>
             </w:pPr>
+            <w:proofErr w:type="spellStart"/>
             <w:r>
               <w:rPr>
                 <w:rFonts w:eastAsiaTheme="minorEastAsia" w:hint="eastAsia"/>
@@ -9665,6 +9830,7 @@
               </w:rPr>
               <w:t>vaild</w:t>
             </w:r>
+            <w:proofErr w:type="spellEnd"/>
           </w:p>
         </w:tc>
         <w:tc>
@@ -9914,6 +10080,7 @@
                 <w:rFonts w:eastAsiaTheme="minorEastAsia"/>
               </w:rPr>
             </w:pPr>
+            <w:proofErr w:type="spellStart"/>
             <w:r>
               <w:rPr>
                 <w:rFonts w:eastAsiaTheme="minorEastAsia" w:hint="eastAsia"/>
@@ -9926,6 +10093,7 @@
               </w:rPr>
               <w:t>resp</w:t>
             </w:r>
+            <w:proofErr w:type="spellEnd"/>
           </w:p>
         </w:tc>
         <w:tc>
@@ -9999,6 +10167,7 @@
                 <w:rFonts w:eastAsiaTheme="minorEastAsia"/>
               </w:rPr>
             </w:pPr>
+            <w:proofErr w:type="spellStart"/>
             <w:r>
               <w:rPr>
                 <w:rFonts w:eastAsiaTheme="minorEastAsia"/>
@@ -10017,6 +10186,7 @@
               </w:rPr>
               <w:t>aild</w:t>
             </w:r>
+            <w:proofErr w:type="spellEnd"/>
           </w:p>
         </w:tc>
         <w:tc>
@@ -10093,6 +10263,7 @@
                 <w:rFonts w:eastAsiaTheme="minorEastAsia"/>
               </w:rPr>
             </w:pPr>
+            <w:proofErr w:type="spellStart"/>
             <w:r>
               <w:rPr>
                 <w:rFonts w:eastAsiaTheme="minorEastAsia" w:hint="eastAsia"/>
@@ -10105,6 +10276,7 @@
               </w:rPr>
               <w:t>rready</w:t>
             </w:r>
+            <w:proofErr w:type="spellEnd"/>
           </w:p>
         </w:tc>
         <w:tc>
@@ -10278,6 +10450,7 @@
                 <w:szCs w:val="20"/>
               </w:rPr>
             </w:pPr>
+            <w:proofErr w:type="spellStart"/>
             <w:r>
               <w:rPr>
                 <w:rFonts w:eastAsiaTheme="minorEastAsia" w:hint="eastAsia"/>
@@ -10290,6 +10463,7 @@
               </w:rPr>
               <w:t>raddr</w:t>
             </w:r>
+            <w:proofErr w:type="spellEnd"/>
           </w:p>
         </w:tc>
         <w:tc>
@@ -10363,6 +10537,7 @@
                 <w:rFonts w:eastAsiaTheme="minorEastAsia"/>
               </w:rPr>
             </w:pPr>
+            <w:proofErr w:type="spellStart"/>
             <w:r>
               <w:rPr>
                 <w:rFonts w:eastAsiaTheme="minorEastAsia" w:hint="eastAsia"/>
@@ -10375,6 +10550,7 @@
               </w:rPr>
               <w:t>rlen</w:t>
             </w:r>
+            <w:proofErr w:type="spellEnd"/>
           </w:p>
         </w:tc>
         <w:tc>
@@ -10445,6 +10621,7 @@
                 <w:rFonts w:eastAsiaTheme="minorEastAsia"/>
               </w:rPr>
             </w:pPr>
+            <w:proofErr w:type="spellStart"/>
             <w:r>
               <w:rPr>
                 <w:rFonts w:eastAsiaTheme="minorEastAsia" w:hint="eastAsia"/>
@@ -10457,6 +10634,7 @@
               </w:rPr>
               <w:t>rsize</w:t>
             </w:r>
+            <w:proofErr w:type="spellEnd"/>
           </w:p>
         </w:tc>
         <w:tc>
@@ -10527,6 +10705,7 @@
                 <w:rFonts w:eastAsiaTheme="minorEastAsia"/>
               </w:rPr>
             </w:pPr>
+            <w:proofErr w:type="spellStart"/>
             <w:r>
               <w:rPr>
                 <w:rFonts w:eastAsiaTheme="minorEastAsia" w:hint="eastAsia"/>
@@ -10539,6 +10718,7 @@
               </w:rPr>
               <w:t>rburst</w:t>
             </w:r>
+            <w:proofErr w:type="spellEnd"/>
           </w:p>
         </w:tc>
         <w:tc>
@@ -10621,6 +10801,7 @@
                 <w:rFonts w:eastAsiaTheme="minorEastAsia"/>
               </w:rPr>
             </w:pPr>
+            <w:proofErr w:type="spellStart"/>
             <w:r>
               <w:rPr>
                 <w:rFonts w:eastAsiaTheme="minorEastAsia" w:hint="eastAsia"/>
@@ -10633,6 +10814,7 @@
               </w:rPr>
               <w:t>rcache</w:t>
             </w:r>
+            <w:proofErr w:type="spellEnd"/>
           </w:p>
         </w:tc>
         <w:tc>
@@ -10700,6 +10882,7 @@
                 <w:rFonts w:eastAsiaTheme="minorEastAsia"/>
               </w:rPr>
             </w:pPr>
+            <w:proofErr w:type="spellStart"/>
             <w:r>
               <w:rPr>
                 <w:rFonts w:eastAsiaTheme="minorEastAsia" w:hint="eastAsia"/>
@@ -10712,6 +10895,7 @@
               </w:rPr>
               <w:t>rprot</w:t>
             </w:r>
+            <w:proofErr w:type="spellEnd"/>
           </w:p>
         </w:tc>
         <w:tc>
@@ -10779,6 +10963,7 @@
                 <w:rFonts w:eastAsiaTheme="minorEastAsia"/>
               </w:rPr>
             </w:pPr>
+            <w:proofErr w:type="spellStart"/>
             <w:r>
               <w:rPr>
                 <w:rFonts w:eastAsiaTheme="minorEastAsia" w:hint="eastAsia"/>
@@ -10791,6 +10976,7 @@
               </w:rPr>
               <w:t>rqos</w:t>
             </w:r>
+            <w:proofErr w:type="spellEnd"/>
           </w:p>
         </w:tc>
         <w:tc>
@@ -10861,12 +11047,14 @@
                 <w:szCs w:val="20"/>
               </w:rPr>
             </w:pPr>
+            <w:proofErr w:type="spellStart"/>
             <w:r>
               <w:rPr>
                 <w:rFonts w:eastAsiaTheme="minorEastAsia"/>
               </w:rPr>
               <w:t>aruser</w:t>
             </w:r>
+            <w:proofErr w:type="spellEnd"/>
           </w:p>
         </w:tc>
         <w:tc>
@@ -10940,6 +11128,7 @@
                 <w:szCs w:val="20"/>
               </w:rPr>
             </w:pPr>
+            <w:proofErr w:type="spellStart"/>
             <w:r>
               <w:rPr>
                 <w:rFonts w:eastAsiaTheme="minorEastAsia" w:hint="eastAsia"/>
@@ -10952,6 +11141,7 @@
               </w:rPr>
               <w:t>vaild</w:t>
             </w:r>
+            <w:proofErr w:type="spellEnd"/>
           </w:p>
         </w:tc>
         <w:tc>
@@ -11034,6 +11224,7 @@
                 <w:szCs w:val="20"/>
               </w:rPr>
             </w:pPr>
+            <w:proofErr w:type="spellStart"/>
             <w:r>
               <w:rPr>
                 <w:rFonts w:eastAsiaTheme="minorEastAsia" w:hint="eastAsia"/>
@@ -11046,6 +11237,7 @@
               </w:rPr>
               <w:t>ready</w:t>
             </w:r>
+            <w:proofErr w:type="spellEnd"/>
           </w:p>
         </w:tc>
         <w:tc>
@@ -11222,6 +11414,7 @@
                 <w:szCs w:val="20"/>
               </w:rPr>
             </w:pPr>
+            <w:proofErr w:type="spellStart"/>
             <w:r>
               <w:rPr>
                 <w:rFonts w:eastAsiaTheme="minorEastAsia" w:hint="eastAsia"/>
@@ -11234,6 +11427,7 @@
               </w:rPr>
               <w:t>data</w:t>
             </w:r>
+            <w:proofErr w:type="spellEnd"/>
           </w:p>
         </w:tc>
         <w:tc>
@@ -11316,6 +11510,7 @@
                 <w:szCs w:val="20"/>
               </w:rPr>
             </w:pPr>
+            <w:proofErr w:type="spellStart"/>
             <w:r>
               <w:rPr>
                 <w:rFonts w:eastAsiaTheme="minorEastAsia" w:hint="eastAsia"/>
@@ -11328,6 +11523,7 @@
               </w:rPr>
               <w:t>resp</w:t>
             </w:r>
+            <w:proofErr w:type="spellEnd"/>
           </w:p>
         </w:tc>
         <w:tc>
@@ -11410,6 +11606,7 @@
                 <w:szCs w:val="20"/>
               </w:rPr>
             </w:pPr>
+            <w:proofErr w:type="spellStart"/>
             <w:r>
               <w:rPr>
                 <w:rFonts w:eastAsiaTheme="minorEastAsia" w:hint="eastAsia"/>
@@ -11422,6 +11619,7 @@
               </w:rPr>
               <w:t>last</w:t>
             </w:r>
+            <w:proofErr w:type="spellEnd"/>
           </w:p>
         </w:tc>
         <w:tc>
@@ -11522,6 +11720,7 @@
                 <w:szCs w:val="20"/>
               </w:rPr>
             </w:pPr>
+            <w:proofErr w:type="spellStart"/>
             <w:r>
               <w:rPr>
                 <w:rFonts w:eastAsiaTheme="minorEastAsia" w:hint="eastAsia"/>
@@ -11534,6 +11733,7 @@
               </w:rPr>
               <w:t>vaild</w:t>
             </w:r>
+            <w:proofErr w:type="spellEnd"/>
           </w:p>
         </w:tc>
         <w:tc>
@@ -11624,6 +11824,7 @@
                 <w:szCs w:val="20"/>
               </w:rPr>
             </w:pPr>
+            <w:proofErr w:type="spellStart"/>
             <w:r>
               <w:rPr>
                 <w:rFonts w:eastAsiaTheme="minorEastAsia" w:hint="eastAsia"/>
@@ -11636,6 +11837,7 @@
               </w:rPr>
               <w:t>iready</w:t>
             </w:r>
+            <w:proofErr w:type="spellEnd"/>
           </w:p>
         </w:tc>
         <w:tc>
@@ -11718,6 +11920,7 @@
                 <w:rFonts w:eastAsiaTheme="minorEastAsia"/>
               </w:rPr>
             </w:pPr>
+            <w:proofErr w:type="spellStart"/>
             <w:r>
               <w:rPr>
                 <w:rFonts w:eastAsiaTheme="minorEastAsia" w:hint="eastAsia"/>
@@ -11730,6 +11933,7 @@
               </w:rPr>
               <w:t>ipayload</w:t>
             </w:r>
+            <w:proofErr w:type="spellEnd"/>
           </w:p>
         </w:tc>
         <w:tc>
@@ -11862,6 +12066,7 @@
                 <w:szCs w:val="20"/>
               </w:rPr>
             </w:pPr>
+            <w:proofErr w:type="spellStart"/>
             <w:r>
               <w:rPr>
                 <w:rFonts w:ascii="Arial" w:eastAsiaTheme="minorEastAsia" w:hAnsi="Arial" w:cs="Arial" w:hint="eastAsia"/>
@@ -11880,6 +12085,7 @@
               </w:rPr>
               <w:t>mw</w:t>
             </w:r>
+            <w:proofErr w:type="spellEnd"/>
           </w:p>
         </w:tc>
         <w:tc>
@@ -11972,6 +12178,7 @@
                 <w:szCs w:val="20"/>
               </w:rPr>
             </w:pPr>
+            <w:proofErr w:type="spellStart"/>
             <w:r>
               <w:rPr>
                 <w:rFonts w:ascii="Arial" w:eastAsiaTheme="minorEastAsia" w:hAnsi="Arial" w:cs="Arial" w:hint="eastAsia"/>
@@ -11990,6 +12197,7 @@
               </w:rPr>
               <w:t>xid</w:t>
             </w:r>
+            <w:proofErr w:type="spellEnd"/>
           </w:p>
         </w:tc>
         <w:tc>
@@ -12094,6 +12302,7 @@
                 <w:szCs w:val="20"/>
               </w:rPr>
             </w:pPr>
+            <w:proofErr w:type="spellStart"/>
             <w:r>
               <w:rPr>
                 <w:rFonts w:ascii="Arial" w:eastAsiaTheme="minorEastAsia" w:hAnsi="Arial" w:cs="Arial" w:hint="eastAsia"/>
@@ -12112,6 +12321,7 @@
               </w:rPr>
               <w:t>ddr</w:t>
             </w:r>
+            <w:proofErr w:type="spellEnd"/>
           </w:p>
         </w:tc>
         <w:tc>
@@ -12551,6 +12761,7 @@
                 <w:szCs w:val="20"/>
               </w:rPr>
             </w:pPr>
+            <w:proofErr w:type="spellStart"/>
             <w:r>
               <w:rPr>
                 <w:rFonts w:eastAsiaTheme="minorEastAsia" w:hint="eastAsia"/>
@@ -12563,6 +12774,7 @@
               </w:rPr>
               <w:t>ovaild</w:t>
             </w:r>
+            <w:proofErr w:type="spellEnd"/>
           </w:p>
         </w:tc>
         <w:tc>
@@ -12648,6 +12860,7 @@
                 <w:szCs w:val="20"/>
               </w:rPr>
             </w:pPr>
+            <w:proofErr w:type="spellStart"/>
             <w:r>
               <w:rPr>
                 <w:rFonts w:eastAsiaTheme="minorEastAsia" w:hint="eastAsia"/>
@@ -12660,6 +12873,7 @@
               </w:rPr>
               <w:t>oready</w:t>
             </w:r>
+            <w:proofErr w:type="spellEnd"/>
           </w:p>
         </w:tc>
         <w:tc>
@@ -12742,6 +12956,7 @@
                 <w:rFonts w:eastAsiaTheme="minorEastAsia"/>
               </w:rPr>
             </w:pPr>
+            <w:proofErr w:type="spellStart"/>
             <w:r>
               <w:rPr>
                 <w:rFonts w:eastAsiaTheme="minorEastAsia" w:hint="eastAsia"/>
@@ -12754,6 +12969,7 @@
               </w:rPr>
               <w:t>opayload</w:t>
             </w:r>
+            <w:proofErr w:type="spellEnd"/>
           </w:p>
         </w:tc>
         <w:tc>
@@ -12886,6 +13102,7 @@
                 <w:szCs w:val="20"/>
               </w:rPr>
             </w:pPr>
+            <w:proofErr w:type="spellStart"/>
             <w:r>
               <w:rPr>
                 <w:rFonts w:ascii="Arial" w:eastAsiaTheme="minorEastAsia" w:hAnsi="Arial" w:cs="Arial" w:hint="eastAsia"/>
@@ -12904,6 +13121,7 @@
               </w:rPr>
               <w:t>mw</w:t>
             </w:r>
+            <w:proofErr w:type="spellEnd"/>
           </w:p>
         </w:tc>
         <w:tc>
@@ -12996,6 +13214,7 @@
                 <w:szCs w:val="20"/>
               </w:rPr>
             </w:pPr>
+            <w:proofErr w:type="spellStart"/>
             <w:r>
               <w:rPr>
                 <w:rFonts w:ascii="Arial" w:eastAsiaTheme="minorEastAsia" w:hAnsi="Arial" w:cs="Arial" w:hint="eastAsia"/>
@@ -13014,6 +13233,7 @@
               </w:rPr>
               <w:t>xid</w:t>
             </w:r>
+            <w:proofErr w:type="spellEnd"/>
           </w:p>
         </w:tc>
         <w:tc>
@@ -13101,6 +13321,139 @@
               <w:jc w:val="center"/>
               <w:rPr>
                 <w:rFonts w:ascii="Arial" w:eastAsiaTheme="minorEastAsia" w:hAnsi="Arial" w:cs="Arial"/>
+                <w:strike/>
+                <w:kern w:val="0"/>
+                <w:sz w:val="20"/>
+                <w:szCs w:val="20"/>
+              </w:rPr>
+            </w:pPr>
+            <w:proofErr w:type="spellStart"/>
+            <w:r>
+              <w:rPr>
+                <w:rFonts w:ascii="Arial" w:eastAsiaTheme="minorEastAsia" w:hAnsi="Arial" w:cs="Arial" w:hint="eastAsia"/>
+                <w:strike/>
+                <w:kern w:val="0"/>
+                <w:sz w:val="20"/>
+                <w:szCs w:val="20"/>
+              </w:rPr>
+              <w:t>a</w:t>
+            </w:r>
+            <w:r>
+              <w:rPr>
+                <w:rFonts w:ascii="Arial" w:eastAsiaTheme="minorEastAsia" w:hAnsi="Arial" w:cs="Arial"/>
+                <w:strike/>
+                <w:kern w:val="0"/>
+                <w:sz w:val="20"/>
+                <w:szCs w:val="20"/>
+              </w:rPr>
+              <w:t>ddr</w:t>
+            </w:r>
+            <w:proofErr w:type="spellEnd"/>
+          </w:p>
+        </w:tc>
+        <w:tc>
+          <w:tcPr>
+            <w:tcW w:w="1306" w:type="dxa"/>
+            <w:vAlign w:val="center"/>
+          </w:tcPr>
+          <w:p>
+            <w:pPr>
+              <w:jc w:val="center"/>
+              <w:rPr>
+                <w:rFonts w:ascii="Arial" w:eastAsiaTheme="minorEastAsia" w:hAnsi="Arial" w:cs="Arial"/>
+                <w:strike/>
+                <w:kern w:val="0"/>
+                <w:sz w:val="20"/>
+                <w:szCs w:val="20"/>
+              </w:rPr>
+            </w:pPr>
+            <w:r>
+              <w:rPr>
+                <w:rFonts w:ascii="Arial" w:eastAsiaTheme="minorEastAsia" w:hAnsi="Arial" w:cs="Arial"/>
+                <w:strike/>
+                <w:kern w:val="0"/>
+                <w:sz w:val="20"/>
+                <w:szCs w:val="20"/>
+              </w:rPr>
+              <w:t>configurable</w:t>
+            </w:r>
+          </w:p>
+        </w:tc>
+        <w:tc>
+          <w:tcPr>
+            <w:tcW w:w="619" w:type="dxa"/>
+            <w:vMerge/>
+            <w:vAlign w:val="center"/>
+          </w:tcPr>
+          <w:p>
+            <w:pPr>
+              <w:jc w:val="center"/>
+              <w:rPr>
+                <w:rFonts w:eastAsiaTheme="minorEastAsia"/>
+                <w:strike/>
+              </w:rPr>
+            </w:pPr>
+          </w:p>
+        </w:tc>
+        <w:tc>
+          <w:tcPr>
+            <w:tcW w:w="2371" w:type="dxa"/>
+          </w:tcPr>
+          <w:p>
+            <w:pPr>
+              <w:rPr>
+                <w:strike/>
+              </w:rPr>
+            </w:pPr>
+            <w:r>
+              <w:rPr>
+                <w:rFonts w:eastAsiaTheme="minorEastAsia"/>
+                <w:strike/>
+              </w:rPr>
+              <w:t xml:space="preserve">Address of this </w:t>
+            </w:r>
+            <w:proofErr w:type="spellStart"/>
+            <w:r>
+              <w:rPr>
+                <w:rFonts w:eastAsiaTheme="minorEastAsia"/>
+                <w:strike/>
+              </w:rPr>
+              <w:t>rdata</w:t>
+            </w:r>
+            <w:proofErr w:type="spellEnd"/>
+          </w:p>
+        </w:tc>
+      </w:tr>
+      <w:tr>
+        <w:tc>
+          <w:tcPr>
+            <w:tcW w:w="1209" w:type="dxa"/>
+            <w:vMerge/>
+          </w:tcPr>
+          <w:p/>
+        </w:tc>
+        <w:tc>
+          <w:tcPr>
+            <w:tcW w:w="2016" w:type="dxa"/>
+            <w:vMerge/>
+          </w:tcPr>
+          <w:p>
+            <w:pPr>
+              <w:rPr>
+                <w:rFonts w:eastAsiaTheme="minorEastAsia"/>
+              </w:rPr>
+            </w:pPr>
+          </w:p>
+        </w:tc>
+        <w:tc>
+          <w:tcPr>
+            <w:tcW w:w="769" w:type="dxa"/>
+          </w:tcPr>
+          <w:p>
+            <w:pPr>
+              <w:jc w:val="center"/>
+              <w:rPr>
+                <w:rFonts w:ascii="Arial" w:eastAsiaTheme="minorEastAsia" w:hAnsi="Arial" w:cs="Arial"/>
                 <w:kern w:val="0"/>
                 <w:sz w:val="20"/>
                 <w:szCs w:val="20"/>
@@ -13113,7 +13466,7 @@
                 <w:sz w:val="20"/>
                 <w:szCs w:val="20"/>
               </w:rPr>
-              <w:t>a</w:t>
+              <w:t>l</w:t>
             </w:r>
             <w:r>
               <w:rPr>
@@ -13122,7 +13475,7 @@
                 <w:sz w:val="20"/>
                 <w:szCs w:val="20"/>
               </w:rPr>
-              <w:t>ddr</w:t>
+              <w:t>ast</w:t>
             </w:r>
           </w:p>
         </w:tc>
@@ -13143,122 +13496,438 @@
             </w:pPr>
             <w:r>
               <w:rPr>
+                <w:rFonts w:ascii="Arial" w:eastAsiaTheme="minorEastAsia" w:hAnsi="Arial" w:cs="Arial" w:hint="eastAsia"/>
+                <w:kern w:val="0"/>
+                <w:sz w:val="20"/>
+                <w:szCs w:val="20"/>
+              </w:rPr>
+              <w:t>1</w:t>
+            </w:r>
+          </w:p>
+        </w:tc>
+        <w:tc>
+          <w:tcPr>
+            <w:tcW w:w="619" w:type="dxa"/>
+            <w:vMerge/>
+            <w:vAlign w:val="center"/>
+          </w:tcPr>
+          <w:p>
+            <w:pPr>
+              <w:jc w:val="center"/>
+              <w:rPr>
+                <w:rFonts w:eastAsiaTheme="minorEastAsia"/>
+              </w:rPr>
+            </w:pPr>
+          </w:p>
+        </w:tc>
+        <w:tc>
+          <w:tcPr>
+            <w:tcW w:w="2371" w:type="dxa"/>
+          </w:tcPr>
+          <w:p>
+            <w:r>
+              <w:rPr>
+                <w:rFonts w:eastAsiaTheme="minorEastAsia"/>
+              </w:rPr>
+              <w:t xml:space="preserve">Last burst </w:t>
+            </w:r>
+            <w:r>
+              <w:rPr>
+                <w:rFonts w:eastAsiaTheme="minorEastAsia" w:hint="eastAsia"/>
+              </w:rPr>
+              <w:t>transfer</w:t>
+            </w:r>
+            <w:r>
+              <w:rPr>
+                <w:rFonts w:eastAsiaTheme="minorEastAsia"/>
+              </w:rPr>
+              <w:t xml:space="preserve"> flag</w:t>
+            </w:r>
+          </w:p>
+        </w:tc>
+      </w:tr>
+      <w:tr>
+        <w:tc>
+          <w:tcPr>
+            <w:tcW w:w="1209" w:type="dxa"/>
+            <w:vMerge/>
+          </w:tcPr>
+          <w:p/>
+        </w:tc>
+        <w:tc>
+          <w:tcPr>
+            <w:tcW w:w="2016" w:type="dxa"/>
+            <w:vMerge/>
+          </w:tcPr>
+          <w:p>
+            <w:pPr>
+              <w:rPr>
+                <w:rFonts w:eastAsiaTheme="minorEastAsia"/>
+              </w:rPr>
+            </w:pPr>
+          </w:p>
+        </w:tc>
+        <w:tc>
+          <w:tcPr>
+            <w:tcW w:w="769" w:type="dxa"/>
+          </w:tcPr>
+          <w:p>
+            <w:pPr>
+              <w:jc w:val="center"/>
+              <w:rPr>
                 <w:rFonts w:ascii="Arial" w:eastAsiaTheme="minorEastAsia" w:hAnsi="Arial" w:cs="Arial"/>
                 <w:kern w:val="0"/>
                 <w:sz w:val="20"/>
                 <w:szCs w:val="20"/>
               </w:rPr>
-              <w:t>configurable</w:t>
-            </w:r>
-          </w:p>
-        </w:tc>
-        <w:tc>
-          <w:tcPr>
-            <w:tcW w:w="619" w:type="dxa"/>
-            <w:vMerge/>
-            <w:vAlign w:val="center"/>
-          </w:tcPr>
-          <w:p>
-            <w:pPr>
-              <w:jc w:val="center"/>
-              <w:rPr>
-                <w:rFonts w:eastAsiaTheme="minorEastAsia"/>
-              </w:rPr>
-            </w:pPr>
-          </w:p>
-        </w:tc>
-        <w:tc>
-          <w:tcPr>
-            <w:tcW w:w="2371" w:type="dxa"/>
-          </w:tcPr>
-          <w:p>
-            <w:r>
-              <w:rPr>
-                <w:rFonts w:eastAsiaTheme="minorEastAsia"/>
-              </w:rPr>
-              <w:t>Address of this rdata</w:t>
-            </w:r>
-          </w:p>
-        </w:tc>
-      </w:tr>
-      <w:tr>
-        <w:tc>
-          <w:tcPr>
-            <w:tcW w:w="1209" w:type="dxa"/>
-            <w:vMerge/>
-          </w:tcPr>
-          <w:p/>
-        </w:tc>
-        <w:tc>
-          <w:tcPr>
-            <w:tcW w:w="2016" w:type="dxa"/>
-            <w:vMerge/>
-          </w:tcPr>
-          <w:p>
-            <w:pPr>
-              <w:rPr>
-                <w:rFonts w:eastAsiaTheme="minorEastAsia"/>
-              </w:rPr>
-            </w:pPr>
-          </w:p>
-        </w:tc>
-        <w:tc>
-          <w:tcPr>
-            <w:tcW w:w="769" w:type="dxa"/>
-          </w:tcPr>
-          <w:p>
-            <w:pPr>
-              <w:jc w:val="center"/>
+            </w:pPr>
+            <w:r>
+              <w:rPr>
+                <w:rFonts w:ascii="Arial" w:eastAsiaTheme="minorEastAsia" w:hAnsi="Arial" w:cs="Arial" w:hint="eastAsia"/>
+                <w:kern w:val="0"/>
+                <w:sz w:val="20"/>
+                <w:szCs w:val="20"/>
+              </w:rPr>
+              <w:t>d</w:t>
+            </w:r>
+            <w:r>
               <w:rPr>
                 <w:rFonts w:ascii="Arial" w:eastAsiaTheme="minorEastAsia" w:hAnsi="Arial" w:cs="Arial"/>
                 <w:kern w:val="0"/>
                 <w:sz w:val="20"/>
                 <w:szCs w:val="20"/>
               </w:rPr>
-            </w:pPr>
-            <w:r>
-              <w:rPr>
-                <w:rFonts w:ascii="Arial" w:eastAsiaTheme="minorEastAsia" w:hAnsi="Arial" w:cs="Arial" w:hint="eastAsia"/>
-                <w:kern w:val="0"/>
-                <w:sz w:val="20"/>
-                <w:szCs w:val="20"/>
-              </w:rPr>
-              <w:t>l</w:t>
-            </w:r>
-            <w:r>
+              <w:t>ata</w:t>
+            </w:r>
+          </w:p>
+        </w:tc>
+        <w:tc>
+          <w:tcPr>
+            <w:tcW w:w="1306" w:type="dxa"/>
+            <w:vAlign w:val="center"/>
+          </w:tcPr>
+          <w:p>
+            <w:pPr>
+              <w:jc w:val="center"/>
               <w:rPr>
                 <w:rFonts w:ascii="Arial" w:eastAsiaTheme="minorEastAsia" w:hAnsi="Arial" w:cs="Arial"/>
                 <w:kern w:val="0"/>
                 <w:sz w:val="20"/>
                 <w:szCs w:val="20"/>
               </w:rPr>
-              <w:t>ast</w:t>
-            </w:r>
-          </w:p>
-        </w:tc>
-        <w:tc>
-          <w:tcPr>
-            <w:tcW w:w="1306" w:type="dxa"/>
-            <w:vAlign w:val="center"/>
-          </w:tcPr>
-          <w:p>
-            <w:pPr>
-              <w:jc w:val="center"/>
+            </w:pPr>
+            <w:r>
               <w:rPr>
                 <w:rFonts w:ascii="Arial" w:eastAsiaTheme="minorEastAsia" w:hAnsi="Arial" w:cs="Arial"/>
                 <w:kern w:val="0"/>
                 <w:sz w:val="20"/>
                 <w:szCs w:val="20"/>
               </w:rPr>
-            </w:pPr>
-            <w:r>
-              <w:rPr>
-                <w:rFonts w:ascii="Arial" w:eastAsiaTheme="minorEastAsia" w:hAnsi="Arial" w:cs="Arial" w:hint="eastAsia"/>
+              <w:t>configurable</w:t>
+            </w:r>
+          </w:p>
+        </w:tc>
+        <w:tc>
+          <w:tcPr>
+            <w:tcW w:w="619" w:type="dxa"/>
+            <w:vMerge/>
+            <w:vAlign w:val="center"/>
+          </w:tcPr>
+          <w:p>
+            <w:pPr>
+              <w:jc w:val="center"/>
+              <w:rPr>
+                <w:rFonts w:eastAsiaTheme="minorEastAsia"/>
+              </w:rPr>
+            </w:pPr>
+          </w:p>
+        </w:tc>
+        <w:tc>
+          <w:tcPr>
+            <w:tcW w:w="2371" w:type="dxa"/>
+          </w:tcPr>
+          <w:p>
+            <w:pPr>
+              <w:rPr>
+                <w:rFonts w:eastAsiaTheme="minorEastAsia"/>
+              </w:rPr>
+            </w:pPr>
+            <w:r>
+              <w:rPr>
+                <w:rFonts w:eastAsiaTheme="minorEastAsia" w:hint="eastAsia"/>
+              </w:rPr>
+              <w:t>A</w:t>
+            </w:r>
+            <w:r>
+              <w:rPr>
+                <w:rFonts w:eastAsiaTheme="minorEastAsia"/>
+              </w:rPr>
+              <w:t xml:space="preserve">XI </w:t>
+            </w:r>
+            <w:proofErr w:type="spellStart"/>
+            <w:r>
+              <w:rPr>
+                <w:rFonts w:eastAsiaTheme="minorEastAsia"/>
+              </w:rPr>
+              <w:t>rdata</w:t>
+            </w:r>
+            <w:proofErr w:type="spellEnd"/>
+          </w:p>
+        </w:tc>
+      </w:tr>
+      <w:tr>
+        <w:tc>
+          <w:tcPr>
+            <w:tcW w:w="1209" w:type="dxa"/>
+            <w:vMerge w:val="restart"/>
+          </w:tcPr>
+          <w:p>
+            <w:pPr>
+              <w:rPr>
+                <w:rFonts w:eastAsiaTheme="minorEastAsia"/>
+              </w:rPr>
+            </w:pPr>
+            <w:r>
+              <w:rPr>
+                <w:rFonts w:eastAsiaTheme="minorEastAsia"/>
+              </w:rPr>
+              <w:t>Register</w:t>
+            </w:r>
+          </w:p>
+        </w:tc>
+        <w:tc>
+          <w:tcPr>
+            <w:tcW w:w="2785" w:type="dxa"/>
+            <w:gridSpan w:val="2"/>
+          </w:tcPr>
+          <w:p>
+            <w:pPr>
+              <w:jc w:val="center"/>
+            </w:pPr>
+            <w:proofErr w:type="spellStart"/>
+            <w:r>
+              <w:rPr>
+                <w:rFonts w:eastAsiaTheme="minorEastAsia"/>
+              </w:rPr>
+              <w:t>axi_sramc_idle</w:t>
+            </w:r>
+            <w:proofErr w:type="spellEnd"/>
+          </w:p>
+        </w:tc>
+        <w:tc>
+          <w:tcPr>
+            <w:tcW w:w="1306" w:type="dxa"/>
+            <w:vAlign w:val="center"/>
+          </w:tcPr>
+          <w:p>
+            <w:pPr>
+              <w:jc w:val="center"/>
+              <w:rPr>
+                <w:rFonts w:eastAsiaTheme="minorEastAsia"/>
+              </w:rPr>
+            </w:pPr>
+            <w:r>
+              <w:rPr>
+                <w:rFonts w:eastAsiaTheme="minorEastAsia" w:hint="eastAsia"/>
+              </w:rPr>
+              <w:t>1</w:t>
+            </w:r>
+          </w:p>
+        </w:tc>
+        <w:tc>
+          <w:tcPr>
+            <w:tcW w:w="619" w:type="dxa"/>
+            <w:vMerge w:val="restart"/>
+            <w:vAlign w:val="center"/>
+          </w:tcPr>
+          <w:p>
+            <w:pPr>
+              <w:jc w:val="center"/>
+              <w:rPr>
+                <w:rFonts w:eastAsiaTheme="minorEastAsia"/>
+              </w:rPr>
+            </w:pPr>
+            <w:r>
+              <w:rPr>
+                <w:rFonts w:eastAsiaTheme="minorEastAsia" w:hint="eastAsia"/>
+              </w:rPr>
+              <w:t>O</w:t>
+            </w:r>
+          </w:p>
+        </w:tc>
+        <w:tc>
+          <w:tcPr>
+            <w:tcW w:w="2371" w:type="dxa"/>
+          </w:tcPr>
+          <w:p>
+            <w:pPr>
+              <w:rPr>
+                <w:rFonts w:eastAsiaTheme="minorEastAsia"/>
+              </w:rPr>
+            </w:pPr>
+            <w:r>
+              <w:rPr>
+                <w:rFonts w:eastAsiaTheme="minorEastAsia" w:hint="eastAsia"/>
+              </w:rPr>
+              <w:t>A</w:t>
+            </w:r>
+            <w:r>
+              <w:rPr>
+                <w:rFonts w:eastAsiaTheme="minorEastAsia"/>
+              </w:rPr>
+              <w:t>XI_SRAMC module is idle</w:t>
+            </w:r>
+          </w:p>
+        </w:tc>
+      </w:tr>
+      <w:tr>
+        <w:tc>
+          <w:tcPr>
+            <w:tcW w:w="1209" w:type="dxa"/>
+            <w:vMerge/>
+          </w:tcPr>
+          <w:p/>
+        </w:tc>
+        <w:tc>
+          <w:tcPr>
+            <w:tcW w:w="2785" w:type="dxa"/>
+            <w:gridSpan w:val="2"/>
+          </w:tcPr>
+          <w:p>
+            <w:pPr>
+              <w:jc w:val="center"/>
+              <w:rPr>
+                <w:rFonts w:eastAsiaTheme="minorEastAsia"/>
+              </w:rPr>
+            </w:pPr>
+            <w:proofErr w:type="spellStart"/>
+            <w:r>
+              <w:rPr>
+                <w:rFonts w:eastAsiaTheme="minorEastAsia"/>
+              </w:rPr>
+              <w:t>ecc_err</w:t>
+            </w:r>
+            <w:proofErr w:type="spellEnd"/>
+          </w:p>
+        </w:tc>
+        <w:tc>
+          <w:tcPr>
+            <w:tcW w:w="1306" w:type="dxa"/>
+            <w:vAlign w:val="center"/>
+          </w:tcPr>
+          <w:p>
+            <w:pPr>
+              <w:jc w:val="center"/>
+              <w:rPr>
+                <w:rFonts w:eastAsiaTheme="minorEastAsia"/>
+              </w:rPr>
+            </w:pPr>
+            <w:r>
+              <w:rPr>
+                <w:rFonts w:eastAsiaTheme="minorEastAsia" w:hint="eastAsia"/>
+              </w:rPr>
+              <w:t>1</w:t>
+            </w:r>
+          </w:p>
+        </w:tc>
+        <w:tc>
+          <w:tcPr>
+            <w:tcW w:w="619" w:type="dxa"/>
+            <w:vMerge/>
+            <w:vAlign w:val="center"/>
+          </w:tcPr>
+          <w:p>
+            <w:pPr>
+              <w:jc w:val="center"/>
+            </w:pPr>
+          </w:p>
+        </w:tc>
+        <w:tc>
+          <w:tcPr>
+            <w:tcW w:w="2371" w:type="dxa"/>
+          </w:tcPr>
+          <w:p>
+            <w:pPr>
+              <w:rPr>
+                <w:rFonts w:eastAsiaTheme="minorEastAsia"/>
+              </w:rPr>
+            </w:pPr>
+            <w:proofErr w:type="spellStart"/>
+            <w:r>
+              <w:rPr>
+                <w:rFonts w:eastAsiaTheme="minorEastAsia"/>
+              </w:rPr>
+              <w:t>Rdata</w:t>
+            </w:r>
+            <w:proofErr w:type="spellEnd"/>
+            <w:r>
+              <w:rPr>
+                <w:rFonts w:eastAsiaTheme="minorEastAsia"/>
+              </w:rPr>
+              <w:t xml:space="preserve"> ECC error and u</w:t>
+            </w:r>
+            <w:r>
+              <w:rPr>
+                <w:rFonts w:eastAsiaTheme="minorEastAsia"/>
+              </w:rPr>
+              <w:t>ncorrectable</w:t>
+            </w:r>
+          </w:p>
+        </w:tc>
+      </w:tr>
+      <w:tr>
+        <w:tc>
+          <w:tcPr>
+            <w:tcW w:w="1209" w:type="dxa"/>
+            <w:vMerge/>
+          </w:tcPr>
+          <w:p/>
+        </w:tc>
+        <w:tc>
+          <w:tcPr>
+            <w:tcW w:w="2785" w:type="dxa"/>
+            <w:gridSpan w:val="2"/>
+          </w:tcPr>
+          <w:p>
+            <w:pPr>
+              <w:jc w:val="center"/>
+              <w:rPr>
+                <w:rFonts w:eastAsiaTheme="minorEastAsia"/>
+                <w:strike/>
+              </w:rPr>
+            </w:pPr>
+            <w:proofErr w:type="spellStart"/>
+            <w:r>
+              <w:rPr>
+                <w:rFonts w:eastAsiaTheme="minorEastAsia"/>
+                <w:strike/>
+              </w:rPr>
+              <w:t>ecc_err_addr</w:t>
+            </w:r>
+            <w:proofErr w:type="spellEnd"/>
+          </w:p>
+        </w:tc>
+        <w:tc>
+          <w:tcPr>
+            <w:tcW w:w="1306" w:type="dxa"/>
+            <w:vAlign w:val="center"/>
+          </w:tcPr>
+          <w:p>
+            <w:pPr>
+              <w:jc w:val="center"/>
+              <w:rPr>
+                <w:strike/>
+              </w:rPr>
+            </w:pPr>
+            <w:r>
+              <w:rPr>
+                <w:rFonts w:ascii="Arial" w:eastAsiaTheme="minorEastAsia" w:hAnsi="Arial" w:cs="Arial"/>
+                <w:strike/>
                 <w:kern w:val="0"/>
                 <w:sz w:val="20"/>
                 <w:szCs w:val="20"/>
               </w:rPr>
-              <w:t>1</w:t>
+              <w:t>configurable</w:t>
             </w:r>
           </w:p>
         </w:tc>
@@ -13272,7 +13941,7 @@
             <w:pPr>
               <w:jc w:val="center"/>
               <w:rPr>
-                <w:rFonts w:eastAsiaTheme="minorEastAsia"/>
+                <w:strike/>
               </w:rPr>
             </w:pPr>
           </w:p>
@@ -13282,417 +13951,18 @@
             <w:tcW w:w="2371" w:type="dxa"/>
           </w:tcPr>
           <w:p>
-            <w:r>
-              <w:rPr>
-                <w:rFonts w:eastAsiaTheme="minorEastAsia"/>
-              </w:rPr>
-              <w:t xml:space="preserve">Last burst </w:t>
-            </w:r>
-            <w:r>
-              <w:rPr>
-                <w:rFonts w:eastAsiaTheme="minorEastAsia" w:hint="eastAsia"/>
-              </w:rPr>
-              <w:t>transfer</w:t>
-            </w:r>
-            <w:r>
-              <w:rPr>
-                <w:rFonts w:eastAsiaTheme="minorEastAsia"/>
-              </w:rPr>
-              <w:t xml:space="preserve"> flag</w:t>
-            </w:r>
-          </w:p>
-        </w:tc>
-      </w:tr>
-      <w:tr>
-        <w:tc>
-          <w:tcPr>
-            <w:tcW w:w="1209" w:type="dxa"/>
-            <w:vMerge/>
-          </w:tcPr>
-          <w:p/>
-        </w:tc>
-        <w:tc>
-          <w:tcPr>
-            <w:tcW w:w="2016" w:type="dxa"/>
-            <w:vMerge/>
-          </w:tcPr>
-          <w:p>
-            <w:pPr>
-              <w:rPr>
-                <w:rFonts w:eastAsiaTheme="minorEastAsia"/>
-              </w:rPr>
-            </w:pPr>
-          </w:p>
-        </w:tc>
-        <w:tc>
-          <w:tcPr>
-            <w:tcW w:w="769" w:type="dxa"/>
-          </w:tcPr>
-          <w:p>
-            <w:pPr>
-              <w:jc w:val="center"/>
-              <w:rPr>
-                <w:rFonts w:ascii="Arial" w:eastAsiaTheme="minorEastAsia" w:hAnsi="Arial" w:cs="Arial"/>
-                <w:kern w:val="0"/>
-                <w:sz w:val="20"/>
-                <w:szCs w:val="20"/>
-              </w:rPr>
-            </w:pPr>
-            <w:r>
-              <w:rPr>
-                <w:rFonts w:ascii="Arial" w:eastAsiaTheme="minorEastAsia" w:hAnsi="Arial" w:cs="Arial" w:hint="eastAsia"/>
-                <w:kern w:val="0"/>
-                <w:sz w:val="20"/>
-                <w:szCs w:val="20"/>
-              </w:rPr>
-              <w:t>d</w:t>
-            </w:r>
-            <w:r>
-              <w:rPr>
-                <w:rFonts w:ascii="Arial" w:eastAsiaTheme="minorEastAsia" w:hAnsi="Arial" w:cs="Arial"/>
-                <w:kern w:val="0"/>
-                <w:sz w:val="20"/>
-                <w:szCs w:val="20"/>
-              </w:rPr>
-              <w:t>ata</w:t>
-            </w:r>
-          </w:p>
-        </w:tc>
-        <w:tc>
-          <w:tcPr>
-            <w:tcW w:w="1306" w:type="dxa"/>
-            <w:vAlign w:val="center"/>
-          </w:tcPr>
-          <w:p>
-            <w:pPr>
-              <w:jc w:val="center"/>
-              <w:rPr>
-                <w:rFonts w:ascii="Arial" w:eastAsiaTheme="minorEastAsia" w:hAnsi="Arial" w:cs="Arial"/>
-                <w:kern w:val="0"/>
-                <w:sz w:val="20"/>
-                <w:szCs w:val="20"/>
-              </w:rPr>
-            </w:pPr>
-            <w:r>
-              <w:rPr>
-                <w:rFonts w:ascii="Arial" w:eastAsiaTheme="minorEastAsia" w:hAnsi="Arial" w:cs="Arial"/>
-                <w:kern w:val="0"/>
-                <w:sz w:val="20"/>
-                <w:szCs w:val="20"/>
-              </w:rPr>
-              <w:t>configurable</w:t>
-            </w:r>
-          </w:p>
-        </w:tc>
-        <w:tc>
-          <w:tcPr>
-            <w:tcW w:w="619" w:type="dxa"/>
-            <w:vMerge/>
-            <w:vAlign w:val="center"/>
-          </w:tcPr>
-          <w:p>
-            <w:pPr>
-              <w:jc w:val="center"/>
-              <w:rPr>
-                <w:rFonts w:eastAsiaTheme="minorEastAsia"/>
-              </w:rPr>
-            </w:pPr>
-          </w:p>
-        </w:tc>
-        <w:tc>
-          <w:tcPr>
-            <w:tcW w:w="2371" w:type="dxa"/>
-          </w:tcPr>
-          <w:p>
-            <w:pPr>
-              <w:rPr>
-                <w:rFonts w:eastAsiaTheme="minorEastAsia"/>
-              </w:rPr>
-            </w:pPr>
-            <w:r>
-              <w:rPr>
-                <w:rFonts w:eastAsiaTheme="minorEastAsia" w:hint="eastAsia"/>
-              </w:rPr>
-              <w:t>A</w:t>
-            </w:r>
-            <w:r>
-              <w:rPr>
-                <w:rFonts w:eastAsiaTheme="minorEastAsia"/>
-              </w:rPr>
-              <w:t>XI rdata</w:t>
-            </w:r>
-          </w:p>
-        </w:tc>
-      </w:tr>
-      <w:tr>
-        <w:tc>
-          <w:tcPr>
-            <w:tcW w:w="1209" w:type="dxa"/>
-            <w:vMerge w:val="restart"/>
-          </w:tcPr>
-          <w:p>
-            <w:pPr>
-              <w:rPr>
-                <w:rFonts w:eastAsiaTheme="minorEastAsia"/>
-              </w:rPr>
-            </w:pPr>
-            <w:r>
-              <w:rPr>
-                <w:rFonts w:eastAsiaTheme="minorEastAsia"/>
-              </w:rPr>
-              <w:t>Register</w:t>
-            </w:r>
-          </w:p>
-        </w:tc>
-        <w:tc>
-          <w:tcPr>
-            <w:tcW w:w="2785" w:type="dxa"/>
-            <w:gridSpan w:val="2"/>
-          </w:tcPr>
-          <w:p>
-            <w:pPr>
-              <w:jc w:val="center"/>
-            </w:pPr>
-            <w:r>
-              <w:rPr>
-                <w:rFonts w:eastAsiaTheme="minorEastAsia"/>
-              </w:rPr>
-              <w:t>axi_sramc_idle</w:t>
-            </w:r>
-          </w:p>
-        </w:tc>
-        <w:tc>
-          <w:tcPr>
-            <w:tcW w:w="1306" w:type="dxa"/>
-            <w:vAlign w:val="center"/>
-          </w:tcPr>
-          <w:p>
-            <w:pPr>
-              <w:jc w:val="center"/>
-              <w:rPr>
-                <w:rFonts w:eastAsiaTheme="minorEastAsia"/>
-              </w:rPr>
-            </w:pPr>
-            <w:r>
-              <w:rPr>
-                <w:rFonts w:eastAsiaTheme="minorEastAsia" w:hint="eastAsia"/>
-              </w:rPr>
-              <w:t>1</w:t>
-            </w:r>
-          </w:p>
-        </w:tc>
-        <w:tc>
-          <w:tcPr>
-            <w:tcW w:w="619" w:type="dxa"/>
-            <w:vMerge w:val="restart"/>
-            <w:vAlign w:val="center"/>
-          </w:tcPr>
-          <w:p>
-            <w:pPr>
-              <w:jc w:val="center"/>
-              <w:rPr>
-                <w:rFonts w:eastAsiaTheme="minorEastAsia"/>
-              </w:rPr>
-            </w:pPr>
-            <w:r>
-              <w:rPr>
-                <w:rFonts w:eastAsiaTheme="minorEastAsia" w:hint="eastAsia"/>
-              </w:rPr>
-              <w:t>O</w:t>
-            </w:r>
-          </w:p>
-        </w:tc>
-        <w:tc>
-          <w:tcPr>
-            <w:tcW w:w="2371" w:type="dxa"/>
-          </w:tcPr>
-          <w:p>
-            <w:pPr>
-              <w:rPr>
-                <w:rFonts w:eastAsiaTheme="minorEastAsia"/>
-              </w:rPr>
-            </w:pPr>
-            <w:r>
-              <w:rPr>
-                <w:rFonts w:eastAsiaTheme="minorEastAsia" w:hint="eastAsia"/>
-              </w:rPr>
-              <w:t>A</w:t>
-            </w:r>
-            <w:r>
-              <w:rPr>
-                <w:rFonts w:eastAsiaTheme="minorEastAsia"/>
-              </w:rPr>
-              <w:t>XI_SRAMC module is idle</w:t>
-            </w:r>
-          </w:p>
-        </w:tc>
-      </w:tr>
-      <w:tr>
-        <w:tc>
-          <w:tcPr>
-            <w:tcW w:w="1209" w:type="dxa"/>
-            <w:vMerge/>
-          </w:tcPr>
-          <w:p/>
-        </w:tc>
-        <w:tc>
-          <w:tcPr>
-            <w:tcW w:w="2785" w:type="dxa"/>
-            <w:gridSpan w:val="2"/>
-          </w:tcPr>
-          <w:p>
-            <w:pPr>
-              <w:jc w:val="center"/>
-              <w:rPr>
-                <w:rFonts w:eastAsiaTheme="minorEastAsia"/>
-              </w:rPr>
-            </w:pPr>
-            <w:r>
-              <w:rPr>
-                <w:rFonts w:eastAsiaTheme="minorEastAsia"/>
-              </w:rPr>
-              <w:t>ecc_err</w:t>
-            </w:r>
-          </w:p>
-        </w:tc>
-        <w:tc>
-          <w:tcPr>
-            <w:tcW w:w="1306" w:type="dxa"/>
-            <w:vAlign w:val="center"/>
-          </w:tcPr>
-          <w:p>
-            <w:pPr>
-              <w:jc w:val="center"/>
-              <w:rPr>
-                <w:rFonts w:eastAsiaTheme="minorEastAsia"/>
-              </w:rPr>
-            </w:pPr>
-            <w:r>
-              <w:rPr>
-                <w:rFonts w:eastAsiaTheme="minorEastAsia" w:hint="eastAsia"/>
-              </w:rPr>
-              <w:t>1</w:t>
-            </w:r>
-          </w:p>
-        </w:tc>
-        <w:tc>
-          <w:tcPr>
-            <w:tcW w:w="619" w:type="dxa"/>
-            <w:vMerge/>
-            <w:vAlign w:val="center"/>
-          </w:tcPr>
-          <w:p>
-            <w:pPr>
-              <w:jc w:val="center"/>
-            </w:pPr>
-          </w:p>
-        </w:tc>
-        <w:tc>
-          <w:tcPr>
-            <w:tcW w:w="2371" w:type="dxa"/>
-          </w:tcPr>
-          <w:p>
-            <w:pPr>
-              <w:rPr>
-                <w:rFonts w:eastAsiaTheme="minorEastAsia"/>
-              </w:rPr>
-            </w:pPr>
-            <w:r>
-              <w:rPr>
-                <w:rFonts w:eastAsiaTheme="minorEastAsia"/>
-              </w:rPr>
-              <w:t>Rdata ECC error and u</w:t>
-            </w:r>
-            <w:r>
-              <w:rPr>
-                <w:rFonts w:eastAsiaTheme="minorEastAsia"/>
-              </w:rPr>
-              <w:t>ncorrectable</w:t>
-            </w:r>
-          </w:p>
-        </w:tc>
-      </w:tr>
-      <w:tr>
-        <w:tc>
-          <w:tcPr>
-            <w:tcW w:w="1209" w:type="dxa"/>
-            <w:vMerge/>
-          </w:tcPr>
-          <w:p/>
-        </w:tc>
-        <w:tc>
-          <w:tcPr>
-            <w:tcW w:w="2785" w:type="dxa"/>
-            <w:gridSpan w:val="2"/>
-          </w:tcPr>
-          <w:p>
-            <w:pPr>
-              <w:jc w:val="center"/>
-              <w:rPr>
-                <w:rFonts w:eastAsiaTheme="minorEastAsia"/>
-              </w:rPr>
-            </w:pPr>
-            <w:r>
-              <w:rPr>
-                <w:rFonts w:eastAsiaTheme="minorEastAsia"/>
-              </w:rPr>
-              <w:t>ecc_err_addr</w:t>
-            </w:r>
-          </w:p>
-        </w:tc>
-        <w:tc>
-          <w:tcPr>
-            <w:tcW w:w="1306" w:type="dxa"/>
-            <w:vAlign w:val="center"/>
-          </w:tcPr>
-          <w:p>
-            <w:pPr>
-              <w:jc w:val="center"/>
-            </w:pPr>
-            <w:r>
-              <w:rPr>
-                <w:rFonts w:ascii="Arial" w:eastAsiaTheme="minorEastAsia" w:hAnsi="Arial" w:cs="Arial"/>
-                <w:kern w:val="0"/>
-                <w:sz w:val="20"/>
-                <w:szCs w:val="20"/>
-              </w:rPr>
-              <w:t>configurable</w:t>
-            </w:r>
-          </w:p>
-        </w:tc>
-        <w:tc>
-          <w:tcPr>
-            <w:tcW w:w="619" w:type="dxa"/>
-            <w:vMerge/>
-            <w:vAlign w:val="center"/>
-          </w:tcPr>
-          <w:p>
-            <w:pPr>
-              <w:jc w:val="center"/>
-            </w:pPr>
-          </w:p>
-        </w:tc>
-        <w:tc>
-          <w:tcPr>
-            <w:tcW w:w="2371" w:type="dxa"/>
-          </w:tcPr>
-          <w:p>
-            <w:pPr>
-              <w:rPr>
-                <w:rFonts w:eastAsiaTheme="minorEastAsia"/>
-              </w:rPr>
-            </w:pPr>
-            <w:r>
-              <w:rPr>
-                <w:rFonts w:eastAsiaTheme="minorEastAsia"/>
-              </w:rPr>
-              <w:t>Memory address</w:t>
-            </w:r>
-            <w:r>
-              <w:rPr>
-                <w:rFonts w:eastAsiaTheme="minorEastAsia"/>
-              </w:rPr>
-              <w:t xml:space="preserve"> corresponding to the ECC error</w:t>
+            <w:pPr>
+              <w:rPr>
+                <w:rFonts w:eastAsiaTheme="minorEastAsia"/>
+                <w:strike/>
+              </w:rPr>
+            </w:pPr>
+            <w:r>
+              <w:rPr>
+                <w:rFonts w:eastAsiaTheme="minorEastAsia"/>
+                <w:strike/>
+              </w:rPr>
+              <w:t>Memory address corresponding to the ECC error</w:t>
             </w:r>
           </w:p>
         </w:tc>
@@ -13906,7 +14176,6 @@
         <w:rPr>
           <w:rFonts w:hint="eastAsia"/>
         </w:rPr>
-        <w:lastRenderedPageBreak/>
         <w:t>A</w:t>
       </w:r>
       <w:r>
@@ -14604,6 +14873,7 @@
             <w:gridSpan w:val="2"/>
           </w:tcPr>
           <w:p>
+            <w:proofErr w:type="spellStart"/>
             <w:r>
               <w:rPr>
                 <w:rFonts w:eastAsiaTheme="minorEastAsia" w:hint="eastAsia"/>
@@ -14616,6 +14886,7 @@
               </w:rPr>
               <w:t>ld</w:t>
             </w:r>
+            <w:proofErr w:type="spellEnd"/>
           </w:p>
         </w:tc>
         <w:tc>
@@ -14672,6 +14943,7 @@
             <w:gridSpan w:val="2"/>
           </w:tcPr>
           <w:p>
+            <w:proofErr w:type="spellStart"/>
             <w:r>
               <w:rPr>
                 <w:rFonts w:eastAsiaTheme="minorEastAsia" w:hint="eastAsia"/>
@@ -14684,6 +14956,7 @@
               </w:rPr>
               <w:t>dy</w:t>
             </w:r>
+            <w:proofErr w:type="spellEnd"/>
           </w:p>
         </w:tc>
         <w:tc>
@@ -14764,6 +15037,7 @@
             <w:tcW w:w="917" w:type="dxa"/>
           </w:tcPr>
           <w:p>
+            <w:proofErr w:type="spellStart"/>
             <w:r>
               <w:rPr>
                 <w:rFonts w:eastAsiaTheme="minorEastAsia" w:hint="eastAsia"/>
@@ -14776,6 +15050,7 @@
               </w:rPr>
               <w:t>xid</w:t>
             </w:r>
+            <w:proofErr w:type="spellEnd"/>
           </w:p>
         </w:tc>
         <w:tc>
@@ -14850,6 +15125,7 @@
             <w:tcW w:w="917" w:type="dxa"/>
           </w:tcPr>
           <w:p>
+            <w:proofErr w:type="spellStart"/>
             <w:r>
               <w:rPr>
                 <w:rFonts w:eastAsiaTheme="minorEastAsia" w:hint="eastAsia"/>
@@ -14862,6 +15138,7 @@
               </w:rPr>
               <w:t>ddr</w:t>
             </w:r>
+            <w:proofErr w:type="spellEnd"/>
           </w:p>
         </w:tc>
         <w:tc>
@@ -15225,6 +15502,7 @@
             <w:tcW w:w="917" w:type="dxa"/>
           </w:tcPr>
           <w:p>
+            <w:proofErr w:type="spellStart"/>
             <w:r>
               <w:rPr>
                 <w:rFonts w:eastAsiaTheme="minorEastAsia" w:hint="eastAsia"/>
@@ -15237,6 +15515,7 @@
               </w:rPr>
               <w:t>mw</w:t>
             </w:r>
+            <w:proofErr w:type="spellEnd"/>
           </w:p>
         </w:tc>
         <w:tc>
@@ -15387,8 +15666,16 @@
               <w:rPr>
                 <w:rFonts w:eastAsiaTheme="minorEastAsia"/>
               </w:rPr>
-              <w:t>ecoder rsp</w:t>
-            </w:r>
+              <w:t xml:space="preserve">ecoder </w:t>
+            </w:r>
+            <w:proofErr w:type="spellStart"/>
+            <w:r>
+              <w:rPr>
+                <w:rFonts w:eastAsiaTheme="minorEastAsia"/>
+              </w:rPr>
+              <w:t>rsp</w:t>
+            </w:r>
+            <w:proofErr w:type="spellEnd"/>
           </w:p>
         </w:tc>
         <w:tc>
@@ -15402,6 +15689,7 @@
                 <w:rFonts w:eastAsiaTheme="minorEastAsia"/>
               </w:rPr>
             </w:pPr>
+            <w:proofErr w:type="spellStart"/>
             <w:r>
               <w:rPr>
                 <w:rFonts w:eastAsiaTheme="minorEastAsia" w:hint="eastAsia"/>
@@ -15414,6 +15702,7 @@
               </w:rPr>
               <w:t>ld</w:t>
             </w:r>
+            <w:proofErr w:type="spellEnd"/>
           </w:p>
         </w:tc>
         <w:tc>
@@ -15465,12 +15754,14 @@
             <w:gridSpan w:val="2"/>
           </w:tcPr>
           <w:p>
+            <w:proofErr w:type="spellStart"/>
             <w:r>
               <w:rPr>
                 <w:rFonts w:eastAsiaTheme="minorEastAsia" w:hint="eastAsia"/>
               </w:rPr>
               <w:t>Rdy</w:t>
             </w:r>
+            <w:proofErr w:type="spellEnd"/>
           </w:p>
         </w:tc>
         <w:tc>
@@ -15551,6 +15842,7 @@
                 <w:rFonts w:eastAsiaTheme="minorEastAsia"/>
               </w:rPr>
             </w:pPr>
+            <w:proofErr w:type="spellStart"/>
             <w:r>
               <w:rPr>
                 <w:rFonts w:eastAsiaTheme="minorEastAsia" w:hint="eastAsia"/>
@@ -15563,6 +15855,7 @@
               </w:rPr>
               <w:t>xid</w:t>
             </w:r>
+            <w:proofErr w:type="spellEnd"/>
           </w:p>
         </w:tc>
         <w:tc>
@@ -15798,6 +16091,7 @@
                 <w:rFonts w:eastAsiaTheme="minorEastAsia"/>
               </w:rPr>
             </w:pPr>
+            <w:proofErr w:type="spellStart"/>
             <w:r>
               <w:rPr>
                 <w:rFonts w:eastAsiaTheme="minorEastAsia" w:hint="eastAsia"/>
@@ -15810,6 +16104,7 @@
               </w:rPr>
               <w:t>mw</w:t>
             </w:r>
+            <w:proofErr w:type="spellEnd"/>
           </w:p>
         </w:tc>
         <w:tc>
@@ -16025,7 +16320,21 @@
         <w:rPr>
           <w:rFonts w:eastAsiaTheme="minorEastAsia"/>
         </w:rPr>
-        <w:t xml:space="preserve">To simplify the design, it does not support out-of-order reading, that is to say, the Rrsp </w:t>
+        <w:t xml:space="preserve">To simplify the design, it does not support out-of-order reading, that is to say, the </w:t>
+      </w:r>
+      <w:proofErr w:type="spellStart"/>
+      <w:r>
+        <w:rPr>
+          <w:rFonts w:eastAsiaTheme="minorEastAsia"/>
+        </w:rPr>
+        <w:t>Rrsp</w:t>
+      </w:r>
+      <w:proofErr w:type="spellEnd"/>
+      <w:r>
+        <w:rPr>
+          <w:rFonts w:eastAsiaTheme="minorEastAsia"/>
+        </w:rPr>
+        <w:t xml:space="preserve"> </w:t>
       </w:r>
       <w:r>
         <w:rPr>
@@ -16105,11 +16414,19 @@
         </w:rPr>
         <w:t xml:space="preserve">the AR </w:t>
       </w:r>
-      <w:r>
-        <w:rPr>
-          <w:rFonts w:eastAsiaTheme="minorEastAsia"/>
-        </w:rPr>
-        <w:t>FiFO receiving a transaction</w:t>
+      <w:proofErr w:type="spellStart"/>
+      <w:r>
+        <w:rPr>
+          <w:rFonts w:eastAsiaTheme="minorEastAsia"/>
+        </w:rPr>
+        <w:t>FiFO</w:t>
+      </w:r>
+      <w:proofErr w:type="spellEnd"/>
+      <w:r>
+        <w:rPr>
+          <w:rFonts w:eastAsiaTheme="minorEastAsia"/>
+        </w:rPr>
+        <w:t xml:space="preserve"> receiving a transaction</w:t>
       </w:r>
       <w:r>
         <w:rPr>
@@ -16117,11 +16434,19 @@
         </w:rPr>
         <w:t xml:space="preserve">, and counter minus one for the </w:t>
       </w:r>
-      <w:r>
-        <w:rPr>
-          <w:rFonts w:eastAsiaTheme="minorEastAsia"/>
-        </w:rPr>
-        <w:t xml:space="preserve">Rrsp </w:t>
+      <w:proofErr w:type="spellStart"/>
+      <w:r>
+        <w:rPr>
+          <w:rFonts w:eastAsiaTheme="minorEastAsia"/>
+        </w:rPr>
+        <w:t>Rrsp</w:t>
+      </w:r>
+      <w:proofErr w:type="spellEnd"/>
+      <w:r>
+        <w:rPr>
+          <w:rFonts w:eastAsiaTheme="minorEastAsia"/>
+        </w:rPr>
+        <w:t xml:space="preserve"> </w:t>
       </w:r>
       <w:r>
         <w:rPr>
@@ -16453,7 +16778,21 @@
         <w:rPr>
           <w:rFonts w:eastAsiaTheme="minorEastAsia"/>
         </w:rPr>
-        <w:t>the write request with ‘wstrb != `1’ will</w:t>
+        <w:t>the write request with ‘</w:t>
+      </w:r>
+      <w:proofErr w:type="spellStart"/>
+      <w:r>
+        <w:rPr>
+          <w:rFonts w:eastAsiaTheme="minorEastAsia"/>
+        </w:rPr>
+        <w:t>wstrb</w:t>
+      </w:r>
+      <w:proofErr w:type="spellEnd"/>
+      <w:r>
+        <w:rPr>
+          <w:rFonts w:eastAsiaTheme="minorEastAsia"/>
+        </w:rPr>
+        <w:t xml:space="preserve"> != `1’ will</w:t>
       </w:r>
       <w:r>
         <w:rPr>
@@ -16549,14 +16888,30 @@
         <w:rPr>
           <w:rFonts w:eastAsiaTheme="minorEastAsia"/>
         </w:rPr>
-        <w:t xml:space="preserve">it is routed to the RMW or the Brsp </w:t>
-      </w:r>
+        <w:t xml:space="preserve">it is routed to the RMW or the </w:t>
+      </w:r>
+      <w:proofErr w:type="spellStart"/>
+      <w:r>
+        <w:rPr>
+          <w:rFonts w:eastAsiaTheme="minorEastAsia"/>
+        </w:rPr>
+        <w:t>Brsp</w:t>
+      </w:r>
+      <w:proofErr w:type="spellEnd"/>
+      <w:r>
+        <w:rPr>
+          <w:rFonts w:eastAsiaTheme="minorEastAsia"/>
+        </w:rPr>
+        <w:t xml:space="preserve"> </w:t>
+      </w:r>
+      <w:proofErr w:type="spellStart"/>
       <w:r>
         <w:rPr>
           <w:rFonts w:eastAsiaTheme="minorEastAsia"/>
         </w:rPr>
         <w:t>gen</w:t>
       </w:r>
+      <w:proofErr w:type="spellEnd"/>
       <w:r>
         <w:rPr>
           <w:rFonts w:eastAsiaTheme="minorEastAsia"/>
@@ -16567,7 +16922,35 @@
         <w:rPr>
           <w:rFonts w:eastAsiaTheme="minorEastAsia"/>
         </w:rPr>
-        <w:t>is determined by field ‘rmw’ in decoder rsp.</w:t>
+        <w:t>is determined by field ‘</w:t>
+      </w:r>
+      <w:proofErr w:type="spellStart"/>
+      <w:r>
+        <w:rPr>
+          <w:rFonts w:eastAsiaTheme="minorEastAsia"/>
+        </w:rPr>
+        <w:t>rmw</w:t>
+      </w:r>
+      <w:proofErr w:type="spellEnd"/>
+      <w:r>
+        <w:rPr>
+          <w:rFonts w:eastAsiaTheme="minorEastAsia"/>
+        </w:rPr>
+        <w:t xml:space="preserve">’ in decoder </w:t>
+      </w:r>
+      <w:proofErr w:type="spellStart"/>
+      <w:r>
+        <w:rPr>
+          <w:rFonts w:eastAsiaTheme="minorEastAsia"/>
+        </w:rPr>
+        <w:t>rsp</w:t>
+      </w:r>
+      <w:proofErr w:type="spellEnd"/>
+      <w:r>
+        <w:rPr>
+          <w:rFonts w:eastAsiaTheme="minorEastAsia"/>
+        </w:rPr>
+        <w:t>.</w:t>
       </w:r>
       <w:r>
         <w:rPr>
@@ -16579,7 +16962,21 @@
         <w:rPr>
           <w:rFonts w:eastAsiaTheme="minorEastAsia"/>
         </w:rPr>
-        <w:t xml:space="preserve">When ‘rmw’ signal is set, </w:t>
+        <w:t>When ‘</w:t>
+      </w:r>
+      <w:proofErr w:type="spellStart"/>
+      <w:r>
+        <w:rPr>
+          <w:rFonts w:eastAsiaTheme="minorEastAsia"/>
+        </w:rPr>
+        <w:t>rmw</w:t>
+      </w:r>
+      <w:proofErr w:type="spellEnd"/>
+      <w:r>
+        <w:rPr>
+          <w:rFonts w:eastAsiaTheme="minorEastAsia"/>
+        </w:rPr>
+        <w:t xml:space="preserve">’ signal is set, </w:t>
       </w:r>
       <w:r>
         <w:rPr>
@@ -16639,7 +17036,21 @@
         <w:rPr>
           <w:rFonts w:eastAsiaTheme="minorEastAsia"/>
         </w:rPr>
-        <w:t>the Brsp gen</w:t>
+        <w:t xml:space="preserve">the </w:t>
+      </w:r>
+      <w:proofErr w:type="spellStart"/>
+      <w:r>
+        <w:rPr>
+          <w:rFonts w:eastAsiaTheme="minorEastAsia"/>
+        </w:rPr>
+        <w:t>Brsp</w:t>
+      </w:r>
+      <w:proofErr w:type="spellEnd"/>
+      <w:r>
+        <w:rPr>
+          <w:rFonts w:eastAsiaTheme="minorEastAsia"/>
+        </w:rPr>
+        <w:t xml:space="preserve"> gen</w:t>
       </w:r>
       <w:r>
         <w:rPr>
@@ -16675,7 +17086,21 @@
         <w:rPr>
           <w:rFonts w:eastAsiaTheme="minorEastAsia"/>
         </w:rPr>
-        <w:t>’ and ‘Axid’.</w:t>
+        <w:t>’ and ‘</w:t>
+      </w:r>
+      <w:proofErr w:type="spellStart"/>
+      <w:r>
+        <w:rPr>
+          <w:rFonts w:eastAsiaTheme="minorEastAsia"/>
+        </w:rPr>
+        <w:t>Axid</w:t>
+      </w:r>
+      <w:proofErr w:type="spellEnd"/>
+      <w:r>
+        <w:rPr>
+          <w:rFonts w:eastAsiaTheme="minorEastAsia"/>
+        </w:rPr>
+        <w:t>’.</w:t>
       </w:r>
       <w:r>
         <w:rPr>
@@ -17068,6 +17493,7 @@
         </w:rPr>
         <w:t xml:space="preserve">The AXI </w:t>
       </w:r>
+      <w:proofErr w:type="spellStart"/>
       <w:r>
         <w:rPr>
           <w:rFonts w:eastAsiaTheme="minorEastAsia"/>
@@ -17078,7 +17504,14 @@
         <w:rPr>
           <w:rFonts w:eastAsiaTheme="minorEastAsia"/>
         </w:rPr>
-        <w:t>data written into mem will be enc</w:t>
+        <w:t>data</w:t>
+      </w:r>
+      <w:proofErr w:type="spellEnd"/>
+      <w:r>
+        <w:rPr>
+          <w:rFonts w:eastAsiaTheme="minorEastAsia"/>
+        </w:rPr>
+        <w:t xml:space="preserve"> written into mem will be enc</w:t>
       </w:r>
       <w:r>
         <w:rPr>
@@ -17176,6 +17609,7 @@
         </w:rPr>
         <w:t xml:space="preserve"> to obtain AXI </w:t>
       </w:r>
+      <w:proofErr w:type="spellStart"/>
       <w:r>
         <w:rPr>
           <w:rFonts w:eastAsiaTheme="minorEastAsia"/>
@@ -17186,7 +17620,14 @@
         <w:rPr>
           <w:rFonts w:eastAsiaTheme="minorEastAsia"/>
         </w:rPr>
-        <w:t>data.</w:t>
+        <w:t>data</w:t>
+      </w:r>
+      <w:proofErr w:type="spellEnd"/>
+      <w:r>
+        <w:rPr>
+          <w:rFonts w:eastAsiaTheme="minorEastAsia"/>
+        </w:rPr>
+        <w:t>.</w:t>
       </w:r>
       <w:r>
         <w:rPr>
@@ -17264,7 +17705,7 @@
         <w:rPr>
           <w:rFonts w:eastAsiaTheme="minorEastAsia"/>
         </w:rPr>
-        <w:t xml:space="preserve"> “ECC_ERR” </w:t>
+        <w:t xml:space="preserve">“ECC_ERR” </w:t>
       </w:r>
       <w:r>
         <w:rPr>
@@ -17280,15 +17721,23 @@
       </w:r>
       <w:r>
         <w:rPr>
-          <w:rFonts w:eastAsiaTheme="minorEastAsia"/>
-        </w:rPr>
-        <w:t xml:space="preserve"> and the address corresponding to the error data will be written into register </w:t>
-      </w:r>
-      <w:r>
-        <w:rPr>
-          <w:rFonts w:eastAsiaTheme="minorEastAsia"/>
-        </w:rPr>
-        <w:t>“ECC_ERR_ADDR”</w:t>
+          <w:rFonts w:eastAsiaTheme="minorEastAsia" w:hint="eastAsia"/>
+        </w:rPr>
+        <w:t>.</w:t>
+      </w:r>
+      <w:r>
+        <w:rPr>
+          <w:rFonts w:eastAsiaTheme="minorEastAsia"/>
+          <w:strike/>
+        </w:rPr>
+        <w:t xml:space="preserve"> </w:t>
+      </w:r>
+      <w:r>
+        <w:rPr>
+          <w:rFonts w:eastAsiaTheme="minorEastAsia"/>
+          <w:strike/>
+        </w:rPr>
+        <w:t>and the address corresponding to the error data will be written into register “ECC_ERR_ADDR”</w:t>
       </w:r>
       <w:r>
         <w:rPr>
@@ -17587,7 +18036,15 @@
         <w:t>ECC Encoder to p</w:t>
       </w:r>
       <w:r>
-        <w:t>erform wdata Hamming encoding</w:t>
+        <w:t xml:space="preserve">erform </w:t>
+      </w:r>
+      <w:proofErr w:type="spellStart"/>
+      <w:r>
+        <w:t>wdata</w:t>
+      </w:r>
+      <w:proofErr w:type="spellEnd"/>
+      <w:r>
+        <w:t xml:space="preserve"> Hamming encoding</w:t>
       </w:r>
       <w:r>
         <w:t>.</w:t>
@@ -17876,7 +18333,35 @@
         <w:rPr>
           <w:rFonts w:eastAsiaTheme="minorEastAsia"/>
         </w:rPr>
-        <w:t xml:space="preserve"> write data is 64’h1111_2222_3333_4444, address is ‘h1234 and wstrb is ‘hfe; </w:t>
+        <w:t xml:space="preserve"> write data is 64’h1111_2222_3333_4444, address is ‘h1234 and </w:t>
+      </w:r>
+      <w:proofErr w:type="spellStart"/>
+      <w:r>
+        <w:rPr>
+          <w:rFonts w:eastAsiaTheme="minorEastAsia"/>
+        </w:rPr>
+        <w:t>wstrb</w:t>
+      </w:r>
+      <w:proofErr w:type="spellEnd"/>
+      <w:r>
+        <w:rPr>
+          <w:rFonts w:eastAsiaTheme="minorEastAsia"/>
+        </w:rPr>
+        <w:t xml:space="preserve"> is ‘</w:t>
+      </w:r>
+      <w:proofErr w:type="spellStart"/>
+      <w:r>
+        <w:rPr>
+          <w:rFonts w:eastAsiaTheme="minorEastAsia"/>
+        </w:rPr>
+        <w:t>hfe</w:t>
+      </w:r>
+      <w:proofErr w:type="spellEnd"/>
+      <w:r>
+        <w:rPr>
+          <w:rFonts w:eastAsiaTheme="minorEastAsia"/>
+        </w:rPr>
+        <w:t xml:space="preserve">; </w:t>
       </w:r>
       <w:r>
         <w:rPr>
@@ -18815,6 +19300,7 @@
                 <w:color w:val="0070C0"/>
               </w:rPr>
             </w:pPr>
+            <w:proofErr w:type="spellStart"/>
             <w:r>
               <w:rPr>
                 <w:rFonts w:hint="eastAsia"/>
@@ -18832,6 +19318,7 @@
               </w:rPr>
               <w:t>am_a</w:t>
             </w:r>
+            <w:proofErr w:type="spellEnd"/>
           </w:p>
         </w:tc>
         <w:tc>
@@ -18978,6 +19465,7 @@
                 <w:color w:val="0070C0"/>
               </w:rPr>
             </w:pPr>
+            <w:proofErr w:type="spellStart"/>
             <w:r>
               <w:rPr>
                 <w:rFonts w:hint="eastAsia"/>
@@ -18995,6 +19483,7 @@
               </w:rPr>
               <w:t>am_b</w:t>
             </w:r>
+            <w:proofErr w:type="spellEnd"/>
           </w:p>
         </w:tc>
         <w:tc>
@@ -20065,7 +20554,25 @@
           <w:iCs/>
           <w:color w:val="0070C0"/>
         </w:rPr>
-        <w:t xml:space="preserve">and vt cell </w:t>
+        <w:t xml:space="preserve">and </w:t>
+      </w:r>
+      <w:proofErr w:type="spellStart"/>
+      <w:r>
+        <w:rPr>
+          <w:i/>
+          <w:iCs/>
+          <w:color w:val="0070C0"/>
+        </w:rPr>
+        <w:t>vt</w:t>
+      </w:r>
+      <w:proofErr w:type="spellEnd"/>
+      <w:r>
+        <w:rPr>
+          <w:i/>
+          <w:iCs/>
+          <w:color w:val="0070C0"/>
+        </w:rPr>
+        <w:t xml:space="preserve"> cell </w:t>
       </w:r>
       <w:r>
         <w:rPr>
@@ -20555,13 +21062,23 @@
           <w:color w:val="0070C0"/>
         </w:rPr>
       </w:pPr>
+      <w:proofErr w:type="spellStart"/>
       <w:r>
         <w:rPr>
           <w:i/>
           <w:iCs/>
           <w:color w:val="0070C0"/>
         </w:rPr>
-        <w:t>Etcs.</w:t>
+        <w:t>Etcs</w:t>
+      </w:r>
+      <w:proofErr w:type="spellEnd"/>
+      <w:r>
+        <w:rPr>
+          <w:i/>
+          <w:iCs/>
+          <w:color w:val="0070C0"/>
+        </w:rPr>
+        <w:t>.</w:t>
       </w:r>
     </w:p>
     <w:p>
@@ -20649,7 +21166,377 @@
       </w:r>
       <w:bookmarkEnd w:id="64"/>
     </w:p>
-    <w:p/>
+    <w:p>
+      <w:pPr>
+        <w:pStyle w:val="20"/>
+        <w:rPr>
+          <w:rFonts w:eastAsiaTheme="minorEastAsia" w:hint="eastAsia"/>
+        </w:rPr>
+      </w:pPr>
+      <w:bookmarkStart w:id="65" w:name="_Ref142643323"/>
+      <w:r>
+        <w:rPr>
+          <w:rFonts w:eastAsiaTheme="minorEastAsia" w:hint="eastAsia"/>
+        </w:rPr>
+        <w:t>M</w:t>
+      </w:r>
+      <w:r>
+        <w:rPr>
+          <w:rFonts w:eastAsiaTheme="minorEastAsia"/>
+        </w:rPr>
+        <w:t>emory Wrapper</w:t>
+      </w:r>
+      <w:bookmarkEnd w:id="65"/>
+    </w:p>
+    <w:p>
+      <w:pPr>
+        <w:jc w:val="center"/>
+        <w:rPr>
+          <w:rFonts w:eastAsiaTheme="minorEastAsia"/>
+        </w:rPr>
+      </w:pPr>
+      <w:r>
+        <w:rPr>
+          <w:noProof/>
+        </w:rPr>
+        <w:drawing>
+          <wp:inline distT="0" distB="0" distL="0" distR="0" wp14:anchorId="1DD30598" wp14:editId="438A6997">
+            <wp:extent cx="3993226" cy="2248095"/>
+            <wp:effectExtent l="0" t="0" r="7620" b="0"/>
+            <wp:docPr id="504615982" name="图片 1"/>
+            <wp:cNvGraphicFramePr>
+              <a:graphicFrameLocks xmlns:a="http://schemas.openxmlformats.org/drawingml/2006/main" noChangeAspect="1"/>
+            </wp:cNvGraphicFramePr>
+            <a:graphic xmlns:a="http://schemas.openxmlformats.org/drawingml/2006/main">
+              <a:graphicData uri="http://schemas.openxmlformats.org/drawingml/2006/picture">
+                <pic:pic xmlns:pic="http://schemas.openxmlformats.org/drawingml/2006/picture">
+                  <pic:nvPicPr>
+                    <pic:cNvPr id="504615982" name=""/>
+                    <pic:cNvPicPr/>
+                  </pic:nvPicPr>
+                  <pic:blipFill>
+                    <a:blip r:embed="rId19"/>
+                    <a:stretch>
+                      <a:fillRect/>
+                    </a:stretch>
+                  </pic:blipFill>
+                  <pic:spPr>
+                    <a:xfrm>
+                      <a:off x="0" y="0"/>
+                      <a:ext cx="3993226" cy="2248095"/>
+                    </a:xfrm>
+                    <a:prstGeom prst="rect">
+                      <a:avLst/>
+                    </a:prstGeom>
+                  </pic:spPr>
+                </pic:pic>
+              </a:graphicData>
+            </a:graphic>
+          </wp:inline>
+        </w:drawing>
+      </w:r>
+    </w:p>
+    <w:p>
+      <w:pPr>
+        <w:pStyle w:val="ac"/>
+      </w:pPr>
+      <w:bookmarkStart w:id="66" w:name="_Ref142643843"/>
+      <w:r>
+        <w:t xml:space="preserve">Figure </w:t>
+      </w:r>
+      <w:r>
+        <w:fldChar w:fldCharType="begin"/>
+      </w:r>
+      <w:r>
+        <w:instrText xml:space="preserve"> STYLEREF 1 \s </w:instrText>
+      </w:r>
+      <w:r>
+        <w:fldChar w:fldCharType="separate"/>
+      </w:r>
+      <w:r>
+        <w:rPr>
+          <w:noProof/>
+        </w:rPr>
+        <w:t>11</w:t>
+      </w:r>
+      <w:r>
+        <w:rPr>
+          <w:noProof/>
+        </w:rPr>
+        <w:fldChar w:fldCharType="end"/>
+      </w:r>
+      <w:r>
+        <w:noBreakHyphen/>
+      </w:r>
+      <w:r>
+        <w:fldChar w:fldCharType="begin"/>
+      </w:r>
+      <w:r>
+        <w:instrText xml:space="preserve"> SEQ Figure \* ARABIC \s 1 </w:instrText>
+      </w:r>
+      <w:r>
+        <w:fldChar w:fldCharType="separate"/>
+      </w:r>
+      <w:r>
+        <w:rPr>
+          <w:noProof/>
+        </w:rPr>
+        <w:t>1</w:t>
+      </w:r>
+      <w:r>
+        <w:rPr>
+          <w:noProof/>
+        </w:rPr>
+        <w:fldChar w:fldCharType="end"/>
+      </w:r>
+      <w:bookmarkEnd w:id="66"/>
+      <w:r>
+        <w:t xml:space="preserve"> Memory Wrapper</w:t>
+      </w:r>
+      <w:r>
+        <w:t xml:space="preserve"> Diagram</w:t>
+      </w:r>
+    </w:p>
+    <w:p>
+      <w:pPr>
+        <w:rPr>
+          <w:rFonts w:eastAsiaTheme="minorEastAsia" w:hint="eastAsia"/>
+        </w:rPr>
+      </w:pPr>
+      <w:r>
+        <w:rPr>
+          <w:rFonts w:eastAsiaTheme="minorEastAsia"/>
+        </w:rPr>
+        <w:t>Memory Wrapper</w:t>
+      </w:r>
+      <w:r>
+        <w:rPr>
+          <w:rFonts w:eastAsiaTheme="minorEastAsia"/>
+        </w:rPr>
+        <w:t xml:space="preserve"> completes the conversion of </w:t>
+      </w:r>
+      <w:r>
+        <w:rPr>
+          <w:rFonts w:eastAsiaTheme="minorEastAsia"/>
+        </w:rPr>
+        <w:t xml:space="preserve">SRAM access signals of </w:t>
+      </w:r>
+      <w:r>
+        <w:rPr>
+          <w:rFonts w:eastAsiaTheme="minorEastAsia"/>
+        </w:rPr>
+        <w:t>AXI_SRAMC and native SRAM interface signals.</w:t>
+      </w:r>
+      <w:r>
+        <w:rPr>
+          <w:rFonts w:eastAsiaTheme="minorEastAsia"/>
+        </w:rPr>
+        <w:t xml:space="preserve"> As shown in </w:t>
+      </w:r>
+      <w:r>
+        <w:rPr>
+          <w:rFonts w:eastAsiaTheme="minorEastAsia"/>
+        </w:rPr>
+        <w:fldChar w:fldCharType="begin"/>
+      </w:r>
+      <w:r>
+        <w:rPr>
+          <w:rFonts w:eastAsiaTheme="minorEastAsia"/>
+        </w:rPr>
+        <w:instrText xml:space="preserve"> REF _Ref142643843 \h </w:instrText>
+      </w:r>
+      <w:r>
+        <w:rPr>
+          <w:rFonts w:eastAsiaTheme="minorEastAsia"/>
+        </w:rPr>
+      </w:r>
+      <w:r>
+        <w:rPr>
+          <w:rFonts w:eastAsiaTheme="minorEastAsia"/>
+        </w:rPr>
+        <w:fldChar w:fldCharType="separate"/>
+      </w:r>
+      <w:r>
+        <w:t xml:space="preserve">Figure </w:t>
+      </w:r>
+      <w:r>
+        <w:rPr>
+          <w:noProof/>
+        </w:rPr>
+        <w:t>11</w:t>
+      </w:r>
+      <w:r>
+        <w:noBreakHyphen/>
+      </w:r>
+      <w:r>
+        <w:rPr>
+          <w:noProof/>
+        </w:rPr>
+        <w:t>1</w:t>
+      </w:r>
+      <w:r>
+        <w:rPr>
+          <w:rFonts w:eastAsiaTheme="minorEastAsia"/>
+        </w:rPr>
+        <w:fldChar w:fldCharType="end"/>
+      </w:r>
+      <w:r>
+        <w:rPr>
+          <w:rFonts w:eastAsiaTheme="minorEastAsia"/>
+        </w:rPr>
+        <w:t xml:space="preserve">, </w:t>
+      </w:r>
+      <w:r>
+        <w:rPr>
+          <w:rFonts w:eastAsiaTheme="minorEastAsia"/>
+        </w:rPr>
+        <w:t>c</w:t>
+      </w:r>
+      <w:r>
+        <w:rPr>
+          <w:rFonts w:eastAsiaTheme="minorEastAsia"/>
+        </w:rPr>
+        <w:t xml:space="preserve">onsidering the delay of </w:t>
+      </w:r>
+      <w:r>
+        <w:rPr>
+          <w:rFonts w:eastAsiaTheme="minorEastAsia"/>
+        </w:rPr>
+        <w:t>SRAM</w:t>
+      </w:r>
+      <w:r>
+        <w:rPr>
+          <w:rFonts w:eastAsiaTheme="minorEastAsia"/>
+        </w:rPr>
+        <w:t xml:space="preserve"> output, some control signals for AXI_SRAMC reply will go through a pipeline to complete the timing alignment with the output data.</w:t>
+      </w:r>
+      <w:r>
+        <w:rPr>
+          <w:rFonts w:eastAsiaTheme="minorEastAsia"/>
+        </w:rPr>
+        <w:t xml:space="preserve"> </w:t>
+      </w:r>
+      <w:r>
+        <w:rPr>
+          <w:rFonts w:eastAsiaTheme="minorEastAsia"/>
+        </w:rPr>
+        <w:t xml:space="preserve">Then the control signal and read data (not necessarily) will be stored in a FIFO. Assuming that the read latency of SRAM is N cycles, the number of pipeline stages is N, and the depth of </w:t>
+      </w:r>
+      <w:r>
+        <w:rPr>
+          <w:rFonts w:eastAsiaTheme="minorEastAsia"/>
+        </w:rPr>
+        <w:t>FIFO</w:t>
+      </w:r>
+      <w:r>
+        <w:rPr>
+          <w:rFonts w:eastAsiaTheme="minorEastAsia"/>
+        </w:rPr>
+        <w:t xml:space="preserve"> is N+1</w:t>
+      </w:r>
+      <w:r>
+        <w:rPr>
+          <w:rFonts w:eastAsiaTheme="minorEastAsia"/>
+        </w:rPr>
+        <w:t>.</w:t>
+      </w:r>
+      <w:r>
+        <w:rPr>
+          <w:rFonts w:eastAsiaTheme="minorEastAsia"/>
+        </w:rPr>
+        <w:t xml:space="preserve"> </w:t>
+      </w:r>
+      <w:r>
+        <w:rPr>
+          <w:rFonts w:eastAsiaTheme="minorEastAsia"/>
+        </w:rPr>
+        <w:t xml:space="preserve">The output valid is asserted when the </w:t>
+      </w:r>
+      <w:r>
+        <w:rPr>
+          <w:rFonts w:eastAsiaTheme="minorEastAsia"/>
+        </w:rPr>
+        <w:t>FIFO</w:t>
+      </w:r>
+      <w:r>
+        <w:rPr>
+          <w:rFonts w:eastAsiaTheme="minorEastAsia"/>
+        </w:rPr>
+        <w:t xml:space="preserve"> is not empty.</w:t>
+      </w:r>
+      <w:r>
+        <w:rPr>
+          <w:rFonts w:eastAsiaTheme="minorEastAsia"/>
+        </w:rPr>
+        <w:t xml:space="preserve"> </w:t>
+      </w:r>
+      <w:r>
+        <w:rPr>
+          <w:rFonts w:eastAsiaTheme="minorEastAsia"/>
+        </w:rPr>
+        <w:t xml:space="preserve">A counter is used to record the number of </w:t>
+      </w:r>
+      <w:r>
+        <w:rPr>
+          <w:rFonts w:eastAsiaTheme="minorEastAsia"/>
+        </w:rPr>
+        <w:t xml:space="preserve">outstanding </w:t>
+      </w:r>
+      <w:r>
+        <w:rPr>
+          <w:rFonts w:eastAsiaTheme="minorEastAsia"/>
+        </w:rPr>
+        <w:t>transfers in the Memory Wrapper</w:t>
+      </w:r>
+      <w:r>
+        <w:rPr>
+          <w:rFonts w:eastAsiaTheme="minorEastAsia"/>
+        </w:rPr>
+        <w:t xml:space="preserve">. </w:t>
+      </w:r>
+      <w:r>
+        <w:rPr>
+          <w:rFonts w:eastAsiaTheme="minorEastAsia"/>
+        </w:rPr>
+        <w:t xml:space="preserve">When the input Valid/Ready signal handshakes, the counter adds one, and when the output Valid/Ready handshakes, the counter decreases one. When the count </w:t>
+      </w:r>
+      <w:r>
+        <w:rPr>
+          <w:rFonts w:eastAsiaTheme="minorEastAsia"/>
+        </w:rPr>
+        <w:t xml:space="preserve">value </w:t>
+      </w:r>
+      <w:r>
+        <w:rPr>
+          <w:rFonts w:eastAsiaTheme="minorEastAsia"/>
+        </w:rPr>
+        <w:t>reaches N+1, the input ready is unassert</w:t>
+      </w:r>
+      <w:r>
+        <w:rPr>
+          <w:rFonts w:eastAsiaTheme="minorEastAsia"/>
+        </w:rPr>
+        <w:t>ed</w:t>
+      </w:r>
+      <w:r>
+        <w:rPr>
+          <w:rFonts w:eastAsiaTheme="minorEastAsia"/>
+        </w:rPr>
+        <w:t xml:space="preserve"> and </w:t>
+      </w:r>
+      <w:r>
+        <w:rPr>
+          <w:rFonts w:eastAsiaTheme="minorEastAsia"/>
+        </w:rPr>
+        <w:t xml:space="preserve">Memory Wrapper </w:t>
+      </w:r>
+      <w:r>
+        <w:rPr>
+          <w:rFonts w:eastAsiaTheme="minorEastAsia"/>
+        </w:rPr>
+        <w:t>does not accept input access.</w:t>
+      </w:r>
+    </w:p>
     <w:sectPr>
       <w:pgSz w:w="11900" w:h="16840"/>
       <w:pgMar w:top="1440" w:right="1800" w:bottom="1440" w:left="1800" w:header="851" w:footer="992" w:gutter="0"/>

</xml_diff>

<commit_message>
updated top && HDD
</commit_message>
<xml_diff>
--- a/axi_mem_controller/Project_GR001_IP_AXI_SRAMC_HDD.docx
+++ b/axi_mem_controller/Project_GR001_IP_AXI_SRAMC_HDD.docx
@@ -6102,6 +6102,9 @@
       <w:r>
         <w:t xml:space="preserve"> narrow transfers</w:t>
       </w:r>
+      <w:r>
+        <w:t xml:space="preserve"> and unaligned transfers</w:t>
+      </w:r>
     </w:p>
     <w:p>
       <w:r>
@@ -6573,19 +6576,7 @@
         <w:rPr>
           <w:rFonts w:eastAsiaTheme="minorEastAsia"/>
         </w:rPr>
-        <w:t>See</w:t>
-      </w:r>
-      <w:r>
-        <w:rPr>
-          <w:rFonts w:eastAsiaTheme="minorEastAsia"/>
-        </w:rPr>
-        <w:t xml:space="preserve"> </w:t>
-      </w:r>
-      <w:r>
-        <w:rPr>
-          <w:rFonts w:eastAsiaTheme="minorEastAsia"/>
-        </w:rPr>
-        <w:t xml:space="preserve">Appendix Section </w:t>
+        <w:t xml:space="preserve">See Appendix Section </w:t>
       </w:r>
       <w:r>
         <w:rPr>
@@ -7154,6 +7145,7 @@
         <w:t>“</w:t>
       </w:r>
       <w:proofErr w:type="spellStart"/>
+      <w:proofErr w:type="gramStart"/>
       <w:r>
         <w:rPr>
           <w:rFonts w:eastAsiaTheme="minorEastAsia"/>
@@ -7173,6 +7165,7 @@
         </w:rPr>
         <w:t>=</w:t>
       </w:r>
+      <w:proofErr w:type="gramEnd"/>
       <w:r>
         <w:rPr>
           <w:rFonts w:eastAsiaTheme="minorEastAsia"/>
@@ -7411,21 +7404,11 @@
             <w:r>
               <w:rPr>
                 <w:rFonts w:hint="eastAsia"/>
-                <w:color w:val="FF0000"/>
               </w:rPr>
               <w:t>5</w:t>
             </w:r>
             <w:r>
-              <w:rPr>
-                <w:color w:val="FF0000"/>
-              </w:rPr>
               <w:t>00MHz</w:t>
-            </w:r>
-            <w:r>
-              <w:rPr>
-                <w:color w:val="FF0000"/>
-              </w:rPr>
-              <w:t xml:space="preserve"> (TBD)</w:t>
             </w:r>
           </w:p>
         </w:tc>
@@ -8037,12 +8020,12 @@
         <w:tblLook w:val="04A0" w:firstRow="1" w:lastRow="0" w:firstColumn="1" w:lastColumn="0" w:noHBand="0" w:noVBand="1"/>
       </w:tblPr>
       <w:tblGrid>
-        <w:gridCol w:w="1209"/>
-        <w:gridCol w:w="2016"/>
-        <w:gridCol w:w="769"/>
+        <w:gridCol w:w="1206"/>
+        <w:gridCol w:w="2001"/>
+        <w:gridCol w:w="828"/>
         <w:gridCol w:w="1306"/>
-        <w:gridCol w:w="619"/>
-        <w:gridCol w:w="2371"/>
+        <w:gridCol w:w="615"/>
+        <w:gridCol w:w="2334"/>
       </w:tblGrid>
       <w:tr>
         <w:tc>
@@ -8368,6 +8351,12 @@
               <w:rPr>
                 <w:rFonts w:eastAsiaTheme="minorEastAsia"/>
               </w:rPr>
+              <w:t>s_</w:t>
+            </w:r>
+            <w:r>
+              <w:rPr>
+                <w:rFonts w:eastAsiaTheme="minorEastAsia"/>
+              </w:rPr>
               <w:t>aw</w:t>
             </w:r>
             <w:r>
@@ -8465,6 +8454,12 @@
               </w:rPr>
             </w:pPr>
             <w:proofErr w:type="spellStart"/>
+            <w:r>
+              <w:rPr>
+                <w:rFonts w:eastAsiaTheme="minorEastAsia"/>
+              </w:rPr>
+              <w:t>s_</w:t>
+            </w:r>
             <w:r>
               <w:rPr>
                 <w:rFonts w:eastAsiaTheme="minorEastAsia" w:hint="eastAsia"/>
@@ -8565,6 +8560,12 @@
             <w:proofErr w:type="spellStart"/>
             <w:r>
               <w:rPr>
+                <w:rFonts w:eastAsiaTheme="minorEastAsia"/>
+              </w:rPr>
+              <w:t>s_</w:t>
+            </w:r>
+            <w:r>
+              <w:rPr>
                 <w:rFonts w:eastAsiaTheme="minorEastAsia" w:hint="eastAsia"/>
               </w:rPr>
               <w:t>a</w:t>
@@ -8655,6 +8656,12 @@
             <w:proofErr w:type="spellStart"/>
             <w:r>
               <w:rPr>
+                <w:rFonts w:eastAsiaTheme="minorEastAsia"/>
+              </w:rPr>
+              <w:t>s_</w:t>
+            </w:r>
+            <w:r>
+              <w:rPr>
                 <w:rFonts w:eastAsiaTheme="minorEastAsia" w:hint="eastAsia"/>
               </w:rPr>
               <w:t>a</w:t>
@@ -8690,7 +8697,7 @@
                 <w:sz w:val="20"/>
                 <w:szCs w:val="20"/>
               </w:rPr>
-              <w:t>configurable</w:t>
+              <w:t>32</w:t>
             </w:r>
           </w:p>
         </w:tc>
@@ -8748,6 +8755,12 @@
             <w:proofErr w:type="spellStart"/>
             <w:r>
               <w:rPr>
+                <w:rFonts w:eastAsiaTheme="minorEastAsia"/>
+              </w:rPr>
+              <w:t>s_</w:t>
+            </w:r>
+            <w:r>
+              <w:rPr>
                 <w:rFonts w:eastAsiaTheme="minorEastAsia" w:hint="eastAsia"/>
               </w:rPr>
               <w:t>a</w:t>
@@ -8838,6 +8851,12 @@
             <w:proofErr w:type="spellStart"/>
             <w:r>
               <w:rPr>
+                <w:rFonts w:eastAsiaTheme="minorEastAsia"/>
+              </w:rPr>
+              <w:t>s_</w:t>
+            </w:r>
+            <w:r>
+              <w:rPr>
                 <w:rFonts w:eastAsiaTheme="minorEastAsia" w:hint="eastAsia"/>
               </w:rPr>
               <w:t>a</w:t>
@@ -8925,6 +8944,12 @@
             <w:proofErr w:type="spellStart"/>
             <w:r>
               <w:rPr>
+                <w:rFonts w:eastAsiaTheme="minorEastAsia"/>
+              </w:rPr>
+              <w:t>s_</w:t>
+            </w:r>
+            <w:r>
+              <w:rPr>
                 <w:rFonts w:eastAsiaTheme="minorEastAsia" w:hint="eastAsia"/>
               </w:rPr>
               <w:t>a</w:t>
@@ -9029,6 +9054,12 @@
             <w:proofErr w:type="spellStart"/>
             <w:r>
               <w:rPr>
+                <w:rFonts w:eastAsiaTheme="minorEastAsia"/>
+              </w:rPr>
+              <w:t>s_</w:t>
+            </w:r>
+            <w:r>
+              <w:rPr>
                 <w:rFonts w:eastAsiaTheme="minorEastAsia" w:hint="eastAsia"/>
               </w:rPr>
               <w:t>a</w:t>
@@ -9113,6 +9144,12 @@
             <w:proofErr w:type="spellStart"/>
             <w:r>
               <w:rPr>
+                <w:rFonts w:eastAsiaTheme="minorEastAsia"/>
+              </w:rPr>
+              <w:t>s_</w:t>
+            </w:r>
+            <w:r>
+              <w:rPr>
                 <w:rFonts w:eastAsiaTheme="minorEastAsia" w:hint="eastAsia"/>
               </w:rPr>
               <w:t>a</w:t>
@@ -9195,6 +9232,12 @@
               </w:rPr>
             </w:pPr>
             <w:proofErr w:type="spellStart"/>
+            <w:r>
+              <w:rPr>
+                <w:rFonts w:eastAsiaTheme="minorEastAsia"/>
+              </w:rPr>
+              <w:t>s_</w:t>
+            </w:r>
             <w:r>
               <w:rPr>
                 <w:rFonts w:eastAsiaTheme="minorEastAsia" w:hint="eastAsia"/>
@@ -9286,6 +9329,12 @@
               <w:rPr>
                 <w:rFonts w:eastAsiaTheme="minorEastAsia"/>
               </w:rPr>
+              <w:t>s_</w:t>
+            </w:r>
+            <w:r>
+              <w:rPr>
+                <w:rFonts w:eastAsiaTheme="minorEastAsia"/>
+              </w:rPr>
               <w:t>a</w:t>
             </w:r>
             <w:r>
@@ -9377,6 +9426,12 @@
             <w:proofErr w:type="spellStart"/>
             <w:r>
               <w:rPr>
+                <w:rFonts w:eastAsiaTheme="minorEastAsia"/>
+              </w:rPr>
+              <w:t>s_</w:t>
+            </w:r>
+            <w:r>
+              <w:rPr>
                 <w:rFonts w:eastAsiaTheme="minorEastAsia" w:hint="eastAsia"/>
               </w:rPr>
               <w:t>w</w:t>
@@ -9462,6 +9517,12 @@
               </w:rPr>
             </w:pPr>
             <w:proofErr w:type="spellStart"/>
+            <w:r>
+              <w:rPr>
+                <w:rFonts w:eastAsiaTheme="minorEastAsia"/>
+              </w:rPr>
+              <w:t>s_</w:t>
+            </w:r>
             <w:r>
               <w:rPr>
                 <w:rFonts w:eastAsiaTheme="minorEastAsia" w:hint="eastAsia"/>
@@ -9554,6 +9615,12 @@
             <w:proofErr w:type="spellStart"/>
             <w:r>
               <w:rPr>
+                <w:rFonts w:eastAsiaTheme="minorEastAsia"/>
+              </w:rPr>
+              <w:t>s_</w:t>
+            </w:r>
+            <w:r>
+              <w:rPr>
                 <w:rFonts w:eastAsiaTheme="minorEastAsia" w:hint="eastAsia"/>
               </w:rPr>
               <w:t>w</w:t>
@@ -9644,6 +9711,12 @@
             <w:proofErr w:type="spellStart"/>
             <w:r>
               <w:rPr>
+                <w:rFonts w:eastAsiaTheme="minorEastAsia"/>
+              </w:rPr>
+              <w:t>s_</w:t>
+            </w:r>
+            <w:r>
+              <w:rPr>
                 <w:rFonts w:eastAsiaTheme="minorEastAsia" w:hint="eastAsia"/>
               </w:rPr>
               <w:t>w</w:t>
@@ -9733,6 +9806,12 @@
             <w:proofErr w:type="spellStart"/>
             <w:r>
               <w:rPr>
+                <w:rFonts w:eastAsiaTheme="minorEastAsia"/>
+              </w:rPr>
+              <w:t>s_</w:t>
+            </w:r>
+            <w:r>
+              <w:rPr>
                 <w:rFonts w:eastAsiaTheme="minorEastAsia" w:hint="eastAsia"/>
               </w:rPr>
               <w:t>w</w:t>
@@ -9820,6 +9899,12 @@
             <w:proofErr w:type="spellStart"/>
             <w:r>
               <w:rPr>
+                <w:rFonts w:eastAsiaTheme="minorEastAsia"/>
+              </w:rPr>
+              <w:t>s_</w:t>
+            </w:r>
+            <w:r>
+              <w:rPr>
                 <w:rFonts w:eastAsiaTheme="minorEastAsia" w:hint="eastAsia"/>
               </w:rPr>
               <w:t>b</w:t>
@@ -9904,6 +9989,13 @@
                 <w:rFonts w:eastAsiaTheme="minorEastAsia"/>
               </w:rPr>
             </w:pPr>
+            <w:proofErr w:type="spellStart"/>
+            <w:r>
+              <w:rPr>
+                <w:rFonts w:eastAsiaTheme="minorEastAsia"/>
+              </w:rPr>
+              <w:t>s_</w:t>
+            </w:r>
             <w:r>
               <w:rPr>
                 <w:rFonts w:eastAsiaTheme="minorEastAsia" w:hint="eastAsia"/>
@@ -9916,6 +10008,7 @@
               </w:rPr>
               <w:t>ready</w:t>
             </w:r>
+            <w:proofErr w:type="spellEnd"/>
           </w:p>
         </w:tc>
         <w:tc>
@@ -9992,6 +10085,13 @@
                 <w:szCs w:val="20"/>
               </w:rPr>
             </w:pPr>
+            <w:proofErr w:type="spellStart"/>
+            <w:r>
+              <w:rPr>
+                <w:rFonts w:eastAsiaTheme="minorEastAsia"/>
+              </w:rPr>
+              <w:t>s_</w:t>
+            </w:r>
             <w:r>
               <w:rPr>
                 <w:rFonts w:eastAsiaTheme="minorEastAsia" w:hint="eastAsia"/>
@@ -10004,6 +10104,7 @@
               </w:rPr>
               <w:t>id</w:t>
             </w:r>
+            <w:proofErr w:type="spellEnd"/>
           </w:p>
         </w:tc>
         <w:tc>
@@ -10083,6 +10184,12 @@
             <w:proofErr w:type="spellStart"/>
             <w:r>
               <w:rPr>
+                <w:rFonts w:eastAsiaTheme="minorEastAsia"/>
+              </w:rPr>
+              <w:t>s_</w:t>
+            </w:r>
+            <w:r>
+              <w:rPr>
                 <w:rFonts w:eastAsiaTheme="minorEastAsia" w:hint="eastAsia"/>
               </w:rPr>
               <w:t>b</w:t>
@@ -10172,6 +10279,12 @@
               <w:rPr>
                 <w:rFonts w:eastAsiaTheme="minorEastAsia"/>
               </w:rPr>
+              <w:t>s_</w:t>
+            </w:r>
+            <w:r>
+              <w:rPr>
+                <w:rFonts w:eastAsiaTheme="minorEastAsia"/>
+              </w:rPr>
               <w:t>ar</w:t>
             </w:r>
             <w:r>
@@ -10264,6 +10377,12 @@
               </w:rPr>
             </w:pPr>
             <w:proofErr w:type="spellStart"/>
+            <w:r>
+              <w:rPr>
+                <w:rFonts w:eastAsiaTheme="minorEastAsia"/>
+              </w:rPr>
+              <w:t>s_</w:t>
+            </w:r>
             <w:r>
               <w:rPr>
                 <w:rFonts w:eastAsiaTheme="minorEastAsia" w:hint="eastAsia"/>
@@ -10362,6 +10481,13 @@
                 <w:szCs w:val="20"/>
               </w:rPr>
             </w:pPr>
+            <w:proofErr w:type="spellStart"/>
+            <w:r>
+              <w:rPr>
+                <w:rFonts w:eastAsiaTheme="minorEastAsia"/>
+              </w:rPr>
+              <w:t>s_</w:t>
+            </w:r>
             <w:r>
               <w:rPr>
                 <w:rFonts w:eastAsiaTheme="minorEastAsia" w:hint="eastAsia"/>
@@ -10374,6 +10500,7 @@
               </w:rPr>
               <w:t>rid</w:t>
             </w:r>
+            <w:proofErr w:type="spellEnd"/>
           </w:p>
         </w:tc>
         <w:tc>
@@ -10453,6 +10580,12 @@
             <w:proofErr w:type="spellStart"/>
             <w:r>
               <w:rPr>
+                <w:rFonts w:eastAsiaTheme="minorEastAsia"/>
+              </w:rPr>
+              <w:t>s_</w:t>
+            </w:r>
+            <w:r>
+              <w:rPr>
                 <w:rFonts w:eastAsiaTheme="minorEastAsia" w:hint="eastAsia"/>
               </w:rPr>
               <w:t>a</w:t>
@@ -10482,7 +10615,7 @@
                 <w:sz w:val="20"/>
                 <w:szCs w:val="20"/>
               </w:rPr>
-              <w:t>configurable</w:t>
+              <w:t>32</w:t>
             </w:r>
           </w:p>
         </w:tc>
@@ -10540,6 +10673,12 @@
             <w:proofErr w:type="spellStart"/>
             <w:r>
               <w:rPr>
+                <w:rFonts w:eastAsiaTheme="minorEastAsia"/>
+              </w:rPr>
+              <w:t>s_</w:t>
+            </w:r>
+            <w:r>
+              <w:rPr>
                 <w:rFonts w:eastAsiaTheme="minorEastAsia" w:hint="eastAsia"/>
               </w:rPr>
               <w:t>a</w:t>
@@ -10624,6 +10763,12 @@
             <w:proofErr w:type="spellStart"/>
             <w:r>
               <w:rPr>
+                <w:rFonts w:eastAsiaTheme="minorEastAsia"/>
+              </w:rPr>
+              <w:t>s_</w:t>
+            </w:r>
+            <w:r>
+              <w:rPr>
                 <w:rFonts w:eastAsiaTheme="minorEastAsia" w:hint="eastAsia"/>
               </w:rPr>
               <w:t>a</w:t>
@@ -10708,6 +10853,12 @@
             <w:proofErr w:type="spellStart"/>
             <w:r>
               <w:rPr>
+                <w:rFonts w:eastAsiaTheme="minorEastAsia"/>
+              </w:rPr>
+              <w:t>s_</w:t>
+            </w:r>
+            <w:r>
+              <w:rPr>
                 <w:rFonts w:eastAsiaTheme="minorEastAsia" w:hint="eastAsia"/>
               </w:rPr>
               <w:t>a</w:t>
@@ -10804,6 +10955,12 @@
             <w:proofErr w:type="spellStart"/>
             <w:r>
               <w:rPr>
+                <w:rFonts w:eastAsiaTheme="minorEastAsia"/>
+              </w:rPr>
+              <w:t>s_</w:t>
+            </w:r>
+            <w:r>
+              <w:rPr>
                 <w:rFonts w:eastAsiaTheme="minorEastAsia" w:hint="eastAsia"/>
               </w:rPr>
               <w:t>a</w:t>
@@ -10885,6 +11042,12 @@
             <w:proofErr w:type="spellStart"/>
             <w:r>
               <w:rPr>
+                <w:rFonts w:eastAsiaTheme="minorEastAsia"/>
+              </w:rPr>
+              <w:t>s_</w:t>
+            </w:r>
+            <w:r>
+              <w:rPr>
                 <w:rFonts w:eastAsiaTheme="minorEastAsia" w:hint="eastAsia"/>
               </w:rPr>
               <w:t>a</w:t>
@@ -10964,6 +11127,12 @@
               </w:rPr>
             </w:pPr>
             <w:proofErr w:type="spellStart"/>
+            <w:r>
+              <w:rPr>
+                <w:rFonts w:eastAsiaTheme="minorEastAsia"/>
+              </w:rPr>
+              <w:t>s_</w:t>
+            </w:r>
             <w:r>
               <w:rPr>
                 <w:rFonts w:eastAsiaTheme="minorEastAsia" w:hint="eastAsia"/>
@@ -11052,6 +11221,12 @@
               <w:rPr>
                 <w:rFonts w:eastAsiaTheme="minorEastAsia"/>
               </w:rPr>
+              <w:t>s_</w:t>
+            </w:r>
+            <w:r>
+              <w:rPr>
+                <w:rFonts w:eastAsiaTheme="minorEastAsia"/>
+              </w:rPr>
               <w:t>aruser</w:t>
             </w:r>
             <w:proofErr w:type="spellEnd"/>
@@ -11131,6 +11306,12 @@
             <w:proofErr w:type="spellStart"/>
             <w:r>
               <w:rPr>
+                <w:rFonts w:eastAsiaTheme="minorEastAsia"/>
+              </w:rPr>
+              <w:t>s_</w:t>
+            </w:r>
+            <w:r>
+              <w:rPr>
                 <w:rFonts w:eastAsiaTheme="minorEastAsia" w:hint="eastAsia"/>
               </w:rPr>
               <w:t>r</w:t>
@@ -11227,6 +11408,12 @@
             <w:proofErr w:type="spellStart"/>
             <w:r>
               <w:rPr>
+                <w:rFonts w:eastAsiaTheme="minorEastAsia"/>
+              </w:rPr>
+              <w:t>s_</w:t>
+            </w:r>
+            <w:r>
+              <w:rPr>
                 <w:rFonts w:eastAsiaTheme="minorEastAsia" w:hint="eastAsia"/>
               </w:rPr>
               <w:t>r</w:t>
@@ -11320,6 +11507,13 @@
                 <w:szCs w:val="20"/>
               </w:rPr>
             </w:pPr>
+            <w:proofErr w:type="spellStart"/>
+            <w:r>
+              <w:rPr>
+                <w:rFonts w:eastAsiaTheme="minorEastAsia"/>
+              </w:rPr>
+              <w:t>s_</w:t>
+            </w:r>
             <w:r>
               <w:rPr>
                 <w:rFonts w:eastAsiaTheme="minorEastAsia" w:hint="eastAsia"/>
@@ -11332,6 +11526,7 @@
               </w:rPr>
               <w:t>id</w:t>
             </w:r>
+            <w:proofErr w:type="spellEnd"/>
           </w:p>
         </w:tc>
         <w:tc>
@@ -11417,6 +11612,12 @@
             <w:proofErr w:type="spellStart"/>
             <w:r>
               <w:rPr>
+                <w:rFonts w:eastAsiaTheme="minorEastAsia"/>
+              </w:rPr>
+              <w:t>s_</w:t>
+            </w:r>
+            <w:r>
+              <w:rPr>
                 <w:rFonts w:eastAsiaTheme="minorEastAsia" w:hint="eastAsia"/>
               </w:rPr>
               <w:t>r</w:t>
@@ -11513,6 +11714,12 @@
             <w:proofErr w:type="spellStart"/>
             <w:r>
               <w:rPr>
+                <w:rFonts w:eastAsiaTheme="minorEastAsia"/>
+              </w:rPr>
+              <w:t>s_</w:t>
+            </w:r>
+            <w:r>
+              <w:rPr>
                 <w:rFonts w:eastAsiaTheme="minorEastAsia" w:hint="eastAsia"/>
               </w:rPr>
               <w:t>r</w:t>
@@ -11609,6 +11816,12 @@
             <w:proofErr w:type="spellStart"/>
             <w:r>
               <w:rPr>
+                <w:rFonts w:eastAsiaTheme="minorEastAsia"/>
+              </w:rPr>
+              <w:t>s_</w:t>
+            </w:r>
+            <w:r>
+              <w:rPr>
                 <w:rFonts w:eastAsiaTheme="minorEastAsia" w:hint="eastAsia"/>
               </w:rPr>
               <w:t>r</w:t>
@@ -11723,9 +11936,21 @@
             <w:proofErr w:type="spellStart"/>
             <w:r>
               <w:rPr>
+                <w:rFonts w:eastAsiaTheme="minorEastAsia"/>
+              </w:rPr>
+              <w:t>m_</w:t>
+            </w:r>
+            <w:r>
+              <w:rPr>
                 <w:rFonts w:eastAsiaTheme="minorEastAsia" w:hint="eastAsia"/>
               </w:rPr>
               <w:t>mi</w:t>
+            </w:r>
+            <w:r>
+              <w:rPr>
+                <w:rFonts w:eastAsiaTheme="minorEastAsia"/>
+              </w:rPr>
+              <w:t>_</w:t>
             </w:r>
             <w:r>
               <w:rPr>
@@ -11827,15 +12052,27 @@
             <w:proofErr w:type="spellStart"/>
             <w:r>
               <w:rPr>
-                <w:rFonts w:eastAsiaTheme="minorEastAsia" w:hint="eastAsia"/>
-              </w:rPr>
-              <w:t>m</w:t>
-            </w:r>
-            <w:r>
-              <w:rPr>
-                <w:rFonts w:eastAsiaTheme="minorEastAsia"/>
-              </w:rPr>
-              <w:t>iready</w:t>
+                <w:rFonts w:eastAsiaTheme="minorEastAsia"/>
+              </w:rPr>
+              <w:t>m_m</w:t>
+            </w:r>
+            <w:r>
+              <w:rPr>
+                <w:rFonts w:eastAsiaTheme="minorEastAsia"/>
+              </w:rPr>
+              <w:t>i</w:t>
+            </w:r>
+            <w:r>
+              <w:rPr>
+                <w:rFonts w:eastAsiaTheme="minorEastAsia"/>
+              </w:rPr>
+              <w:t>_</w:t>
+            </w:r>
+            <w:r>
+              <w:rPr>
+                <w:rFonts w:eastAsiaTheme="minorEastAsia"/>
+              </w:rPr>
+              <w:t>ready</w:t>
             </w:r>
             <w:proofErr w:type="spellEnd"/>
           </w:p>
@@ -11923,6 +12160,12 @@
             <w:proofErr w:type="spellStart"/>
             <w:r>
               <w:rPr>
+                <w:rFonts w:eastAsiaTheme="minorEastAsia"/>
+              </w:rPr>
+              <w:t>m_</w:t>
+            </w:r>
+            <w:r>
+              <w:rPr>
                 <w:rFonts w:eastAsiaTheme="minorEastAsia" w:hint="eastAsia"/>
               </w:rPr>
               <w:t>m</w:t>
@@ -11931,7 +12174,19 @@
               <w:rPr>
                 <w:rFonts w:eastAsiaTheme="minorEastAsia"/>
               </w:rPr>
-              <w:t>ipayload</w:t>
+              <w:t>i</w:t>
+            </w:r>
+            <w:r>
+              <w:rPr>
+                <w:rFonts w:eastAsiaTheme="minorEastAsia"/>
+              </w:rPr>
+              <w:t>_</w:t>
+            </w:r>
+            <w:r>
+              <w:rPr>
+                <w:rFonts w:eastAsiaTheme="minorEastAsia"/>
+              </w:rPr>
+              <w:t>payload</w:t>
             </w:r>
             <w:proofErr w:type="spellEnd"/>
           </w:p>
@@ -12305,6 +12560,15 @@
             <w:proofErr w:type="spellStart"/>
             <w:r>
               <w:rPr>
+                <w:rFonts w:ascii="Arial" w:eastAsiaTheme="minorEastAsia" w:hAnsi="Arial" w:cs="Arial"/>
+                <w:kern w:val="0"/>
+                <w:sz w:val="20"/>
+                <w:szCs w:val="20"/>
+              </w:rPr>
+              <w:t>ax</w:t>
+            </w:r>
+            <w:r>
+              <w:rPr>
                 <w:rFonts w:ascii="Arial" w:eastAsiaTheme="minorEastAsia" w:hAnsi="Arial" w:cs="Arial" w:hint="eastAsia"/>
                 <w:kern w:val="0"/>
                 <w:sz w:val="20"/>
@@ -12346,7 +12610,7 @@
                 <w:sz w:val="20"/>
                 <w:szCs w:val="20"/>
               </w:rPr>
-              <w:t>configurable</w:t>
+              <w:t>32</w:t>
             </w:r>
           </w:p>
         </w:tc>
@@ -12426,6 +12690,16 @@
                 <w:szCs w:val="20"/>
               </w:rPr>
             </w:pPr>
+            <w:proofErr w:type="spellStart"/>
+            <w:r>
+              <w:rPr>
+                <w:rFonts w:ascii="Arial" w:eastAsiaTheme="minorEastAsia" w:hAnsi="Arial" w:cs="Arial"/>
+                <w:kern w:val="0"/>
+                <w:sz w:val="20"/>
+                <w:szCs w:val="20"/>
+              </w:rPr>
+              <w:t>ax</w:t>
+            </w:r>
             <w:r>
               <w:rPr>
                 <w:rFonts w:ascii="Arial" w:eastAsiaTheme="minorEastAsia" w:hAnsi="Arial" w:cs="Arial" w:hint="eastAsia"/>
@@ -12444,6 +12718,7 @@
               </w:rPr>
               <w:t>ast</w:t>
             </w:r>
+            <w:proofErr w:type="spellEnd"/>
           </w:p>
         </w:tc>
         <w:tc>
@@ -12548,6 +12823,16 @@
                 <w:szCs w:val="20"/>
               </w:rPr>
             </w:pPr>
+            <w:proofErr w:type="spellStart"/>
+            <w:r>
+              <w:rPr>
+                <w:rFonts w:ascii="Arial" w:eastAsiaTheme="minorEastAsia" w:hAnsi="Arial" w:cs="Arial"/>
+                <w:kern w:val="0"/>
+                <w:sz w:val="20"/>
+                <w:szCs w:val="20"/>
+              </w:rPr>
+              <w:t>ax</w:t>
+            </w:r>
             <w:r>
               <w:rPr>
                 <w:rFonts w:ascii="Arial" w:eastAsiaTheme="minorEastAsia" w:hAnsi="Arial" w:cs="Arial" w:hint="eastAsia"/>
@@ -12566,6 +12851,7 @@
               </w:rPr>
               <w:t>ser</w:t>
             </w:r>
+            <w:proofErr w:type="spellEnd"/>
           </w:p>
         </w:tc>
         <w:tc>
@@ -12764,6 +13050,12 @@
             <w:proofErr w:type="spellStart"/>
             <w:r>
               <w:rPr>
+                <w:rFonts w:eastAsiaTheme="minorEastAsia"/>
+              </w:rPr>
+              <w:t>m_</w:t>
+            </w:r>
+            <w:r>
+              <w:rPr>
                 <w:rFonts w:eastAsiaTheme="minorEastAsia" w:hint="eastAsia"/>
               </w:rPr>
               <w:t>m</w:t>
@@ -12772,7 +13064,19 @@
               <w:rPr>
                 <w:rFonts w:eastAsiaTheme="minorEastAsia"/>
               </w:rPr>
-              <w:t>ovaild</w:t>
+              <w:t>o</w:t>
+            </w:r>
+            <w:r>
+              <w:rPr>
+                <w:rFonts w:eastAsiaTheme="minorEastAsia"/>
+              </w:rPr>
+              <w:t>_</w:t>
+            </w:r>
+            <w:r>
+              <w:rPr>
+                <w:rFonts w:eastAsiaTheme="minorEastAsia"/>
+              </w:rPr>
+              <w:t>vaild</w:t>
             </w:r>
             <w:proofErr w:type="spellEnd"/>
           </w:p>
@@ -12863,6 +13167,12 @@
             <w:proofErr w:type="spellStart"/>
             <w:r>
               <w:rPr>
+                <w:rFonts w:eastAsiaTheme="minorEastAsia"/>
+              </w:rPr>
+              <w:t>m_</w:t>
+            </w:r>
+            <w:r>
+              <w:rPr>
                 <w:rFonts w:eastAsiaTheme="minorEastAsia" w:hint="eastAsia"/>
               </w:rPr>
               <w:t>m</w:t>
@@ -12871,7 +13181,19 @@
               <w:rPr>
                 <w:rFonts w:eastAsiaTheme="minorEastAsia"/>
               </w:rPr>
-              <w:t>oready</w:t>
+              <w:t>o</w:t>
+            </w:r>
+            <w:r>
+              <w:rPr>
+                <w:rFonts w:eastAsiaTheme="minorEastAsia"/>
+              </w:rPr>
+              <w:t>_</w:t>
+            </w:r>
+            <w:r>
+              <w:rPr>
+                <w:rFonts w:eastAsiaTheme="minorEastAsia"/>
+              </w:rPr>
+              <w:t>ready</w:t>
             </w:r>
             <w:proofErr w:type="spellEnd"/>
           </w:p>
@@ -12959,6 +13281,12 @@
             <w:proofErr w:type="spellStart"/>
             <w:r>
               <w:rPr>
+                <w:rFonts w:eastAsiaTheme="minorEastAsia"/>
+              </w:rPr>
+              <w:t>m_</w:t>
+            </w:r>
+            <w:r>
+              <w:rPr>
                 <w:rFonts w:eastAsiaTheme="minorEastAsia" w:hint="eastAsia"/>
               </w:rPr>
               <w:t>m</w:t>
@@ -12967,7 +13295,19 @@
               <w:rPr>
                 <w:rFonts w:eastAsiaTheme="minorEastAsia"/>
               </w:rPr>
-              <w:t>opayload</w:t>
+              <w:t>o</w:t>
+            </w:r>
+            <w:r>
+              <w:rPr>
+                <w:rFonts w:eastAsiaTheme="minorEastAsia"/>
+              </w:rPr>
+              <w:t>_</w:t>
+            </w:r>
+            <w:r>
+              <w:rPr>
+                <w:rFonts w:eastAsiaTheme="minorEastAsia"/>
+              </w:rPr>
+              <w:t>payload</w:t>
             </w:r>
             <w:proofErr w:type="spellEnd"/>
           </w:p>
@@ -13459,6 +13799,16 @@
                 <w:szCs w:val="20"/>
               </w:rPr>
             </w:pPr>
+            <w:proofErr w:type="spellStart"/>
+            <w:r>
+              <w:rPr>
+                <w:rFonts w:ascii="Arial" w:eastAsiaTheme="minorEastAsia" w:hAnsi="Arial" w:cs="Arial"/>
+                <w:kern w:val="0"/>
+                <w:sz w:val="20"/>
+                <w:szCs w:val="20"/>
+              </w:rPr>
+              <w:t>ax</w:t>
+            </w:r>
             <w:r>
               <w:rPr>
                 <w:rFonts w:ascii="Arial" w:eastAsiaTheme="minorEastAsia" w:hAnsi="Arial" w:cs="Arial" w:hint="eastAsia"/>
@@ -13477,6 +13827,7 @@
               </w:rPr>
               <w:t>ast</w:t>
             </w:r>
+            <w:proofErr w:type="spellEnd"/>
           </w:p>
         </w:tc>
         <w:tc>
@@ -16781,6 +17132,7 @@
         <w:t>the write request with ‘</w:t>
       </w:r>
       <w:proofErr w:type="spellStart"/>
+      <w:proofErr w:type="gramStart"/>
       <w:r>
         <w:rPr>
           <w:rFonts w:eastAsiaTheme="minorEastAsia"/>
@@ -16792,7 +17144,14 @@
         <w:rPr>
           <w:rFonts w:eastAsiaTheme="minorEastAsia"/>
         </w:rPr>
-        <w:t xml:space="preserve"> != `1’ will</w:t>
+        <w:t xml:space="preserve"> !</w:t>
+      </w:r>
+      <w:proofErr w:type="gramEnd"/>
+      <w:r>
+        <w:rPr>
+          <w:rFonts w:eastAsiaTheme="minorEastAsia"/>
+        </w:rPr>
+        <w:t>= `1’ will</w:t>
       </w:r>
       <w:r>
         <w:rPr>
@@ -17822,10 +18181,10 @@
           <w:noProof/>
         </w:rPr>
         <w:drawing>
-          <wp:inline distT="0" distB="0" distL="0" distR="0" wp14:anchorId="4465F759" wp14:editId="16CEE3FB">
-            <wp:extent cx="2095682" cy="4145639"/>
-            <wp:effectExtent l="0" t="0" r="0" b="7620"/>
-            <wp:docPr id="311831451" name="图片 1"/>
+          <wp:inline distT="0" distB="0" distL="0" distR="0" wp14:anchorId="1B538AC4" wp14:editId="0F6727BD">
+            <wp:extent cx="1860605" cy="3794016"/>
+            <wp:effectExtent l="0" t="0" r="6350" b="0"/>
+            <wp:docPr id="1895954140" name="图片 1"/>
             <wp:cNvGraphicFramePr>
               <a:graphicFrameLocks xmlns:a="http://schemas.openxmlformats.org/drawingml/2006/main" noChangeAspect="1"/>
             </wp:cNvGraphicFramePr>
@@ -17833,7 +18192,7 @@
               <a:graphicData uri="http://schemas.openxmlformats.org/drawingml/2006/picture">
                 <pic:pic xmlns:pic="http://schemas.openxmlformats.org/drawingml/2006/picture">
                   <pic:nvPicPr>
-                    <pic:cNvPr id="311831451" name=""/>
+                    <pic:cNvPr id="1895954140" name=""/>
                     <pic:cNvPicPr/>
                   </pic:nvPicPr>
                   <pic:blipFill>
@@ -17845,7 +18204,7 @@
                   <pic:spPr>
                     <a:xfrm>
                       <a:off x="0" y="0"/>
-                      <a:ext cx="2095682" cy="4145639"/>
+                      <a:ext cx="1864063" cy="3801068"/>
                     </a:xfrm>
                     <a:prstGeom prst="rect">
                       <a:avLst/>
@@ -19300,30 +19659,39 @@
                 <w:color w:val="0070C0"/>
               </w:rPr>
             </w:pPr>
-            <w:proofErr w:type="spellStart"/>
-            <w:r>
-              <w:rPr>
-                <w:rFonts w:hint="eastAsia"/>
+          </w:p>
+        </w:tc>
+        <w:tc>
+          <w:tcPr>
+            <w:tcW w:w="1381" w:type="dxa"/>
+          </w:tcPr>
+          <w:p>
+            <w:pPr>
+              <w:rPr>
                 <w:i/>
                 <w:iCs/>
                 <w:color w:val="0070C0"/>
               </w:rPr>
-              <w:t>r</w:t>
-            </w:r>
-            <w:r>
+            </w:pPr>
+          </w:p>
+        </w:tc>
+        <w:tc>
+          <w:tcPr>
+            <w:tcW w:w="1382" w:type="dxa"/>
+          </w:tcPr>
+          <w:p>
+            <w:pPr>
               <w:rPr>
                 <w:i/>
                 <w:iCs/>
                 <w:color w:val="0070C0"/>
               </w:rPr>
-              <w:t>am_a</w:t>
-            </w:r>
-            <w:proofErr w:type="spellEnd"/>
-          </w:p>
-        </w:tc>
-        <w:tc>
-          <w:tcPr>
-            <w:tcW w:w="1381" w:type="dxa"/>
+            </w:pPr>
+          </w:p>
+        </w:tc>
+        <w:tc>
+          <w:tcPr>
+            <w:tcW w:w="1382" w:type="dxa"/>
           </w:tcPr>
           <w:p>
             <w:pPr>
@@ -19333,28 +19701,47 @@
                 <w:color w:val="0070C0"/>
               </w:rPr>
             </w:pPr>
-            <w:r>
-              <w:rPr>
-                <w:rFonts w:hint="eastAsia"/>
+          </w:p>
+        </w:tc>
+        <w:tc>
+          <w:tcPr>
+            <w:tcW w:w="1382" w:type="dxa"/>
+          </w:tcPr>
+          <w:p>
+            <w:pPr>
+              <w:rPr>
                 <w:i/>
                 <w:iCs/>
                 <w:color w:val="0070C0"/>
               </w:rPr>
-              <w:t>1</w:t>
-            </w:r>
-            <w:r>
+            </w:pPr>
+          </w:p>
+        </w:tc>
+        <w:tc>
+          <w:tcPr>
+            <w:tcW w:w="1382" w:type="dxa"/>
+          </w:tcPr>
+          <w:p/>
+        </w:tc>
+      </w:tr>
+      <w:tr>
+        <w:tc>
+          <w:tcPr>
+            <w:tcW w:w="1381" w:type="dxa"/>
+          </w:tcPr>
+          <w:p>
+            <w:pPr>
               <w:rPr>
                 <w:i/>
                 <w:iCs/>
                 <w:color w:val="0070C0"/>
               </w:rPr>
-              <w:t>6</w:t>
-            </w:r>
-          </w:p>
-        </w:tc>
-        <w:tc>
-          <w:tcPr>
-            <w:tcW w:w="1382" w:type="dxa"/>
+            </w:pPr>
+          </w:p>
+        </w:tc>
+        <w:tc>
+          <w:tcPr>
+            <w:tcW w:w="1381" w:type="dxa"/>
           </w:tcPr>
           <w:p>
             <w:pPr>
@@ -19364,23 +19751,34 @@
                 <w:color w:val="0070C0"/>
               </w:rPr>
             </w:pPr>
-            <w:r>
-              <w:rPr>
-                <w:rFonts w:hint="eastAsia"/>
+          </w:p>
+        </w:tc>
+        <w:tc>
+          <w:tcPr>
+            <w:tcW w:w="1382" w:type="dxa"/>
+          </w:tcPr>
+          <w:p>
+            <w:pPr>
+              <w:rPr>
                 <w:i/>
                 <w:iCs/>
                 <w:color w:val="0070C0"/>
               </w:rPr>
-              <w:t>3</w:t>
-            </w:r>
-            <w:r>
+            </w:pPr>
+          </w:p>
+        </w:tc>
+        <w:tc>
+          <w:tcPr>
+            <w:tcW w:w="1382" w:type="dxa"/>
+          </w:tcPr>
+          <w:p>
+            <w:pPr>
               <w:rPr>
                 <w:i/>
                 <w:iCs/>
                 <w:color w:val="0070C0"/>
               </w:rPr>
-              <w:t>2</w:t>
-            </w:r>
+            </w:pPr>
           </w:p>
         </w:tc>
         <w:tc>
@@ -19395,219 +19793,6 @@
                 <w:color w:val="0070C0"/>
               </w:rPr>
             </w:pPr>
-            <w:r>
-              <w:rPr>
-                <w:rFonts w:hint="eastAsia"/>
-                <w:i/>
-                <w:iCs/>
-                <w:color w:val="0070C0"/>
-              </w:rPr>
-              <w:t>5</w:t>
-            </w:r>
-            <w:r>
-              <w:rPr>
-                <w:i/>
-                <w:iCs/>
-                <w:color w:val="0070C0"/>
-              </w:rPr>
-              <w:t>00MHz</w:t>
-            </w:r>
-          </w:p>
-        </w:tc>
-        <w:tc>
-          <w:tcPr>
-            <w:tcW w:w="1382" w:type="dxa"/>
-          </w:tcPr>
-          <w:p>
-            <w:pPr>
-              <w:rPr>
-                <w:i/>
-                <w:iCs/>
-                <w:color w:val="0070C0"/>
-              </w:rPr>
-            </w:pPr>
-            <w:r>
-              <w:rPr>
-                <w:rFonts w:hint="eastAsia"/>
-                <w:i/>
-                <w:iCs/>
-                <w:color w:val="0070C0"/>
-              </w:rPr>
-              <w:t>S</w:t>
-            </w:r>
-            <w:r>
-              <w:rPr>
-                <w:i/>
-                <w:iCs/>
-                <w:color w:val="0070C0"/>
-              </w:rPr>
-              <w:t>ingle Port</w:t>
-            </w:r>
-          </w:p>
-        </w:tc>
-        <w:tc>
-          <w:tcPr>
-            <w:tcW w:w="1382" w:type="dxa"/>
-          </w:tcPr>
-          <w:p/>
-        </w:tc>
-      </w:tr>
-      <w:tr>
-        <w:tc>
-          <w:tcPr>
-            <w:tcW w:w="1381" w:type="dxa"/>
-          </w:tcPr>
-          <w:p>
-            <w:pPr>
-              <w:rPr>
-                <w:i/>
-                <w:iCs/>
-                <w:color w:val="0070C0"/>
-              </w:rPr>
-            </w:pPr>
-            <w:proofErr w:type="spellStart"/>
-            <w:r>
-              <w:rPr>
-                <w:rFonts w:hint="eastAsia"/>
-                <w:i/>
-                <w:iCs/>
-                <w:color w:val="0070C0"/>
-              </w:rPr>
-              <w:t>r</w:t>
-            </w:r>
-            <w:r>
-              <w:rPr>
-                <w:i/>
-                <w:iCs/>
-                <w:color w:val="0070C0"/>
-              </w:rPr>
-              <w:t>am_b</w:t>
-            </w:r>
-            <w:proofErr w:type="spellEnd"/>
-          </w:p>
-        </w:tc>
-        <w:tc>
-          <w:tcPr>
-            <w:tcW w:w="1381" w:type="dxa"/>
-          </w:tcPr>
-          <w:p>
-            <w:pPr>
-              <w:rPr>
-                <w:i/>
-                <w:iCs/>
-                <w:color w:val="0070C0"/>
-              </w:rPr>
-            </w:pPr>
-            <w:r>
-              <w:rPr>
-                <w:rFonts w:hint="eastAsia"/>
-                <w:i/>
-                <w:iCs/>
-                <w:color w:val="0070C0"/>
-              </w:rPr>
-              <w:t>3</w:t>
-            </w:r>
-            <w:r>
-              <w:rPr>
-                <w:i/>
-                <w:iCs/>
-                <w:color w:val="0070C0"/>
-              </w:rPr>
-              <w:t>2</w:t>
-            </w:r>
-          </w:p>
-        </w:tc>
-        <w:tc>
-          <w:tcPr>
-            <w:tcW w:w="1382" w:type="dxa"/>
-          </w:tcPr>
-          <w:p>
-            <w:pPr>
-              <w:rPr>
-                <w:i/>
-                <w:iCs/>
-                <w:color w:val="0070C0"/>
-              </w:rPr>
-            </w:pPr>
-            <w:r>
-              <w:rPr>
-                <w:rFonts w:hint="eastAsia"/>
-                <w:i/>
-                <w:iCs/>
-                <w:color w:val="0070C0"/>
-              </w:rPr>
-              <w:t>6</w:t>
-            </w:r>
-            <w:r>
-              <w:rPr>
-                <w:i/>
-                <w:iCs/>
-                <w:color w:val="0070C0"/>
-              </w:rPr>
-              <w:t>4</w:t>
-            </w:r>
-          </w:p>
-        </w:tc>
-        <w:tc>
-          <w:tcPr>
-            <w:tcW w:w="1382" w:type="dxa"/>
-          </w:tcPr>
-          <w:p>
-            <w:pPr>
-              <w:rPr>
-                <w:i/>
-                <w:iCs/>
-                <w:color w:val="0070C0"/>
-              </w:rPr>
-            </w:pPr>
-            <w:r>
-              <w:rPr>
-                <w:rFonts w:hint="eastAsia"/>
-                <w:i/>
-                <w:iCs/>
-                <w:color w:val="0070C0"/>
-              </w:rPr>
-              <w:t>1</w:t>
-            </w:r>
-            <w:r>
-              <w:rPr>
-                <w:i/>
-                <w:iCs/>
-                <w:color w:val="0070C0"/>
-              </w:rPr>
-              <w:t>GHz</w:t>
-            </w:r>
-          </w:p>
-        </w:tc>
-        <w:tc>
-          <w:tcPr>
-            <w:tcW w:w="1382" w:type="dxa"/>
-          </w:tcPr>
-          <w:p>
-            <w:pPr>
-              <w:rPr>
-                <w:i/>
-                <w:iCs/>
-                <w:color w:val="0070C0"/>
-              </w:rPr>
-            </w:pPr>
-            <w:r>
-              <w:rPr>
-                <w:rFonts w:hint="eastAsia"/>
-                <w:i/>
-                <w:iCs/>
-                <w:color w:val="0070C0"/>
-              </w:rPr>
-              <w:t>D</w:t>
-            </w:r>
-            <w:r>
-              <w:rPr>
-                <w:i/>
-                <w:iCs/>
-                <w:color w:val="0070C0"/>
-              </w:rPr>
-              <w:t>ual Port</w:t>
-            </w:r>
           </w:p>
         </w:tc>
         <w:tc>
@@ -21170,7 +21355,7 @@
       <w:pPr>
         <w:pStyle w:val="20"/>
         <w:rPr>
-          <w:rFonts w:eastAsiaTheme="minorEastAsia" w:hint="eastAsia"/>
+          <w:rFonts w:eastAsiaTheme="minorEastAsia"/>
         </w:rPr>
       </w:pPr>
       <w:bookmarkStart w:id="65" w:name="_Ref142643323"/>
@@ -21291,16 +21476,13 @@
       </w:r>
       <w:bookmarkEnd w:id="66"/>
       <w:r>
-        <w:t xml:space="preserve"> Memory Wrapper</w:t>
-      </w:r>
-      <w:r>
-        <w:t xml:space="preserve"> Diagram</w:t>
+        <w:t xml:space="preserve"> Memory Wrapper Diagram</w:t>
       </w:r>
     </w:p>
     <w:p>
       <w:pPr>
         <w:rPr>
-          <w:rFonts w:eastAsiaTheme="minorEastAsia" w:hint="eastAsia"/>
+          <w:rFonts w:eastAsiaTheme="minorEastAsia"/>
         </w:rPr>
       </w:pPr>
       <w:r>

</xml_diff>

<commit_message>
updated axi_sramc rtl draft version
</commit_message>
<xml_diff>
--- a/axi_mem_controller/Project_GR001_IP_AXI_SRAMC_HDD.docx
+++ b/axi_mem_controller/Project_GR001_IP_AXI_SRAMC_HDD.docx
@@ -6350,25 +6350,51 @@
       <w:r>
         <w:t xml:space="preserve">Figure </w:t>
       </w:r>
-      <w:fldSimple w:instr=" STYLEREF 1 \s ">
-        <w:r>
-          <w:rPr>
-            <w:noProof/>
-          </w:rPr>
-          <w:t>3</w:t>
-        </w:r>
-      </w:fldSimple>
+      <w:r>
+        <w:fldChar w:fldCharType="begin"/>
+      </w:r>
+      <w:r>
+        <w:instrText xml:space="preserve"> STYLEREF 1 \s </w:instrText>
+      </w:r>
+      <w:r>
+        <w:fldChar w:fldCharType="separate"/>
+      </w:r>
+      <w:r>
+        <w:rPr>
+          <w:noProof/>
+        </w:rPr>
+        <w:t>3</w:t>
+      </w:r>
+      <w:r>
+        <w:rPr>
+          <w:noProof/>
+        </w:rPr>
+        <w:fldChar w:fldCharType="end"/>
+      </w:r>
       <w:r>
         <w:noBreakHyphen/>
       </w:r>
-      <w:fldSimple w:instr=" SEQ Figure \* ARABIC \s 1 ">
-        <w:r>
-          <w:rPr>
-            <w:noProof/>
-          </w:rPr>
-          <w:t>1</w:t>
-        </w:r>
-      </w:fldSimple>
+      <w:r>
+        <w:fldChar w:fldCharType="begin"/>
+      </w:r>
+      <w:r>
+        <w:instrText xml:space="preserve"> SEQ Figure \* ARABIC \s 1 </w:instrText>
+      </w:r>
+      <w:r>
+        <w:fldChar w:fldCharType="separate"/>
+      </w:r>
+      <w:r>
+        <w:rPr>
+          <w:noProof/>
+        </w:rPr>
+        <w:t>1</w:t>
+      </w:r>
+      <w:r>
+        <w:rPr>
+          <w:noProof/>
+        </w:rPr>
+        <w:fldChar w:fldCharType="end"/>
+      </w:r>
       <w:bookmarkEnd w:id="8"/>
       <w:r>
         <w:t xml:space="preserve"> </w:t>
@@ -6890,25 +6916,51 @@
       <w:r>
         <w:t xml:space="preserve">Figure </w:t>
       </w:r>
-      <w:fldSimple w:instr=" STYLEREF 1 \s ">
-        <w:r>
-          <w:rPr>
-            <w:noProof/>
-          </w:rPr>
-          <w:t>3</w:t>
-        </w:r>
-      </w:fldSimple>
+      <w:r>
+        <w:fldChar w:fldCharType="begin"/>
+      </w:r>
+      <w:r>
+        <w:instrText xml:space="preserve"> STYLEREF 1 \s </w:instrText>
+      </w:r>
+      <w:r>
+        <w:fldChar w:fldCharType="separate"/>
+      </w:r>
+      <w:r>
+        <w:rPr>
+          <w:noProof/>
+        </w:rPr>
+        <w:t>3</w:t>
+      </w:r>
+      <w:r>
+        <w:rPr>
+          <w:noProof/>
+        </w:rPr>
+        <w:fldChar w:fldCharType="end"/>
+      </w:r>
       <w:r>
         <w:noBreakHyphen/>
       </w:r>
-      <w:fldSimple w:instr=" SEQ Figure \* ARABIC \s 1 ">
-        <w:r>
-          <w:rPr>
-            <w:noProof/>
-          </w:rPr>
-          <w:t>2</w:t>
-        </w:r>
-      </w:fldSimple>
+      <w:r>
+        <w:fldChar w:fldCharType="begin"/>
+      </w:r>
+      <w:r>
+        <w:instrText xml:space="preserve"> SEQ Figure \* ARABIC \s 1 </w:instrText>
+      </w:r>
+      <w:r>
+        <w:fldChar w:fldCharType="separate"/>
+      </w:r>
+      <w:r>
+        <w:rPr>
+          <w:noProof/>
+        </w:rPr>
+        <w:t>2</w:t>
+      </w:r>
+      <w:r>
+        <w:rPr>
+          <w:noProof/>
+        </w:rPr>
+        <w:fldChar w:fldCharType="end"/>
+      </w:r>
       <w:bookmarkEnd w:id="12"/>
       <w:r>
         <w:t xml:space="preserve"> </w:t>
@@ -7079,19 +7131,65 @@
         </w:rPr>
         <w:t>“</w:t>
       </w:r>
-      <w:proofErr w:type="spellStart"/>
+      <w:r>
+        <w:rPr>
+          <w:rFonts w:eastAsiaTheme="minorEastAsia"/>
+        </w:rPr>
+        <w:t>wstrb==</w:t>
+      </w:r>
+      <w:r>
+        <w:rPr>
+          <w:rFonts w:eastAsiaTheme="minorEastAsia"/>
+        </w:rPr>
+        <w:t>`</w:t>
+      </w:r>
+      <w:r>
+        <w:rPr>
+          <w:rFonts w:eastAsiaTheme="minorEastAsia"/>
+        </w:rPr>
+        <w:t>1</w:t>
+      </w:r>
+      <w:r>
+        <w:rPr>
+          <w:rFonts w:eastAsiaTheme="minorEastAsia"/>
+        </w:rPr>
+        <w:t>” and “burst length==3”</w:t>
+      </w:r>
+      <w:r>
+        <w:rPr>
+          <w:rFonts w:eastAsiaTheme="minorEastAsia"/>
+        </w:rPr>
+        <w:t xml:space="preserve">, the second is a partial write </w:t>
+      </w:r>
+      <w:r>
+        <w:rPr>
+          <w:rFonts w:eastAsiaTheme="minorEastAsia"/>
+        </w:rPr>
+        <w:t xml:space="preserve">transaction (PW) with </w:t>
+      </w:r>
+      <w:r>
+        <w:rPr>
+          <w:rFonts w:eastAsiaTheme="minorEastAsia"/>
+        </w:rPr>
+        <w:t>“</w:t>
+      </w:r>
       <w:r>
         <w:rPr>
           <w:rFonts w:eastAsiaTheme="minorEastAsia"/>
         </w:rPr>
         <w:t>wstrb</w:t>
       </w:r>
-      <w:proofErr w:type="spellEnd"/>
-      <w:r>
-        <w:rPr>
-          <w:rFonts w:eastAsiaTheme="minorEastAsia"/>
-        </w:rPr>
-        <w:t>==</w:t>
+      <w:r>
+        <w:rPr>
+          <w:rFonts w:eastAsiaTheme="minorEastAsia"/>
+        </w:rPr>
+        <w:t>!</w:t>
+      </w:r>
+      <w:r>
+        <w:rPr>
+          <w:rFonts w:eastAsiaTheme="minorEastAsia"/>
+        </w:rPr>
+        <w:t>=</w:t>
       </w:r>
       <w:r>
         <w:rPr>
@@ -7109,97 +7207,13 @@
         <w:rPr>
           <w:rFonts w:eastAsiaTheme="minorEastAsia"/>
         </w:rPr>
-        <w:t>” and “burst length==3”</w:t>
-      </w:r>
-      <w:r>
-        <w:rPr>
-          <w:rFonts w:eastAsiaTheme="minorEastAsia"/>
-        </w:rPr>
-        <w:t xml:space="preserve">, the second is a partial write </w:t>
-      </w:r>
-      <w:r>
-        <w:rPr>
-          <w:rFonts w:eastAsiaTheme="minorEastAsia"/>
-        </w:rPr>
-        <w:t xml:space="preserve">transaction (PW) with </w:t>
-      </w:r>
-      <w:r>
-        <w:rPr>
-          <w:rFonts w:eastAsiaTheme="minorEastAsia"/>
-        </w:rPr>
-        <w:t>“</w:t>
-      </w:r>
-      <w:proofErr w:type="spellStart"/>
-      <w:proofErr w:type="gramStart"/>
-      <w:r>
-        <w:rPr>
-          <w:rFonts w:eastAsiaTheme="minorEastAsia"/>
-        </w:rPr>
-        <w:t>wstrb</w:t>
-      </w:r>
-      <w:proofErr w:type="spellEnd"/>
-      <w:r>
-        <w:rPr>
-          <w:rFonts w:eastAsiaTheme="minorEastAsia"/>
-        </w:rPr>
-        <w:t>!</w:t>
-      </w:r>
-      <w:r>
-        <w:rPr>
-          <w:rFonts w:eastAsiaTheme="minorEastAsia"/>
-        </w:rPr>
-        <w:t>=</w:t>
-      </w:r>
-      <w:proofErr w:type="gramEnd"/>
-      <w:r>
-        <w:rPr>
-          <w:rFonts w:eastAsiaTheme="minorEastAsia"/>
-        </w:rPr>
-        <w:t>`</w:t>
-      </w:r>
-      <w:r>
-        <w:rPr>
-          <w:rFonts w:eastAsiaTheme="minorEastAsia"/>
-        </w:rPr>
-        <w:t>1</w:t>
-      </w:r>
-      <w:r>
-        <w:rPr>
-          <w:rFonts w:eastAsiaTheme="minorEastAsia"/>
-        </w:rPr>
         <w:t>” and “burst length==2”</w:t>
       </w:r>
       <w:r>
         <w:rPr>
           <w:rFonts w:eastAsiaTheme="minorEastAsia"/>
         </w:rPr>
-        <w:t xml:space="preserve">, the third is a narrow write </w:t>
-      </w:r>
-      <w:proofErr w:type="spellStart"/>
-      <w:r>
-        <w:rPr>
-          <w:rFonts w:eastAsiaTheme="minorEastAsia"/>
-        </w:rPr>
-        <w:t>transacton</w:t>
-      </w:r>
-      <w:proofErr w:type="spellEnd"/>
-      <w:r>
-        <w:rPr>
-          <w:rFonts w:eastAsiaTheme="minorEastAsia"/>
-        </w:rPr>
-        <w:t xml:space="preserve"> (NRW) with “</w:t>
-      </w:r>
-      <w:r>
-        <w:rPr>
-          <w:rFonts w:eastAsiaTheme="minorEastAsia"/>
-        </w:rPr>
-        <w:t>burst length==</w:t>
-      </w:r>
-      <w:r>
-        <w:rPr>
-          <w:rFonts w:eastAsiaTheme="minorEastAsia"/>
-        </w:rPr>
-        <w:t>1”.</w:t>
+        <w:t>, the third is a narrow write transacton (NRW) with “burst length==1”.</w:t>
       </w:r>
     </w:p>
     <w:p>
@@ -7385,7 +7399,6 @@
                 <w:rFonts w:eastAsiaTheme="minorEastAsia"/>
               </w:rPr>
             </w:pPr>
-            <w:proofErr w:type="spellStart"/>
             <w:r>
               <w:rPr>
                 <w:rFonts w:eastAsiaTheme="minorEastAsia"/>
@@ -7398,7 +7411,6 @@
               </w:rPr>
               <w:t>lk</w:t>
             </w:r>
-            <w:proofErr w:type="spellEnd"/>
           </w:p>
         </w:tc>
         <w:tc>
@@ -7529,25 +7541,51 @@
       <w:r>
         <w:t xml:space="preserve">Table </w:t>
       </w:r>
-      <w:fldSimple w:instr=" STYLEREF 1 \s ">
-        <w:r>
-          <w:rPr>
-            <w:noProof/>
-          </w:rPr>
-          <w:t>3</w:t>
-        </w:r>
-      </w:fldSimple>
+      <w:r>
+        <w:fldChar w:fldCharType="begin"/>
+      </w:r>
+      <w:r>
+        <w:instrText xml:space="preserve"> STYLEREF 1 \s </w:instrText>
+      </w:r>
+      <w:r>
+        <w:fldChar w:fldCharType="separate"/>
+      </w:r>
+      <w:r>
+        <w:rPr>
+          <w:noProof/>
+        </w:rPr>
+        <w:t>3</w:t>
+      </w:r>
+      <w:r>
+        <w:rPr>
+          <w:noProof/>
+        </w:rPr>
+        <w:fldChar w:fldCharType="end"/>
+      </w:r>
       <w:r>
         <w:noBreakHyphen/>
       </w:r>
-      <w:fldSimple w:instr=" SEQ Table \* ARABIC \s 1 ">
-        <w:r>
-          <w:rPr>
-            <w:noProof/>
-          </w:rPr>
-          <w:t>1</w:t>
-        </w:r>
-      </w:fldSimple>
+      <w:r>
+        <w:fldChar w:fldCharType="begin"/>
+      </w:r>
+      <w:r>
+        <w:instrText xml:space="preserve"> SEQ Table \* ARABIC \s 1 </w:instrText>
+      </w:r>
+      <w:r>
+        <w:fldChar w:fldCharType="separate"/>
+      </w:r>
+      <w:r>
+        <w:rPr>
+          <w:noProof/>
+        </w:rPr>
+        <w:t>1</w:t>
+      </w:r>
+      <w:r>
+        <w:rPr>
+          <w:noProof/>
+        </w:rPr>
+        <w:fldChar w:fldCharType="end"/>
+      </w:r>
       <w:r>
         <w:t xml:space="preserve"> Clock Requirements</w:t>
       </w:r>
@@ -7639,7 +7677,6 @@
             <w:tcW w:w="2763" w:type="dxa"/>
           </w:tcPr>
           <w:p>
-            <w:proofErr w:type="spellStart"/>
             <w:r>
               <w:rPr>
                 <w:rFonts w:hint="eastAsia"/>
@@ -7649,7 +7686,6 @@
             <w:r>
               <w:t>st_n</w:t>
             </w:r>
-            <w:proofErr w:type="spellEnd"/>
           </w:p>
         </w:tc>
         <w:tc>
@@ -7662,7 +7698,6 @@
                 <w:rFonts w:eastAsiaTheme="minorEastAsia"/>
               </w:rPr>
             </w:pPr>
-            <w:proofErr w:type="spellStart"/>
             <w:r>
               <w:rPr>
                 <w:rFonts w:eastAsiaTheme="minorEastAsia" w:hint="eastAsia"/>
@@ -7675,7 +7710,6 @@
               </w:rPr>
               <w:t>lk</w:t>
             </w:r>
-            <w:proofErr w:type="spellEnd"/>
           </w:p>
         </w:tc>
         <w:tc>
@@ -7750,25 +7784,51 @@
       <w:r>
         <w:t xml:space="preserve">Table </w:t>
       </w:r>
-      <w:fldSimple w:instr=" STYLEREF 1 \s ">
-        <w:r>
-          <w:rPr>
-            <w:noProof/>
-          </w:rPr>
-          <w:t>3</w:t>
-        </w:r>
-      </w:fldSimple>
+      <w:r>
+        <w:fldChar w:fldCharType="begin"/>
+      </w:r>
+      <w:r>
+        <w:instrText xml:space="preserve"> STYLEREF 1 \s </w:instrText>
+      </w:r>
+      <w:r>
+        <w:fldChar w:fldCharType="separate"/>
+      </w:r>
+      <w:r>
+        <w:rPr>
+          <w:noProof/>
+        </w:rPr>
+        <w:t>3</w:t>
+      </w:r>
+      <w:r>
+        <w:rPr>
+          <w:noProof/>
+        </w:rPr>
+        <w:fldChar w:fldCharType="end"/>
+      </w:r>
       <w:r>
         <w:noBreakHyphen/>
       </w:r>
-      <w:fldSimple w:instr=" SEQ Table \* ARABIC \s 1 ">
-        <w:r>
-          <w:rPr>
-            <w:noProof/>
-          </w:rPr>
-          <w:t>2</w:t>
-        </w:r>
-      </w:fldSimple>
+      <w:r>
+        <w:fldChar w:fldCharType="begin"/>
+      </w:r>
+      <w:r>
+        <w:instrText xml:space="preserve"> SEQ Table \* ARABIC \s 1 </w:instrText>
+      </w:r>
+      <w:r>
+        <w:fldChar w:fldCharType="separate"/>
+      </w:r>
+      <w:r>
+        <w:rPr>
+          <w:noProof/>
+        </w:rPr>
+        <w:t>2</w:t>
+      </w:r>
+      <w:r>
+        <w:rPr>
+          <w:noProof/>
+        </w:rPr>
+        <w:fldChar w:fldCharType="end"/>
+      </w:r>
       <w:r>
         <w:t xml:space="preserve"> Reset Requirements</w:t>
       </w:r>
@@ -7946,23 +8006,13 @@
           <w:color w:val="0070C0"/>
         </w:rPr>
       </w:pPr>
-      <w:proofErr w:type="spellStart"/>
       <w:r>
         <w:rPr>
           <w:i/>
           <w:iCs/>
           <w:color w:val="0070C0"/>
         </w:rPr>
-        <w:t>Etcs</w:t>
-      </w:r>
-      <w:proofErr w:type="spellEnd"/>
-      <w:r>
-        <w:rPr>
-          <w:i/>
-          <w:iCs/>
-          <w:color w:val="0070C0"/>
-        </w:rPr>
-        <w:t>.</w:t>
+        <w:t>Etcs.</w:t>
       </w:r>
     </w:p>
     <w:p/>
@@ -8103,7 +8153,6 @@
             <w:pPr>
               <w:jc w:val="center"/>
             </w:pPr>
-            <w:proofErr w:type="spellStart"/>
             <w:r>
               <w:rPr>
                 <w:rFonts w:hint="eastAsia"/>
@@ -8113,7 +8162,6 @@
             <w:r>
               <w:t>lk</w:t>
             </w:r>
-            <w:proofErr w:type="spellEnd"/>
           </w:p>
         </w:tc>
         <w:tc>
@@ -8194,7 +8242,6 @@
             <w:pPr>
               <w:jc w:val="center"/>
             </w:pPr>
-            <w:proofErr w:type="spellStart"/>
             <w:r>
               <w:rPr>
                 <w:rFonts w:hint="eastAsia"/>
@@ -8204,7 +8251,6 @@
             <w:r>
               <w:t>st_n</w:t>
             </w:r>
-            <w:proofErr w:type="spellEnd"/>
           </w:p>
         </w:tc>
         <w:tc>
@@ -8299,7 +8345,6 @@
                 <w:rFonts w:eastAsiaTheme="minorEastAsia"/>
               </w:rPr>
             </w:pPr>
-            <w:proofErr w:type="spellStart"/>
             <w:r>
               <w:rPr>
                 <w:rFonts w:eastAsiaTheme="minorEastAsia"/>
@@ -8324,7 +8369,6 @@
               </w:rPr>
               <w:t>aild</w:t>
             </w:r>
-            <w:proofErr w:type="spellEnd"/>
           </w:p>
         </w:tc>
         <w:tc>
@@ -8406,7 +8450,6 @@
                 <w:rFonts w:eastAsiaTheme="minorEastAsia"/>
               </w:rPr>
             </w:pPr>
-            <w:proofErr w:type="spellStart"/>
             <w:r>
               <w:rPr>
                 <w:rFonts w:eastAsiaTheme="minorEastAsia"/>
@@ -8425,7 +8468,6 @@
               </w:rPr>
               <w:t>wready</w:t>
             </w:r>
-            <w:proofErr w:type="spellEnd"/>
           </w:p>
         </w:tc>
         <w:tc>
@@ -8510,7 +8552,6 @@
                 <w:szCs w:val="20"/>
               </w:rPr>
             </w:pPr>
-            <w:proofErr w:type="spellStart"/>
             <w:r>
               <w:rPr>
                 <w:rFonts w:eastAsiaTheme="minorEastAsia"/>
@@ -8529,7 +8570,6 @@
               </w:rPr>
               <w:t>wid</w:t>
             </w:r>
-            <w:proofErr w:type="spellEnd"/>
           </w:p>
         </w:tc>
         <w:tc>
@@ -8606,7 +8646,6 @@
                 <w:szCs w:val="20"/>
               </w:rPr>
             </w:pPr>
-            <w:proofErr w:type="spellStart"/>
             <w:r>
               <w:rPr>
                 <w:rFonts w:eastAsiaTheme="minorEastAsia"/>
@@ -8625,7 +8664,6 @@
               </w:rPr>
               <w:t>waddr</w:t>
             </w:r>
-            <w:proofErr w:type="spellEnd"/>
           </w:p>
         </w:tc>
         <w:tc>
@@ -8705,7 +8743,6 @@
                 <w:rFonts w:eastAsiaTheme="minorEastAsia"/>
               </w:rPr>
             </w:pPr>
-            <w:proofErr w:type="spellStart"/>
             <w:r>
               <w:rPr>
                 <w:rFonts w:eastAsiaTheme="minorEastAsia"/>
@@ -8724,7 +8761,6 @@
               </w:rPr>
               <w:t>wlen</w:t>
             </w:r>
-            <w:proofErr w:type="spellEnd"/>
           </w:p>
         </w:tc>
         <w:tc>
@@ -8801,7 +8837,6 @@
                 <w:rFonts w:eastAsiaTheme="minorEastAsia"/>
               </w:rPr>
             </w:pPr>
-            <w:proofErr w:type="spellStart"/>
             <w:r>
               <w:rPr>
                 <w:rFonts w:eastAsiaTheme="minorEastAsia"/>
@@ -8820,7 +8855,6 @@
               </w:rPr>
               <w:t>wsize</w:t>
             </w:r>
-            <w:proofErr w:type="spellEnd"/>
           </w:p>
         </w:tc>
         <w:tc>
@@ -8894,7 +8928,6 @@
                 <w:rFonts w:eastAsiaTheme="minorEastAsia"/>
               </w:rPr>
             </w:pPr>
-            <w:proofErr w:type="spellStart"/>
             <w:r>
               <w:rPr>
                 <w:rFonts w:eastAsiaTheme="minorEastAsia"/>
@@ -8913,7 +8946,6 @@
               </w:rPr>
               <w:t>wburst</w:t>
             </w:r>
-            <w:proofErr w:type="spellEnd"/>
           </w:p>
         </w:tc>
         <w:tc>
@@ -9004,7 +9036,6 @@
                 <w:rFonts w:eastAsiaTheme="minorEastAsia"/>
               </w:rPr>
             </w:pPr>
-            <w:proofErr w:type="spellStart"/>
             <w:r>
               <w:rPr>
                 <w:rFonts w:eastAsiaTheme="minorEastAsia"/>
@@ -9023,7 +9054,6 @@
               </w:rPr>
               <w:t>wcache</w:t>
             </w:r>
-            <w:proofErr w:type="spellEnd"/>
           </w:p>
         </w:tc>
         <w:tc>
@@ -9094,7 +9124,6 @@
                 <w:rFonts w:eastAsiaTheme="minorEastAsia"/>
               </w:rPr>
             </w:pPr>
-            <w:proofErr w:type="spellStart"/>
             <w:r>
               <w:rPr>
                 <w:rFonts w:eastAsiaTheme="minorEastAsia"/>
@@ -9113,7 +9142,6 @@
               </w:rPr>
               <w:t>wprot</w:t>
             </w:r>
-            <w:proofErr w:type="spellEnd"/>
           </w:p>
         </w:tc>
         <w:tc>
@@ -9184,7 +9212,6 @@
                 <w:rFonts w:eastAsiaTheme="minorEastAsia"/>
               </w:rPr>
             </w:pPr>
-            <w:proofErr w:type="spellStart"/>
             <w:r>
               <w:rPr>
                 <w:rFonts w:eastAsiaTheme="minorEastAsia"/>
@@ -9203,7 +9230,6 @@
               </w:rPr>
               <w:t>wqos</w:t>
             </w:r>
-            <w:proofErr w:type="spellEnd"/>
           </w:p>
         </w:tc>
         <w:tc>
@@ -9277,7 +9303,6 @@
                 <w:szCs w:val="20"/>
               </w:rPr>
             </w:pPr>
-            <w:proofErr w:type="spellStart"/>
             <w:r>
               <w:rPr>
                 <w:rFonts w:eastAsiaTheme="minorEastAsia"/>
@@ -9302,7 +9327,6 @@
               </w:rPr>
               <w:t>user</w:t>
             </w:r>
-            <w:proofErr w:type="spellEnd"/>
           </w:p>
         </w:tc>
         <w:tc>
@@ -9376,7 +9400,6 @@
                 <w:rFonts w:eastAsiaTheme="minorEastAsia"/>
               </w:rPr>
             </w:pPr>
-            <w:proofErr w:type="spellStart"/>
             <w:r>
               <w:rPr>
                 <w:rFonts w:eastAsiaTheme="minorEastAsia"/>
@@ -9395,7 +9418,6 @@
               </w:rPr>
               <w:t>valid</w:t>
             </w:r>
-            <w:proofErr w:type="spellEnd"/>
           </w:p>
         </w:tc>
         <w:tc>
@@ -9469,7 +9491,6 @@
                 <w:rFonts w:eastAsiaTheme="minorEastAsia"/>
               </w:rPr>
             </w:pPr>
-            <w:proofErr w:type="spellStart"/>
             <w:r>
               <w:rPr>
                 <w:rFonts w:eastAsiaTheme="minorEastAsia"/>
@@ -9488,7 +9509,6 @@
               </w:rPr>
               <w:t>ready</w:t>
             </w:r>
-            <w:proofErr w:type="spellEnd"/>
           </w:p>
         </w:tc>
         <w:tc>
@@ -9565,7 +9585,6 @@
                 <w:szCs w:val="20"/>
               </w:rPr>
             </w:pPr>
-            <w:proofErr w:type="spellStart"/>
             <w:r>
               <w:rPr>
                 <w:rFonts w:eastAsiaTheme="minorEastAsia"/>
@@ -9584,7 +9603,6 @@
               </w:rPr>
               <w:t>data</w:t>
             </w:r>
-            <w:proofErr w:type="spellEnd"/>
           </w:p>
         </w:tc>
         <w:tc>
@@ -9661,7 +9679,6 @@
                 <w:szCs w:val="20"/>
               </w:rPr>
             </w:pPr>
-            <w:proofErr w:type="spellStart"/>
             <w:r>
               <w:rPr>
                 <w:rFonts w:eastAsiaTheme="minorEastAsia"/>
@@ -9680,7 +9697,6 @@
               </w:rPr>
               <w:t>strb</w:t>
             </w:r>
-            <w:proofErr w:type="spellEnd"/>
           </w:p>
         </w:tc>
         <w:tc>
@@ -9756,7 +9772,6 @@
                 <w:rFonts w:eastAsiaTheme="minorEastAsia"/>
               </w:rPr>
             </w:pPr>
-            <w:proofErr w:type="spellStart"/>
             <w:r>
               <w:rPr>
                 <w:rFonts w:eastAsiaTheme="minorEastAsia"/>
@@ -9775,7 +9790,6 @@
               </w:rPr>
               <w:t>last</w:t>
             </w:r>
-            <w:proofErr w:type="spellEnd"/>
           </w:p>
         </w:tc>
         <w:tc>
@@ -9849,7 +9863,6 @@
                 <w:rFonts w:eastAsiaTheme="minorEastAsia"/>
               </w:rPr>
             </w:pPr>
-            <w:proofErr w:type="spellStart"/>
             <w:r>
               <w:rPr>
                 <w:rFonts w:eastAsiaTheme="minorEastAsia"/>
@@ -9868,7 +9881,6 @@
               </w:rPr>
               <w:t>vaild</w:t>
             </w:r>
-            <w:proofErr w:type="spellEnd"/>
           </w:p>
         </w:tc>
         <w:tc>
@@ -9942,7 +9954,6 @@
                 <w:rFonts w:eastAsiaTheme="minorEastAsia"/>
               </w:rPr>
             </w:pPr>
-            <w:proofErr w:type="spellStart"/>
             <w:r>
               <w:rPr>
                 <w:rFonts w:eastAsiaTheme="minorEastAsia"/>
@@ -9961,7 +9972,6 @@
               </w:rPr>
               <w:t>ready</w:t>
             </w:r>
-            <w:proofErr w:type="spellEnd"/>
           </w:p>
         </w:tc>
         <w:tc>
@@ -10038,7 +10048,6 @@
                 <w:szCs w:val="20"/>
               </w:rPr>
             </w:pPr>
-            <w:proofErr w:type="spellStart"/>
             <w:r>
               <w:rPr>
                 <w:rFonts w:eastAsiaTheme="minorEastAsia"/>
@@ -10057,7 +10066,6 @@
               </w:rPr>
               <w:t>id</w:t>
             </w:r>
-            <w:proofErr w:type="spellEnd"/>
           </w:p>
         </w:tc>
         <w:tc>
@@ -10134,7 +10142,6 @@
                 <w:rFonts w:eastAsiaTheme="minorEastAsia"/>
               </w:rPr>
             </w:pPr>
-            <w:proofErr w:type="spellStart"/>
             <w:r>
               <w:rPr>
                 <w:rFonts w:eastAsiaTheme="minorEastAsia"/>
@@ -10153,7 +10160,6 @@
               </w:rPr>
               <w:t>resp</w:t>
             </w:r>
-            <w:proofErr w:type="spellEnd"/>
           </w:p>
         </w:tc>
         <w:tc>
@@ -10227,7 +10233,6 @@
                 <w:rFonts w:eastAsiaTheme="minorEastAsia"/>
               </w:rPr>
             </w:pPr>
-            <w:proofErr w:type="spellStart"/>
             <w:r>
               <w:rPr>
                 <w:rFonts w:eastAsiaTheme="minorEastAsia"/>
@@ -10252,7 +10257,6 @@
               </w:rPr>
               <w:t>aild</w:t>
             </w:r>
-            <w:proofErr w:type="spellEnd"/>
           </w:p>
         </w:tc>
         <w:tc>
@@ -10329,7 +10333,6 @@
                 <w:rFonts w:eastAsiaTheme="minorEastAsia"/>
               </w:rPr>
             </w:pPr>
-            <w:proofErr w:type="spellStart"/>
             <w:r>
               <w:rPr>
                 <w:rFonts w:eastAsiaTheme="minorEastAsia"/>
@@ -10348,7 +10351,6 @@
               </w:rPr>
               <w:t>rready</w:t>
             </w:r>
-            <w:proofErr w:type="spellEnd"/>
           </w:p>
         </w:tc>
         <w:tc>
@@ -10434,7 +10436,6 @@
                 <w:szCs w:val="20"/>
               </w:rPr>
             </w:pPr>
-            <w:proofErr w:type="spellStart"/>
             <w:r>
               <w:rPr>
                 <w:rFonts w:eastAsiaTheme="minorEastAsia"/>
@@ -10453,7 +10454,6 @@
               </w:rPr>
               <w:t>rid</w:t>
             </w:r>
-            <w:proofErr w:type="spellEnd"/>
           </w:p>
         </w:tc>
         <w:tc>
@@ -10530,7 +10530,6 @@
                 <w:szCs w:val="20"/>
               </w:rPr>
             </w:pPr>
-            <w:proofErr w:type="spellStart"/>
             <w:r>
               <w:rPr>
                 <w:rFonts w:eastAsiaTheme="minorEastAsia"/>
@@ -10549,7 +10548,6 @@
               </w:rPr>
               <w:t>raddr</w:t>
             </w:r>
-            <w:proofErr w:type="spellEnd"/>
           </w:p>
         </w:tc>
         <w:tc>
@@ -10623,7 +10621,6 @@
                 <w:rFonts w:eastAsiaTheme="minorEastAsia"/>
               </w:rPr>
             </w:pPr>
-            <w:proofErr w:type="spellStart"/>
             <w:r>
               <w:rPr>
                 <w:rFonts w:eastAsiaTheme="minorEastAsia"/>
@@ -10642,7 +10639,6 @@
               </w:rPr>
               <w:t>rlen</w:t>
             </w:r>
-            <w:proofErr w:type="spellEnd"/>
           </w:p>
         </w:tc>
         <w:tc>
@@ -10713,7 +10709,6 @@
                 <w:rFonts w:eastAsiaTheme="minorEastAsia"/>
               </w:rPr>
             </w:pPr>
-            <w:proofErr w:type="spellStart"/>
             <w:r>
               <w:rPr>
                 <w:rFonts w:eastAsiaTheme="minorEastAsia"/>
@@ -10732,7 +10727,6 @@
               </w:rPr>
               <w:t>rsize</w:t>
             </w:r>
-            <w:proofErr w:type="spellEnd"/>
           </w:p>
         </w:tc>
         <w:tc>
@@ -10803,7 +10797,6 @@
                 <w:rFonts w:eastAsiaTheme="minorEastAsia"/>
               </w:rPr>
             </w:pPr>
-            <w:proofErr w:type="spellStart"/>
             <w:r>
               <w:rPr>
                 <w:rFonts w:eastAsiaTheme="minorEastAsia"/>
@@ -10822,7 +10815,6 @@
               </w:rPr>
               <w:t>rburst</w:t>
             </w:r>
-            <w:proofErr w:type="spellEnd"/>
           </w:p>
         </w:tc>
         <w:tc>
@@ -10905,7 +10897,6 @@
                 <w:rFonts w:eastAsiaTheme="minorEastAsia"/>
               </w:rPr>
             </w:pPr>
-            <w:proofErr w:type="spellStart"/>
             <w:r>
               <w:rPr>
                 <w:rFonts w:eastAsiaTheme="minorEastAsia"/>
@@ -10924,7 +10915,6 @@
               </w:rPr>
               <w:t>rcache</w:t>
             </w:r>
-            <w:proofErr w:type="spellEnd"/>
           </w:p>
         </w:tc>
         <w:tc>
@@ -10992,7 +10982,6 @@
                 <w:rFonts w:eastAsiaTheme="minorEastAsia"/>
               </w:rPr>
             </w:pPr>
-            <w:proofErr w:type="spellStart"/>
             <w:r>
               <w:rPr>
                 <w:rFonts w:eastAsiaTheme="minorEastAsia"/>
@@ -11011,7 +11000,6 @@
               </w:rPr>
               <w:t>rprot</w:t>
             </w:r>
-            <w:proofErr w:type="spellEnd"/>
           </w:p>
         </w:tc>
         <w:tc>
@@ -11079,7 +11067,6 @@
                 <w:rFonts w:eastAsiaTheme="minorEastAsia"/>
               </w:rPr>
             </w:pPr>
-            <w:proofErr w:type="spellStart"/>
             <w:r>
               <w:rPr>
                 <w:rFonts w:eastAsiaTheme="minorEastAsia"/>
@@ -11098,7 +11085,6 @@
               </w:rPr>
               <w:t>rqos</w:t>
             </w:r>
-            <w:proofErr w:type="spellEnd"/>
           </w:p>
         </w:tc>
         <w:tc>
@@ -11169,7 +11155,6 @@
                 <w:szCs w:val="20"/>
               </w:rPr>
             </w:pPr>
-            <w:proofErr w:type="spellStart"/>
             <w:r>
               <w:rPr>
                 <w:rFonts w:eastAsiaTheme="minorEastAsia"/>
@@ -11182,7 +11167,6 @@
               </w:rPr>
               <w:t>aruser</w:t>
             </w:r>
-            <w:proofErr w:type="spellEnd"/>
           </w:p>
         </w:tc>
         <w:tc>
@@ -11256,7 +11240,6 @@
                 <w:szCs w:val="20"/>
               </w:rPr>
             </w:pPr>
-            <w:proofErr w:type="spellStart"/>
             <w:r>
               <w:rPr>
                 <w:rFonts w:eastAsiaTheme="minorEastAsia"/>
@@ -11275,7 +11258,6 @@
               </w:rPr>
               <w:t>vaild</w:t>
             </w:r>
-            <w:proofErr w:type="spellEnd"/>
           </w:p>
         </w:tc>
         <w:tc>
@@ -11358,7 +11340,6 @@
                 <w:szCs w:val="20"/>
               </w:rPr>
             </w:pPr>
-            <w:proofErr w:type="spellStart"/>
             <w:r>
               <w:rPr>
                 <w:rFonts w:eastAsiaTheme="minorEastAsia"/>
@@ -11377,7 +11358,6 @@
               </w:rPr>
               <w:t>ready</w:t>
             </w:r>
-            <w:proofErr w:type="spellEnd"/>
           </w:p>
         </w:tc>
         <w:tc>
@@ -11460,7 +11440,6 @@
                 <w:szCs w:val="20"/>
               </w:rPr>
             </w:pPr>
-            <w:proofErr w:type="spellStart"/>
             <w:r>
               <w:rPr>
                 <w:rFonts w:eastAsiaTheme="minorEastAsia"/>
@@ -11479,7 +11458,6 @@
               </w:rPr>
               <w:t>id</w:t>
             </w:r>
-            <w:proofErr w:type="spellEnd"/>
           </w:p>
         </w:tc>
         <w:tc>
@@ -11562,7 +11540,6 @@
                 <w:szCs w:val="20"/>
               </w:rPr>
             </w:pPr>
-            <w:proofErr w:type="spellStart"/>
             <w:r>
               <w:rPr>
                 <w:rFonts w:eastAsiaTheme="minorEastAsia"/>
@@ -11581,7 +11558,6 @@
               </w:rPr>
               <w:t>data</w:t>
             </w:r>
-            <w:proofErr w:type="spellEnd"/>
           </w:p>
         </w:tc>
         <w:tc>
@@ -11664,7 +11640,6 @@
                 <w:szCs w:val="20"/>
               </w:rPr>
             </w:pPr>
-            <w:proofErr w:type="spellStart"/>
             <w:r>
               <w:rPr>
                 <w:rFonts w:eastAsiaTheme="minorEastAsia"/>
@@ -11683,7 +11658,6 @@
               </w:rPr>
               <w:t>resp</w:t>
             </w:r>
-            <w:proofErr w:type="spellEnd"/>
           </w:p>
         </w:tc>
         <w:tc>
@@ -11766,7 +11740,6 @@
                 <w:szCs w:val="20"/>
               </w:rPr>
             </w:pPr>
-            <w:proofErr w:type="spellStart"/>
             <w:r>
               <w:rPr>
                 <w:rFonts w:eastAsiaTheme="minorEastAsia"/>
@@ -11785,7 +11758,6 @@
               </w:rPr>
               <w:t>last</w:t>
             </w:r>
-            <w:proofErr w:type="spellEnd"/>
           </w:p>
         </w:tc>
         <w:tc>
@@ -11886,7 +11858,6 @@
                 <w:szCs w:val="20"/>
               </w:rPr>
             </w:pPr>
-            <w:proofErr w:type="spellStart"/>
             <w:r>
               <w:rPr>
                 <w:rFonts w:eastAsiaTheme="minorEastAsia"/>
@@ -11911,7 +11882,6 @@
               </w:rPr>
               <w:t>vaild</w:t>
             </w:r>
-            <w:proofErr w:type="spellEnd"/>
           </w:p>
         </w:tc>
         <w:tc>
@@ -12002,7 +11972,6 @@
                 <w:szCs w:val="20"/>
               </w:rPr>
             </w:pPr>
-            <w:proofErr w:type="spellStart"/>
             <w:r>
               <w:rPr>
                 <w:rFonts w:eastAsiaTheme="minorEastAsia"/>
@@ -12027,7 +11996,6 @@
               </w:rPr>
               <w:t>ready</w:t>
             </w:r>
-            <w:proofErr w:type="spellEnd"/>
           </w:p>
         </w:tc>
         <w:tc>
@@ -12110,7 +12078,6 @@
                 <w:rFonts w:eastAsiaTheme="minorEastAsia"/>
               </w:rPr>
             </w:pPr>
-            <w:proofErr w:type="spellStart"/>
             <w:r>
               <w:rPr>
                 <w:rFonts w:eastAsiaTheme="minorEastAsia"/>
@@ -12141,7 +12108,6 @@
               </w:rPr>
               <w:t>payload</w:t>
             </w:r>
-            <w:proofErr w:type="spellEnd"/>
           </w:p>
         </w:tc>
         <w:tc>
@@ -12274,7 +12240,6 @@
                 <w:szCs w:val="20"/>
               </w:rPr>
             </w:pPr>
-            <w:proofErr w:type="spellStart"/>
             <w:r>
               <w:rPr>
                 <w:rFonts w:ascii="Arial" w:eastAsiaTheme="minorEastAsia" w:hAnsi="Arial" w:cs="Arial" w:hint="eastAsia"/>
@@ -12293,7 +12258,6 @@
               </w:rPr>
               <w:t>mw</w:t>
             </w:r>
-            <w:proofErr w:type="spellEnd"/>
           </w:p>
         </w:tc>
         <w:tc>
@@ -12386,7 +12350,6 @@
                 <w:szCs w:val="20"/>
               </w:rPr>
             </w:pPr>
-            <w:proofErr w:type="spellStart"/>
             <w:r>
               <w:rPr>
                 <w:rFonts w:ascii="Arial" w:eastAsiaTheme="minorEastAsia" w:hAnsi="Arial" w:cs="Arial" w:hint="eastAsia"/>
@@ -12405,7 +12368,6 @@
               </w:rPr>
               <w:t>xid</w:t>
             </w:r>
-            <w:proofErr w:type="spellEnd"/>
           </w:p>
         </w:tc>
         <w:tc>
@@ -12510,7 +12472,6 @@
                 <w:szCs w:val="20"/>
               </w:rPr>
             </w:pPr>
-            <w:proofErr w:type="spellStart"/>
             <w:r>
               <w:rPr>
                 <w:rFonts w:ascii="Arial" w:eastAsiaTheme="minorEastAsia" w:hAnsi="Arial" w:cs="Arial"/>
@@ -12538,7 +12499,6 @@
               </w:rPr>
               <w:t>ddr</w:t>
             </w:r>
-            <w:proofErr w:type="spellEnd"/>
           </w:p>
         </w:tc>
         <w:tc>
@@ -12643,7 +12603,6 @@
                 <w:szCs w:val="20"/>
               </w:rPr>
             </w:pPr>
-            <w:proofErr w:type="spellStart"/>
             <w:r>
               <w:rPr>
                 <w:rFonts w:ascii="Arial" w:eastAsiaTheme="minorEastAsia" w:hAnsi="Arial" w:cs="Arial"/>
@@ -12671,7 +12630,6 @@
               </w:rPr>
               <w:t>ast</w:t>
             </w:r>
-            <w:proofErr w:type="spellEnd"/>
           </w:p>
         </w:tc>
         <w:tc>
@@ -12776,7 +12734,6 @@
                 <w:szCs w:val="20"/>
               </w:rPr>
             </w:pPr>
-            <w:proofErr w:type="spellStart"/>
             <w:r>
               <w:rPr>
                 <w:rFonts w:ascii="Arial" w:eastAsiaTheme="minorEastAsia" w:hAnsi="Arial" w:cs="Arial"/>
@@ -12804,7 +12761,6 @@
               </w:rPr>
               <w:t>ser</w:t>
             </w:r>
-            <w:proofErr w:type="spellEnd"/>
           </w:p>
         </w:tc>
         <w:tc>
@@ -13000,7 +12956,6 @@
                 <w:szCs w:val="20"/>
               </w:rPr>
             </w:pPr>
-            <w:proofErr w:type="spellStart"/>
             <w:r>
               <w:rPr>
                 <w:rFonts w:eastAsiaTheme="minorEastAsia"/>
@@ -13031,7 +12986,6 @@
               </w:rPr>
               <w:t>vaild</w:t>
             </w:r>
-            <w:proofErr w:type="spellEnd"/>
           </w:p>
         </w:tc>
         <w:tc>
@@ -13117,7 +13071,6 @@
                 <w:szCs w:val="20"/>
               </w:rPr>
             </w:pPr>
-            <w:proofErr w:type="spellStart"/>
             <w:r>
               <w:rPr>
                 <w:rFonts w:eastAsiaTheme="minorEastAsia"/>
@@ -13148,7 +13101,6 @@
               </w:rPr>
               <w:t>ready</w:t>
             </w:r>
-            <w:proofErr w:type="spellEnd"/>
           </w:p>
         </w:tc>
         <w:tc>
@@ -13231,7 +13183,6 @@
                 <w:rFonts w:eastAsiaTheme="minorEastAsia"/>
               </w:rPr>
             </w:pPr>
-            <w:proofErr w:type="spellStart"/>
             <w:r>
               <w:rPr>
                 <w:rFonts w:eastAsiaTheme="minorEastAsia"/>
@@ -13262,7 +13213,6 @@
               </w:rPr>
               <w:t>payload</w:t>
             </w:r>
-            <w:proofErr w:type="spellEnd"/>
           </w:p>
         </w:tc>
         <w:tc>
@@ -13395,7 +13345,6 @@
                 <w:szCs w:val="20"/>
               </w:rPr>
             </w:pPr>
-            <w:proofErr w:type="spellStart"/>
             <w:r>
               <w:rPr>
                 <w:rFonts w:ascii="Arial" w:eastAsiaTheme="minorEastAsia" w:hAnsi="Arial" w:cs="Arial" w:hint="eastAsia"/>
@@ -13414,7 +13363,6 @@
               </w:rPr>
               <w:t>mw</w:t>
             </w:r>
-            <w:proofErr w:type="spellEnd"/>
           </w:p>
         </w:tc>
         <w:tc>
@@ -13507,7 +13455,6 @@
                 <w:szCs w:val="20"/>
               </w:rPr>
             </w:pPr>
-            <w:proofErr w:type="spellStart"/>
             <w:r>
               <w:rPr>
                 <w:rFonts w:ascii="Arial" w:eastAsiaTheme="minorEastAsia" w:hAnsi="Arial" w:cs="Arial" w:hint="eastAsia"/>
@@ -13526,7 +13473,6 @@
               </w:rPr>
               <w:t>xid</w:t>
             </w:r>
-            <w:proofErr w:type="spellEnd"/>
           </w:p>
         </w:tc>
         <w:tc>
@@ -13620,7 +13566,6 @@
                 <w:szCs w:val="20"/>
               </w:rPr>
             </w:pPr>
-            <w:proofErr w:type="spellStart"/>
             <w:r>
               <w:rPr>
                 <w:rFonts w:ascii="Arial" w:eastAsiaTheme="minorEastAsia" w:hAnsi="Arial" w:cs="Arial" w:hint="eastAsia"/>
@@ -13641,7 +13586,6 @@
               </w:rPr>
               <w:t>ddr</w:t>
             </w:r>
-            <w:proofErr w:type="spellEnd"/>
           </w:p>
         </w:tc>
         <w:tc>
@@ -13703,17 +13647,8 @@
                 <w:rFonts w:eastAsiaTheme="minorEastAsia"/>
                 <w:strike/>
               </w:rPr>
-              <w:t xml:space="preserve">Address of this </w:t>
-            </w:r>
-            <w:proofErr w:type="spellStart"/>
-            <w:r>
-              <w:rPr>
-                <w:rFonts w:eastAsiaTheme="minorEastAsia"/>
-                <w:strike/>
-              </w:rPr>
-              <w:t>rdata</w:t>
-            </w:r>
-            <w:proofErr w:type="spellEnd"/>
+              <w:t>Address of this rdata</w:t>
+            </w:r>
           </w:p>
         </w:tc>
       </w:tr>
@@ -13752,7 +13687,6 @@
                 <w:szCs w:val="20"/>
               </w:rPr>
             </w:pPr>
-            <w:proofErr w:type="spellStart"/>
             <w:r>
               <w:rPr>
                 <w:rFonts w:ascii="Arial" w:eastAsiaTheme="minorEastAsia" w:hAnsi="Arial" w:cs="Arial"/>
@@ -13780,7 +13714,6 @@
               </w:rPr>
               <w:t>ast</w:t>
             </w:r>
-            <w:proofErr w:type="spellEnd"/>
           </w:p>
         </w:tc>
         <w:tc>
@@ -13966,16 +13899,8 @@
               <w:rPr>
                 <w:rFonts w:eastAsiaTheme="minorEastAsia"/>
               </w:rPr>
-              <w:t xml:space="preserve">XI </w:t>
-            </w:r>
-            <w:proofErr w:type="spellStart"/>
-            <w:r>
-              <w:rPr>
-                <w:rFonts w:eastAsiaTheme="minorEastAsia"/>
-              </w:rPr>
-              <w:t>rdata</w:t>
-            </w:r>
-            <w:proofErr w:type="spellEnd"/>
+              <w:t>XI rdata</w:t>
+            </w:r>
           </w:p>
         </w:tc>
       </w:tr>
@@ -14008,14 +13933,12 @@
             <w:pPr>
               <w:jc w:val="center"/>
             </w:pPr>
-            <w:proofErr w:type="spellStart"/>
             <w:r>
               <w:rPr>
                 <w:rFonts w:eastAsiaTheme="minorEastAsia"/>
               </w:rPr>
               <w:t>axi_sramc_idle</w:t>
             </w:r>
-            <w:proofErr w:type="spellEnd"/>
           </w:p>
         </w:tc>
         <w:tc>
@@ -14104,14 +14027,12 @@
                 <w:rFonts w:eastAsiaTheme="minorEastAsia"/>
               </w:rPr>
             </w:pPr>
-            <w:proofErr w:type="spellStart"/>
             <w:r>
               <w:rPr>
                 <w:rFonts w:eastAsiaTheme="minorEastAsia"/>
               </w:rPr>
               <w:t>ecc_err</w:t>
             </w:r>
-            <w:proofErr w:type="spellEnd"/>
           </w:p>
         </w:tc>
         <w:tc>
@@ -14156,19 +14077,11 @@
                 <w:rFonts w:eastAsiaTheme="minorEastAsia"/>
               </w:rPr>
             </w:pPr>
-            <w:proofErr w:type="spellStart"/>
-            <w:r>
-              <w:rPr>
-                <w:rFonts w:eastAsiaTheme="minorEastAsia"/>
-              </w:rPr>
-              <w:t>Rdata</w:t>
-            </w:r>
-            <w:proofErr w:type="spellEnd"/>
-            <w:r>
-              <w:rPr>
-                <w:rFonts w:eastAsiaTheme="minorEastAsia"/>
-              </w:rPr>
-              <w:t xml:space="preserve"> ECC error and u</w:t>
+            <w:r>
+              <w:rPr>
+                <w:rFonts w:eastAsiaTheme="minorEastAsia"/>
+              </w:rPr>
+              <w:t>Rdata ECC error and u</w:t>
             </w:r>
             <w:r>
               <w:rPr>
@@ -14200,7 +14113,6 @@
                 <w:strike/>
               </w:rPr>
             </w:pPr>
-            <w:proofErr w:type="spellStart"/>
             <w:r>
               <w:rPr>
                 <w:rFonts w:eastAsiaTheme="minorEastAsia"/>
@@ -14208,7 +14120,6 @@
               </w:rPr>
               <w:t>ecc_err_addr</w:t>
             </w:r>
-            <w:proofErr w:type="spellEnd"/>
           </w:p>
         </w:tc>
         <w:tc>
@@ -14327,25 +14238,51 @@
       <w:r>
         <w:t xml:space="preserve">Table </w:t>
       </w:r>
-      <w:fldSimple w:instr=" STYLEREF 1 \s ">
-        <w:r>
-          <w:rPr>
-            <w:noProof/>
-          </w:rPr>
-          <w:t>3</w:t>
-        </w:r>
-      </w:fldSimple>
+      <w:r>
+        <w:fldChar w:fldCharType="begin"/>
+      </w:r>
+      <w:r>
+        <w:instrText xml:space="preserve"> STYLEREF 1 \s </w:instrText>
+      </w:r>
+      <w:r>
+        <w:fldChar w:fldCharType="separate"/>
+      </w:r>
+      <w:r>
+        <w:rPr>
+          <w:noProof/>
+        </w:rPr>
+        <w:t>3</w:t>
+      </w:r>
+      <w:r>
+        <w:rPr>
+          <w:noProof/>
+        </w:rPr>
+        <w:fldChar w:fldCharType="end"/>
+      </w:r>
       <w:r>
         <w:noBreakHyphen/>
       </w:r>
-      <w:fldSimple w:instr=" SEQ Table \* ARABIC \s 1 ">
-        <w:r>
-          <w:rPr>
-            <w:noProof/>
-          </w:rPr>
-          <w:t>3</w:t>
-        </w:r>
-      </w:fldSimple>
+      <w:r>
+        <w:fldChar w:fldCharType="begin"/>
+      </w:r>
+      <w:r>
+        <w:instrText xml:space="preserve"> SEQ Table \* ARABIC \s 1 </w:instrText>
+      </w:r>
+      <w:r>
+        <w:fldChar w:fldCharType="separate"/>
+      </w:r>
+      <w:r>
+        <w:rPr>
+          <w:noProof/>
+        </w:rPr>
+        <w:t>3</w:t>
+      </w:r>
+      <w:r>
+        <w:rPr>
+          <w:noProof/>
+        </w:rPr>
+        <w:fldChar w:fldCharType="end"/>
+      </w:r>
       <w:r>
         <w:t xml:space="preserve"> I/O Interfaces</w:t>
       </w:r>
@@ -14610,25 +14547,51 @@
       <w:r>
         <w:t xml:space="preserve">Table </w:t>
       </w:r>
-      <w:fldSimple w:instr=" STYLEREF 1 \s ">
-        <w:r>
-          <w:rPr>
-            <w:noProof/>
-          </w:rPr>
-          <w:t>3</w:t>
-        </w:r>
-      </w:fldSimple>
+      <w:r>
+        <w:fldChar w:fldCharType="begin"/>
+      </w:r>
+      <w:r>
+        <w:instrText xml:space="preserve"> STYLEREF 1 \s </w:instrText>
+      </w:r>
+      <w:r>
+        <w:fldChar w:fldCharType="separate"/>
+      </w:r>
+      <w:r>
+        <w:rPr>
+          <w:noProof/>
+        </w:rPr>
+        <w:t>3</w:t>
+      </w:r>
+      <w:r>
+        <w:rPr>
+          <w:noProof/>
+        </w:rPr>
+        <w:fldChar w:fldCharType="end"/>
+      </w:r>
       <w:r>
         <w:noBreakHyphen/>
       </w:r>
-      <w:fldSimple w:instr=" SEQ Table \* ARABIC \s 1 ">
-        <w:r>
-          <w:rPr>
-            <w:noProof/>
-          </w:rPr>
-          <w:t>4</w:t>
-        </w:r>
-      </w:fldSimple>
+      <w:r>
+        <w:fldChar w:fldCharType="begin"/>
+      </w:r>
+      <w:r>
+        <w:instrText xml:space="preserve"> SEQ Table \* ARABIC \s 1 </w:instrText>
+      </w:r>
+      <w:r>
+        <w:fldChar w:fldCharType="separate"/>
+      </w:r>
+      <w:r>
+        <w:rPr>
+          <w:noProof/>
+        </w:rPr>
+        <w:t>4</w:t>
+      </w:r>
+      <w:r>
+        <w:rPr>
+          <w:noProof/>
+        </w:rPr>
+        <w:fldChar w:fldCharType="end"/>
+      </w:r>
       <w:r>
         <w:t xml:space="preserve"> Address Mapping</w:t>
       </w:r>
@@ -14745,25 +14708,51 @@
       <w:r>
         <w:t xml:space="preserve">Figure </w:t>
       </w:r>
-      <w:fldSimple w:instr=" STYLEREF 1 \s ">
-        <w:r>
-          <w:rPr>
-            <w:noProof/>
-          </w:rPr>
-          <w:t>4</w:t>
-        </w:r>
-      </w:fldSimple>
+      <w:r>
+        <w:fldChar w:fldCharType="begin"/>
+      </w:r>
+      <w:r>
+        <w:instrText xml:space="preserve"> STYLEREF 1 \s </w:instrText>
+      </w:r>
+      <w:r>
+        <w:fldChar w:fldCharType="separate"/>
+      </w:r>
+      <w:r>
+        <w:rPr>
+          <w:noProof/>
+        </w:rPr>
+        <w:t>4</w:t>
+      </w:r>
+      <w:r>
+        <w:rPr>
+          <w:noProof/>
+        </w:rPr>
+        <w:fldChar w:fldCharType="end"/>
+      </w:r>
       <w:r>
         <w:noBreakHyphen/>
       </w:r>
-      <w:fldSimple w:instr=" SEQ Figure \* ARABIC \s 1 ">
-        <w:r>
-          <w:rPr>
-            <w:noProof/>
-          </w:rPr>
-          <w:t>1</w:t>
-        </w:r>
-      </w:fldSimple>
+      <w:r>
+        <w:fldChar w:fldCharType="begin"/>
+      </w:r>
+      <w:r>
+        <w:instrText xml:space="preserve"> SEQ Figure \* ARABIC \s 1 </w:instrText>
+      </w:r>
+      <w:r>
+        <w:fldChar w:fldCharType="separate"/>
+      </w:r>
+      <w:r>
+        <w:rPr>
+          <w:noProof/>
+        </w:rPr>
+        <w:t>1</w:t>
+      </w:r>
+      <w:r>
+        <w:rPr>
+          <w:noProof/>
+        </w:rPr>
+        <w:fldChar w:fldCharType="end"/>
+      </w:r>
       <w:bookmarkEnd w:id="25"/>
       <w:r>
         <w:t xml:space="preserve"> Read Handler Diagram</w:t>
@@ -15099,7 +15088,6 @@
             <w:gridSpan w:val="2"/>
           </w:tcPr>
           <w:p>
-            <w:proofErr w:type="spellStart"/>
             <w:r>
               <w:rPr>
                 <w:rFonts w:eastAsiaTheme="minorEastAsia" w:hint="eastAsia"/>
@@ -15112,7 +15100,6 @@
               </w:rPr>
               <w:t>ld</w:t>
             </w:r>
-            <w:proofErr w:type="spellEnd"/>
           </w:p>
         </w:tc>
         <w:tc>
@@ -15169,7 +15156,6 @@
             <w:gridSpan w:val="2"/>
           </w:tcPr>
           <w:p>
-            <w:proofErr w:type="spellStart"/>
             <w:r>
               <w:rPr>
                 <w:rFonts w:eastAsiaTheme="minorEastAsia" w:hint="eastAsia"/>
@@ -15182,7 +15168,6 @@
               </w:rPr>
               <w:t>dy</w:t>
             </w:r>
-            <w:proofErr w:type="spellEnd"/>
           </w:p>
         </w:tc>
         <w:tc>
@@ -15263,7 +15248,6 @@
             <w:tcW w:w="917" w:type="dxa"/>
           </w:tcPr>
           <w:p>
-            <w:proofErr w:type="spellStart"/>
             <w:r>
               <w:rPr>
                 <w:rFonts w:eastAsiaTheme="minorEastAsia" w:hint="eastAsia"/>
@@ -15276,7 +15260,6 @@
               </w:rPr>
               <w:t>xid</w:t>
             </w:r>
-            <w:proofErr w:type="spellEnd"/>
           </w:p>
         </w:tc>
         <w:tc>
@@ -15351,7 +15334,6 @@
             <w:tcW w:w="917" w:type="dxa"/>
           </w:tcPr>
           <w:p>
-            <w:proofErr w:type="spellStart"/>
             <w:r>
               <w:rPr>
                 <w:rFonts w:eastAsiaTheme="minorEastAsia" w:hint="eastAsia"/>
@@ -15364,7 +15346,6 @@
               </w:rPr>
               <w:t>ddr</w:t>
             </w:r>
-            <w:proofErr w:type="spellEnd"/>
           </w:p>
         </w:tc>
         <w:tc>
@@ -15720,7 +15701,6 @@
             <w:tcW w:w="917" w:type="dxa"/>
           </w:tcPr>
           <w:p>
-            <w:proofErr w:type="spellStart"/>
             <w:r>
               <w:rPr>
                 <w:rFonts w:eastAsiaTheme="minorEastAsia" w:hint="eastAsia"/>
@@ -15733,7 +15713,6 @@
               </w:rPr>
               <w:t>mw</w:t>
             </w:r>
-            <w:proofErr w:type="spellEnd"/>
           </w:p>
         </w:tc>
         <w:tc>
@@ -15884,16 +15863,8 @@
               <w:rPr>
                 <w:rFonts w:eastAsiaTheme="minorEastAsia"/>
               </w:rPr>
-              <w:t xml:space="preserve">ecoder </w:t>
-            </w:r>
-            <w:proofErr w:type="spellStart"/>
-            <w:r>
-              <w:rPr>
-                <w:rFonts w:eastAsiaTheme="minorEastAsia"/>
-              </w:rPr>
-              <w:t>rsp</w:t>
-            </w:r>
-            <w:proofErr w:type="spellEnd"/>
+              <w:t>ecoder rsp</w:t>
+            </w:r>
           </w:p>
         </w:tc>
         <w:tc>
@@ -15907,7 +15878,6 @@
                 <w:rFonts w:eastAsiaTheme="minorEastAsia"/>
               </w:rPr>
             </w:pPr>
-            <w:proofErr w:type="spellStart"/>
             <w:r>
               <w:rPr>
                 <w:rFonts w:eastAsiaTheme="minorEastAsia" w:hint="eastAsia"/>
@@ -15920,7 +15890,6 @@
               </w:rPr>
               <w:t>ld</w:t>
             </w:r>
-            <w:proofErr w:type="spellEnd"/>
           </w:p>
         </w:tc>
         <w:tc>
@@ -15972,14 +15941,12 @@
             <w:gridSpan w:val="2"/>
           </w:tcPr>
           <w:p>
-            <w:proofErr w:type="spellStart"/>
             <w:r>
               <w:rPr>
                 <w:rFonts w:eastAsiaTheme="minorEastAsia" w:hint="eastAsia"/>
               </w:rPr>
               <w:t>Rdy</w:t>
             </w:r>
-            <w:proofErr w:type="spellEnd"/>
           </w:p>
         </w:tc>
         <w:tc>
@@ -16060,7 +16027,6 @@
                 <w:rFonts w:eastAsiaTheme="minorEastAsia"/>
               </w:rPr>
             </w:pPr>
-            <w:proofErr w:type="spellStart"/>
             <w:r>
               <w:rPr>
                 <w:rFonts w:eastAsiaTheme="minorEastAsia" w:hint="eastAsia"/>
@@ -16073,7 +16039,6 @@
               </w:rPr>
               <w:t>xid</w:t>
             </w:r>
-            <w:proofErr w:type="spellEnd"/>
           </w:p>
         </w:tc>
         <w:tc>
@@ -16309,7 +16274,6 @@
                 <w:rFonts w:eastAsiaTheme="minorEastAsia"/>
               </w:rPr>
             </w:pPr>
-            <w:proofErr w:type="spellStart"/>
             <w:r>
               <w:rPr>
                 <w:rFonts w:eastAsiaTheme="minorEastAsia" w:hint="eastAsia"/>
@@ -16322,7 +16286,6 @@
               </w:rPr>
               <w:t>mw</w:t>
             </w:r>
-            <w:proofErr w:type="spellEnd"/>
           </w:p>
         </w:tc>
         <w:tc>
@@ -16443,25 +16406,51 @@
       <w:r>
         <w:t xml:space="preserve">Table </w:t>
       </w:r>
-      <w:fldSimple w:instr=" STYLEREF 1 \s ">
-        <w:r>
-          <w:rPr>
-            <w:noProof/>
-          </w:rPr>
-          <w:t>4</w:t>
-        </w:r>
-      </w:fldSimple>
+      <w:r>
+        <w:fldChar w:fldCharType="begin"/>
+      </w:r>
+      <w:r>
+        <w:instrText xml:space="preserve"> STYLEREF 1 \s </w:instrText>
+      </w:r>
+      <w:r>
+        <w:fldChar w:fldCharType="separate"/>
+      </w:r>
+      <w:r>
+        <w:rPr>
+          <w:noProof/>
+        </w:rPr>
+        <w:t>4</w:t>
+      </w:r>
+      <w:r>
+        <w:rPr>
+          <w:noProof/>
+        </w:rPr>
+        <w:fldChar w:fldCharType="end"/>
+      </w:r>
       <w:r>
         <w:noBreakHyphen/>
       </w:r>
-      <w:fldSimple w:instr=" SEQ Table \* ARABIC \s 1 ">
-        <w:r>
-          <w:rPr>
-            <w:noProof/>
-          </w:rPr>
-          <w:t>1</w:t>
-        </w:r>
-      </w:fldSimple>
+      <w:r>
+        <w:fldChar w:fldCharType="begin"/>
+      </w:r>
+      <w:r>
+        <w:instrText xml:space="preserve"> SEQ Table \* ARABIC \s 1 </w:instrText>
+      </w:r>
+      <w:r>
+        <w:fldChar w:fldCharType="separate"/>
+      </w:r>
+      <w:r>
+        <w:rPr>
+          <w:noProof/>
+        </w:rPr>
+        <w:t>1</w:t>
+      </w:r>
+      <w:r>
+        <w:rPr>
+          <w:noProof/>
+        </w:rPr>
+        <w:fldChar w:fldCharType="end"/>
+      </w:r>
       <w:bookmarkEnd w:id="28"/>
       <w:r>
         <w:t xml:space="preserve"> Request/Response Format of </w:t>
@@ -16542,16 +16531,62 @@
         <w:rPr>
           <w:rFonts w:eastAsiaTheme="minorEastAsia"/>
         </w:rPr>
-        <w:t xml:space="preserve">To simplify the design, it does not support out-of-order reading, that is to say, the </w:t>
-      </w:r>
-      <w:proofErr w:type="spellStart"/>
-      <w:r>
-        <w:rPr>
-          <w:rFonts w:eastAsiaTheme="minorEastAsia"/>
-        </w:rPr>
-        <w:t>Rrsp</w:t>
-      </w:r>
-      <w:proofErr w:type="spellEnd"/>
+        <w:t xml:space="preserve">To simplify the design, it does not support out-of-order reading, that is to say, the Rrsp </w:t>
+      </w:r>
+      <w:r>
+        <w:rPr>
+          <w:rFonts w:eastAsiaTheme="minorEastAsia"/>
+        </w:rPr>
+        <w:t>g</w:t>
+      </w:r>
+      <w:r>
+        <w:rPr>
+          <w:rFonts w:eastAsiaTheme="minorEastAsia"/>
+        </w:rPr>
+        <w:t xml:space="preserve">en will reply the read data in order, and use the field </w:t>
+      </w:r>
+      <w:r>
+        <w:rPr>
+          <w:rFonts w:eastAsiaTheme="minorEastAsia"/>
+        </w:rPr>
+        <w:t>‘</w:t>
+      </w:r>
+      <w:r>
+        <w:rPr>
+          <w:rFonts w:eastAsiaTheme="minorEastAsia"/>
+        </w:rPr>
+        <w:t>Last</w:t>
+      </w:r>
+      <w:r>
+        <w:rPr>
+          <w:rFonts w:eastAsiaTheme="minorEastAsia"/>
+        </w:rPr>
+        <w:t>’</w:t>
+      </w:r>
+      <w:r>
+        <w:rPr>
+          <w:rFonts w:eastAsiaTheme="minorEastAsia"/>
+        </w:rPr>
+        <w:t xml:space="preserve"> in </w:t>
+      </w:r>
+      <w:r>
+        <w:rPr>
+          <w:rFonts w:eastAsiaTheme="minorEastAsia"/>
+        </w:rPr>
+        <w:t>decoder response</w:t>
+      </w:r>
+      <w:r>
+        <w:rPr>
+          <w:rFonts w:eastAsiaTheme="minorEastAsia"/>
+        </w:rPr>
+        <w:t xml:space="preserve"> as the flag bit of the last data</w:t>
+      </w:r>
+      <w:r>
+        <w:rPr>
+          <w:rFonts w:eastAsiaTheme="minorEastAsia"/>
+        </w:rPr>
+        <w:t>.</w:t>
+      </w:r>
       <w:r>
         <w:rPr>
           <w:rFonts w:eastAsiaTheme="minorEastAsia"/>
@@ -16562,66 +16597,6 @@
         <w:rPr>
           <w:rFonts w:eastAsiaTheme="minorEastAsia"/>
         </w:rPr>
-        <w:t>g</w:t>
-      </w:r>
-      <w:r>
-        <w:rPr>
-          <w:rFonts w:eastAsiaTheme="minorEastAsia"/>
-        </w:rPr>
-        <w:t xml:space="preserve">en will reply the read data in order, and use the field </w:t>
-      </w:r>
-      <w:r>
-        <w:rPr>
-          <w:rFonts w:eastAsiaTheme="minorEastAsia"/>
-        </w:rPr>
-        <w:t>‘</w:t>
-      </w:r>
-      <w:r>
-        <w:rPr>
-          <w:rFonts w:eastAsiaTheme="minorEastAsia"/>
-        </w:rPr>
-        <w:t>Last</w:t>
-      </w:r>
-      <w:r>
-        <w:rPr>
-          <w:rFonts w:eastAsiaTheme="minorEastAsia"/>
-        </w:rPr>
-        <w:t>’</w:t>
-      </w:r>
-      <w:r>
-        <w:rPr>
-          <w:rFonts w:eastAsiaTheme="minorEastAsia"/>
-        </w:rPr>
-        <w:t xml:space="preserve"> in </w:t>
-      </w:r>
-      <w:r>
-        <w:rPr>
-          <w:rFonts w:eastAsiaTheme="minorEastAsia"/>
-        </w:rPr>
-        <w:t>decoder response</w:t>
-      </w:r>
-      <w:r>
-        <w:rPr>
-          <w:rFonts w:eastAsiaTheme="minorEastAsia"/>
-        </w:rPr>
-        <w:t xml:space="preserve"> as the flag bit of the last data</w:t>
-      </w:r>
-      <w:r>
-        <w:rPr>
-          <w:rFonts w:eastAsiaTheme="minorEastAsia"/>
-        </w:rPr>
-        <w:t>.</w:t>
-      </w:r>
-      <w:r>
-        <w:rPr>
-          <w:rFonts w:eastAsiaTheme="minorEastAsia"/>
-        </w:rPr>
-        <w:t xml:space="preserve"> </w:t>
-      </w:r>
-      <w:r>
-        <w:rPr>
-          <w:rFonts w:eastAsiaTheme="minorEastAsia"/>
-        </w:rPr>
         <w:t>A counter is used to record the read trans</w:t>
       </w:r>
       <w:r>
@@ -16636,19 +16611,11 @@
         </w:rPr>
         <w:t xml:space="preserve">the AR </w:t>
       </w:r>
-      <w:proofErr w:type="spellStart"/>
-      <w:r>
-        <w:rPr>
-          <w:rFonts w:eastAsiaTheme="minorEastAsia"/>
-        </w:rPr>
-        <w:t>FiFO</w:t>
-      </w:r>
-      <w:proofErr w:type="spellEnd"/>
-      <w:r>
-        <w:rPr>
-          <w:rFonts w:eastAsiaTheme="minorEastAsia"/>
-        </w:rPr>
-        <w:t xml:space="preserve"> receiving a transaction</w:t>
+      <w:r>
+        <w:rPr>
+          <w:rFonts w:eastAsiaTheme="minorEastAsia"/>
+        </w:rPr>
+        <w:t>FiFO receiving a transaction</w:t>
       </w:r>
       <w:r>
         <w:rPr>
@@ -16656,19 +16623,11 @@
         </w:rPr>
         <w:t xml:space="preserve">, and counter minus one for the </w:t>
       </w:r>
-      <w:proofErr w:type="spellStart"/>
-      <w:r>
-        <w:rPr>
-          <w:rFonts w:eastAsiaTheme="minorEastAsia"/>
-        </w:rPr>
-        <w:t>Rrsp</w:t>
-      </w:r>
-      <w:proofErr w:type="spellEnd"/>
-      <w:r>
-        <w:rPr>
-          <w:rFonts w:eastAsiaTheme="minorEastAsia"/>
-        </w:rPr>
-        <w:t xml:space="preserve"> </w:t>
+      <w:r>
+        <w:rPr>
+          <w:rFonts w:eastAsiaTheme="minorEastAsia"/>
+        </w:rPr>
+        <w:t xml:space="preserve">Rrsp </w:t>
       </w:r>
       <w:r>
         <w:rPr>
@@ -16759,25 +16718,51 @@
       <w:r>
         <w:t xml:space="preserve">Figure </w:t>
       </w:r>
-      <w:fldSimple w:instr=" STYLEREF 1 \s ">
-        <w:r>
-          <w:rPr>
-            <w:noProof/>
-          </w:rPr>
-          <w:t>4</w:t>
-        </w:r>
-      </w:fldSimple>
+      <w:r>
+        <w:fldChar w:fldCharType="begin"/>
+      </w:r>
+      <w:r>
+        <w:instrText xml:space="preserve"> STYLEREF 1 \s </w:instrText>
+      </w:r>
+      <w:r>
+        <w:fldChar w:fldCharType="separate"/>
+      </w:r>
+      <w:r>
+        <w:rPr>
+          <w:noProof/>
+        </w:rPr>
+        <w:t>4</w:t>
+      </w:r>
+      <w:r>
+        <w:rPr>
+          <w:noProof/>
+        </w:rPr>
+        <w:fldChar w:fldCharType="end"/>
+      </w:r>
       <w:r>
         <w:noBreakHyphen/>
       </w:r>
-      <w:fldSimple w:instr=" SEQ Figure \* ARABIC \s 1 ">
-        <w:r>
-          <w:rPr>
-            <w:noProof/>
-          </w:rPr>
-          <w:t>2</w:t>
-        </w:r>
-      </w:fldSimple>
+      <w:r>
+        <w:fldChar w:fldCharType="begin"/>
+      </w:r>
+      <w:r>
+        <w:instrText xml:space="preserve"> SEQ Figure \* ARABIC \s 1 </w:instrText>
+      </w:r>
+      <w:r>
+        <w:fldChar w:fldCharType="separate"/>
+      </w:r>
+      <w:r>
+        <w:rPr>
+          <w:noProof/>
+        </w:rPr>
+        <w:t>2</w:t>
+      </w:r>
+      <w:r>
+        <w:rPr>
+          <w:noProof/>
+        </w:rPr>
+        <w:fldChar w:fldCharType="end"/>
+      </w:r>
       <w:bookmarkEnd w:id="31"/>
       <w:r>
         <w:t xml:space="preserve"> Write Handler Diagram</w:t>
@@ -16974,29 +16959,7 @@
         <w:rPr>
           <w:rFonts w:eastAsiaTheme="minorEastAsia"/>
         </w:rPr>
-        <w:t>the write request with ‘</w:t>
-      </w:r>
-      <w:proofErr w:type="spellStart"/>
-      <w:proofErr w:type="gramStart"/>
-      <w:r>
-        <w:rPr>
-          <w:rFonts w:eastAsiaTheme="minorEastAsia"/>
-        </w:rPr>
-        <w:t>wstrb</w:t>
-      </w:r>
-      <w:proofErr w:type="spellEnd"/>
-      <w:r>
-        <w:rPr>
-          <w:rFonts w:eastAsiaTheme="minorEastAsia"/>
-        </w:rPr>
-        <w:t xml:space="preserve"> !</w:t>
-      </w:r>
-      <w:proofErr w:type="gramEnd"/>
-      <w:r>
-        <w:rPr>
-          <w:rFonts w:eastAsiaTheme="minorEastAsia"/>
-        </w:rPr>
-        <w:t>= `1’ will</w:t>
+        <w:t>the write request with ‘wstrb != `1’ will</w:t>
       </w:r>
       <w:r>
         <w:rPr>
@@ -17092,30 +17055,26 @@
         <w:rPr>
           <w:rFonts w:eastAsiaTheme="minorEastAsia"/>
         </w:rPr>
-        <w:t xml:space="preserve">it is routed to the RMW or the </w:t>
-      </w:r>
-      <w:proofErr w:type="spellStart"/>
-      <w:r>
-        <w:rPr>
-          <w:rFonts w:eastAsiaTheme="minorEastAsia"/>
-        </w:rPr>
-        <w:t>Brsp</w:t>
-      </w:r>
-      <w:proofErr w:type="spellEnd"/>
+        <w:t xml:space="preserve">it is routed to the RMW or the Brsp </w:t>
+      </w:r>
+      <w:r>
+        <w:rPr>
+          <w:rFonts w:eastAsiaTheme="minorEastAsia"/>
+        </w:rPr>
+        <w:t>gen</w:t>
+      </w:r>
       <w:r>
         <w:rPr>
           <w:rFonts w:eastAsiaTheme="minorEastAsia"/>
         </w:rPr>
         <w:t xml:space="preserve"> </w:t>
       </w:r>
-      <w:proofErr w:type="spellStart"/>
-      <w:r>
-        <w:rPr>
-          <w:rFonts w:eastAsiaTheme="minorEastAsia"/>
-        </w:rPr>
-        <w:t>gen</w:t>
-      </w:r>
-      <w:proofErr w:type="spellEnd"/>
+      <w:r>
+        <w:rPr>
+          <w:rFonts w:eastAsiaTheme="minorEastAsia"/>
+        </w:rPr>
+        <w:t>is determined by field ‘rmw’ in decoder rsp.</w:t>
+      </w:r>
       <w:r>
         <w:rPr>
           <w:rFonts w:eastAsiaTheme="minorEastAsia"/>
@@ -17126,33 +17085,47 @@
         <w:rPr>
           <w:rFonts w:eastAsiaTheme="minorEastAsia"/>
         </w:rPr>
-        <w:t>is determined by field ‘</w:t>
-      </w:r>
-      <w:proofErr w:type="spellStart"/>
-      <w:r>
-        <w:rPr>
-          <w:rFonts w:eastAsiaTheme="minorEastAsia"/>
-        </w:rPr>
-        <w:t>rmw</w:t>
-      </w:r>
-      <w:proofErr w:type="spellEnd"/>
-      <w:r>
-        <w:rPr>
-          <w:rFonts w:eastAsiaTheme="minorEastAsia"/>
-        </w:rPr>
-        <w:t xml:space="preserve">’ in decoder </w:t>
-      </w:r>
-      <w:proofErr w:type="spellStart"/>
-      <w:r>
-        <w:rPr>
-          <w:rFonts w:eastAsiaTheme="minorEastAsia"/>
-        </w:rPr>
-        <w:t>rsp</w:t>
-      </w:r>
-      <w:proofErr w:type="spellEnd"/>
-      <w:r>
-        <w:rPr>
-          <w:rFonts w:eastAsiaTheme="minorEastAsia"/>
+        <w:t xml:space="preserve">When ‘rmw’ signal is set, </w:t>
+      </w:r>
+      <w:r>
+        <w:rPr>
+          <w:rFonts w:eastAsiaTheme="minorEastAsia"/>
+        </w:rPr>
+        <w:t xml:space="preserve">it indicates that </w:t>
+      </w:r>
+      <w:r>
+        <w:rPr>
+          <w:rFonts w:eastAsiaTheme="minorEastAsia"/>
+        </w:rPr>
+        <w:t>the</w:t>
+      </w:r>
+      <w:r>
+        <w:rPr>
+          <w:rFonts w:eastAsiaTheme="minorEastAsia"/>
+        </w:rPr>
+        <w:t xml:space="preserve"> r</w:t>
+      </w:r>
+      <w:r>
+        <w:rPr>
+          <w:rFonts w:eastAsiaTheme="minorEastAsia"/>
+        </w:rPr>
+        <w:t>esponse</w:t>
+      </w:r>
+      <w:r>
+        <w:rPr>
+          <w:rFonts w:eastAsiaTheme="minorEastAsia"/>
+        </w:rPr>
+        <w:t xml:space="preserve"> is a reply to a read request sent by RMW </w:t>
+      </w:r>
+      <w:r>
+        <w:rPr>
+          <w:rFonts w:eastAsiaTheme="minorEastAsia"/>
+        </w:rPr>
+        <w:t>and this response will be routed to RMW</w:t>
+      </w:r>
+      <w:r>
+        <w:rPr>
+          <w:rFonts w:eastAsiaTheme="minorEastAsia" w:hint="eastAsia"/>
         </w:rPr>
         <w:t>.</w:t>
       </w:r>
@@ -17166,95 +17139,13 @@
         <w:rPr>
           <w:rFonts w:eastAsiaTheme="minorEastAsia"/>
         </w:rPr>
-        <w:t>When ‘</w:t>
-      </w:r>
-      <w:proofErr w:type="spellStart"/>
-      <w:r>
-        <w:rPr>
-          <w:rFonts w:eastAsiaTheme="minorEastAsia"/>
-        </w:rPr>
-        <w:t>rmw</w:t>
-      </w:r>
-      <w:proofErr w:type="spellEnd"/>
-      <w:r>
-        <w:rPr>
-          <w:rFonts w:eastAsiaTheme="minorEastAsia"/>
-        </w:rPr>
-        <w:t xml:space="preserve">’ signal is set, </w:t>
-      </w:r>
-      <w:r>
-        <w:rPr>
-          <w:rFonts w:eastAsiaTheme="minorEastAsia"/>
-        </w:rPr>
-        <w:t xml:space="preserve">it indicates that </w:t>
-      </w:r>
-      <w:r>
-        <w:rPr>
-          <w:rFonts w:eastAsiaTheme="minorEastAsia"/>
-        </w:rPr>
-        <w:t>the</w:t>
-      </w:r>
-      <w:r>
-        <w:rPr>
-          <w:rFonts w:eastAsiaTheme="minorEastAsia"/>
-        </w:rPr>
-        <w:t xml:space="preserve"> r</w:t>
-      </w:r>
-      <w:r>
-        <w:rPr>
-          <w:rFonts w:eastAsiaTheme="minorEastAsia"/>
-        </w:rPr>
-        <w:t>esponse</w:t>
-      </w:r>
-      <w:r>
-        <w:rPr>
-          <w:rFonts w:eastAsiaTheme="minorEastAsia"/>
-        </w:rPr>
-        <w:t xml:space="preserve"> is a reply to a read request sent by RMW </w:t>
-      </w:r>
-      <w:r>
-        <w:rPr>
-          <w:rFonts w:eastAsiaTheme="minorEastAsia"/>
-        </w:rPr>
-        <w:t>and this response will be routed to RMW</w:t>
-      </w:r>
-      <w:r>
-        <w:rPr>
-          <w:rFonts w:eastAsiaTheme="minorEastAsia" w:hint="eastAsia"/>
-        </w:rPr>
-        <w:t>.</w:t>
-      </w:r>
-      <w:r>
-        <w:rPr>
-          <w:rFonts w:eastAsiaTheme="minorEastAsia"/>
-        </w:rPr>
-        <w:t xml:space="preserve"> </w:t>
-      </w:r>
-      <w:r>
-        <w:rPr>
-          <w:rFonts w:eastAsiaTheme="minorEastAsia"/>
-        </w:rPr>
         <w:t xml:space="preserve">Since out-of-order writing is not supported, </w:t>
       </w:r>
       <w:r>
         <w:rPr>
           <w:rFonts w:eastAsiaTheme="minorEastAsia"/>
         </w:rPr>
-        <w:t xml:space="preserve">the </w:t>
-      </w:r>
-      <w:proofErr w:type="spellStart"/>
-      <w:r>
-        <w:rPr>
-          <w:rFonts w:eastAsiaTheme="minorEastAsia"/>
-        </w:rPr>
-        <w:t>Brsp</w:t>
-      </w:r>
-      <w:proofErr w:type="spellEnd"/>
-      <w:r>
-        <w:rPr>
-          <w:rFonts w:eastAsiaTheme="minorEastAsia"/>
-        </w:rPr>
-        <w:t xml:space="preserve"> gen</w:t>
+        <w:t>the Brsp gen</w:t>
       </w:r>
       <w:r>
         <w:rPr>
@@ -17290,21 +17181,7 @@
         <w:rPr>
           <w:rFonts w:eastAsiaTheme="minorEastAsia"/>
         </w:rPr>
-        <w:t>’ and ‘</w:t>
-      </w:r>
-      <w:proofErr w:type="spellStart"/>
-      <w:r>
-        <w:rPr>
-          <w:rFonts w:eastAsiaTheme="minorEastAsia"/>
-        </w:rPr>
-        <w:t>Axid</w:t>
-      </w:r>
-      <w:proofErr w:type="spellEnd"/>
-      <w:r>
-        <w:rPr>
-          <w:rFonts w:eastAsiaTheme="minorEastAsia"/>
-        </w:rPr>
-        <w:t>’.</w:t>
+        <w:t>’ and ‘Axid’.</w:t>
       </w:r>
       <w:r>
         <w:rPr>
@@ -17482,7 +17359,43 @@
         <w:rPr>
           <w:rFonts w:eastAsiaTheme="minorEastAsia"/>
         </w:rPr>
-        <w:t xml:space="preserve"> When field ‘RW’==1, </w:t>
+        <w:t xml:space="preserve"> When field </w:t>
+      </w:r>
+      <w:r>
+        <w:rPr>
+          <w:rFonts w:eastAsiaTheme="minorEastAsia" w:hint="eastAsia"/>
+        </w:rPr>
+        <w:t>rmw</w:t>
+      </w:r>
+      <w:r>
+        <w:rPr>
+          <w:rFonts w:eastAsiaTheme="minorEastAsia"/>
+        </w:rPr>
+        <w:t>==0</w:t>
+      </w:r>
+      <w:r>
+        <w:rPr>
+          <w:rFonts w:eastAsiaTheme="minorEastAsia"/>
+        </w:rPr>
+        <w:t xml:space="preserve"> &amp;&amp; </w:t>
+      </w:r>
+      <w:r>
+        <w:rPr>
+          <w:rFonts w:eastAsiaTheme="minorEastAsia"/>
+        </w:rPr>
+        <w:t>‘RW’==</w:t>
+      </w:r>
+      <w:r>
+        <w:rPr>
+          <w:rFonts w:eastAsiaTheme="minorEastAsia"/>
+        </w:rPr>
+        <w:t>0</w:t>
+      </w:r>
+      <w:r>
+        <w:rPr>
+          <w:rFonts w:eastAsiaTheme="minorEastAsia"/>
+        </w:rPr>
+        <w:t xml:space="preserve">, </w:t>
       </w:r>
       <w:r>
         <w:rPr>
@@ -17500,7 +17413,31 @@
         <w:rPr>
           <w:rFonts w:eastAsiaTheme="minorEastAsia"/>
         </w:rPr>
-        <w:t xml:space="preserve"> will be routed to Write Handler, otherwise routed to Read Handler.</w:t>
+        <w:t xml:space="preserve"> will be routed to </w:t>
+      </w:r>
+      <w:r>
+        <w:rPr>
+          <w:rFonts w:eastAsiaTheme="minorEastAsia"/>
+        </w:rPr>
+        <w:t xml:space="preserve">Read </w:t>
+      </w:r>
+      <w:r>
+        <w:rPr>
+          <w:rFonts w:eastAsiaTheme="minorEastAsia"/>
+        </w:rPr>
+        <w:t xml:space="preserve">Handler, otherwise routed to </w:t>
+      </w:r>
+      <w:r>
+        <w:rPr>
+          <w:rFonts w:eastAsiaTheme="minorEastAsia"/>
+        </w:rPr>
+        <w:t>write</w:t>
+      </w:r>
+      <w:r>
+        <w:rPr>
+          <w:rFonts w:eastAsiaTheme="minorEastAsia"/>
+        </w:rPr>
+        <w:t xml:space="preserve"> Handler.</w:t>
       </w:r>
     </w:p>
     <w:p>
@@ -17575,25 +17512,51 @@
       <w:r>
         <w:t xml:space="preserve">Figure </w:t>
       </w:r>
-      <w:fldSimple w:instr=" STYLEREF 1 \s ">
-        <w:r>
-          <w:rPr>
-            <w:noProof/>
-          </w:rPr>
-          <w:t>4</w:t>
-        </w:r>
-      </w:fldSimple>
+      <w:r>
+        <w:fldChar w:fldCharType="begin"/>
+      </w:r>
+      <w:r>
+        <w:instrText xml:space="preserve"> STYLEREF 1 \s </w:instrText>
+      </w:r>
+      <w:r>
+        <w:fldChar w:fldCharType="separate"/>
+      </w:r>
+      <w:r>
+        <w:rPr>
+          <w:noProof/>
+        </w:rPr>
+        <w:t>4</w:t>
+      </w:r>
+      <w:r>
+        <w:rPr>
+          <w:noProof/>
+        </w:rPr>
+        <w:fldChar w:fldCharType="end"/>
+      </w:r>
       <w:r>
         <w:noBreakHyphen/>
       </w:r>
-      <w:fldSimple w:instr=" SEQ Figure \* ARABIC \s 1 ">
-        <w:r>
-          <w:rPr>
-            <w:noProof/>
-          </w:rPr>
-          <w:t>3</w:t>
-        </w:r>
-      </w:fldSimple>
+      <w:r>
+        <w:fldChar w:fldCharType="begin"/>
+      </w:r>
+      <w:r>
+        <w:instrText xml:space="preserve"> SEQ Figure \* ARABIC \s 1 </w:instrText>
+      </w:r>
+      <w:r>
+        <w:fldChar w:fldCharType="separate"/>
+      </w:r>
+      <w:r>
+        <w:rPr>
+          <w:noProof/>
+        </w:rPr>
+        <w:t>3</w:t>
+      </w:r>
+      <w:r>
+        <w:rPr>
+          <w:noProof/>
+        </w:rPr>
+        <w:fldChar w:fldCharType="end"/>
+      </w:r>
       <w:bookmarkEnd w:id="36"/>
       <w:r>
         <w:t xml:space="preserve"> ECC Module Diagram</w:t>
@@ -17671,7 +17634,6 @@
         </w:rPr>
         <w:t xml:space="preserve">The AXI </w:t>
       </w:r>
-      <w:proofErr w:type="spellStart"/>
       <w:r>
         <w:rPr>
           <w:rFonts w:eastAsiaTheme="minorEastAsia"/>
@@ -17682,14 +17644,7 @@
         <w:rPr>
           <w:rFonts w:eastAsiaTheme="minorEastAsia"/>
         </w:rPr>
-        <w:t>data</w:t>
-      </w:r>
-      <w:proofErr w:type="spellEnd"/>
-      <w:r>
-        <w:rPr>
-          <w:rFonts w:eastAsiaTheme="minorEastAsia"/>
-        </w:rPr>
-        <w:t xml:space="preserve"> written into mem will be enc</w:t>
+        <w:t>data written into mem will be enc</w:t>
       </w:r>
       <w:r>
         <w:rPr>
@@ -17787,7 +17742,6 @@
         </w:rPr>
         <w:t xml:space="preserve"> to obtain AXI </w:t>
       </w:r>
-      <w:proofErr w:type="spellStart"/>
       <w:r>
         <w:rPr>
           <w:rFonts w:eastAsiaTheme="minorEastAsia"/>
@@ -17798,14 +17752,7 @@
         <w:rPr>
           <w:rFonts w:eastAsiaTheme="minorEastAsia"/>
         </w:rPr>
-        <w:t>data</w:t>
-      </w:r>
-      <w:proofErr w:type="spellEnd"/>
-      <w:r>
-        <w:rPr>
-          <w:rFonts w:eastAsiaTheme="minorEastAsia"/>
-        </w:rPr>
-        <w:t>.</w:t>
+        <w:t>data.</w:t>
       </w:r>
       <w:r>
         <w:rPr>
@@ -18024,25 +17971,51 @@
       <w:r>
         <w:t xml:space="preserve">Figure </w:t>
       </w:r>
-      <w:fldSimple w:instr=" STYLEREF 1 \s ">
-        <w:r>
-          <w:rPr>
-            <w:noProof/>
-          </w:rPr>
-          <w:t>5</w:t>
-        </w:r>
-      </w:fldSimple>
+      <w:r>
+        <w:fldChar w:fldCharType="begin"/>
+      </w:r>
+      <w:r>
+        <w:instrText xml:space="preserve"> STYLEREF 1 \s </w:instrText>
+      </w:r>
+      <w:r>
+        <w:fldChar w:fldCharType="separate"/>
+      </w:r>
+      <w:r>
+        <w:rPr>
+          <w:noProof/>
+        </w:rPr>
+        <w:t>5</w:t>
+      </w:r>
+      <w:r>
+        <w:rPr>
+          <w:noProof/>
+        </w:rPr>
+        <w:fldChar w:fldCharType="end"/>
+      </w:r>
       <w:r>
         <w:noBreakHyphen/>
       </w:r>
-      <w:fldSimple w:instr=" SEQ Figure \* ARABIC \s 1 ">
-        <w:r>
-          <w:rPr>
-            <w:noProof/>
-          </w:rPr>
-          <w:t>1</w:t>
-        </w:r>
-      </w:fldSimple>
+      <w:r>
+        <w:fldChar w:fldCharType="begin"/>
+      </w:r>
+      <w:r>
+        <w:instrText xml:space="preserve"> SEQ Figure \* ARABIC \s 1 </w:instrText>
+      </w:r>
+      <w:r>
+        <w:fldChar w:fldCharType="separate"/>
+      </w:r>
+      <w:r>
+        <w:rPr>
+          <w:noProof/>
+        </w:rPr>
+        <w:t>1</w:t>
+      </w:r>
+      <w:r>
+        <w:rPr>
+          <w:noProof/>
+        </w:rPr>
+        <w:fldChar w:fldCharType="end"/>
+      </w:r>
       <w:r>
         <w:t xml:space="preserve"> Data Path </w:t>
       </w:r>
@@ -18168,15 +18141,7 @@
         <w:t>ECC Encoder to p</w:t>
       </w:r>
       <w:r>
-        <w:t xml:space="preserve">erform </w:t>
-      </w:r>
-      <w:proofErr w:type="spellStart"/>
-      <w:r>
-        <w:t>wdata</w:t>
-      </w:r>
-      <w:proofErr w:type="spellEnd"/>
-      <w:r>
-        <w:t xml:space="preserve"> Hamming encoding</w:t>
+        <w:t>erform wdata Hamming encoding</w:t>
       </w:r>
       <w:r>
         <w:t>.</w:t>
@@ -18282,25 +18247,51 @@
       <w:r>
         <w:t xml:space="preserve">Figure </w:t>
       </w:r>
-      <w:fldSimple w:instr=" STYLEREF 1 \s ">
-        <w:r>
-          <w:rPr>
-            <w:noProof/>
-          </w:rPr>
-          <w:t>5</w:t>
-        </w:r>
-      </w:fldSimple>
+      <w:r>
+        <w:fldChar w:fldCharType="begin"/>
+      </w:r>
+      <w:r>
+        <w:instrText xml:space="preserve"> STYLEREF 1 \s </w:instrText>
+      </w:r>
+      <w:r>
+        <w:fldChar w:fldCharType="separate"/>
+      </w:r>
+      <w:r>
+        <w:rPr>
+          <w:noProof/>
+        </w:rPr>
+        <w:t>5</w:t>
+      </w:r>
+      <w:r>
+        <w:rPr>
+          <w:noProof/>
+        </w:rPr>
+        <w:fldChar w:fldCharType="end"/>
+      </w:r>
       <w:r>
         <w:noBreakHyphen/>
       </w:r>
-      <w:fldSimple w:instr=" SEQ Figure \* ARABIC \s 1 ">
-        <w:r>
-          <w:rPr>
-            <w:noProof/>
-          </w:rPr>
-          <w:t>2</w:t>
-        </w:r>
-      </w:fldSimple>
+      <w:r>
+        <w:fldChar w:fldCharType="begin"/>
+      </w:r>
+      <w:r>
+        <w:instrText xml:space="preserve"> SEQ Figure \* ARABIC \s 1 </w:instrText>
+      </w:r>
+      <w:r>
+        <w:fldChar w:fldCharType="separate"/>
+      </w:r>
+      <w:r>
+        <w:rPr>
+          <w:noProof/>
+        </w:rPr>
+        <w:t>2</w:t>
+      </w:r>
+      <w:r>
+        <w:rPr>
+          <w:noProof/>
+        </w:rPr>
+        <w:fldChar w:fldCharType="end"/>
+      </w:r>
       <w:r>
         <w:t xml:space="preserve"> Data Path </w:t>
       </w:r>
@@ -18439,35 +18430,7 @@
         <w:rPr>
           <w:rFonts w:eastAsiaTheme="minorEastAsia"/>
         </w:rPr>
-        <w:t xml:space="preserve"> write data is 64’h1111_2222_3333_4444, address is ‘h1234 and </w:t>
-      </w:r>
-      <w:proofErr w:type="spellStart"/>
-      <w:r>
-        <w:rPr>
-          <w:rFonts w:eastAsiaTheme="minorEastAsia"/>
-        </w:rPr>
-        <w:t>wstrb</w:t>
-      </w:r>
-      <w:proofErr w:type="spellEnd"/>
-      <w:r>
-        <w:rPr>
-          <w:rFonts w:eastAsiaTheme="minorEastAsia"/>
-        </w:rPr>
-        <w:t xml:space="preserve"> is ‘</w:t>
-      </w:r>
-      <w:proofErr w:type="spellStart"/>
-      <w:r>
-        <w:rPr>
-          <w:rFonts w:eastAsiaTheme="minorEastAsia"/>
-        </w:rPr>
-        <w:t>hfe</w:t>
-      </w:r>
-      <w:proofErr w:type="spellEnd"/>
-      <w:r>
-        <w:rPr>
-          <w:rFonts w:eastAsiaTheme="minorEastAsia"/>
-        </w:rPr>
-        <w:t xml:space="preserve">; </w:t>
+        <w:t xml:space="preserve"> write data is 64’h1111_2222_3333_4444, address is ‘h1234 and wstrb is ‘hfe; </w:t>
       </w:r>
       <w:r>
         <w:rPr>
@@ -18925,31 +18888,31 @@
           <w:p>
             <w:pPr>
               <w:rPr>
+                <w:rFonts w:eastAsiaTheme="minorEastAsia"/>
+              </w:rPr>
+            </w:pPr>
+            <w:r>
+              <w:rPr>
+                <w:rFonts w:eastAsiaTheme="minorEastAsia"/>
+              </w:rPr>
+              <w:t>HAS_NARROW_TR</w:t>
+            </w:r>
+          </w:p>
+        </w:tc>
+        <w:tc>
+          <w:tcPr>
+            <w:tcW w:w="2763" w:type="dxa"/>
+          </w:tcPr>
+          <w:p>
+            <w:pPr>
+              <w:rPr>
+                <w:rFonts w:eastAsiaTheme="minorEastAsia"/>
+              </w:rPr>
+            </w:pPr>
+            <w:r>
+              <w:rPr>
                 <w:rFonts w:eastAsiaTheme="minorEastAsia" w:hint="eastAsia"/>
               </w:rPr>
-            </w:pPr>
-            <w:r>
-              <w:rPr>
-                <w:rFonts w:eastAsiaTheme="minorEastAsia"/>
-              </w:rPr>
-              <w:t>HAS_NARROW_TR</w:t>
-            </w:r>
-          </w:p>
-        </w:tc>
-        <w:tc>
-          <w:tcPr>
-            <w:tcW w:w="2763" w:type="dxa"/>
-          </w:tcPr>
-          <w:p>
-            <w:pPr>
-              <w:rPr>
-                <w:rFonts w:eastAsiaTheme="minorEastAsia"/>
-              </w:rPr>
-            </w:pPr>
-            <w:r>
-              <w:rPr>
-                <w:rFonts w:eastAsiaTheme="minorEastAsia" w:hint="eastAsia"/>
-              </w:rPr>
               <w:t>1</w:t>
             </w:r>
           </w:p>
@@ -18961,7 +18924,7 @@
           <w:p>
             <w:pPr>
               <w:rPr>
-                <w:rFonts w:eastAsiaTheme="minorEastAsia" w:hint="eastAsia"/>
+                <w:rFonts w:eastAsiaTheme="minorEastAsia"/>
               </w:rPr>
             </w:pPr>
             <w:r>
@@ -18993,31 +18956,31 @@
           <w:p>
             <w:pPr>
               <w:rPr>
+                <w:rFonts w:eastAsiaTheme="minorEastAsia"/>
+              </w:rPr>
+            </w:pPr>
+            <w:r>
+              <w:rPr>
+                <w:rFonts w:eastAsiaTheme="minorEastAsia"/>
+              </w:rPr>
+              <w:t>HAS_UNALIGNED_TR</w:t>
+            </w:r>
+          </w:p>
+        </w:tc>
+        <w:tc>
+          <w:tcPr>
+            <w:tcW w:w="2763" w:type="dxa"/>
+          </w:tcPr>
+          <w:p>
+            <w:pPr>
+              <w:rPr>
+                <w:rFonts w:eastAsiaTheme="minorEastAsia"/>
+              </w:rPr>
+            </w:pPr>
+            <w:r>
+              <w:rPr>
                 <w:rFonts w:eastAsiaTheme="minorEastAsia" w:hint="eastAsia"/>
               </w:rPr>
-            </w:pPr>
-            <w:r>
-              <w:rPr>
-                <w:rFonts w:eastAsiaTheme="minorEastAsia"/>
-              </w:rPr>
-              <w:t>HAS_UNALIGNED_TR</w:t>
-            </w:r>
-          </w:p>
-        </w:tc>
-        <w:tc>
-          <w:tcPr>
-            <w:tcW w:w="2763" w:type="dxa"/>
-          </w:tcPr>
-          <w:p>
-            <w:pPr>
-              <w:rPr>
-                <w:rFonts w:eastAsiaTheme="minorEastAsia"/>
-              </w:rPr>
-            </w:pPr>
-            <w:r>
-              <w:rPr>
-                <w:rFonts w:eastAsiaTheme="minorEastAsia" w:hint="eastAsia"/>
-              </w:rPr>
               <w:t>1</w:t>
             </w:r>
           </w:p>
@@ -19029,7 +18992,7 @@
           <w:p>
             <w:pPr>
               <w:rPr>
-                <w:rFonts w:eastAsiaTheme="minorEastAsia" w:hint="eastAsia"/>
+                <w:rFonts w:eastAsiaTheme="minorEastAsia"/>
               </w:rPr>
             </w:pPr>
             <w:r>
@@ -19038,14 +19001,12 @@
               </w:rPr>
               <w:t xml:space="preserve">Whether unaligned </w:t>
             </w:r>
-            <w:proofErr w:type="spellStart"/>
             <w:r>
               <w:rPr>
                 <w:rFonts w:eastAsiaTheme="minorEastAsia"/>
               </w:rPr>
               <w:t>unaligned</w:t>
             </w:r>
-            <w:proofErr w:type="spellEnd"/>
             <w:r>
               <w:rPr>
                 <w:rFonts w:eastAsiaTheme="minorEastAsia"/>
@@ -19084,25 +19045,51 @@
       <w:r>
         <w:t xml:space="preserve">Table </w:t>
       </w:r>
-      <w:fldSimple w:instr=" STYLEREF 1 \s ">
-        <w:r>
-          <w:rPr>
-            <w:noProof/>
-          </w:rPr>
-          <w:t>6</w:t>
-        </w:r>
-      </w:fldSimple>
+      <w:r>
+        <w:fldChar w:fldCharType="begin"/>
+      </w:r>
+      <w:r>
+        <w:instrText xml:space="preserve"> STYLEREF 1 \s </w:instrText>
+      </w:r>
+      <w:r>
+        <w:fldChar w:fldCharType="separate"/>
+      </w:r>
+      <w:r>
+        <w:rPr>
+          <w:noProof/>
+        </w:rPr>
+        <w:t>6</w:t>
+      </w:r>
+      <w:r>
+        <w:rPr>
+          <w:noProof/>
+        </w:rPr>
+        <w:fldChar w:fldCharType="end"/>
+      </w:r>
       <w:r>
         <w:noBreakHyphen/>
       </w:r>
-      <w:fldSimple w:instr=" SEQ Table \* ARABIC \s 1 ">
-        <w:r>
-          <w:rPr>
-            <w:noProof/>
-          </w:rPr>
-          <w:t>1</w:t>
-        </w:r>
-      </w:fldSimple>
+      <w:r>
+        <w:fldChar w:fldCharType="begin"/>
+      </w:r>
+      <w:r>
+        <w:instrText xml:space="preserve"> SEQ Table \* ARABIC \s 1 </w:instrText>
+      </w:r>
+      <w:r>
+        <w:fldChar w:fldCharType="separate"/>
+      </w:r>
+      <w:r>
+        <w:rPr>
+          <w:noProof/>
+        </w:rPr>
+        <w:t>1</w:t>
+      </w:r>
+      <w:r>
+        <w:rPr>
+          <w:noProof/>
+        </w:rPr>
+        <w:fldChar w:fldCharType="end"/>
+      </w:r>
       <w:r>
         <w:t xml:space="preserve"> Parameter List</w:t>
       </w:r>
@@ -19303,25 +19290,51 @@
       <w:r>
         <w:t xml:space="preserve">Table </w:t>
       </w:r>
-      <w:fldSimple w:instr=" STYLEREF 1 \s ">
-        <w:r>
-          <w:rPr>
-            <w:noProof/>
-          </w:rPr>
-          <w:t>6</w:t>
-        </w:r>
-      </w:fldSimple>
+      <w:r>
+        <w:fldChar w:fldCharType="begin"/>
+      </w:r>
+      <w:r>
+        <w:instrText xml:space="preserve"> STYLEREF 1 \s </w:instrText>
+      </w:r>
+      <w:r>
+        <w:fldChar w:fldCharType="separate"/>
+      </w:r>
+      <w:r>
+        <w:rPr>
+          <w:noProof/>
+        </w:rPr>
+        <w:t>6</w:t>
+      </w:r>
+      <w:r>
+        <w:rPr>
+          <w:noProof/>
+        </w:rPr>
+        <w:fldChar w:fldCharType="end"/>
+      </w:r>
       <w:r>
         <w:noBreakHyphen/>
       </w:r>
-      <w:fldSimple w:instr=" SEQ Table \* ARABIC \s 1 ">
-        <w:r>
-          <w:rPr>
-            <w:noProof/>
-          </w:rPr>
-          <w:t>2</w:t>
-        </w:r>
-      </w:fldSimple>
+      <w:r>
+        <w:fldChar w:fldCharType="begin"/>
+      </w:r>
+      <w:r>
+        <w:instrText xml:space="preserve"> SEQ Table \* ARABIC \s 1 </w:instrText>
+      </w:r>
+      <w:r>
+        <w:fldChar w:fldCharType="separate"/>
+      </w:r>
+      <w:r>
+        <w:rPr>
+          <w:noProof/>
+        </w:rPr>
+        <w:t>2</w:t>
+      </w:r>
+      <w:r>
+        <w:rPr>
+          <w:noProof/>
+        </w:rPr>
+        <w:fldChar w:fldCharType="end"/>
+      </w:r>
       <w:r>
         <w:t xml:space="preserve"> Macro List</w:t>
       </w:r>
@@ -19658,25 +19671,51 @@
       <w:r>
         <w:t xml:space="preserve">Table </w:t>
       </w:r>
-      <w:fldSimple w:instr=" STYLEREF 1 \s ">
-        <w:r>
-          <w:rPr>
-            <w:noProof/>
-          </w:rPr>
-          <w:t>6</w:t>
-        </w:r>
-      </w:fldSimple>
+      <w:r>
+        <w:fldChar w:fldCharType="begin"/>
+      </w:r>
+      <w:r>
+        <w:instrText xml:space="preserve"> STYLEREF 1 \s </w:instrText>
+      </w:r>
+      <w:r>
+        <w:fldChar w:fldCharType="separate"/>
+      </w:r>
+      <w:r>
+        <w:rPr>
+          <w:noProof/>
+        </w:rPr>
+        <w:t>6</w:t>
+      </w:r>
+      <w:r>
+        <w:rPr>
+          <w:noProof/>
+        </w:rPr>
+        <w:fldChar w:fldCharType="end"/>
+      </w:r>
       <w:r>
         <w:noBreakHyphen/>
       </w:r>
-      <w:fldSimple w:instr=" SEQ Table \* ARABIC \s 1 ">
-        <w:r>
-          <w:rPr>
-            <w:noProof/>
-          </w:rPr>
-          <w:t>3</w:t>
-        </w:r>
-      </w:fldSimple>
+      <w:r>
+        <w:fldChar w:fldCharType="begin"/>
+      </w:r>
+      <w:r>
+        <w:instrText xml:space="preserve"> SEQ Table \* ARABIC \s 1 </w:instrText>
+      </w:r>
+      <w:r>
+        <w:fldChar w:fldCharType="separate"/>
+      </w:r>
+      <w:r>
+        <w:rPr>
+          <w:noProof/>
+        </w:rPr>
+        <w:t>3</w:t>
+      </w:r>
+      <w:r>
+        <w:rPr>
+          <w:noProof/>
+        </w:rPr>
+        <w:fldChar w:fldCharType="end"/>
+      </w:r>
       <w:r>
         <w:t xml:space="preserve"> Memory Requirements Table</w:t>
       </w:r>
@@ -19924,25 +19963,51 @@
       <w:r>
         <w:t xml:space="preserve">Table </w:t>
       </w:r>
-      <w:fldSimple w:instr=" STYLEREF 1 \s ">
-        <w:r>
-          <w:rPr>
-            <w:noProof/>
-          </w:rPr>
-          <w:t>7</w:t>
-        </w:r>
-      </w:fldSimple>
+      <w:r>
+        <w:fldChar w:fldCharType="begin"/>
+      </w:r>
+      <w:r>
+        <w:instrText xml:space="preserve"> STYLEREF 1 \s </w:instrText>
+      </w:r>
+      <w:r>
+        <w:fldChar w:fldCharType="separate"/>
+      </w:r>
+      <w:r>
+        <w:rPr>
+          <w:noProof/>
+        </w:rPr>
+        <w:t>7</w:t>
+      </w:r>
+      <w:r>
+        <w:rPr>
+          <w:noProof/>
+        </w:rPr>
+        <w:fldChar w:fldCharType="end"/>
+      </w:r>
       <w:r>
         <w:noBreakHyphen/>
       </w:r>
-      <w:fldSimple w:instr=" SEQ Table \* ARABIC \s 1 ">
-        <w:r>
-          <w:rPr>
-            <w:noProof/>
-          </w:rPr>
-          <w:t>1</w:t>
-        </w:r>
-      </w:fldSimple>
+      <w:r>
+        <w:fldChar w:fldCharType="begin"/>
+      </w:r>
+      <w:r>
+        <w:instrText xml:space="preserve"> SEQ Table \* ARABIC \s 1 </w:instrText>
+      </w:r>
+      <w:r>
+        <w:fldChar w:fldCharType="separate"/>
+      </w:r>
+      <w:r>
+        <w:rPr>
+          <w:noProof/>
+        </w:rPr>
+        <w:t>1</w:t>
+      </w:r>
+      <w:r>
+        <w:rPr>
+          <w:noProof/>
+        </w:rPr>
+        <w:fldChar w:fldCharType="end"/>
+      </w:r>
       <w:r>
         <w:t xml:space="preserve"> Power State Table</w:t>
       </w:r>
@@ -20122,25 +20187,51 @@
       <w:r>
         <w:t xml:space="preserve">Table </w:t>
       </w:r>
-      <w:fldSimple w:instr=" STYLEREF 1 \s ">
-        <w:r>
-          <w:rPr>
-            <w:noProof/>
-          </w:rPr>
-          <w:t>7</w:t>
-        </w:r>
-      </w:fldSimple>
+      <w:r>
+        <w:fldChar w:fldCharType="begin"/>
+      </w:r>
+      <w:r>
+        <w:instrText xml:space="preserve"> STYLEREF 1 \s </w:instrText>
+      </w:r>
+      <w:r>
+        <w:fldChar w:fldCharType="separate"/>
+      </w:r>
+      <w:r>
+        <w:rPr>
+          <w:noProof/>
+        </w:rPr>
+        <w:t>7</w:t>
+      </w:r>
+      <w:r>
+        <w:rPr>
+          <w:noProof/>
+        </w:rPr>
+        <w:fldChar w:fldCharType="end"/>
+      </w:r>
       <w:r>
         <w:noBreakHyphen/>
       </w:r>
-      <w:fldSimple w:instr=" SEQ Table \* ARABIC \s 1 ">
-        <w:r>
-          <w:rPr>
-            <w:noProof/>
-          </w:rPr>
-          <w:t>2</w:t>
-        </w:r>
-      </w:fldSimple>
+      <w:r>
+        <w:fldChar w:fldCharType="begin"/>
+      </w:r>
+      <w:r>
+        <w:instrText xml:space="preserve"> SEQ Table \* ARABIC \s 1 </w:instrText>
+      </w:r>
+      <w:r>
+        <w:fldChar w:fldCharType="separate"/>
+      </w:r>
+      <w:r>
+        <w:rPr>
+          <w:noProof/>
+        </w:rPr>
+        <w:t>2</w:t>
+      </w:r>
+      <w:r>
+        <w:rPr>
+          <w:noProof/>
+        </w:rPr>
+        <w:fldChar w:fldCharType="end"/>
+      </w:r>
       <w:r>
         <w:t xml:space="preserve"> Power Consumption Table</w:t>
       </w:r>
@@ -20470,25 +20561,7 @@
           <w:iCs/>
           <w:color w:val="0070C0"/>
         </w:rPr>
-        <w:t xml:space="preserve">and </w:t>
-      </w:r>
-      <w:proofErr w:type="spellStart"/>
-      <w:r>
-        <w:rPr>
-          <w:i/>
-          <w:iCs/>
-          <w:color w:val="0070C0"/>
-        </w:rPr>
-        <w:t>vt</w:t>
-      </w:r>
-      <w:proofErr w:type="spellEnd"/>
-      <w:r>
-        <w:rPr>
-          <w:i/>
-          <w:iCs/>
-          <w:color w:val="0070C0"/>
-        </w:rPr>
-        <w:t xml:space="preserve"> cell </w:t>
+        <w:t xml:space="preserve">and vt cell </w:t>
       </w:r>
       <w:r>
         <w:rPr>
@@ -20616,25 +20689,51 @@
       <w:r>
         <w:t xml:space="preserve">Table </w:t>
       </w:r>
-      <w:fldSimple w:instr=" STYLEREF 1 \s ">
-        <w:r>
-          <w:rPr>
-            <w:noProof/>
-          </w:rPr>
-          <w:t>7</w:t>
-        </w:r>
-      </w:fldSimple>
+      <w:r>
+        <w:fldChar w:fldCharType="begin"/>
+      </w:r>
+      <w:r>
+        <w:instrText xml:space="preserve"> STYLEREF 1 \s </w:instrText>
+      </w:r>
+      <w:r>
+        <w:fldChar w:fldCharType="separate"/>
+      </w:r>
+      <w:r>
+        <w:rPr>
+          <w:noProof/>
+        </w:rPr>
+        <w:t>7</w:t>
+      </w:r>
+      <w:r>
+        <w:rPr>
+          <w:noProof/>
+        </w:rPr>
+        <w:fldChar w:fldCharType="end"/>
+      </w:r>
       <w:r>
         <w:noBreakHyphen/>
       </w:r>
-      <w:fldSimple w:instr=" SEQ Table \* ARABIC \s 1 ">
-        <w:r>
-          <w:rPr>
-            <w:noProof/>
-          </w:rPr>
-          <w:t>3</w:t>
-        </w:r>
-      </w:fldSimple>
+      <w:r>
+        <w:fldChar w:fldCharType="begin"/>
+      </w:r>
+      <w:r>
+        <w:instrText xml:space="preserve"> SEQ Table \* ARABIC \s 1 </w:instrText>
+      </w:r>
+      <w:r>
+        <w:fldChar w:fldCharType="separate"/>
+      </w:r>
+      <w:r>
+        <w:rPr>
+          <w:noProof/>
+        </w:rPr>
+        <w:t>3</w:t>
+      </w:r>
+      <w:r>
+        <w:rPr>
+          <w:noProof/>
+        </w:rPr>
+        <w:fldChar w:fldCharType="end"/>
+      </w:r>
       <w:r>
         <w:t xml:space="preserve"> Area Information</w:t>
       </w:r>
@@ -20759,25 +20858,51 @@
       <w:r>
         <w:t xml:space="preserve">Table </w:t>
       </w:r>
-      <w:fldSimple w:instr=" STYLEREF 1 \s ">
-        <w:r>
-          <w:rPr>
-            <w:noProof/>
-          </w:rPr>
-          <w:t>7</w:t>
-        </w:r>
-      </w:fldSimple>
+      <w:r>
+        <w:fldChar w:fldCharType="begin"/>
+      </w:r>
+      <w:r>
+        <w:instrText xml:space="preserve"> STYLEREF 1 \s </w:instrText>
+      </w:r>
+      <w:r>
+        <w:fldChar w:fldCharType="separate"/>
+      </w:r>
+      <w:r>
+        <w:rPr>
+          <w:noProof/>
+        </w:rPr>
+        <w:t>7</w:t>
+      </w:r>
+      <w:r>
+        <w:rPr>
+          <w:noProof/>
+        </w:rPr>
+        <w:fldChar w:fldCharType="end"/>
+      </w:r>
       <w:r>
         <w:noBreakHyphen/>
       </w:r>
-      <w:fldSimple w:instr=" SEQ Table \* ARABIC \s 1 ">
-        <w:r>
-          <w:rPr>
-            <w:noProof/>
-          </w:rPr>
-          <w:t>4</w:t>
-        </w:r>
-      </w:fldSimple>
+      <w:r>
+        <w:fldChar w:fldCharType="begin"/>
+      </w:r>
+      <w:r>
+        <w:instrText xml:space="preserve"> SEQ Table \* ARABIC \s 1 </w:instrText>
+      </w:r>
+      <w:r>
+        <w:fldChar w:fldCharType="separate"/>
+      </w:r>
+      <w:r>
+        <w:rPr>
+          <w:noProof/>
+        </w:rPr>
+        <w:t>4</w:t>
+      </w:r>
+      <w:r>
+        <w:rPr>
+          <w:noProof/>
+        </w:rPr>
+        <w:fldChar w:fldCharType="end"/>
+      </w:r>
       <w:r>
         <w:t xml:space="preserve"> VT Cell Number</w:t>
       </w:r>
@@ -20926,23 +21051,13 @@
           <w:color w:val="0070C0"/>
         </w:rPr>
       </w:pPr>
-      <w:proofErr w:type="spellStart"/>
       <w:r>
         <w:rPr>
           <w:i/>
           <w:iCs/>
           <w:color w:val="0070C0"/>
         </w:rPr>
-        <w:t>Etcs</w:t>
-      </w:r>
-      <w:proofErr w:type="spellEnd"/>
-      <w:r>
-        <w:rPr>
-          <w:i/>
-          <w:iCs/>
-          <w:color w:val="0070C0"/>
-        </w:rPr>
-        <w:t>.</w:t>
+        <w:t>Etcs.</w:t>
       </w:r>
     </w:p>
     <w:p>
@@ -21108,25 +21223,51 @@
       <w:r>
         <w:t xml:space="preserve">Figure </w:t>
       </w:r>
-      <w:fldSimple w:instr=" STYLEREF 1 \s ">
-        <w:r>
-          <w:rPr>
-            <w:noProof/>
-          </w:rPr>
-          <w:t>11</w:t>
-        </w:r>
-      </w:fldSimple>
+      <w:r>
+        <w:fldChar w:fldCharType="begin"/>
+      </w:r>
+      <w:r>
+        <w:instrText xml:space="preserve"> STYLEREF 1 \s </w:instrText>
+      </w:r>
+      <w:r>
+        <w:fldChar w:fldCharType="separate"/>
+      </w:r>
+      <w:r>
+        <w:rPr>
+          <w:noProof/>
+        </w:rPr>
+        <w:t>11</w:t>
+      </w:r>
+      <w:r>
+        <w:rPr>
+          <w:noProof/>
+        </w:rPr>
+        <w:fldChar w:fldCharType="end"/>
+      </w:r>
       <w:r>
         <w:noBreakHyphen/>
       </w:r>
-      <w:fldSimple w:instr=" SEQ Figure \* ARABIC \s 1 ">
-        <w:r>
-          <w:rPr>
-            <w:noProof/>
-          </w:rPr>
-          <w:t>1</w:t>
-        </w:r>
-      </w:fldSimple>
+      <w:r>
+        <w:fldChar w:fldCharType="begin"/>
+      </w:r>
+      <w:r>
+        <w:instrText xml:space="preserve"> SEQ Figure \* ARABIC \s 1 </w:instrText>
+      </w:r>
+      <w:r>
+        <w:fldChar w:fldCharType="separate"/>
+      </w:r>
+      <w:r>
+        <w:rPr>
+          <w:noProof/>
+        </w:rPr>
+        <w:t>1</w:t>
+      </w:r>
+      <w:r>
+        <w:rPr>
+          <w:noProof/>
+        </w:rPr>
+        <w:fldChar w:fldCharType="end"/>
+      </w:r>
       <w:bookmarkEnd w:id="66"/>
       <w:r>
         <w:t xml:space="preserve"> Memory Wrapper Diagram</w:t>

</xml_diff>

<commit_message>
first version for dv
</commit_message>
<xml_diff>
--- a/axi_mem_controller/Project_GR001_IP_AXI_SRAMC_HDD.docx
+++ b/axi_mem_controller/Project_GR001_IP_AXI_SRAMC_HDD.docx
@@ -6350,51 +6350,25 @@
       <w:r>
         <w:t xml:space="preserve">Figure </w:t>
       </w:r>
-      <w:r>
-        <w:fldChar w:fldCharType="begin"/>
-      </w:r>
-      <w:r>
-        <w:instrText xml:space="preserve"> STYLEREF 1 \s </w:instrText>
-      </w:r>
-      <w:r>
-        <w:fldChar w:fldCharType="separate"/>
-      </w:r>
-      <w:r>
-        <w:rPr>
-          <w:noProof/>
-        </w:rPr>
-        <w:t>3</w:t>
-      </w:r>
-      <w:r>
-        <w:rPr>
-          <w:noProof/>
-        </w:rPr>
-        <w:fldChar w:fldCharType="end"/>
-      </w:r>
+      <w:fldSimple w:instr=" STYLEREF 1 \s ">
+        <w:r>
+          <w:rPr>
+            <w:noProof/>
+          </w:rPr>
+          <w:t>3</w:t>
+        </w:r>
+      </w:fldSimple>
       <w:r>
         <w:noBreakHyphen/>
       </w:r>
-      <w:r>
-        <w:fldChar w:fldCharType="begin"/>
-      </w:r>
-      <w:r>
-        <w:instrText xml:space="preserve"> SEQ Figure \* ARABIC \s 1 </w:instrText>
-      </w:r>
-      <w:r>
-        <w:fldChar w:fldCharType="separate"/>
-      </w:r>
-      <w:r>
-        <w:rPr>
-          <w:noProof/>
-        </w:rPr>
-        <w:t>1</w:t>
-      </w:r>
-      <w:r>
-        <w:rPr>
-          <w:noProof/>
-        </w:rPr>
-        <w:fldChar w:fldCharType="end"/>
-      </w:r>
+      <w:fldSimple w:instr=" SEQ Figure \* ARABIC \s 1 ">
+        <w:r>
+          <w:rPr>
+            <w:noProof/>
+          </w:rPr>
+          <w:t>1</w:t>
+        </w:r>
+      </w:fldSimple>
       <w:bookmarkEnd w:id="8"/>
       <w:r>
         <w:t xml:space="preserve"> </w:t>
@@ -6916,51 +6890,25 @@
       <w:r>
         <w:t xml:space="preserve">Figure </w:t>
       </w:r>
-      <w:r>
-        <w:fldChar w:fldCharType="begin"/>
-      </w:r>
-      <w:r>
-        <w:instrText xml:space="preserve"> STYLEREF 1 \s </w:instrText>
-      </w:r>
-      <w:r>
-        <w:fldChar w:fldCharType="separate"/>
-      </w:r>
-      <w:r>
-        <w:rPr>
-          <w:noProof/>
-        </w:rPr>
-        <w:t>3</w:t>
-      </w:r>
-      <w:r>
-        <w:rPr>
-          <w:noProof/>
-        </w:rPr>
-        <w:fldChar w:fldCharType="end"/>
-      </w:r>
+      <w:fldSimple w:instr=" STYLEREF 1 \s ">
+        <w:r>
+          <w:rPr>
+            <w:noProof/>
+          </w:rPr>
+          <w:t>3</w:t>
+        </w:r>
+      </w:fldSimple>
       <w:r>
         <w:noBreakHyphen/>
       </w:r>
-      <w:r>
-        <w:fldChar w:fldCharType="begin"/>
-      </w:r>
-      <w:r>
-        <w:instrText xml:space="preserve"> SEQ Figure \* ARABIC \s 1 </w:instrText>
-      </w:r>
-      <w:r>
-        <w:fldChar w:fldCharType="separate"/>
-      </w:r>
-      <w:r>
-        <w:rPr>
-          <w:noProof/>
-        </w:rPr>
-        <w:t>2</w:t>
-      </w:r>
-      <w:r>
-        <w:rPr>
-          <w:noProof/>
-        </w:rPr>
-        <w:fldChar w:fldCharType="end"/>
-      </w:r>
+      <w:fldSimple w:instr=" SEQ Figure \* ARABIC \s 1 ">
+        <w:r>
+          <w:rPr>
+            <w:noProof/>
+          </w:rPr>
+          <w:t>2</w:t>
+        </w:r>
+      </w:fldSimple>
       <w:bookmarkEnd w:id="12"/>
       <w:r>
         <w:t xml:space="preserve"> </w:t>
@@ -7541,51 +7489,25 @@
       <w:r>
         <w:t xml:space="preserve">Table </w:t>
       </w:r>
-      <w:r>
-        <w:fldChar w:fldCharType="begin"/>
-      </w:r>
-      <w:r>
-        <w:instrText xml:space="preserve"> STYLEREF 1 \s </w:instrText>
-      </w:r>
-      <w:r>
-        <w:fldChar w:fldCharType="separate"/>
-      </w:r>
-      <w:r>
-        <w:rPr>
-          <w:noProof/>
-        </w:rPr>
-        <w:t>3</w:t>
-      </w:r>
-      <w:r>
-        <w:rPr>
-          <w:noProof/>
-        </w:rPr>
-        <w:fldChar w:fldCharType="end"/>
-      </w:r>
+      <w:fldSimple w:instr=" STYLEREF 1 \s ">
+        <w:r>
+          <w:rPr>
+            <w:noProof/>
+          </w:rPr>
+          <w:t>3</w:t>
+        </w:r>
+      </w:fldSimple>
       <w:r>
         <w:noBreakHyphen/>
       </w:r>
-      <w:r>
-        <w:fldChar w:fldCharType="begin"/>
-      </w:r>
-      <w:r>
-        <w:instrText xml:space="preserve"> SEQ Table \* ARABIC \s 1 </w:instrText>
-      </w:r>
-      <w:r>
-        <w:fldChar w:fldCharType="separate"/>
-      </w:r>
-      <w:r>
-        <w:rPr>
-          <w:noProof/>
-        </w:rPr>
-        <w:t>1</w:t>
-      </w:r>
-      <w:r>
-        <w:rPr>
-          <w:noProof/>
-        </w:rPr>
-        <w:fldChar w:fldCharType="end"/>
-      </w:r>
+      <w:fldSimple w:instr=" SEQ Table \* ARABIC \s 1 ">
+        <w:r>
+          <w:rPr>
+            <w:noProof/>
+          </w:rPr>
+          <w:t>1</w:t>
+        </w:r>
+      </w:fldSimple>
       <w:r>
         <w:t xml:space="preserve"> Clock Requirements</w:t>
       </w:r>
@@ -7784,51 +7706,25 @@
       <w:r>
         <w:t xml:space="preserve">Table </w:t>
       </w:r>
-      <w:r>
-        <w:fldChar w:fldCharType="begin"/>
-      </w:r>
-      <w:r>
-        <w:instrText xml:space="preserve"> STYLEREF 1 \s </w:instrText>
-      </w:r>
-      <w:r>
-        <w:fldChar w:fldCharType="separate"/>
-      </w:r>
-      <w:r>
-        <w:rPr>
-          <w:noProof/>
-        </w:rPr>
-        <w:t>3</w:t>
-      </w:r>
-      <w:r>
-        <w:rPr>
-          <w:noProof/>
-        </w:rPr>
-        <w:fldChar w:fldCharType="end"/>
-      </w:r>
+      <w:fldSimple w:instr=" STYLEREF 1 \s ">
+        <w:r>
+          <w:rPr>
+            <w:noProof/>
+          </w:rPr>
+          <w:t>3</w:t>
+        </w:r>
+      </w:fldSimple>
       <w:r>
         <w:noBreakHyphen/>
       </w:r>
-      <w:r>
-        <w:fldChar w:fldCharType="begin"/>
-      </w:r>
-      <w:r>
-        <w:instrText xml:space="preserve"> SEQ Table \* ARABIC \s 1 </w:instrText>
-      </w:r>
-      <w:r>
-        <w:fldChar w:fldCharType="separate"/>
-      </w:r>
-      <w:r>
-        <w:rPr>
-          <w:noProof/>
-        </w:rPr>
-        <w:t>2</w:t>
-      </w:r>
-      <w:r>
-        <w:rPr>
-          <w:noProof/>
-        </w:rPr>
-        <w:fldChar w:fldCharType="end"/>
-      </w:r>
+      <w:fldSimple w:instr=" SEQ Table \* ARABIC \s 1 ">
+        <w:r>
+          <w:rPr>
+            <w:noProof/>
+          </w:rPr>
+          <w:t>2</w:t>
+        </w:r>
+      </w:fldSimple>
       <w:r>
         <w:t xml:space="preserve"> Reset Requirements</w:t>
       </w:r>
@@ -14238,51 +14134,25 @@
       <w:r>
         <w:t xml:space="preserve">Table </w:t>
       </w:r>
-      <w:r>
-        <w:fldChar w:fldCharType="begin"/>
-      </w:r>
-      <w:r>
-        <w:instrText xml:space="preserve"> STYLEREF 1 \s </w:instrText>
-      </w:r>
-      <w:r>
-        <w:fldChar w:fldCharType="separate"/>
-      </w:r>
-      <w:r>
-        <w:rPr>
-          <w:noProof/>
-        </w:rPr>
-        <w:t>3</w:t>
-      </w:r>
-      <w:r>
-        <w:rPr>
-          <w:noProof/>
-        </w:rPr>
-        <w:fldChar w:fldCharType="end"/>
-      </w:r>
+      <w:fldSimple w:instr=" STYLEREF 1 \s ">
+        <w:r>
+          <w:rPr>
+            <w:noProof/>
+          </w:rPr>
+          <w:t>3</w:t>
+        </w:r>
+      </w:fldSimple>
       <w:r>
         <w:noBreakHyphen/>
       </w:r>
-      <w:r>
-        <w:fldChar w:fldCharType="begin"/>
-      </w:r>
-      <w:r>
-        <w:instrText xml:space="preserve"> SEQ Table \* ARABIC \s 1 </w:instrText>
-      </w:r>
-      <w:r>
-        <w:fldChar w:fldCharType="separate"/>
-      </w:r>
-      <w:r>
-        <w:rPr>
-          <w:noProof/>
-        </w:rPr>
-        <w:t>3</w:t>
-      </w:r>
-      <w:r>
-        <w:rPr>
-          <w:noProof/>
-        </w:rPr>
-        <w:fldChar w:fldCharType="end"/>
-      </w:r>
+      <w:fldSimple w:instr=" SEQ Table \* ARABIC \s 1 ">
+        <w:r>
+          <w:rPr>
+            <w:noProof/>
+          </w:rPr>
+          <w:t>3</w:t>
+        </w:r>
+      </w:fldSimple>
       <w:r>
         <w:t xml:space="preserve"> I/O Interfaces</w:t>
       </w:r>
@@ -14547,51 +14417,25 @@
       <w:r>
         <w:t xml:space="preserve">Table </w:t>
       </w:r>
-      <w:r>
-        <w:fldChar w:fldCharType="begin"/>
-      </w:r>
-      <w:r>
-        <w:instrText xml:space="preserve"> STYLEREF 1 \s </w:instrText>
-      </w:r>
-      <w:r>
-        <w:fldChar w:fldCharType="separate"/>
-      </w:r>
-      <w:r>
-        <w:rPr>
-          <w:noProof/>
-        </w:rPr>
-        <w:t>3</w:t>
-      </w:r>
-      <w:r>
-        <w:rPr>
-          <w:noProof/>
-        </w:rPr>
-        <w:fldChar w:fldCharType="end"/>
-      </w:r>
+      <w:fldSimple w:instr=" STYLEREF 1 \s ">
+        <w:r>
+          <w:rPr>
+            <w:noProof/>
+          </w:rPr>
+          <w:t>3</w:t>
+        </w:r>
+      </w:fldSimple>
       <w:r>
         <w:noBreakHyphen/>
       </w:r>
-      <w:r>
-        <w:fldChar w:fldCharType="begin"/>
-      </w:r>
-      <w:r>
-        <w:instrText xml:space="preserve"> SEQ Table \* ARABIC \s 1 </w:instrText>
-      </w:r>
-      <w:r>
-        <w:fldChar w:fldCharType="separate"/>
-      </w:r>
-      <w:r>
-        <w:rPr>
-          <w:noProof/>
-        </w:rPr>
-        <w:t>4</w:t>
-      </w:r>
-      <w:r>
-        <w:rPr>
-          <w:noProof/>
-        </w:rPr>
-        <w:fldChar w:fldCharType="end"/>
-      </w:r>
+      <w:fldSimple w:instr=" SEQ Table \* ARABIC \s 1 ">
+        <w:r>
+          <w:rPr>
+            <w:noProof/>
+          </w:rPr>
+          <w:t>4</w:t>
+        </w:r>
+      </w:fldSimple>
       <w:r>
         <w:t xml:space="preserve"> Address Mapping</w:t>
       </w:r>
@@ -14708,51 +14552,25 @@
       <w:r>
         <w:t xml:space="preserve">Figure </w:t>
       </w:r>
-      <w:r>
-        <w:fldChar w:fldCharType="begin"/>
-      </w:r>
-      <w:r>
-        <w:instrText xml:space="preserve"> STYLEREF 1 \s </w:instrText>
-      </w:r>
-      <w:r>
-        <w:fldChar w:fldCharType="separate"/>
-      </w:r>
-      <w:r>
-        <w:rPr>
-          <w:noProof/>
-        </w:rPr>
-        <w:t>4</w:t>
-      </w:r>
-      <w:r>
-        <w:rPr>
-          <w:noProof/>
-        </w:rPr>
-        <w:fldChar w:fldCharType="end"/>
-      </w:r>
+      <w:fldSimple w:instr=" STYLEREF 1 \s ">
+        <w:r>
+          <w:rPr>
+            <w:noProof/>
+          </w:rPr>
+          <w:t>4</w:t>
+        </w:r>
+      </w:fldSimple>
       <w:r>
         <w:noBreakHyphen/>
       </w:r>
-      <w:r>
-        <w:fldChar w:fldCharType="begin"/>
-      </w:r>
-      <w:r>
-        <w:instrText xml:space="preserve"> SEQ Figure \* ARABIC \s 1 </w:instrText>
-      </w:r>
-      <w:r>
-        <w:fldChar w:fldCharType="separate"/>
-      </w:r>
-      <w:r>
-        <w:rPr>
-          <w:noProof/>
-        </w:rPr>
-        <w:t>1</w:t>
-      </w:r>
-      <w:r>
-        <w:rPr>
-          <w:noProof/>
-        </w:rPr>
-        <w:fldChar w:fldCharType="end"/>
-      </w:r>
+      <w:fldSimple w:instr=" SEQ Figure \* ARABIC \s 1 ">
+        <w:r>
+          <w:rPr>
+            <w:noProof/>
+          </w:rPr>
+          <w:t>1</w:t>
+        </w:r>
+      </w:fldSimple>
       <w:bookmarkEnd w:id="25"/>
       <w:r>
         <w:t xml:space="preserve"> Read Handler Diagram</w:t>
@@ -16406,51 +16224,25 @@
       <w:r>
         <w:t xml:space="preserve">Table </w:t>
       </w:r>
-      <w:r>
-        <w:fldChar w:fldCharType="begin"/>
-      </w:r>
-      <w:r>
-        <w:instrText xml:space="preserve"> STYLEREF 1 \s </w:instrText>
-      </w:r>
-      <w:r>
-        <w:fldChar w:fldCharType="separate"/>
-      </w:r>
-      <w:r>
-        <w:rPr>
-          <w:noProof/>
-        </w:rPr>
-        <w:t>4</w:t>
-      </w:r>
-      <w:r>
-        <w:rPr>
-          <w:noProof/>
-        </w:rPr>
-        <w:fldChar w:fldCharType="end"/>
-      </w:r>
+      <w:fldSimple w:instr=" STYLEREF 1 \s ">
+        <w:r>
+          <w:rPr>
+            <w:noProof/>
+          </w:rPr>
+          <w:t>4</w:t>
+        </w:r>
+      </w:fldSimple>
       <w:r>
         <w:noBreakHyphen/>
       </w:r>
-      <w:r>
-        <w:fldChar w:fldCharType="begin"/>
-      </w:r>
-      <w:r>
-        <w:instrText xml:space="preserve"> SEQ Table \* ARABIC \s 1 </w:instrText>
-      </w:r>
-      <w:r>
-        <w:fldChar w:fldCharType="separate"/>
-      </w:r>
-      <w:r>
-        <w:rPr>
-          <w:noProof/>
-        </w:rPr>
-        <w:t>1</w:t>
-      </w:r>
-      <w:r>
-        <w:rPr>
-          <w:noProof/>
-        </w:rPr>
-        <w:fldChar w:fldCharType="end"/>
-      </w:r>
+      <w:fldSimple w:instr=" SEQ Table \* ARABIC \s 1 ">
+        <w:r>
+          <w:rPr>
+            <w:noProof/>
+          </w:rPr>
+          <w:t>1</w:t>
+        </w:r>
+      </w:fldSimple>
       <w:bookmarkEnd w:id="28"/>
       <w:r>
         <w:t xml:space="preserve"> Request/Response Format of </w:t>
@@ -16718,51 +16510,25 @@
       <w:r>
         <w:t xml:space="preserve">Figure </w:t>
       </w:r>
-      <w:r>
-        <w:fldChar w:fldCharType="begin"/>
-      </w:r>
-      <w:r>
-        <w:instrText xml:space="preserve"> STYLEREF 1 \s </w:instrText>
-      </w:r>
-      <w:r>
-        <w:fldChar w:fldCharType="separate"/>
-      </w:r>
-      <w:r>
-        <w:rPr>
-          <w:noProof/>
-        </w:rPr>
-        <w:t>4</w:t>
-      </w:r>
-      <w:r>
-        <w:rPr>
-          <w:noProof/>
-        </w:rPr>
-        <w:fldChar w:fldCharType="end"/>
-      </w:r>
+      <w:fldSimple w:instr=" STYLEREF 1 \s ">
+        <w:r>
+          <w:rPr>
+            <w:noProof/>
+          </w:rPr>
+          <w:t>4</w:t>
+        </w:r>
+      </w:fldSimple>
       <w:r>
         <w:noBreakHyphen/>
       </w:r>
-      <w:r>
-        <w:fldChar w:fldCharType="begin"/>
-      </w:r>
-      <w:r>
-        <w:instrText xml:space="preserve"> SEQ Figure \* ARABIC \s 1 </w:instrText>
-      </w:r>
-      <w:r>
-        <w:fldChar w:fldCharType="separate"/>
-      </w:r>
-      <w:r>
-        <w:rPr>
-          <w:noProof/>
-        </w:rPr>
-        <w:t>2</w:t>
-      </w:r>
-      <w:r>
-        <w:rPr>
-          <w:noProof/>
-        </w:rPr>
-        <w:fldChar w:fldCharType="end"/>
-      </w:r>
+      <w:fldSimple w:instr=" SEQ Figure \* ARABIC \s 1 ">
+        <w:r>
+          <w:rPr>
+            <w:noProof/>
+          </w:rPr>
+          <w:t>2</w:t>
+        </w:r>
+      </w:fldSimple>
       <w:bookmarkEnd w:id="31"/>
       <w:r>
         <w:t xml:space="preserve"> Write Handler Diagram</w:t>
@@ -17371,13 +17137,7 @@
         <w:rPr>
           <w:rFonts w:eastAsiaTheme="minorEastAsia"/>
         </w:rPr>
-        <w:t>==0</w:t>
-      </w:r>
-      <w:r>
-        <w:rPr>
-          <w:rFonts w:eastAsiaTheme="minorEastAsia"/>
-        </w:rPr>
-        <w:t xml:space="preserve"> &amp;&amp; </w:t>
+        <w:t xml:space="preserve">==0 &amp;&amp; </w:t>
       </w:r>
       <w:r>
         <w:rPr>
@@ -17512,51 +17272,25 @@
       <w:r>
         <w:t xml:space="preserve">Figure </w:t>
       </w:r>
-      <w:r>
-        <w:fldChar w:fldCharType="begin"/>
-      </w:r>
-      <w:r>
-        <w:instrText xml:space="preserve"> STYLEREF 1 \s </w:instrText>
-      </w:r>
-      <w:r>
-        <w:fldChar w:fldCharType="separate"/>
-      </w:r>
-      <w:r>
-        <w:rPr>
-          <w:noProof/>
-        </w:rPr>
-        <w:t>4</w:t>
-      </w:r>
-      <w:r>
-        <w:rPr>
-          <w:noProof/>
-        </w:rPr>
-        <w:fldChar w:fldCharType="end"/>
-      </w:r>
+      <w:fldSimple w:instr=" STYLEREF 1 \s ">
+        <w:r>
+          <w:rPr>
+            <w:noProof/>
+          </w:rPr>
+          <w:t>4</w:t>
+        </w:r>
+      </w:fldSimple>
       <w:r>
         <w:noBreakHyphen/>
       </w:r>
-      <w:r>
-        <w:fldChar w:fldCharType="begin"/>
-      </w:r>
-      <w:r>
-        <w:instrText xml:space="preserve"> SEQ Figure \* ARABIC \s 1 </w:instrText>
-      </w:r>
-      <w:r>
-        <w:fldChar w:fldCharType="separate"/>
-      </w:r>
-      <w:r>
-        <w:rPr>
-          <w:noProof/>
-        </w:rPr>
-        <w:t>3</w:t>
-      </w:r>
-      <w:r>
-        <w:rPr>
-          <w:noProof/>
-        </w:rPr>
-        <w:fldChar w:fldCharType="end"/>
-      </w:r>
+      <w:fldSimple w:instr=" SEQ Figure \* ARABIC \s 1 ">
+        <w:r>
+          <w:rPr>
+            <w:noProof/>
+          </w:rPr>
+          <w:t>3</w:t>
+        </w:r>
+      </w:fldSimple>
       <w:bookmarkEnd w:id="36"/>
       <w:r>
         <w:t xml:space="preserve"> ECC Module Diagram</w:t>
@@ -17971,51 +17705,25 @@
       <w:r>
         <w:t xml:space="preserve">Figure </w:t>
       </w:r>
-      <w:r>
-        <w:fldChar w:fldCharType="begin"/>
-      </w:r>
-      <w:r>
-        <w:instrText xml:space="preserve"> STYLEREF 1 \s </w:instrText>
-      </w:r>
-      <w:r>
-        <w:fldChar w:fldCharType="separate"/>
-      </w:r>
-      <w:r>
-        <w:rPr>
-          <w:noProof/>
-        </w:rPr>
-        <w:t>5</w:t>
-      </w:r>
-      <w:r>
-        <w:rPr>
-          <w:noProof/>
-        </w:rPr>
-        <w:fldChar w:fldCharType="end"/>
-      </w:r>
+      <w:fldSimple w:instr=" STYLEREF 1 \s ">
+        <w:r>
+          <w:rPr>
+            <w:noProof/>
+          </w:rPr>
+          <w:t>5</w:t>
+        </w:r>
+      </w:fldSimple>
       <w:r>
         <w:noBreakHyphen/>
       </w:r>
-      <w:r>
-        <w:fldChar w:fldCharType="begin"/>
-      </w:r>
-      <w:r>
-        <w:instrText xml:space="preserve"> SEQ Figure \* ARABIC \s 1 </w:instrText>
-      </w:r>
-      <w:r>
-        <w:fldChar w:fldCharType="separate"/>
-      </w:r>
-      <w:r>
-        <w:rPr>
-          <w:noProof/>
-        </w:rPr>
-        <w:t>1</w:t>
-      </w:r>
-      <w:r>
-        <w:rPr>
-          <w:noProof/>
-        </w:rPr>
-        <w:fldChar w:fldCharType="end"/>
-      </w:r>
+      <w:fldSimple w:instr=" SEQ Figure \* ARABIC \s 1 ">
+        <w:r>
+          <w:rPr>
+            <w:noProof/>
+          </w:rPr>
+          <w:t>1</w:t>
+        </w:r>
+      </w:fldSimple>
       <w:r>
         <w:t xml:space="preserve"> Data Path </w:t>
       </w:r>
@@ -18247,51 +17955,25 @@
       <w:r>
         <w:t xml:space="preserve">Figure </w:t>
       </w:r>
-      <w:r>
-        <w:fldChar w:fldCharType="begin"/>
-      </w:r>
-      <w:r>
-        <w:instrText xml:space="preserve"> STYLEREF 1 \s </w:instrText>
-      </w:r>
-      <w:r>
-        <w:fldChar w:fldCharType="separate"/>
-      </w:r>
-      <w:r>
-        <w:rPr>
-          <w:noProof/>
-        </w:rPr>
-        <w:t>5</w:t>
-      </w:r>
-      <w:r>
-        <w:rPr>
-          <w:noProof/>
-        </w:rPr>
-        <w:fldChar w:fldCharType="end"/>
-      </w:r>
+      <w:fldSimple w:instr=" STYLEREF 1 \s ">
+        <w:r>
+          <w:rPr>
+            <w:noProof/>
+          </w:rPr>
+          <w:t>5</w:t>
+        </w:r>
+      </w:fldSimple>
       <w:r>
         <w:noBreakHyphen/>
       </w:r>
-      <w:r>
-        <w:fldChar w:fldCharType="begin"/>
-      </w:r>
-      <w:r>
-        <w:instrText xml:space="preserve"> SEQ Figure \* ARABIC \s 1 </w:instrText>
-      </w:r>
-      <w:r>
-        <w:fldChar w:fldCharType="separate"/>
-      </w:r>
-      <w:r>
-        <w:rPr>
-          <w:noProof/>
-        </w:rPr>
-        <w:t>2</w:t>
-      </w:r>
-      <w:r>
-        <w:rPr>
-          <w:noProof/>
-        </w:rPr>
-        <w:fldChar w:fldCharType="end"/>
-      </w:r>
+      <w:fldSimple w:instr=" SEQ Figure \* ARABIC \s 1 ">
+        <w:r>
+          <w:rPr>
+            <w:noProof/>
+          </w:rPr>
+          <w:t>2</w:t>
+        </w:r>
+      </w:fldSimple>
       <w:r>
         <w:t xml:space="preserve"> Data Path </w:t>
       </w:r>
@@ -19045,51 +18727,25 @@
       <w:r>
         <w:t xml:space="preserve">Table </w:t>
       </w:r>
-      <w:r>
-        <w:fldChar w:fldCharType="begin"/>
-      </w:r>
-      <w:r>
-        <w:instrText xml:space="preserve"> STYLEREF 1 \s </w:instrText>
-      </w:r>
-      <w:r>
-        <w:fldChar w:fldCharType="separate"/>
-      </w:r>
-      <w:r>
-        <w:rPr>
-          <w:noProof/>
-        </w:rPr>
-        <w:t>6</w:t>
-      </w:r>
-      <w:r>
-        <w:rPr>
-          <w:noProof/>
-        </w:rPr>
-        <w:fldChar w:fldCharType="end"/>
-      </w:r>
+      <w:fldSimple w:instr=" STYLEREF 1 \s ">
+        <w:r>
+          <w:rPr>
+            <w:noProof/>
+          </w:rPr>
+          <w:t>6</w:t>
+        </w:r>
+      </w:fldSimple>
       <w:r>
         <w:noBreakHyphen/>
       </w:r>
-      <w:r>
-        <w:fldChar w:fldCharType="begin"/>
-      </w:r>
-      <w:r>
-        <w:instrText xml:space="preserve"> SEQ Table \* ARABIC \s 1 </w:instrText>
-      </w:r>
-      <w:r>
-        <w:fldChar w:fldCharType="separate"/>
-      </w:r>
-      <w:r>
-        <w:rPr>
-          <w:noProof/>
-        </w:rPr>
-        <w:t>1</w:t>
-      </w:r>
-      <w:r>
-        <w:rPr>
-          <w:noProof/>
-        </w:rPr>
-        <w:fldChar w:fldCharType="end"/>
-      </w:r>
+      <w:fldSimple w:instr=" SEQ Table \* ARABIC \s 1 ">
+        <w:r>
+          <w:rPr>
+            <w:noProof/>
+          </w:rPr>
+          <w:t>1</w:t>
+        </w:r>
+      </w:fldSimple>
       <w:r>
         <w:t xml:space="preserve"> Parameter List</w:t>
       </w:r>
@@ -19290,51 +18946,25 @@
       <w:r>
         <w:t xml:space="preserve">Table </w:t>
       </w:r>
-      <w:r>
-        <w:fldChar w:fldCharType="begin"/>
-      </w:r>
-      <w:r>
-        <w:instrText xml:space="preserve"> STYLEREF 1 \s </w:instrText>
-      </w:r>
-      <w:r>
-        <w:fldChar w:fldCharType="separate"/>
-      </w:r>
-      <w:r>
-        <w:rPr>
-          <w:noProof/>
-        </w:rPr>
-        <w:t>6</w:t>
-      </w:r>
-      <w:r>
-        <w:rPr>
-          <w:noProof/>
-        </w:rPr>
-        <w:fldChar w:fldCharType="end"/>
-      </w:r>
+      <w:fldSimple w:instr=" STYLEREF 1 \s ">
+        <w:r>
+          <w:rPr>
+            <w:noProof/>
+          </w:rPr>
+          <w:t>6</w:t>
+        </w:r>
+      </w:fldSimple>
       <w:r>
         <w:noBreakHyphen/>
       </w:r>
-      <w:r>
-        <w:fldChar w:fldCharType="begin"/>
-      </w:r>
-      <w:r>
-        <w:instrText xml:space="preserve"> SEQ Table \* ARABIC \s 1 </w:instrText>
-      </w:r>
-      <w:r>
-        <w:fldChar w:fldCharType="separate"/>
-      </w:r>
-      <w:r>
-        <w:rPr>
-          <w:noProof/>
-        </w:rPr>
-        <w:t>2</w:t>
-      </w:r>
-      <w:r>
-        <w:rPr>
-          <w:noProof/>
-        </w:rPr>
-        <w:fldChar w:fldCharType="end"/>
-      </w:r>
+      <w:fldSimple w:instr=" SEQ Table \* ARABIC \s 1 ">
+        <w:r>
+          <w:rPr>
+            <w:noProof/>
+          </w:rPr>
+          <w:t>2</w:t>
+        </w:r>
+      </w:fldSimple>
       <w:r>
         <w:t xml:space="preserve"> Macro List</w:t>
       </w:r>
@@ -19671,51 +19301,25 @@
       <w:r>
         <w:t xml:space="preserve">Table </w:t>
       </w:r>
-      <w:r>
-        <w:fldChar w:fldCharType="begin"/>
-      </w:r>
-      <w:r>
-        <w:instrText xml:space="preserve"> STYLEREF 1 \s </w:instrText>
-      </w:r>
-      <w:r>
-        <w:fldChar w:fldCharType="separate"/>
-      </w:r>
-      <w:r>
-        <w:rPr>
-          <w:noProof/>
-        </w:rPr>
-        <w:t>6</w:t>
-      </w:r>
-      <w:r>
-        <w:rPr>
-          <w:noProof/>
-        </w:rPr>
-        <w:fldChar w:fldCharType="end"/>
-      </w:r>
+      <w:fldSimple w:instr=" STYLEREF 1 \s ">
+        <w:r>
+          <w:rPr>
+            <w:noProof/>
+          </w:rPr>
+          <w:t>6</w:t>
+        </w:r>
+      </w:fldSimple>
       <w:r>
         <w:noBreakHyphen/>
       </w:r>
-      <w:r>
-        <w:fldChar w:fldCharType="begin"/>
-      </w:r>
-      <w:r>
-        <w:instrText xml:space="preserve"> SEQ Table \* ARABIC \s 1 </w:instrText>
-      </w:r>
-      <w:r>
-        <w:fldChar w:fldCharType="separate"/>
-      </w:r>
-      <w:r>
-        <w:rPr>
-          <w:noProof/>
-        </w:rPr>
-        <w:t>3</w:t>
-      </w:r>
-      <w:r>
-        <w:rPr>
-          <w:noProof/>
-        </w:rPr>
-        <w:fldChar w:fldCharType="end"/>
-      </w:r>
+      <w:fldSimple w:instr=" SEQ Table \* ARABIC \s 1 ">
+        <w:r>
+          <w:rPr>
+            <w:noProof/>
+          </w:rPr>
+          <w:t>3</w:t>
+        </w:r>
+      </w:fldSimple>
       <w:r>
         <w:t xml:space="preserve"> Memory Requirements Table</w:t>
       </w:r>
@@ -19963,51 +19567,25 @@
       <w:r>
         <w:t xml:space="preserve">Table </w:t>
       </w:r>
-      <w:r>
-        <w:fldChar w:fldCharType="begin"/>
-      </w:r>
-      <w:r>
-        <w:instrText xml:space="preserve"> STYLEREF 1 \s </w:instrText>
-      </w:r>
-      <w:r>
-        <w:fldChar w:fldCharType="separate"/>
-      </w:r>
-      <w:r>
-        <w:rPr>
-          <w:noProof/>
-        </w:rPr>
-        <w:t>7</w:t>
-      </w:r>
-      <w:r>
-        <w:rPr>
-          <w:noProof/>
-        </w:rPr>
-        <w:fldChar w:fldCharType="end"/>
-      </w:r>
+      <w:fldSimple w:instr=" STYLEREF 1 \s ">
+        <w:r>
+          <w:rPr>
+            <w:noProof/>
+          </w:rPr>
+          <w:t>7</w:t>
+        </w:r>
+      </w:fldSimple>
       <w:r>
         <w:noBreakHyphen/>
       </w:r>
-      <w:r>
-        <w:fldChar w:fldCharType="begin"/>
-      </w:r>
-      <w:r>
-        <w:instrText xml:space="preserve"> SEQ Table \* ARABIC \s 1 </w:instrText>
-      </w:r>
-      <w:r>
-        <w:fldChar w:fldCharType="separate"/>
-      </w:r>
-      <w:r>
-        <w:rPr>
-          <w:noProof/>
-        </w:rPr>
-        <w:t>1</w:t>
-      </w:r>
-      <w:r>
-        <w:rPr>
-          <w:noProof/>
-        </w:rPr>
-        <w:fldChar w:fldCharType="end"/>
-      </w:r>
+      <w:fldSimple w:instr=" SEQ Table \* ARABIC \s 1 ">
+        <w:r>
+          <w:rPr>
+            <w:noProof/>
+          </w:rPr>
+          <w:t>1</w:t>
+        </w:r>
+      </w:fldSimple>
       <w:r>
         <w:t xml:space="preserve"> Power State Table</w:t>
       </w:r>
@@ -20187,51 +19765,25 @@
       <w:r>
         <w:t xml:space="preserve">Table </w:t>
       </w:r>
-      <w:r>
-        <w:fldChar w:fldCharType="begin"/>
-      </w:r>
-      <w:r>
-        <w:instrText xml:space="preserve"> STYLEREF 1 \s </w:instrText>
-      </w:r>
-      <w:r>
-        <w:fldChar w:fldCharType="separate"/>
-      </w:r>
-      <w:r>
-        <w:rPr>
-          <w:noProof/>
-        </w:rPr>
-        <w:t>7</w:t>
-      </w:r>
-      <w:r>
-        <w:rPr>
-          <w:noProof/>
-        </w:rPr>
-        <w:fldChar w:fldCharType="end"/>
-      </w:r>
+      <w:fldSimple w:instr=" STYLEREF 1 \s ">
+        <w:r>
+          <w:rPr>
+            <w:noProof/>
+          </w:rPr>
+          <w:t>7</w:t>
+        </w:r>
+      </w:fldSimple>
       <w:r>
         <w:noBreakHyphen/>
       </w:r>
-      <w:r>
-        <w:fldChar w:fldCharType="begin"/>
-      </w:r>
-      <w:r>
-        <w:instrText xml:space="preserve"> SEQ Table \* ARABIC \s 1 </w:instrText>
-      </w:r>
-      <w:r>
-        <w:fldChar w:fldCharType="separate"/>
-      </w:r>
-      <w:r>
-        <w:rPr>
-          <w:noProof/>
-        </w:rPr>
-        <w:t>2</w:t>
-      </w:r>
-      <w:r>
-        <w:rPr>
-          <w:noProof/>
-        </w:rPr>
-        <w:fldChar w:fldCharType="end"/>
-      </w:r>
+      <w:fldSimple w:instr=" SEQ Table \* ARABIC \s 1 ">
+        <w:r>
+          <w:rPr>
+            <w:noProof/>
+          </w:rPr>
+          <w:t>2</w:t>
+        </w:r>
+      </w:fldSimple>
       <w:r>
         <w:t xml:space="preserve"> Power Consumption Table</w:t>
       </w:r>
@@ -20689,51 +20241,25 @@
       <w:r>
         <w:t xml:space="preserve">Table </w:t>
       </w:r>
-      <w:r>
-        <w:fldChar w:fldCharType="begin"/>
-      </w:r>
-      <w:r>
-        <w:instrText xml:space="preserve"> STYLEREF 1 \s </w:instrText>
-      </w:r>
-      <w:r>
-        <w:fldChar w:fldCharType="separate"/>
-      </w:r>
-      <w:r>
-        <w:rPr>
-          <w:noProof/>
-        </w:rPr>
-        <w:t>7</w:t>
-      </w:r>
-      <w:r>
-        <w:rPr>
-          <w:noProof/>
-        </w:rPr>
-        <w:fldChar w:fldCharType="end"/>
-      </w:r>
+      <w:fldSimple w:instr=" STYLEREF 1 \s ">
+        <w:r>
+          <w:rPr>
+            <w:noProof/>
+          </w:rPr>
+          <w:t>7</w:t>
+        </w:r>
+      </w:fldSimple>
       <w:r>
         <w:noBreakHyphen/>
       </w:r>
-      <w:r>
-        <w:fldChar w:fldCharType="begin"/>
-      </w:r>
-      <w:r>
-        <w:instrText xml:space="preserve"> SEQ Table \* ARABIC \s 1 </w:instrText>
-      </w:r>
-      <w:r>
-        <w:fldChar w:fldCharType="separate"/>
-      </w:r>
-      <w:r>
-        <w:rPr>
-          <w:noProof/>
-        </w:rPr>
-        <w:t>3</w:t>
-      </w:r>
-      <w:r>
-        <w:rPr>
-          <w:noProof/>
-        </w:rPr>
-        <w:fldChar w:fldCharType="end"/>
-      </w:r>
+      <w:fldSimple w:instr=" SEQ Table \* ARABIC \s 1 ">
+        <w:r>
+          <w:rPr>
+            <w:noProof/>
+          </w:rPr>
+          <w:t>3</w:t>
+        </w:r>
+      </w:fldSimple>
       <w:r>
         <w:t xml:space="preserve"> Area Information</w:t>
       </w:r>
@@ -20858,51 +20384,25 @@
       <w:r>
         <w:t xml:space="preserve">Table </w:t>
       </w:r>
-      <w:r>
-        <w:fldChar w:fldCharType="begin"/>
-      </w:r>
-      <w:r>
-        <w:instrText xml:space="preserve"> STYLEREF 1 \s </w:instrText>
-      </w:r>
-      <w:r>
-        <w:fldChar w:fldCharType="separate"/>
-      </w:r>
-      <w:r>
-        <w:rPr>
-          <w:noProof/>
-        </w:rPr>
-        <w:t>7</w:t>
-      </w:r>
-      <w:r>
-        <w:rPr>
-          <w:noProof/>
-        </w:rPr>
-        <w:fldChar w:fldCharType="end"/>
-      </w:r>
+      <w:fldSimple w:instr=" STYLEREF 1 \s ">
+        <w:r>
+          <w:rPr>
+            <w:noProof/>
+          </w:rPr>
+          <w:t>7</w:t>
+        </w:r>
+      </w:fldSimple>
       <w:r>
         <w:noBreakHyphen/>
       </w:r>
-      <w:r>
-        <w:fldChar w:fldCharType="begin"/>
-      </w:r>
-      <w:r>
-        <w:instrText xml:space="preserve"> SEQ Table \* ARABIC \s 1 </w:instrText>
-      </w:r>
-      <w:r>
-        <w:fldChar w:fldCharType="separate"/>
-      </w:r>
-      <w:r>
-        <w:rPr>
-          <w:noProof/>
-        </w:rPr>
-        <w:t>4</w:t>
-      </w:r>
-      <w:r>
-        <w:rPr>
-          <w:noProof/>
-        </w:rPr>
-        <w:fldChar w:fldCharType="end"/>
-      </w:r>
+      <w:fldSimple w:instr=" SEQ Table \* ARABIC \s 1 ">
+        <w:r>
+          <w:rPr>
+            <w:noProof/>
+          </w:rPr>
+          <w:t>4</w:t>
+        </w:r>
+      </w:fldSimple>
       <w:r>
         <w:t xml:space="preserve"> VT Cell Number</w:t>
       </w:r>
@@ -21223,51 +20723,25 @@
       <w:r>
         <w:t xml:space="preserve">Figure </w:t>
       </w:r>
-      <w:r>
-        <w:fldChar w:fldCharType="begin"/>
-      </w:r>
-      <w:r>
-        <w:instrText xml:space="preserve"> STYLEREF 1 \s </w:instrText>
-      </w:r>
-      <w:r>
-        <w:fldChar w:fldCharType="separate"/>
-      </w:r>
-      <w:r>
-        <w:rPr>
-          <w:noProof/>
-        </w:rPr>
-        <w:t>11</w:t>
-      </w:r>
-      <w:r>
-        <w:rPr>
-          <w:noProof/>
-        </w:rPr>
-        <w:fldChar w:fldCharType="end"/>
-      </w:r>
+      <w:fldSimple w:instr=" STYLEREF 1 \s ">
+        <w:r>
+          <w:rPr>
+            <w:noProof/>
+          </w:rPr>
+          <w:t>11</w:t>
+        </w:r>
+      </w:fldSimple>
       <w:r>
         <w:noBreakHyphen/>
       </w:r>
-      <w:r>
-        <w:fldChar w:fldCharType="begin"/>
-      </w:r>
-      <w:r>
-        <w:instrText xml:space="preserve"> SEQ Figure \* ARABIC \s 1 </w:instrText>
-      </w:r>
-      <w:r>
-        <w:fldChar w:fldCharType="separate"/>
-      </w:r>
-      <w:r>
-        <w:rPr>
-          <w:noProof/>
-        </w:rPr>
-        <w:t>1</w:t>
-      </w:r>
-      <w:r>
-        <w:rPr>
-          <w:noProof/>
-        </w:rPr>
-        <w:fldChar w:fldCharType="end"/>
-      </w:r>
+      <w:fldSimple w:instr=" SEQ Figure \* ARABIC \s 1 ">
+        <w:r>
+          <w:rPr>
+            <w:noProof/>
+          </w:rPr>
+          <w:t>1</w:t>
+        </w:r>
+      </w:fldSimple>
       <w:bookmarkEnd w:id="66"/>
       <w:r>
         <w:t xml:space="preserve"> Memory Wrapper Diagram</w:t>
@@ -21486,7 +20960,19 @@
         <w:rPr>
           <w:rFonts w:eastAsiaTheme="minorEastAsia"/>
         </w:rPr>
-        <w:t>reaches N+1, the input ready is unassert</w:t>
+        <w:t>reaches N+</w:t>
+      </w:r>
+      <w:r>
+        <w:rPr>
+          <w:rFonts w:eastAsiaTheme="minorEastAsia"/>
+        </w:rPr>
+        <w:t>2</w:t>
+      </w:r>
+      <w:r>
+        <w:rPr>
+          <w:rFonts w:eastAsiaTheme="minorEastAsia"/>
+        </w:rPr>
+        <w:t>, the input ready is unassert</w:t>
       </w:r>
       <w:r>
         <w:rPr>

</xml_diff>

<commit_message>
updated rtl core 230921
</commit_message>
<xml_diff>
--- a/axi_mem_controller/Project_GR001_IP_AXI_SRAMC_HDD.docx
+++ b/axi_mem_controller/Project_GR001_IP_AXI_SRAMC_HDD.docx
@@ -6856,25 +6856,51 @@
       <w:r>
         <w:t xml:space="preserve">Figure </w:t>
       </w:r>
-      <w:fldSimple w:instr=" STYLEREF 1 \s ">
-        <w:r>
-          <w:rPr>
-            <w:noProof/>
-          </w:rPr>
-          <w:t>3</w:t>
-        </w:r>
-      </w:fldSimple>
+      <w:r>
+        <w:fldChar w:fldCharType="begin"/>
+      </w:r>
+      <w:r>
+        <w:instrText xml:space="preserve"> STYLEREF 1 \s </w:instrText>
+      </w:r>
+      <w:r>
+        <w:fldChar w:fldCharType="separate"/>
+      </w:r>
+      <w:r>
+        <w:rPr>
+          <w:noProof/>
+        </w:rPr>
+        <w:t>3</w:t>
+      </w:r>
+      <w:r>
+        <w:rPr>
+          <w:noProof/>
+        </w:rPr>
+        <w:fldChar w:fldCharType="end"/>
+      </w:r>
       <w:r>
         <w:noBreakHyphen/>
       </w:r>
-      <w:fldSimple w:instr=" SEQ Figure \* ARABIC \s 1 ">
-        <w:r>
-          <w:rPr>
-            <w:noProof/>
-          </w:rPr>
-          <w:t>1</w:t>
-        </w:r>
-      </w:fldSimple>
+      <w:r>
+        <w:fldChar w:fldCharType="begin"/>
+      </w:r>
+      <w:r>
+        <w:instrText xml:space="preserve"> SEQ Figure \* ARABIC \s 1 </w:instrText>
+      </w:r>
+      <w:r>
+        <w:fldChar w:fldCharType="separate"/>
+      </w:r>
+      <w:r>
+        <w:rPr>
+          <w:noProof/>
+        </w:rPr>
+        <w:t>1</w:t>
+      </w:r>
+      <w:r>
+        <w:rPr>
+          <w:noProof/>
+        </w:rPr>
+        <w:fldChar w:fldCharType="end"/>
+      </w:r>
       <w:bookmarkEnd w:id="8"/>
       <w:r>
         <w:t xml:space="preserve"> </w:t>
@@ -7470,25 +7496,51 @@
       <w:r>
         <w:t xml:space="preserve">Figure </w:t>
       </w:r>
-      <w:fldSimple w:instr=" STYLEREF 1 \s ">
-        <w:r>
-          <w:rPr>
-            <w:noProof/>
-          </w:rPr>
-          <w:t>3</w:t>
-        </w:r>
-      </w:fldSimple>
+      <w:r>
+        <w:fldChar w:fldCharType="begin"/>
+      </w:r>
+      <w:r>
+        <w:instrText xml:space="preserve"> STYLEREF 1 \s </w:instrText>
+      </w:r>
+      <w:r>
+        <w:fldChar w:fldCharType="separate"/>
+      </w:r>
+      <w:r>
+        <w:rPr>
+          <w:noProof/>
+        </w:rPr>
+        <w:t>3</w:t>
+      </w:r>
+      <w:r>
+        <w:rPr>
+          <w:noProof/>
+        </w:rPr>
+        <w:fldChar w:fldCharType="end"/>
+      </w:r>
       <w:r>
         <w:noBreakHyphen/>
       </w:r>
-      <w:fldSimple w:instr=" SEQ Figure \* ARABIC \s 1 ">
-        <w:r>
-          <w:rPr>
-            <w:noProof/>
-          </w:rPr>
-          <w:t>2</w:t>
-        </w:r>
-      </w:fldSimple>
+      <w:r>
+        <w:fldChar w:fldCharType="begin"/>
+      </w:r>
+      <w:r>
+        <w:instrText xml:space="preserve"> SEQ Figure \* ARABIC \s 1 </w:instrText>
+      </w:r>
+      <w:r>
+        <w:fldChar w:fldCharType="separate"/>
+      </w:r>
+      <w:r>
+        <w:rPr>
+          <w:noProof/>
+        </w:rPr>
+        <w:t>2</w:t>
+      </w:r>
+      <w:r>
+        <w:rPr>
+          <w:noProof/>
+        </w:rPr>
+        <w:fldChar w:fldCharType="end"/>
+      </w:r>
       <w:bookmarkEnd w:id="12"/>
       <w:r>
         <w:t xml:space="preserve"> </w:t>
@@ -8069,25 +8121,51 @@
       <w:r>
         <w:t xml:space="preserve">Table </w:t>
       </w:r>
-      <w:fldSimple w:instr=" STYLEREF 1 \s ">
-        <w:r>
-          <w:rPr>
-            <w:noProof/>
-          </w:rPr>
-          <w:t>3</w:t>
-        </w:r>
-      </w:fldSimple>
+      <w:r>
+        <w:fldChar w:fldCharType="begin"/>
+      </w:r>
+      <w:r>
+        <w:instrText xml:space="preserve"> STYLEREF 1 \s </w:instrText>
+      </w:r>
+      <w:r>
+        <w:fldChar w:fldCharType="separate"/>
+      </w:r>
+      <w:r>
+        <w:rPr>
+          <w:noProof/>
+        </w:rPr>
+        <w:t>3</w:t>
+      </w:r>
+      <w:r>
+        <w:rPr>
+          <w:noProof/>
+        </w:rPr>
+        <w:fldChar w:fldCharType="end"/>
+      </w:r>
       <w:r>
         <w:noBreakHyphen/>
       </w:r>
-      <w:fldSimple w:instr=" SEQ Table \* ARABIC \s 1 ">
-        <w:r>
-          <w:rPr>
-            <w:noProof/>
-          </w:rPr>
-          <w:t>1</w:t>
-        </w:r>
-      </w:fldSimple>
+      <w:r>
+        <w:fldChar w:fldCharType="begin"/>
+      </w:r>
+      <w:r>
+        <w:instrText xml:space="preserve"> SEQ Table \* ARABIC \s 1 </w:instrText>
+      </w:r>
+      <w:r>
+        <w:fldChar w:fldCharType="separate"/>
+      </w:r>
+      <w:r>
+        <w:rPr>
+          <w:noProof/>
+        </w:rPr>
+        <w:t>1</w:t>
+      </w:r>
+      <w:r>
+        <w:rPr>
+          <w:noProof/>
+        </w:rPr>
+        <w:fldChar w:fldCharType="end"/>
+      </w:r>
       <w:r>
         <w:t xml:space="preserve"> Clock Requirements</w:t>
       </w:r>
@@ -8286,25 +8364,51 @@
       <w:r>
         <w:t xml:space="preserve">Table </w:t>
       </w:r>
-      <w:fldSimple w:instr=" STYLEREF 1 \s ">
-        <w:r>
-          <w:rPr>
-            <w:noProof/>
-          </w:rPr>
-          <w:t>3</w:t>
-        </w:r>
-      </w:fldSimple>
+      <w:r>
+        <w:fldChar w:fldCharType="begin"/>
+      </w:r>
+      <w:r>
+        <w:instrText xml:space="preserve"> STYLEREF 1 \s </w:instrText>
+      </w:r>
+      <w:r>
+        <w:fldChar w:fldCharType="separate"/>
+      </w:r>
+      <w:r>
+        <w:rPr>
+          <w:noProof/>
+        </w:rPr>
+        <w:t>3</w:t>
+      </w:r>
+      <w:r>
+        <w:rPr>
+          <w:noProof/>
+        </w:rPr>
+        <w:fldChar w:fldCharType="end"/>
+      </w:r>
       <w:r>
         <w:noBreakHyphen/>
       </w:r>
-      <w:fldSimple w:instr=" SEQ Table \* ARABIC \s 1 ">
-        <w:r>
-          <w:rPr>
-            <w:noProof/>
-          </w:rPr>
-          <w:t>2</w:t>
-        </w:r>
-      </w:fldSimple>
+      <w:r>
+        <w:fldChar w:fldCharType="begin"/>
+      </w:r>
+      <w:r>
+        <w:instrText xml:space="preserve"> SEQ Table \* ARABIC \s 1 </w:instrText>
+      </w:r>
+      <w:r>
+        <w:fldChar w:fldCharType="separate"/>
+      </w:r>
+      <w:r>
+        <w:rPr>
+          <w:noProof/>
+        </w:rPr>
+        <w:t>2</w:t>
+      </w:r>
+      <w:r>
+        <w:rPr>
+          <w:noProof/>
+        </w:rPr>
+        <w:fldChar w:fldCharType="end"/>
+      </w:r>
       <w:r>
         <w:t xml:space="preserve"> Reset Requirements</w:t>
       </w:r>
@@ -12546,19 +12650,7 @@
               <w:rPr>
                 <w:rFonts w:eastAsiaTheme="minorEastAsia"/>
               </w:rPr>
-              <w:t>i</w:t>
-            </w:r>
-            <w:r>
-              <w:rPr>
-                <w:rFonts w:eastAsiaTheme="minorEastAsia"/>
-              </w:rPr>
-              <w:t>_</w:t>
-            </w:r>
-            <w:r>
-              <w:rPr>
-                <w:rFonts w:eastAsiaTheme="minorEastAsia"/>
-              </w:rPr>
-              <w:t>addr</w:t>
+              <w:t>i_addr</w:t>
             </w:r>
           </w:p>
         </w:tc>
@@ -12570,20 +12662,20 @@
           <w:p>
             <w:pPr>
               <w:jc w:val="center"/>
+              <w:rPr>
+                <w:rFonts w:ascii="Arial" w:eastAsiaTheme="minorEastAsia" w:hAnsi="Arial" w:cs="Arial"/>
+                <w:kern w:val="0"/>
+                <w:sz w:val="20"/>
+                <w:szCs w:val="20"/>
+              </w:rPr>
+            </w:pPr>
+            <w:r>
               <w:rPr>
                 <w:rFonts w:ascii="Arial" w:eastAsiaTheme="minorEastAsia" w:hAnsi="Arial" w:cs="Arial" w:hint="eastAsia"/>
                 <w:kern w:val="0"/>
                 <w:sz w:val="20"/>
                 <w:szCs w:val="20"/>
               </w:rPr>
-            </w:pPr>
-            <w:r>
-              <w:rPr>
-                <w:rFonts w:ascii="Arial" w:eastAsiaTheme="minorEastAsia" w:hAnsi="Arial" w:cs="Arial" w:hint="eastAsia"/>
-                <w:kern w:val="0"/>
-                <w:sz w:val="20"/>
-                <w:szCs w:val="20"/>
-              </w:rPr>
               <w:t>3</w:t>
             </w:r>
             <w:r>
@@ -12606,38 +12698,32 @@
             <w:pPr>
               <w:jc w:val="center"/>
               <w:rPr>
+                <w:rFonts w:eastAsiaTheme="minorEastAsia"/>
+              </w:rPr>
+            </w:pPr>
+            <w:r>
+              <w:rPr>
                 <w:rFonts w:eastAsiaTheme="minorEastAsia" w:hint="eastAsia"/>
               </w:rPr>
+              <w:t>O</w:t>
+            </w:r>
+          </w:p>
+        </w:tc>
+        <w:tc>
+          <w:tcPr>
+            <w:tcW w:w="2334" w:type="dxa"/>
+          </w:tcPr>
+          <w:p>
+            <w:pPr>
+              <w:rPr>
+                <w:rFonts w:eastAsiaTheme="minorEastAsia"/>
+              </w:rPr>
             </w:pPr>
             <w:r>
               <w:rPr>
-                <w:rFonts w:eastAsiaTheme="minorEastAsia" w:hint="eastAsia"/>
-              </w:rPr>
-              <w:t>O</w:t>
-            </w:r>
-          </w:p>
-        </w:tc>
-        <w:tc>
-          <w:tcPr>
-            <w:tcW w:w="2334" w:type="dxa"/>
-          </w:tcPr>
-          <w:p>
-            <w:pPr>
-              <w:rPr>
-                <w:rFonts w:eastAsiaTheme="minorEastAsia"/>
-              </w:rPr>
-            </w:pPr>
-            <w:r>
-              <w:rPr>
-                <w:rFonts w:eastAsiaTheme="minorEastAsia"/>
-              </w:rPr>
-              <w:t>Memory access</w:t>
-            </w:r>
-            <w:r>
-              <w:rPr>
-                <w:rFonts w:eastAsiaTheme="minorEastAsia"/>
-              </w:rPr>
-              <w:t xml:space="preserve"> address</w:t>
+                <w:rFonts w:eastAsiaTheme="minorEastAsia"/>
+              </w:rPr>
+              <w:t>Memory access address</w:t>
             </w:r>
           </w:p>
         </w:tc>
@@ -12677,13 +12763,7 @@
               <w:rPr>
                 <w:rFonts w:eastAsiaTheme="minorEastAsia"/>
               </w:rPr>
-              <w:t>i</w:t>
-            </w:r>
-            <w:r>
-              <w:rPr>
-                <w:rFonts w:eastAsiaTheme="minorEastAsia"/>
-              </w:rPr>
-              <w:t>_data</w:t>
+              <w:t>i_data</w:t>
             </w:r>
           </w:p>
         </w:tc>
@@ -12695,20 +12775,20 @@
           <w:p>
             <w:pPr>
               <w:jc w:val="center"/>
-              <w:rPr>
-                <w:rFonts w:ascii="Arial" w:eastAsiaTheme="minorEastAsia" w:hAnsi="Arial" w:cs="Arial" w:hint="eastAsia"/>
-                <w:kern w:val="0"/>
-                <w:sz w:val="20"/>
-                <w:szCs w:val="20"/>
-              </w:rPr>
-            </w:pPr>
-            <w:r>
               <w:rPr>
                 <w:rFonts w:ascii="Arial" w:eastAsiaTheme="minorEastAsia" w:hAnsi="Arial" w:cs="Arial"/>
                 <w:kern w:val="0"/>
                 <w:sz w:val="20"/>
                 <w:szCs w:val="20"/>
               </w:rPr>
+            </w:pPr>
+            <w:r>
+              <w:rPr>
+                <w:rFonts w:ascii="Arial" w:eastAsiaTheme="minorEastAsia" w:hAnsi="Arial" w:cs="Arial"/>
+                <w:kern w:val="0"/>
+                <w:sz w:val="20"/>
+                <w:szCs w:val="20"/>
+              </w:rPr>
               <w:t>configurable</w:t>
             </w:r>
           </w:p>
@@ -12722,38 +12802,32 @@
             <w:pPr>
               <w:jc w:val="center"/>
               <w:rPr>
+                <w:rFonts w:eastAsiaTheme="minorEastAsia"/>
+              </w:rPr>
+            </w:pPr>
+            <w:r>
+              <w:rPr>
                 <w:rFonts w:eastAsiaTheme="minorEastAsia" w:hint="eastAsia"/>
               </w:rPr>
+              <w:t>O</w:t>
+            </w:r>
+          </w:p>
+        </w:tc>
+        <w:tc>
+          <w:tcPr>
+            <w:tcW w:w="2334" w:type="dxa"/>
+          </w:tcPr>
+          <w:p>
+            <w:pPr>
+              <w:rPr>
+                <w:rFonts w:eastAsiaTheme="minorEastAsia"/>
+              </w:rPr>
             </w:pPr>
             <w:r>
               <w:rPr>
-                <w:rFonts w:eastAsiaTheme="minorEastAsia" w:hint="eastAsia"/>
-              </w:rPr>
-              <w:t>O</w:t>
-            </w:r>
-          </w:p>
-        </w:tc>
-        <w:tc>
-          <w:tcPr>
-            <w:tcW w:w="2334" w:type="dxa"/>
-          </w:tcPr>
-          <w:p>
-            <w:pPr>
-              <w:rPr>
-                <w:rFonts w:eastAsiaTheme="minorEastAsia"/>
-              </w:rPr>
-            </w:pPr>
-            <w:r>
-              <w:rPr>
-                <w:rFonts w:eastAsiaTheme="minorEastAsia"/>
-              </w:rPr>
-              <w:t>Memory</w:t>
-            </w:r>
-            <w:r>
-              <w:rPr>
-                <w:rFonts w:eastAsiaTheme="minorEastAsia"/>
-              </w:rPr>
-              <w:t xml:space="preserve"> write data</w:t>
+                <w:rFonts w:eastAsiaTheme="minorEastAsia"/>
+              </w:rPr>
+              <w:t>Memory write data</w:t>
             </w:r>
           </w:p>
         </w:tc>
@@ -13211,25 +13285,51 @@
       <w:r>
         <w:t xml:space="preserve">Table </w:t>
       </w:r>
-      <w:fldSimple w:instr=" STYLEREF 1 \s ">
-        <w:r>
-          <w:rPr>
-            <w:noProof/>
-          </w:rPr>
-          <w:t>3</w:t>
-        </w:r>
-      </w:fldSimple>
+      <w:r>
+        <w:fldChar w:fldCharType="begin"/>
+      </w:r>
+      <w:r>
+        <w:instrText xml:space="preserve"> STYLEREF 1 \s </w:instrText>
+      </w:r>
+      <w:r>
+        <w:fldChar w:fldCharType="separate"/>
+      </w:r>
+      <w:r>
+        <w:rPr>
+          <w:noProof/>
+        </w:rPr>
+        <w:t>3</w:t>
+      </w:r>
+      <w:r>
+        <w:rPr>
+          <w:noProof/>
+        </w:rPr>
+        <w:fldChar w:fldCharType="end"/>
+      </w:r>
       <w:r>
         <w:noBreakHyphen/>
       </w:r>
-      <w:fldSimple w:instr=" SEQ Table \* ARABIC \s 1 ">
-        <w:r>
-          <w:rPr>
-            <w:noProof/>
-          </w:rPr>
-          <w:t>3</w:t>
-        </w:r>
-      </w:fldSimple>
+      <w:r>
+        <w:fldChar w:fldCharType="begin"/>
+      </w:r>
+      <w:r>
+        <w:instrText xml:space="preserve"> SEQ Table \* ARABIC \s 1 </w:instrText>
+      </w:r>
+      <w:r>
+        <w:fldChar w:fldCharType="separate"/>
+      </w:r>
+      <w:r>
+        <w:rPr>
+          <w:noProof/>
+        </w:rPr>
+        <w:t>3</w:t>
+      </w:r>
+      <w:r>
+        <w:rPr>
+          <w:noProof/>
+        </w:rPr>
+        <w:fldChar w:fldCharType="end"/>
+      </w:r>
       <w:r>
         <w:t xml:space="preserve"> I/O Interfaces</w:t>
       </w:r>
@@ -13494,25 +13594,51 @@
       <w:r>
         <w:t xml:space="preserve">Table </w:t>
       </w:r>
-      <w:fldSimple w:instr=" STYLEREF 1 \s ">
-        <w:r>
-          <w:rPr>
-            <w:noProof/>
-          </w:rPr>
-          <w:t>3</w:t>
-        </w:r>
-      </w:fldSimple>
+      <w:r>
+        <w:fldChar w:fldCharType="begin"/>
+      </w:r>
+      <w:r>
+        <w:instrText xml:space="preserve"> STYLEREF 1 \s </w:instrText>
+      </w:r>
+      <w:r>
+        <w:fldChar w:fldCharType="separate"/>
+      </w:r>
+      <w:r>
+        <w:rPr>
+          <w:noProof/>
+        </w:rPr>
+        <w:t>3</w:t>
+      </w:r>
+      <w:r>
+        <w:rPr>
+          <w:noProof/>
+        </w:rPr>
+        <w:fldChar w:fldCharType="end"/>
+      </w:r>
       <w:r>
         <w:noBreakHyphen/>
       </w:r>
-      <w:fldSimple w:instr=" SEQ Table \* ARABIC \s 1 ">
-        <w:r>
-          <w:rPr>
-            <w:noProof/>
-          </w:rPr>
-          <w:t>4</w:t>
-        </w:r>
-      </w:fldSimple>
+      <w:r>
+        <w:fldChar w:fldCharType="begin"/>
+      </w:r>
+      <w:r>
+        <w:instrText xml:space="preserve"> SEQ Table \* ARABIC \s 1 </w:instrText>
+      </w:r>
+      <w:r>
+        <w:fldChar w:fldCharType="separate"/>
+      </w:r>
+      <w:r>
+        <w:rPr>
+          <w:noProof/>
+        </w:rPr>
+        <w:t>4</w:t>
+      </w:r>
+      <w:r>
+        <w:rPr>
+          <w:noProof/>
+        </w:rPr>
+        <w:fldChar w:fldCharType="end"/>
+      </w:r>
       <w:r>
         <w:t xml:space="preserve"> Address Mapping</w:t>
       </w:r>
@@ -13629,25 +13755,51 @@
       <w:r>
         <w:t xml:space="preserve">Figure </w:t>
       </w:r>
-      <w:fldSimple w:instr=" STYLEREF 1 \s ">
-        <w:r>
-          <w:rPr>
-            <w:noProof/>
-          </w:rPr>
-          <w:t>4</w:t>
-        </w:r>
-      </w:fldSimple>
+      <w:r>
+        <w:fldChar w:fldCharType="begin"/>
+      </w:r>
+      <w:r>
+        <w:instrText xml:space="preserve"> STYLEREF 1 \s </w:instrText>
+      </w:r>
+      <w:r>
+        <w:fldChar w:fldCharType="separate"/>
+      </w:r>
+      <w:r>
+        <w:rPr>
+          <w:noProof/>
+        </w:rPr>
+        <w:t>4</w:t>
+      </w:r>
+      <w:r>
+        <w:rPr>
+          <w:noProof/>
+        </w:rPr>
+        <w:fldChar w:fldCharType="end"/>
+      </w:r>
       <w:r>
         <w:noBreakHyphen/>
       </w:r>
-      <w:fldSimple w:instr=" SEQ Figure \* ARABIC \s 1 ">
-        <w:r>
-          <w:rPr>
-            <w:noProof/>
-          </w:rPr>
-          <w:t>1</w:t>
-        </w:r>
-      </w:fldSimple>
+      <w:r>
+        <w:fldChar w:fldCharType="begin"/>
+      </w:r>
+      <w:r>
+        <w:instrText xml:space="preserve"> SEQ Figure \* ARABIC \s 1 </w:instrText>
+      </w:r>
+      <w:r>
+        <w:fldChar w:fldCharType="separate"/>
+      </w:r>
+      <w:r>
+        <w:rPr>
+          <w:noProof/>
+        </w:rPr>
+        <w:t>1</w:t>
+      </w:r>
+      <w:r>
+        <w:rPr>
+          <w:noProof/>
+        </w:rPr>
+        <w:fldChar w:fldCharType="end"/>
+      </w:r>
       <w:bookmarkEnd w:id="25"/>
       <w:r>
         <w:t xml:space="preserve"> Read Handler Diagram</w:t>
@@ -15283,25 +15435,51 @@
       <w:r>
         <w:t xml:space="preserve">Table </w:t>
       </w:r>
-      <w:fldSimple w:instr=" STYLEREF 1 \s ">
-        <w:r>
-          <w:rPr>
-            <w:noProof/>
-          </w:rPr>
-          <w:t>4</w:t>
-        </w:r>
-      </w:fldSimple>
+      <w:r>
+        <w:fldChar w:fldCharType="begin"/>
+      </w:r>
+      <w:r>
+        <w:instrText xml:space="preserve"> STYLEREF 1 \s </w:instrText>
+      </w:r>
+      <w:r>
+        <w:fldChar w:fldCharType="separate"/>
+      </w:r>
+      <w:r>
+        <w:rPr>
+          <w:noProof/>
+        </w:rPr>
+        <w:t>4</w:t>
+      </w:r>
+      <w:r>
+        <w:rPr>
+          <w:noProof/>
+        </w:rPr>
+        <w:fldChar w:fldCharType="end"/>
+      </w:r>
       <w:r>
         <w:noBreakHyphen/>
       </w:r>
-      <w:fldSimple w:instr=" SEQ Table \* ARABIC \s 1 ">
-        <w:r>
-          <w:rPr>
-            <w:noProof/>
-          </w:rPr>
-          <w:t>1</w:t>
-        </w:r>
-      </w:fldSimple>
+      <w:r>
+        <w:fldChar w:fldCharType="begin"/>
+      </w:r>
+      <w:r>
+        <w:instrText xml:space="preserve"> SEQ Table \* ARABIC \s 1 </w:instrText>
+      </w:r>
+      <w:r>
+        <w:fldChar w:fldCharType="separate"/>
+      </w:r>
+      <w:r>
+        <w:rPr>
+          <w:noProof/>
+        </w:rPr>
+        <w:t>1</w:t>
+      </w:r>
+      <w:r>
+        <w:rPr>
+          <w:noProof/>
+        </w:rPr>
+        <w:fldChar w:fldCharType="end"/>
+      </w:r>
       <w:bookmarkEnd w:id="28"/>
       <w:r>
         <w:t xml:space="preserve"> Request/Response Format of </w:t>
@@ -15575,25 +15753,51 @@
       <w:r>
         <w:t xml:space="preserve">Figure </w:t>
       </w:r>
-      <w:fldSimple w:instr=" STYLEREF 1 \s ">
-        <w:r>
-          <w:rPr>
-            <w:noProof/>
-          </w:rPr>
-          <w:t>4</w:t>
-        </w:r>
-      </w:fldSimple>
+      <w:r>
+        <w:fldChar w:fldCharType="begin"/>
+      </w:r>
+      <w:r>
+        <w:instrText xml:space="preserve"> STYLEREF 1 \s </w:instrText>
+      </w:r>
+      <w:r>
+        <w:fldChar w:fldCharType="separate"/>
+      </w:r>
+      <w:r>
+        <w:rPr>
+          <w:noProof/>
+        </w:rPr>
+        <w:t>4</w:t>
+      </w:r>
+      <w:r>
+        <w:rPr>
+          <w:noProof/>
+        </w:rPr>
+        <w:fldChar w:fldCharType="end"/>
+      </w:r>
       <w:r>
         <w:noBreakHyphen/>
       </w:r>
-      <w:fldSimple w:instr=" SEQ Figure \* ARABIC \s 1 ">
-        <w:r>
-          <w:rPr>
-            <w:noProof/>
-          </w:rPr>
-          <w:t>2</w:t>
-        </w:r>
-      </w:fldSimple>
+      <w:r>
+        <w:fldChar w:fldCharType="begin"/>
+      </w:r>
+      <w:r>
+        <w:instrText xml:space="preserve"> SEQ Figure \* ARABIC \s 1 </w:instrText>
+      </w:r>
+      <w:r>
+        <w:fldChar w:fldCharType="separate"/>
+      </w:r>
+      <w:r>
+        <w:rPr>
+          <w:noProof/>
+        </w:rPr>
+        <w:t>2</w:t>
+      </w:r>
+      <w:r>
+        <w:rPr>
+          <w:noProof/>
+        </w:rPr>
+        <w:fldChar w:fldCharType="end"/>
+      </w:r>
       <w:bookmarkEnd w:id="31"/>
       <w:r>
         <w:t xml:space="preserve"> Write Handler Diagram</w:t>
@@ -15967,25 +16171,51 @@
       <w:r>
         <w:t xml:space="preserve">Figure </w:t>
       </w:r>
-      <w:fldSimple w:instr=" STYLEREF 1 \s ">
-        <w:r>
-          <w:rPr>
-            <w:noProof/>
-          </w:rPr>
-          <w:t>4</w:t>
-        </w:r>
-      </w:fldSimple>
+      <w:r>
+        <w:fldChar w:fldCharType="begin"/>
+      </w:r>
+      <w:r>
+        <w:instrText xml:space="preserve"> STYLEREF 1 \s </w:instrText>
+      </w:r>
+      <w:r>
+        <w:fldChar w:fldCharType="separate"/>
+      </w:r>
+      <w:r>
+        <w:rPr>
+          <w:noProof/>
+        </w:rPr>
+        <w:t>4</w:t>
+      </w:r>
+      <w:r>
+        <w:rPr>
+          <w:noProof/>
+        </w:rPr>
+        <w:fldChar w:fldCharType="end"/>
+      </w:r>
       <w:r>
         <w:noBreakHyphen/>
       </w:r>
-      <w:fldSimple w:instr=" SEQ Figure \* ARABIC \s 1 ">
-        <w:r>
-          <w:rPr>
-            <w:noProof/>
-          </w:rPr>
-          <w:t>3</w:t>
-        </w:r>
-      </w:fldSimple>
+      <w:r>
+        <w:fldChar w:fldCharType="begin"/>
+      </w:r>
+      <w:r>
+        <w:instrText xml:space="preserve"> SEQ Figure \* ARABIC \s 1 </w:instrText>
+      </w:r>
+      <w:r>
+        <w:fldChar w:fldCharType="separate"/>
+      </w:r>
+      <w:r>
+        <w:rPr>
+          <w:noProof/>
+        </w:rPr>
+        <w:t>3</w:t>
+      </w:r>
+      <w:r>
+        <w:rPr>
+          <w:noProof/>
+        </w:rPr>
+        <w:fldChar w:fldCharType="end"/>
+      </w:r>
       <w:bookmarkEnd w:id="34"/>
       <w:r>
         <w:t xml:space="preserve"> </w:t>
@@ -16505,67 +16735,35 @@
       <w:r>
         <w:t xml:space="preserve">Figure </w:t>
       </w:r>
-      <w:r>
-        <w:fldChar w:fldCharType="begin"/>
-      </w:r>
-      <w:r>
-        <w:instrText xml:space="preserve"> STYLEREF 1 \s </w:instrText>
-      </w:r>
-      <w:r>
-        <w:fldChar w:fldCharType="separate"/>
-      </w:r>
-      <w:r>
-        <w:rPr>
-          <w:noProof/>
-        </w:rPr>
-        <w:t>4</w:t>
-      </w:r>
-      <w:r>
-        <w:rPr>
-          <w:noProof/>
-        </w:rPr>
-        <w:fldChar w:fldCharType="end"/>
-      </w:r>
+      <w:fldSimple w:instr=" STYLEREF 1 \s ">
+        <w:r>
+          <w:rPr>
+            <w:noProof/>
+          </w:rPr>
+          <w:t>4</w:t>
+        </w:r>
+      </w:fldSimple>
       <w:r>
         <w:noBreakHyphen/>
       </w:r>
-      <w:r>
-        <w:fldChar w:fldCharType="begin"/>
-      </w:r>
-      <w:r>
-        <w:instrText xml:space="preserve"> SEQ Figure \* ARABIC \s 1 </w:instrText>
-      </w:r>
-      <w:r>
-        <w:fldChar w:fldCharType="separate"/>
-      </w:r>
-      <w:r>
-        <w:rPr>
-          <w:noProof/>
-        </w:rPr>
-        <w:t>4</w:t>
-      </w:r>
-      <w:r>
-        <w:rPr>
-          <w:noProof/>
-        </w:rPr>
-        <w:fldChar w:fldCharType="end"/>
-      </w:r>
+      <w:fldSimple w:instr=" SEQ Figure \* ARABIC \s 1 ">
+        <w:r>
+          <w:rPr>
+            <w:noProof/>
+          </w:rPr>
+          <w:t>4</w:t>
+        </w:r>
+      </w:fldSimple>
       <w:bookmarkEnd w:id="38"/>
       <w:r>
-        <w:t xml:space="preserve"> </w:t>
-      </w:r>
-      <w:r>
-        <w:t>Mem_if_ctrl</w:t>
-      </w:r>
-      <w:r>
-        <w:t xml:space="preserve"> Diagram</w:t>
+        <w:t xml:space="preserve"> Mem_if_ctrl Diagram</w:t>
       </w:r>
       <w:bookmarkEnd w:id="39"/>
     </w:p>
     <w:p>
       <w:pPr>
         <w:rPr>
-          <w:rFonts w:eastAsiaTheme="minorEastAsia" w:hint="eastAsia"/>
+          <w:rFonts w:eastAsiaTheme="minorEastAsia"/>
           <w:b/>
           <w:bCs/>
         </w:rPr>
@@ -16574,7 +16772,90 @@
         <w:rPr>
           <w:rFonts w:eastAsiaTheme="minorEastAsia"/>
         </w:rPr>
-        <w:t>As shown in</w:t>
+        <w:t xml:space="preserve">As shown in </w:t>
+      </w:r>
+      <w:r>
+        <w:rPr>
+          <w:rFonts w:eastAsiaTheme="minorEastAsia"/>
+        </w:rPr>
+        <w:fldChar w:fldCharType="begin"/>
+      </w:r>
+      <w:r>
+        <w:rPr>
+          <w:rFonts w:eastAsiaTheme="minorEastAsia"/>
+        </w:rPr>
+        <w:instrText xml:space="preserve"> REF _Ref145440954 \h </w:instrText>
+      </w:r>
+      <w:r>
+        <w:rPr>
+          <w:rFonts w:eastAsiaTheme="minorEastAsia"/>
+        </w:rPr>
+      </w:r>
+      <w:r>
+        <w:rPr>
+          <w:rFonts w:eastAsiaTheme="minorEastAsia"/>
+        </w:rPr>
+        <w:fldChar w:fldCharType="separate"/>
+      </w:r>
+      <w:r>
+        <w:t xml:space="preserve">Figure </w:t>
+      </w:r>
+      <w:r>
+        <w:rPr>
+          <w:noProof/>
+        </w:rPr>
+        <w:t>4</w:t>
+      </w:r>
+      <w:r>
+        <w:noBreakHyphen/>
+      </w:r>
+      <w:r>
+        <w:rPr>
+          <w:noProof/>
+        </w:rPr>
+        <w:t>4</w:t>
+      </w:r>
+      <w:r>
+        <w:rPr>
+          <w:rFonts w:eastAsiaTheme="minorEastAsia"/>
+        </w:rPr>
+        <w:fldChar w:fldCharType="end"/>
+      </w:r>
+      <w:r>
+        <w:rPr>
+          <w:rFonts w:eastAsiaTheme="minorEastAsia"/>
+        </w:rPr>
+        <w:t>, c</w:t>
+      </w:r>
+      <w:r>
+        <w:rPr>
+          <w:rFonts w:eastAsiaTheme="minorEastAsia"/>
+        </w:rPr>
+        <w:t xml:space="preserve">onsidering the delay of </w:t>
+      </w:r>
+      <w:r>
+        <w:rPr>
+          <w:rFonts w:eastAsiaTheme="minorEastAsia"/>
+        </w:rPr>
+        <w:t>SRAM</w:t>
+      </w:r>
+      <w:r>
+        <w:rPr>
+          <w:rFonts w:eastAsiaTheme="minorEastAsia"/>
+        </w:rPr>
+        <w:t xml:space="preserve"> output, some control signals for AXI_SRAMC reply will go through a pipeline to complete the timing alignment with the output data</w:t>
+      </w:r>
+      <w:r>
+        <w:rPr>
+          <w:rFonts w:eastAsiaTheme="minorEastAsia"/>
+        </w:rPr>
+        <w:t xml:space="preserve"> of SRAM</w:t>
+      </w:r>
+      <w:r>
+        <w:rPr>
+          <w:rFonts w:eastAsiaTheme="minorEastAsia"/>
+        </w:rPr>
+        <w:t>.</w:t>
       </w:r>
       <w:r>
         <w:rPr>
@@ -16586,84 +16867,43 @@
         <w:rPr>
           <w:rFonts w:eastAsiaTheme="minorEastAsia"/>
         </w:rPr>
-        <w:fldChar w:fldCharType="begin"/>
-      </w:r>
-      <w:r>
-        <w:rPr>
-          <w:rFonts w:eastAsiaTheme="minorEastAsia"/>
-        </w:rPr>
-        <w:instrText xml:space="preserve"> REF _Ref145440954 \h </w:instrText>
-      </w:r>
-      <w:r>
-        <w:rPr>
-          <w:rFonts w:eastAsiaTheme="minorEastAsia"/>
-        </w:rPr>
-      </w:r>
-      <w:r>
-        <w:rPr>
-          <w:rFonts w:eastAsiaTheme="minorEastAsia"/>
-        </w:rPr>
-        <w:fldChar w:fldCharType="separate"/>
-      </w:r>
-      <w:r>
-        <w:t xml:space="preserve">Figure </w:t>
-      </w:r>
-      <w:r>
-        <w:rPr>
-          <w:noProof/>
-        </w:rPr>
-        <w:t>4</w:t>
-      </w:r>
-      <w:r>
-        <w:noBreakHyphen/>
-      </w:r>
-      <w:r>
-        <w:rPr>
-          <w:noProof/>
-        </w:rPr>
-        <w:t>4</w:t>
-      </w:r>
-      <w:r>
-        <w:rPr>
-          <w:rFonts w:eastAsiaTheme="minorEastAsia"/>
-        </w:rPr>
-        <w:fldChar w:fldCharType="end"/>
-      </w:r>
-      <w:r>
-        <w:rPr>
-          <w:rFonts w:eastAsiaTheme="minorEastAsia"/>
-        </w:rPr>
-        <w:t>, c</w:t>
-      </w:r>
-      <w:r>
-        <w:rPr>
-          <w:rFonts w:eastAsiaTheme="minorEastAsia"/>
-        </w:rPr>
-        <w:t xml:space="preserve">onsidering the delay of </w:t>
-      </w:r>
-      <w:r>
-        <w:rPr>
-          <w:rFonts w:eastAsiaTheme="minorEastAsia"/>
-        </w:rPr>
-        <w:t>SRAM</w:t>
-      </w:r>
-      <w:r>
-        <w:rPr>
-          <w:rFonts w:eastAsiaTheme="minorEastAsia"/>
-        </w:rPr>
-        <w:t xml:space="preserve"> output, some control signals for AXI_SRAMC reply will go through a pipeline to complete the timing alignment with the output data</w:t>
-      </w:r>
-      <w:r>
-        <w:rPr>
-          <w:rFonts w:eastAsiaTheme="minorEastAsia"/>
-        </w:rPr>
-        <w:t xml:space="preserve"> of SRAM</w:t>
-      </w:r>
-      <w:r>
-        <w:rPr>
-          <w:rFonts w:eastAsiaTheme="minorEastAsia"/>
-        </w:rPr>
-        <w:t>.</w:t>
+        <w:t xml:space="preserve">Then the control signal and read data (not necessarily) will be stored in a FIFO. Assuming that the read latency of SRAM is N cycles, the number of pipeline stages is N, and the depth of </w:t>
+      </w:r>
+      <w:r>
+        <w:rPr>
+          <w:rFonts w:eastAsiaTheme="minorEastAsia"/>
+        </w:rPr>
+        <w:t>FIFO</w:t>
+      </w:r>
+      <w:r>
+        <w:rPr>
+          <w:rFonts w:eastAsiaTheme="minorEastAsia"/>
+        </w:rPr>
+        <w:t xml:space="preserve"> is N+1</w:t>
+      </w:r>
+      <w:r>
+        <w:rPr>
+          <w:rFonts w:eastAsiaTheme="minorEastAsia"/>
+        </w:rPr>
+        <w:t xml:space="preserve">. </w:t>
+      </w:r>
+      <w:r>
+        <w:rPr>
+          <w:rFonts w:eastAsiaTheme="minorEastAsia"/>
+        </w:rPr>
+        <w:t xml:space="preserve">The output valid is asserted when the </w:t>
+      </w:r>
+      <w:r>
+        <w:rPr>
+          <w:rFonts w:eastAsiaTheme="minorEastAsia"/>
+        </w:rPr>
+        <w:t>FIFO</w:t>
+      </w:r>
+      <w:r>
+        <w:rPr>
+          <w:rFonts w:eastAsiaTheme="minorEastAsia"/>
+        </w:rPr>
+        <w:t xml:space="preserve"> is not empty.</w:t>
       </w:r>
       <w:r>
         <w:rPr>
@@ -16675,54 +16915,6 @@
         <w:rPr>
           <w:rFonts w:eastAsiaTheme="minorEastAsia"/>
         </w:rPr>
-        <w:t xml:space="preserve">Then the control signal and read data (not necessarily) will be stored in a FIFO. Assuming that the read latency of SRAM is N cycles, the number of pipeline stages is N, and the depth of </w:t>
-      </w:r>
-      <w:r>
-        <w:rPr>
-          <w:rFonts w:eastAsiaTheme="minorEastAsia"/>
-        </w:rPr>
-        <w:t>FIFO</w:t>
-      </w:r>
-      <w:r>
-        <w:rPr>
-          <w:rFonts w:eastAsiaTheme="minorEastAsia"/>
-        </w:rPr>
-        <w:t xml:space="preserve"> is N+1</w:t>
-      </w:r>
-      <w:r>
-        <w:rPr>
-          <w:rFonts w:eastAsiaTheme="minorEastAsia"/>
-        </w:rPr>
-        <w:t xml:space="preserve">. </w:t>
-      </w:r>
-      <w:r>
-        <w:rPr>
-          <w:rFonts w:eastAsiaTheme="minorEastAsia"/>
-        </w:rPr>
-        <w:t xml:space="preserve">The output valid is asserted when the </w:t>
-      </w:r>
-      <w:r>
-        <w:rPr>
-          <w:rFonts w:eastAsiaTheme="minorEastAsia"/>
-        </w:rPr>
-        <w:t>FIFO</w:t>
-      </w:r>
-      <w:r>
-        <w:rPr>
-          <w:rFonts w:eastAsiaTheme="minorEastAsia"/>
-        </w:rPr>
-        <w:t xml:space="preserve"> is not empty.</w:t>
-      </w:r>
-      <w:r>
-        <w:rPr>
-          <w:rFonts w:eastAsiaTheme="minorEastAsia"/>
-        </w:rPr>
-        <w:t xml:space="preserve"> </w:t>
-      </w:r>
-      <w:r>
-        <w:rPr>
-          <w:rFonts w:eastAsiaTheme="minorEastAsia"/>
-        </w:rPr>
         <w:t xml:space="preserve">A counter is used to record the number of </w:t>
       </w:r>
       <w:r>
@@ -16753,13 +16945,7 @@
         <w:rPr>
           <w:rFonts w:eastAsiaTheme="minorEastAsia"/>
         </w:rPr>
-        <w:t xml:space="preserve"> SRAM</w:t>
-      </w:r>
-      <w:r>
-        <w:rPr>
-          <w:rFonts w:eastAsiaTheme="minorEastAsia"/>
-        </w:rPr>
-        <w:t xml:space="preserve">. </w:t>
+        <w:t xml:space="preserve"> SRAM. </w:t>
       </w:r>
       <w:r>
         <w:rPr>
@@ -16783,7 +16969,7 @@
         <w:rPr>
           <w:rFonts w:eastAsiaTheme="minorEastAsia"/>
         </w:rPr>
-        <w:t>2</w:t>
+        <w:t>1</w:t>
       </w:r>
       <w:r>
         <w:rPr>
@@ -16936,25 +17122,51 @@
       <w:r>
         <w:t xml:space="preserve">Figure </w:t>
       </w:r>
-      <w:fldSimple w:instr=" STYLEREF 1 \s ">
-        <w:r>
-          <w:rPr>
-            <w:noProof/>
-          </w:rPr>
-          <w:t>5</w:t>
-        </w:r>
-      </w:fldSimple>
+      <w:r>
+        <w:fldChar w:fldCharType="begin"/>
+      </w:r>
+      <w:r>
+        <w:instrText xml:space="preserve"> STYLEREF 1 \s </w:instrText>
+      </w:r>
+      <w:r>
+        <w:fldChar w:fldCharType="separate"/>
+      </w:r>
+      <w:r>
+        <w:rPr>
+          <w:noProof/>
+        </w:rPr>
+        <w:t>5</w:t>
+      </w:r>
+      <w:r>
+        <w:rPr>
+          <w:noProof/>
+        </w:rPr>
+        <w:fldChar w:fldCharType="end"/>
+      </w:r>
       <w:r>
         <w:noBreakHyphen/>
       </w:r>
-      <w:fldSimple w:instr=" SEQ Figure \* ARABIC \s 1 ">
-        <w:r>
-          <w:rPr>
-            <w:noProof/>
-          </w:rPr>
-          <w:t>1</w:t>
-        </w:r>
-      </w:fldSimple>
+      <w:r>
+        <w:fldChar w:fldCharType="begin"/>
+      </w:r>
+      <w:r>
+        <w:instrText xml:space="preserve"> SEQ Figure \* ARABIC \s 1 </w:instrText>
+      </w:r>
+      <w:r>
+        <w:fldChar w:fldCharType="separate"/>
+      </w:r>
+      <w:r>
+        <w:rPr>
+          <w:noProof/>
+        </w:rPr>
+        <w:t>1</w:t>
+      </w:r>
+      <w:r>
+        <w:rPr>
+          <w:noProof/>
+        </w:rPr>
+        <w:fldChar w:fldCharType="end"/>
+      </w:r>
       <w:r>
         <w:t xml:space="preserve"> Data Path </w:t>
       </w:r>
@@ -17186,25 +17398,51 @@
       <w:r>
         <w:t xml:space="preserve">Figure </w:t>
       </w:r>
-      <w:fldSimple w:instr=" STYLEREF 1 \s ">
-        <w:r>
-          <w:rPr>
-            <w:noProof/>
-          </w:rPr>
-          <w:t>5</w:t>
-        </w:r>
-      </w:fldSimple>
+      <w:r>
+        <w:fldChar w:fldCharType="begin"/>
+      </w:r>
+      <w:r>
+        <w:instrText xml:space="preserve"> STYLEREF 1 \s </w:instrText>
+      </w:r>
+      <w:r>
+        <w:fldChar w:fldCharType="separate"/>
+      </w:r>
+      <w:r>
+        <w:rPr>
+          <w:noProof/>
+        </w:rPr>
+        <w:t>5</w:t>
+      </w:r>
+      <w:r>
+        <w:rPr>
+          <w:noProof/>
+        </w:rPr>
+        <w:fldChar w:fldCharType="end"/>
+      </w:r>
       <w:r>
         <w:noBreakHyphen/>
       </w:r>
-      <w:fldSimple w:instr=" SEQ Figure \* ARABIC \s 1 ">
-        <w:r>
-          <w:rPr>
-            <w:noProof/>
-          </w:rPr>
-          <w:t>2</w:t>
-        </w:r>
-      </w:fldSimple>
+      <w:r>
+        <w:fldChar w:fldCharType="begin"/>
+      </w:r>
+      <w:r>
+        <w:instrText xml:space="preserve"> SEQ Figure \* ARABIC \s 1 </w:instrText>
+      </w:r>
+      <w:r>
+        <w:fldChar w:fldCharType="separate"/>
+      </w:r>
+      <w:r>
+        <w:rPr>
+          <w:noProof/>
+        </w:rPr>
+        <w:t>2</w:t>
+      </w:r>
+      <w:r>
+        <w:rPr>
+          <w:noProof/>
+        </w:rPr>
+        <w:fldChar w:fldCharType="end"/>
+      </w:r>
       <w:r>
         <w:t xml:space="preserve"> Data Path </w:t>
       </w:r>
@@ -17801,49 +18039,49 @@
           <w:p>
             <w:pPr>
               <w:rPr>
+                <w:rFonts w:eastAsiaTheme="minorEastAsia"/>
+              </w:rPr>
+            </w:pPr>
+            <w:r>
+              <w:rPr>
                 <w:rFonts w:eastAsiaTheme="minorEastAsia" w:hint="eastAsia"/>
               </w:rPr>
+              <w:t>S</w:t>
+            </w:r>
+            <w:r>
+              <w:rPr>
+                <w:rFonts w:eastAsiaTheme="minorEastAsia"/>
+              </w:rPr>
+              <w:t>RAM_R_LATENCY</w:t>
+            </w:r>
+          </w:p>
+        </w:tc>
+        <w:tc>
+          <w:tcPr>
+            <w:tcW w:w="2763" w:type="dxa"/>
+          </w:tcPr>
+          <w:p>
+            <w:pPr>
+              <w:rPr>
+                <w:rFonts w:eastAsiaTheme="minorEastAsia"/>
+              </w:rPr>
             </w:pPr>
             <w:r>
               <w:rPr>
                 <w:rFonts w:eastAsiaTheme="minorEastAsia" w:hint="eastAsia"/>
               </w:rPr>
-              <w:t>S</w:t>
-            </w:r>
-            <w:r>
-              <w:rPr>
-                <w:rFonts w:eastAsiaTheme="minorEastAsia"/>
-              </w:rPr>
-              <w:t>RAM_R_LATENCY</w:t>
-            </w:r>
-          </w:p>
-        </w:tc>
-        <w:tc>
-          <w:tcPr>
-            <w:tcW w:w="2763" w:type="dxa"/>
+              <w:t>1</w:t>
+            </w:r>
+          </w:p>
+        </w:tc>
+        <w:tc>
+          <w:tcPr>
+            <w:tcW w:w="2764" w:type="dxa"/>
           </w:tcPr>
           <w:p>
             <w:pPr>
               <w:rPr>
                 <w:rFonts w:eastAsiaTheme="minorEastAsia"/>
-              </w:rPr>
-            </w:pPr>
-            <w:r>
-              <w:rPr>
-                <w:rFonts w:eastAsiaTheme="minorEastAsia" w:hint="eastAsia"/>
-              </w:rPr>
-              <w:t>1</w:t>
-            </w:r>
-          </w:p>
-        </w:tc>
-        <w:tc>
-          <w:tcPr>
-            <w:tcW w:w="2764" w:type="dxa"/>
-          </w:tcPr>
-          <w:p>
-            <w:pPr>
-              <w:rPr>
-                <w:rFonts w:eastAsiaTheme="minorEastAsia" w:hint="eastAsia"/>
               </w:rPr>
             </w:pPr>
             <w:r>
@@ -18032,25 +18270,51 @@
       <w:r>
         <w:t xml:space="preserve">Table </w:t>
       </w:r>
-      <w:fldSimple w:instr=" STYLEREF 1 \s ">
-        <w:r>
-          <w:rPr>
-            <w:noProof/>
-          </w:rPr>
-          <w:t>6</w:t>
-        </w:r>
-      </w:fldSimple>
+      <w:r>
+        <w:fldChar w:fldCharType="begin"/>
+      </w:r>
+      <w:r>
+        <w:instrText xml:space="preserve"> STYLEREF 1 \s </w:instrText>
+      </w:r>
+      <w:r>
+        <w:fldChar w:fldCharType="separate"/>
+      </w:r>
+      <w:r>
+        <w:rPr>
+          <w:noProof/>
+        </w:rPr>
+        <w:t>6</w:t>
+      </w:r>
+      <w:r>
+        <w:rPr>
+          <w:noProof/>
+        </w:rPr>
+        <w:fldChar w:fldCharType="end"/>
+      </w:r>
       <w:r>
         <w:noBreakHyphen/>
       </w:r>
-      <w:fldSimple w:instr=" SEQ Table \* ARABIC \s 1 ">
-        <w:r>
-          <w:rPr>
-            <w:noProof/>
-          </w:rPr>
-          <w:t>1</w:t>
-        </w:r>
-      </w:fldSimple>
+      <w:r>
+        <w:fldChar w:fldCharType="begin"/>
+      </w:r>
+      <w:r>
+        <w:instrText xml:space="preserve"> SEQ Table \* ARABIC \s 1 </w:instrText>
+      </w:r>
+      <w:r>
+        <w:fldChar w:fldCharType="separate"/>
+      </w:r>
+      <w:r>
+        <w:rPr>
+          <w:noProof/>
+        </w:rPr>
+        <w:t>1</w:t>
+      </w:r>
+      <w:r>
+        <w:rPr>
+          <w:noProof/>
+        </w:rPr>
+        <w:fldChar w:fldCharType="end"/>
+      </w:r>
       <w:r>
         <w:t xml:space="preserve"> Parameter List</w:t>
       </w:r>
@@ -18251,25 +18515,51 @@
       <w:r>
         <w:t xml:space="preserve">Table </w:t>
       </w:r>
-      <w:fldSimple w:instr=" STYLEREF 1 \s ">
-        <w:r>
-          <w:rPr>
-            <w:noProof/>
-          </w:rPr>
-          <w:t>6</w:t>
-        </w:r>
-      </w:fldSimple>
+      <w:r>
+        <w:fldChar w:fldCharType="begin"/>
+      </w:r>
+      <w:r>
+        <w:instrText xml:space="preserve"> STYLEREF 1 \s </w:instrText>
+      </w:r>
+      <w:r>
+        <w:fldChar w:fldCharType="separate"/>
+      </w:r>
+      <w:r>
+        <w:rPr>
+          <w:noProof/>
+        </w:rPr>
+        <w:t>6</w:t>
+      </w:r>
+      <w:r>
+        <w:rPr>
+          <w:noProof/>
+        </w:rPr>
+        <w:fldChar w:fldCharType="end"/>
+      </w:r>
       <w:r>
         <w:noBreakHyphen/>
       </w:r>
-      <w:fldSimple w:instr=" SEQ Table \* ARABIC \s 1 ">
-        <w:r>
-          <w:rPr>
-            <w:noProof/>
-          </w:rPr>
-          <w:t>2</w:t>
-        </w:r>
-      </w:fldSimple>
+      <w:r>
+        <w:fldChar w:fldCharType="begin"/>
+      </w:r>
+      <w:r>
+        <w:instrText xml:space="preserve"> SEQ Table \* ARABIC \s 1 </w:instrText>
+      </w:r>
+      <w:r>
+        <w:fldChar w:fldCharType="separate"/>
+      </w:r>
+      <w:r>
+        <w:rPr>
+          <w:noProof/>
+        </w:rPr>
+        <w:t>2</w:t>
+      </w:r>
+      <w:r>
+        <w:rPr>
+          <w:noProof/>
+        </w:rPr>
+        <w:fldChar w:fldCharType="end"/>
+      </w:r>
       <w:r>
         <w:t xml:space="preserve"> Macro List</w:t>
       </w:r>
@@ -18606,25 +18896,51 @@
       <w:r>
         <w:t xml:space="preserve">Table </w:t>
       </w:r>
-      <w:fldSimple w:instr=" STYLEREF 1 \s ">
-        <w:r>
-          <w:rPr>
-            <w:noProof/>
-          </w:rPr>
-          <w:t>6</w:t>
-        </w:r>
-      </w:fldSimple>
+      <w:r>
+        <w:fldChar w:fldCharType="begin"/>
+      </w:r>
+      <w:r>
+        <w:instrText xml:space="preserve"> STYLEREF 1 \s </w:instrText>
+      </w:r>
+      <w:r>
+        <w:fldChar w:fldCharType="separate"/>
+      </w:r>
+      <w:r>
+        <w:rPr>
+          <w:noProof/>
+        </w:rPr>
+        <w:t>6</w:t>
+      </w:r>
+      <w:r>
+        <w:rPr>
+          <w:noProof/>
+        </w:rPr>
+        <w:fldChar w:fldCharType="end"/>
+      </w:r>
       <w:r>
         <w:noBreakHyphen/>
       </w:r>
-      <w:fldSimple w:instr=" SEQ Table \* ARABIC \s 1 ">
-        <w:r>
-          <w:rPr>
-            <w:noProof/>
-          </w:rPr>
-          <w:t>3</w:t>
-        </w:r>
-      </w:fldSimple>
+      <w:r>
+        <w:fldChar w:fldCharType="begin"/>
+      </w:r>
+      <w:r>
+        <w:instrText xml:space="preserve"> SEQ Table \* ARABIC \s 1 </w:instrText>
+      </w:r>
+      <w:r>
+        <w:fldChar w:fldCharType="separate"/>
+      </w:r>
+      <w:r>
+        <w:rPr>
+          <w:noProof/>
+        </w:rPr>
+        <w:t>3</w:t>
+      </w:r>
+      <w:r>
+        <w:rPr>
+          <w:noProof/>
+        </w:rPr>
+        <w:fldChar w:fldCharType="end"/>
+      </w:r>
       <w:r>
         <w:t xml:space="preserve"> Memory Requirements Table</w:t>
       </w:r>
@@ -18872,25 +19188,51 @@
       <w:r>
         <w:t xml:space="preserve">Table </w:t>
       </w:r>
-      <w:fldSimple w:instr=" STYLEREF 1 \s ">
-        <w:r>
-          <w:rPr>
-            <w:noProof/>
-          </w:rPr>
-          <w:t>7</w:t>
-        </w:r>
-      </w:fldSimple>
+      <w:r>
+        <w:fldChar w:fldCharType="begin"/>
+      </w:r>
+      <w:r>
+        <w:instrText xml:space="preserve"> STYLEREF 1 \s </w:instrText>
+      </w:r>
+      <w:r>
+        <w:fldChar w:fldCharType="separate"/>
+      </w:r>
+      <w:r>
+        <w:rPr>
+          <w:noProof/>
+        </w:rPr>
+        <w:t>7</w:t>
+      </w:r>
+      <w:r>
+        <w:rPr>
+          <w:noProof/>
+        </w:rPr>
+        <w:fldChar w:fldCharType="end"/>
+      </w:r>
       <w:r>
         <w:noBreakHyphen/>
       </w:r>
-      <w:fldSimple w:instr=" SEQ Table \* ARABIC \s 1 ">
-        <w:r>
-          <w:rPr>
-            <w:noProof/>
-          </w:rPr>
-          <w:t>1</w:t>
-        </w:r>
-      </w:fldSimple>
+      <w:r>
+        <w:fldChar w:fldCharType="begin"/>
+      </w:r>
+      <w:r>
+        <w:instrText xml:space="preserve"> SEQ Table \* ARABIC \s 1 </w:instrText>
+      </w:r>
+      <w:r>
+        <w:fldChar w:fldCharType="separate"/>
+      </w:r>
+      <w:r>
+        <w:rPr>
+          <w:noProof/>
+        </w:rPr>
+        <w:t>1</w:t>
+      </w:r>
+      <w:r>
+        <w:rPr>
+          <w:noProof/>
+        </w:rPr>
+        <w:fldChar w:fldCharType="end"/>
+      </w:r>
       <w:r>
         <w:t xml:space="preserve"> Power State Table</w:t>
       </w:r>
@@ -19070,25 +19412,51 @@
       <w:r>
         <w:t xml:space="preserve">Table </w:t>
       </w:r>
-      <w:fldSimple w:instr=" STYLEREF 1 \s ">
-        <w:r>
-          <w:rPr>
-            <w:noProof/>
-          </w:rPr>
-          <w:t>7</w:t>
-        </w:r>
-      </w:fldSimple>
+      <w:r>
+        <w:fldChar w:fldCharType="begin"/>
+      </w:r>
+      <w:r>
+        <w:instrText xml:space="preserve"> STYLEREF 1 \s </w:instrText>
+      </w:r>
+      <w:r>
+        <w:fldChar w:fldCharType="separate"/>
+      </w:r>
+      <w:r>
+        <w:rPr>
+          <w:noProof/>
+        </w:rPr>
+        <w:t>7</w:t>
+      </w:r>
+      <w:r>
+        <w:rPr>
+          <w:noProof/>
+        </w:rPr>
+        <w:fldChar w:fldCharType="end"/>
+      </w:r>
       <w:r>
         <w:noBreakHyphen/>
       </w:r>
-      <w:fldSimple w:instr=" SEQ Table \* ARABIC \s 1 ">
-        <w:r>
-          <w:rPr>
-            <w:noProof/>
-          </w:rPr>
-          <w:t>2</w:t>
-        </w:r>
-      </w:fldSimple>
+      <w:r>
+        <w:fldChar w:fldCharType="begin"/>
+      </w:r>
+      <w:r>
+        <w:instrText xml:space="preserve"> SEQ Table \* ARABIC \s 1 </w:instrText>
+      </w:r>
+      <w:r>
+        <w:fldChar w:fldCharType="separate"/>
+      </w:r>
+      <w:r>
+        <w:rPr>
+          <w:noProof/>
+        </w:rPr>
+        <w:t>2</w:t>
+      </w:r>
+      <w:r>
+        <w:rPr>
+          <w:noProof/>
+        </w:rPr>
+        <w:fldChar w:fldCharType="end"/>
+      </w:r>
       <w:r>
         <w:t xml:space="preserve"> Power Consumption Table</w:t>
       </w:r>
@@ -19546,25 +19914,51 @@
       <w:r>
         <w:t xml:space="preserve">Table </w:t>
       </w:r>
-      <w:fldSimple w:instr=" STYLEREF 1 \s ">
-        <w:r>
-          <w:rPr>
-            <w:noProof/>
-          </w:rPr>
-          <w:t>7</w:t>
-        </w:r>
-      </w:fldSimple>
+      <w:r>
+        <w:fldChar w:fldCharType="begin"/>
+      </w:r>
+      <w:r>
+        <w:instrText xml:space="preserve"> STYLEREF 1 \s </w:instrText>
+      </w:r>
+      <w:r>
+        <w:fldChar w:fldCharType="separate"/>
+      </w:r>
+      <w:r>
+        <w:rPr>
+          <w:noProof/>
+        </w:rPr>
+        <w:t>7</w:t>
+      </w:r>
+      <w:r>
+        <w:rPr>
+          <w:noProof/>
+        </w:rPr>
+        <w:fldChar w:fldCharType="end"/>
+      </w:r>
       <w:r>
         <w:noBreakHyphen/>
       </w:r>
-      <w:fldSimple w:instr=" SEQ Table \* ARABIC \s 1 ">
-        <w:r>
-          <w:rPr>
-            <w:noProof/>
-          </w:rPr>
-          <w:t>3</w:t>
-        </w:r>
-      </w:fldSimple>
+      <w:r>
+        <w:fldChar w:fldCharType="begin"/>
+      </w:r>
+      <w:r>
+        <w:instrText xml:space="preserve"> SEQ Table \* ARABIC \s 1 </w:instrText>
+      </w:r>
+      <w:r>
+        <w:fldChar w:fldCharType="separate"/>
+      </w:r>
+      <w:r>
+        <w:rPr>
+          <w:noProof/>
+        </w:rPr>
+        <w:t>3</w:t>
+      </w:r>
+      <w:r>
+        <w:rPr>
+          <w:noProof/>
+        </w:rPr>
+        <w:fldChar w:fldCharType="end"/>
+      </w:r>
       <w:r>
         <w:t xml:space="preserve"> Area Information</w:t>
       </w:r>
@@ -19689,25 +20083,51 @@
       <w:r>
         <w:t xml:space="preserve">Table </w:t>
       </w:r>
-      <w:fldSimple w:instr=" STYLEREF 1 \s ">
-        <w:r>
-          <w:rPr>
-            <w:noProof/>
-          </w:rPr>
-          <w:t>7</w:t>
-        </w:r>
-      </w:fldSimple>
+      <w:r>
+        <w:fldChar w:fldCharType="begin"/>
+      </w:r>
+      <w:r>
+        <w:instrText xml:space="preserve"> STYLEREF 1 \s </w:instrText>
+      </w:r>
+      <w:r>
+        <w:fldChar w:fldCharType="separate"/>
+      </w:r>
+      <w:r>
+        <w:rPr>
+          <w:noProof/>
+        </w:rPr>
+        <w:t>7</w:t>
+      </w:r>
+      <w:r>
+        <w:rPr>
+          <w:noProof/>
+        </w:rPr>
+        <w:fldChar w:fldCharType="end"/>
+      </w:r>
       <w:r>
         <w:noBreakHyphen/>
       </w:r>
-      <w:fldSimple w:instr=" SEQ Table \* ARABIC \s 1 ">
-        <w:r>
-          <w:rPr>
-            <w:noProof/>
-          </w:rPr>
-          <w:t>4</w:t>
-        </w:r>
-      </w:fldSimple>
+      <w:r>
+        <w:fldChar w:fldCharType="begin"/>
+      </w:r>
+      <w:r>
+        <w:instrText xml:space="preserve"> SEQ Table \* ARABIC \s 1 </w:instrText>
+      </w:r>
+      <w:r>
+        <w:fldChar w:fldCharType="separate"/>
+      </w:r>
+      <w:r>
+        <w:rPr>
+          <w:noProof/>
+        </w:rPr>
+        <w:t>4</w:t>
+      </w:r>
+      <w:r>
+        <w:rPr>
+          <w:noProof/>
+        </w:rPr>
+        <w:fldChar w:fldCharType="end"/>
+      </w:r>
       <w:r>
         <w:t xml:space="preserve"> VT Cell Number</w:t>
       </w:r>
@@ -19965,8 +20385,8 @@
         </w:rPr>
       </w:pPr>
       <w:bookmarkStart w:id="67" w:name="_Ref145334191"/>
-      <w:bookmarkStart w:id="68" w:name="_Ref142643323"/>
-      <w:bookmarkStart w:id="69" w:name="_Toc145441809"/>
+      <w:bookmarkStart w:id="68" w:name="_Toc145441809"/>
+      <w:bookmarkStart w:id="69" w:name="_Ref142643323"/>
       <w:r>
         <w:rPr>
           <w:rFonts w:eastAsiaTheme="minorEastAsia" w:hint="eastAsia"/>
@@ -19980,7 +20400,7 @@
         <w:t xml:space="preserve"> Wrapper</w:t>
       </w:r>
       <w:bookmarkEnd w:id="67"/>
-      <w:bookmarkEnd w:id="69"/>
+      <w:bookmarkEnd w:id="68"/>
       <w:r>
         <w:rPr>
           <w:rFonts w:eastAsiaTheme="minorEastAsia"/>
@@ -20001,7 +20421,7 @@
           <w:noProof/>
         </w:rPr>
         <w:drawing>
-          <wp:inline distT="0" distB="0" distL="0" distR="0" wp14:anchorId="24B97F78" wp14:editId="42386302">
+          <wp:inline distT="0" distB="0" distL="0" distR="0" wp14:anchorId="24B97F78" wp14:editId="4CD0DE7E">
             <wp:extent cx="5554980" cy="2748042"/>
             <wp:effectExtent l="0" t="0" r="7620" b="0"/>
             <wp:docPr id="416733238" name="图片 1"/>
@@ -20059,25 +20479,51 @@
       <w:r>
         <w:t xml:space="preserve">Figure </w:t>
       </w:r>
-      <w:fldSimple w:instr=" STYLEREF 1 \s ">
-        <w:r>
-          <w:rPr>
-            <w:noProof/>
-          </w:rPr>
-          <w:t>11</w:t>
-        </w:r>
-      </w:fldSimple>
+      <w:r>
+        <w:fldChar w:fldCharType="begin"/>
+      </w:r>
+      <w:r>
+        <w:instrText xml:space="preserve"> STYLEREF 1 \s </w:instrText>
+      </w:r>
+      <w:r>
+        <w:fldChar w:fldCharType="separate"/>
+      </w:r>
+      <w:r>
+        <w:rPr>
+          <w:noProof/>
+        </w:rPr>
+        <w:t>11</w:t>
+      </w:r>
+      <w:r>
+        <w:rPr>
+          <w:noProof/>
+        </w:rPr>
+        <w:fldChar w:fldCharType="end"/>
+      </w:r>
       <w:r>
         <w:noBreakHyphen/>
       </w:r>
-      <w:fldSimple w:instr=" SEQ Figure \* ARABIC \s 1 ">
-        <w:r>
-          <w:rPr>
-            <w:noProof/>
-          </w:rPr>
-          <w:t>1</w:t>
-        </w:r>
-      </w:fldSimple>
+      <w:r>
+        <w:fldChar w:fldCharType="begin"/>
+      </w:r>
+      <w:r>
+        <w:instrText xml:space="preserve"> SEQ Figure \* ARABIC \s 1 </w:instrText>
+      </w:r>
+      <w:r>
+        <w:fldChar w:fldCharType="separate"/>
+      </w:r>
+      <w:r>
+        <w:rPr>
+          <w:noProof/>
+        </w:rPr>
+        <w:t>1</w:t>
+      </w:r>
+      <w:r>
+        <w:rPr>
+          <w:noProof/>
+        </w:rPr>
+        <w:fldChar w:fldCharType="end"/>
+      </w:r>
       <w:bookmarkEnd w:id="70"/>
       <w:r>
         <w:t xml:space="preserve"> ECC Wrapper Diagram</w:t>
@@ -20207,7 +20653,7 @@
         </w:rPr>
         <w:t>emory Wrapper</w:t>
       </w:r>
-      <w:bookmarkEnd w:id="68"/>
+      <w:bookmarkEnd w:id="69"/>
       <w:bookmarkEnd w:id="72"/>
       <w:r>
         <w:rPr>
@@ -20274,25 +20720,51 @@
       <w:r>
         <w:t xml:space="preserve">Figure </w:t>
       </w:r>
-      <w:fldSimple w:instr=" STYLEREF 1 \s ">
-        <w:r>
-          <w:rPr>
-            <w:noProof/>
-          </w:rPr>
-          <w:t>11</w:t>
-        </w:r>
-      </w:fldSimple>
+      <w:r>
+        <w:fldChar w:fldCharType="begin"/>
+      </w:r>
+      <w:r>
+        <w:instrText xml:space="preserve"> STYLEREF 1 \s </w:instrText>
+      </w:r>
+      <w:r>
+        <w:fldChar w:fldCharType="separate"/>
+      </w:r>
+      <w:r>
+        <w:rPr>
+          <w:noProof/>
+        </w:rPr>
+        <w:t>11</w:t>
+      </w:r>
+      <w:r>
+        <w:rPr>
+          <w:noProof/>
+        </w:rPr>
+        <w:fldChar w:fldCharType="end"/>
+      </w:r>
       <w:r>
         <w:noBreakHyphen/>
       </w:r>
-      <w:fldSimple w:instr=" SEQ Figure \* ARABIC \s 1 ">
-        <w:r>
-          <w:rPr>
-            <w:noProof/>
-          </w:rPr>
-          <w:t>2</w:t>
-        </w:r>
-      </w:fldSimple>
+      <w:r>
+        <w:fldChar w:fldCharType="begin"/>
+      </w:r>
+      <w:r>
+        <w:instrText xml:space="preserve"> SEQ Figure \* ARABIC \s 1 </w:instrText>
+      </w:r>
+      <w:r>
+        <w:fldChar w:fldCharType="separate"/>
+      </w:r>
+      <w:r>
+        <w:rPr>
+          <w:noProof/>
+        </w:rPr>
+        <w:t>2</w:t>
+      </w:r>
+      <w:r>
+        <w:rPr>
+          <w:noProof/>
+        </w:rPr>
+        <w:fldChar w:fldCharType="end"/>
+      </w:r>
       <w:bookmarkEnd w:id="74"/>
       <w:r>
         <w:t xml:space="preserve"> Memory Wrapper Diagram</w:t>

</xml_diff>